<commit_message>
Le dossier de validation et le protocole IQ en anglais
La page anglaise renvoyait vers les documents français : elle promettait un pack
de validation et livrait du français. Elle sert désormais ses propres documents.

Les preuves anglaises ne sont pas une traduction : la suite de tests les émet
dans les deux langues au cours de la même exécution.

Co-Authored-By: Claude Opus 5 <noreply@anthropic.com>
</commit_message>
<xml_diff>
--- a/docs/Dossier_de_validation_Filum.docx
+++ b/docs/Dossier_de_validation_Filum.docx
@@ -4230,7 +4230,7 @@
                 <w:sz w:val="17"/>
                 <w:szCs w:val="17"/>
               </w:rPr>
-              <w:t xml:space="preserve">4 août 2026 à 15:31</w:t>
+              <w:t xml:space="preserve">4 août 2026 à 16:04</w:t>
             </w:r>
           </w:p>
         </w:tc>
@@ -4709,7 +4709,7 @@
                 <w:sz w:val="14"/>
                 <w:szCs w:val="14"/>
               </w:rPr>
-              <w:t xml:space="preserve">0 ms</w:t>
+              <w:t xml:space="preserve">1 ms</w:t>
             </w:r>
           </w:p>
         </w:tc>
@@ -4812,7 +4812,7 @@
                 <w:sz w:val="17"/>
                 <w:szCs w:val="17"/>
               </w:rPr>
-              <w:t xml:space="preserve">empreintes distinctes pour un même mot de passe (84f24c418f44… ≠ 3c48bc860120…), vérification correcte, mot de passe faux et vide refusés</w:t>
+              <w:t xml:space="preserve">empreintes distinctes pour un même mot de passe (fc5550566f42… ≠ 96440da417cf…), vérification correcte, mot de passe faux et vide refusés</w:t>
             </w:r>
           </w:p>
         </w:tc>
@@ -4851,7 +4851,7 @@
                 <w:sz w:val="14"/>
                 <w:szCs w:val="14"/>
               </w:rPr>
-              <w:t xml:space="preserve">151 ms</w:t>
+              <w:t xml:space="preserve">149 ms</w:t>
             </w:r>
           </w:p>
         </w:tc>
@@ -5096,7 +5096,7 @@
                 <w:sz w:val="17"/>
                 <w:szCs w:val="17"/>
               </w:rPr>
-              <w:t xml:space="preserve">contenu gelé, empreinte 24604eb157d7fa54…, 10485 octets conservés, opération journalisée</w:t>
+              <w:t xml:space="preserve">contenu gelé, empreinte 24604eb157d7fa54…, 10487 octets conservés, opération journalisée</w:t>
             </w:r>
           </w:p>
         </w:tc>
@@ -5135,7 +5135,7 @@
                 <w:sz w:val="14"/>
                 <w:szCs w:val="14"/>
               </w:rPr>
-              <w:t xml:space="preserve">143 ms</w:t>
+              <w:t xml:space="preserve">111 ms</w:t>
             </w:r>
           </w:p>
         </w:tc>
@@ -5238,7 +5238,7 @@
                 <w:sz w:val="17"/>
                 <w:szCs w:val="17"/>
               </w:rPr>
-              <w:t xml:space="preserve">signature liée à l'instantané cmsetfmm…, empreinte attestée 3767 CD80 ACC9, manifestation « Testeur QA1 (QA1) · Approuvé · 04/08/2026 15:31:20 UTC · enregistrement 3767 CD80 ACC9 »</w:t>
+              <w:t xml:space="preserve">signature liée à l'instantané cmseumrd…, empreinte attestée 3767 CD80 ACC9, manifestation « Testeur QA1 (QA1) · Approuvé · 04/08/2026 16:04:52 UTC · enregistrement 3767 CD80 ACC9 »</w:t>
             </w:r>
           </w:p>
         </w:tc>
@@ -5277,7 +5277,7 @@
                 <w:sz w:val="14"/>
                 <w:szCs w:val="14"/>
               </w:rPr>
-              <w:t xml:space="preserve">48 ms</w:t>
+              <w:t xml:space="preserve">44 ms</w:t>
             </w:r>
           </w:p>
         </w:tc>
@@ -5419,7 +5419,7 @@
                 <w:sz w:val="14"/>
                 <w:szCs w:val="14"/>
               </w:rPr>
-              <w:t xml:space="preserve">56 ms</w:t>
+              <w:t xml:space="preserve">54 ms</w:t>
             </w:r>
           </w:p>
         </w:tc>
@@ -5561,7 +5561,7 @@
                 <w:sz w:val="14"/>
                 <w:szCs w:val="14"/>
               </w:rPr>
-              <w:t xml:space="preserve">57 ms</w:t>
+              <w:t xml:space="preserve">51 ms</w:t>
             </w:r>
           </w:p>
         </w:tc>
@@ -5703,7 +5703,7 @@
                 <w:sz w:val="14"/>
                 <w:szCs w:val="14"/>
               </w:rPr>
-              <w:t xml:space="preserve">49 ms</w:t>
+              <w:t xml:space="preserve">47 ms</w:t>
             </w:r>
           </w:p>
         </w:tc>
@@ -5845,7 +5845,7 @@
                 <w:sz w:val="14"/>
                 <w:szCs w:val="14"/>
               </w:rPr>
-              <w:t xml:space="preserve">76 ms</w:t>
+              <w:t xml:space="preserve">77 ms</w:t>
             </w:r>
           </w:p>
         </w:tc>
@@ -5948,7 +5948,7 @@
                 <w:sz w:val="17"/>
                 <w:szCs w:val="17"/>
               </w:rPr>
-              <w:t xml:space="preserve">2 instantanés conservés : le gel de revue reste lisible (10495 o, dépassé), l'enregistrement approuvé porte la même empreinte de contenu</w:t>
+              <w:t xml:space="preserve">2 instantanés conservés : le gel de revue reste lisible (10496 o, dépassé), l'enregistrement approuvé porte la même empreinte de contenu</w:t>
             </w:r>
           </w:p>
         </w:tc>
@@ -5987,7 +5987,7 @@
                 <w:sz w:val="14"/>
                 <w:szCs w:val="14"/>
               </w:rPr>
-              <w:t xml:space="preserve">79 ms</w:t>
+              <w:t xml:space="preserve">74 ms</w:t>
             </w:r>
           </w:p>
         </w:tc>
@@ -6129,7 +6129,7 @@
                 <w:sz w:val="14"/>
                 <w:szCs w:val="14"/>
               </w:rPr>
-              <w:t xml:space="preserve">75 ms</w:t>
+              <w:t xml:space="preserve">72 ms</w:t>
             </w:r>
           </w:p>
         </w:tc>
@@ -6271,7 +6271,7 @@
                 <w:sz w:val="14"/>
                 <w:szCs w:val="14"/>
               </w:rPr>
-              <w:t xml:space="preserve">23 ms</w:t>
+              <w:t xml:space="preserve">25 ms</w:t>
             </w:r>
           </w:p>
         </w:tc>
@@ -6413,7 +6413,7 @@
                 <w:sz w:val="14"/>
                 <w:szCs w:val="14"/>
               </w:rPr>
-              <w:t xml:space="preserve">24 ms</w:t>
+              <w:t xml:space="preserve">25 ms</w:t>
             </w:r>
           </w:p>
         </w:tc>
@@ -6697,7 +6697,7 @@
                 <w:sz w:val="14"/>
                 <w:szCs w:val="14"/>
               </w:rPr>
-              <w:t xml:space="preserve">0 ms</w:t>
+              <w:t xml:space="preserve">1 ms</w:t>
             </w:r>
           </w:p>
         </w:tc>
@@ -6839,7 +6839,7 @@
                 <w:sz w:val="14"/>
                 <w:szCs w:val="14"/>
               </w:rPr>
-              <w:t xml:space="preserve">330 ms</w:t>
+              <w:t xml:space="preserve">340 ms</w:t>
             </w:r>
           </w:p>
         </w:tc>
@@ -6942,7 +6942,7 @@
                 <w:sz w:val="17"/>
                 <w:szCs w:val="17"/>
               </w:rPr>
-              <w:t xml:space="preserve">13 enregistrement(s) archivé(s), 29 fichier(s) couverts par empreintes.sha256, 0 écart ; ancre a3d601af36835b89… ; octets du gel restitués à l'identique ; altération d'un octet détectée et signalée ALTÉRÉ, fichier conservé dans l'archive</w:t>
+              <w:t xml:space="preserve">13 enregistrement(s) archivé(s), 29 fichier(s) couverts par empreintes.sha256, 0 écart ; ancre 510cd0bd33020b04… ; octets du gel restitués à l'identique ; altération d'un octet détectée et signalée ALTÉRÉ, fichier conservé dans l'archive</w:t>
             </w:r>
           </w:p>
         </w:tc>
@@ -6981,7 +6981,7 @@
                 <w:sz w:val="14"/>
                 <w:szCs w:val="14"/>
               </w:rPr>
-              <w:t xml:space="preserve">263 ms</w:t>
+              <w:t xml:space="preserve">248 ms</w:t>
             </w:r>
           </w:p>
         </w:tc>
@@ -7123,7 +7123,7 @@
                 <w:sz w:val="14"/>
                 <w:szCs w:val="14"/>
               </w:rPr>
-              <w:t xml:space="preserve">16 ms</w:t>
+              <w:t xml:space="preserve">14 ms</w:t>
             </w:r>
           </w:p>
         </w:tc>
@@ -7265,7 +7265,7 @@
                 <w:sz w:val="14"/>
                 <w:szCs w:val="14"/>
               </w:rPr>
-              <w:t xml:space="preserve">164 ms</w:t>
+              <w:t xml:space="preserve">152 ms</w:t>
             </w:r>
           </w:p>
         </w:tc>
@@ -7407,7 +7407,7 @@
                 <w:sz w:val="14"/>
                 <w:szCs w:val="14"/>
               </w:rPr>
-              <w:t xml:space="preserve">165 ms</w:t>
+              <w:t xml:space="preserve">167 ms</w:t>
             </w:r>
           </w:p>
         </w:tc>
@@ -7833,7 +7833,7 @@
                 <w:sz w:val="14"/>
                 <w:szCs w:val="14"/>
               </w:rPr>
-              <w:t xml:space="preserve">24 ms</w:t>
+              <w:t xml:space="preserve">25 ms</w:t>
             </w:r>
           </w:p>
         </w:tc>
@@ -7975,7 +7975,7 @@
                 <w:sz w:val="14"/>
                 <w:szCs w:val="14"/>
               </w:rPr>
-              <w:t xml:space="preserve">24 ms</w:t>
+              <w:t xml:space="preserve">23 ms</w:t>
             </w:r>
           </w:p>
         </w:tc>
@@ -8259,7 +8259,7 @@
                 <w:sz w:val="14"/>
                 <w:szCs w:val="14"/>
               </w:rPr>
-              <w:t xml:space="preserve">10 ms</w:t>
+              <w:t xml:space="preserve">8 ms</w:t>
             </w:r>
           </w:p>
         </w:tc>
@@ -8401,7 +8401,7 @@
                 <w:sz w:val="14"/>
                 <w:szCs w:val="14"/>
               </w:rPr>
-              <w:t xml:space="preserve">240 ms</w:t>
+              <w:t xml:space="preserve">237 ms</w:t>
             </w:r>
           </w:p>
         </w:tc>
@@ -8543,7 +8543,7 @@
                 <w:sz w:val="14"/>
                 <w:szCs w:val="14"/>
               </w:rPr>
-              <w:t xml:space="preserve">29 ms</w:t>
+              <w:t xml:space="preserve">28 ms</w:t>
             </w:r>
           </w:p>
         </w:tc>
@@ -11413,7 +11413,7 @@
         <w:sz w:val="15"/>
         <w:szCs w:val="15"/>
       </w:rPr>
-      <w:t xml:space="preserve">   ·   Version 1.2.0 · rapport OQ exécuté le 4 août 2026 à 15:31 UTC</w:t>
+      <w:t xml:space="preserve">   ·   Version 1.2.0 · rapport OQ exécuté le 4 août 2026 à 16:04 UTC</w:t>
     </w:r>
   </w:p>
 </w:ftr>

</xml_diff>

<commit_message>
Documents régénérés : le rapport OQ cite la dernière exécution
Co-Authored-By: Claude Opus 5 <noreply@anthropic.com>
</commit_message>
<xml_diff>
--- a/docs/Dossier_de_validation_Filum.docx
+++ b/docs/Dossier_de_validation_Filum.docx
@@ -4230,7 +4230,7 @@
                 <w:sz w:val="17"/>
                 <w:szCs w:val="17"/>
               </w:rPr>
-              <w:t xml:space="preserve">4 août 2026 à 16:04</w:t>
+              <w:t xml:space="preserve">5 août 2026 à 09:21</w:t>
             </w:r>
           </w:p>
         </w:tc>
@@ -4709,7 +4709,7 @@
                 <w:sz w:val="14"/>
                 <w:szCs w:val="14"/>
               </w:rPr>
-              <w:t xml:space="preserve">1 ms</w:t>
+              <w:t xml:space="preserve">0 ms</w:t>
             </w:r>
           </w:p>
         </w:tc>
@@ -4812,7 +4812,7 @@
                 <w:sz w:val="17"/>
                 <w:szCs w:val="17"/>
               </w:rPr>
-              <w:t xml:space="preserve">empreintes distinctes pour un même mot de passe (fc5550566f42… ≠ 96440da417cf…), vérification correcte, mot de passe faux et vide refusés</w:t>
+              <w:t xml:space="preserve">empreintes distinctes pour un même mot de passe (34637ecf3dca… ≠ 6e8605f3a005…), vérification correcte, mot de passe faux et vide refusés</w:t>
             </w:r>
           </w:p>
         </w:tc>
@@ -4851,7 +4851,7 @@
                 <w:sz w:val="14"/>
                 <w:szCs w:val="14"/>
               </w:rPr>
-              <w:t xml:space="preserve">149 ms</w:t>
+              <w:t xml:space="preserve">142 ms</w:t>
             </w:r>
           </w:p>
         </w:tc>
@@ -5096,7 +5096,7 @@
                 <w:sz w:val="17"/>
                 <w:szCs w:val="17"/>
               </w:rPr>
-              <w:t xml:space="preserve">contenu gelé, empreinte 24604eb157d7fa54…, 10487 octets conservés, opération journalisée</w:t>
+              <w:t xml:space="preserve">contenu gelé, empreinte 24604eb157d7fa54…, 10486 octets conservés, opération journalisée</w:t>
             </w:r>
           </w:p>
         </w:tc>
@@ -5135,7 +5135,7 @@
                 <w:sz w:val="14"/>
                 <w:szCs w:val="14"/>
               </w:rPr>
-              <w:t xml:space="preserve">111 ms</w:t>
+              <w:t xml:space="preserve">164 ms</w:t>
             </w:r>
           </w:p>
         </w:tc>
@@ -5238,7 +5238,7 @@
                 <w:sz w:val="17"/>
                 <w:szCs w:val="17"/>
               </w:rPr>
-              <w:t xml:space="preserve">signature liée à l'instantané cmseumrd…, empreinte attestée 3767 CD80 ACC9, manifestation « Testeur QA1 (QA1) · Approuvé · 04/08/2026 16:04:52 UTC · enregistrement 3767 CD80 ACC9 »</w:t>
+              <w:t xml:space="preserve">signature liée à l'instantané cmsfvncw…, empreinte attestée 3767 CD80 ACC9, manifestation « Testeur QA1 (QA1) · Approuvé · 05/08/2026 09:21:06 UTC · enregistrement 3767 CD80 ACC9 »</w:t>
             </w:r>
           </w:p>
         </w:tc>
@@ -5277,7 +5277,7 @@
                 <w:sz w:val="14"/>
                 <w:szCs w:val="14"/>
               </w:rPr>
-              <w:t xml:space="preserve">44 ms</w:t>
+              <w:t xml:space="preserve">48 ms</w:t>
             </w:r>
           </w:p>
         </w:tc>
@@ -5419,7 +5419,7 @@
                 <w:sz w:val="14"/>
                 <w:szCs w:val="14"/>
               </w:rPr>
-              <w:t xml:space="preserve">54 ms</w:t>
+              <w:t xml:space="preserve">55 ms</w:t>
             </w:r>
           </w:p>
         </w:tc>
@@ -5703,7 +5703,7 @@
                 <w:sz w:val="14"/>
                 <w:szCs w:val="14"/>
               </w:rPr>
-              <w:t xml:space="preserve">47 ms</w:t>
+              <w:t xml:space="preserve">51 ms</w:t>
             </w:r>
           </w:p>
         </w:tc>
@@ -5845,7 +5845,7 @@
                 <w:sz w:val="14"/>
                 <w:szCs w:val="14"/>
               </w:rPr>
-              <w:t xml:space="preserve">77 ms</w:t>
+              <w:t xml:space="preserve">74 ms</w:t>
             </w:r>
           </w:p>
         </w:tc>
@@ -5987,7 +5987,7 @@
                 <w:sz w:val="14"/>
                 <w:szCs w:val="14"/>
               </w:rPr>
-              <w:t xml:space="preserve">74 ms</w:t>
+              <w:t xml:space="preserve">76 ms</w:t>
             </w:r>
           </w:p>
         </w:tc>
@@ -6129,7 +6129,7 @@
                 <w:sz w:val="14"/>
                 <w:szCs w:val="14"/>
               </w:rPr>
-              <w:t xml:space="preserve">72 ms</w:t>
+              <w:t xml:space="preserve">74 ms</w:t>
             </w:r>
           </w:p>
         </w:tc>
@@ -6271,7 +6271,7 @@
                 <w:sz w:val="14"/>
                 <w:szCs w:val="14"/>
               </w:rPr>
-              <w:t xml:space="preserve">25 ms</w:t>
+              <w:t xml:space="preserve">24 ms</w:t>
             </w:r>
           </w:p>
         </w:tc>
@@ -6413,7 +6413,7 @@
                 <w:sz w:val="14"/>
                 <w:szCs w:val="14"/>
               </w:rPr>
-              <w:t xml:space="preserve">25 ms</w:t>
+              <w:t xml:space="preserve">28 ms</w:t>
             </w:r>
           </w:p>
         </w:tc>
@@ -6942,7 +6942,7 @@
                 <w:sz w:val="17"/>
                 <w:szCs w:val="17"/>
               </w:rPr>
-              <w:t xml:space="preserve">13 enregistrement(s) archivé(s), 29 fichier(s) couverts par empreintes.sha256, 0 écart ; ancre 510cd0bd33020b04… ; octets du gel restitués à l'identique ; altération d'un octet détectée et signalée ALTÉRÉ, fichier conservé dans l'archive</w:t>
+              <w:t xml:space="preserve">13 enregistrement(s) archivé(s), 29 fichier(s) couverts par empreintes.sha256, 0 écart ; ancre fcee04af2ca384b8… ; octets du gel restitués à l'identique ; altération d'un octet détectée et signalée ALTÉRÉ, fichier conservé dans l'archive</w:t>
             </w:r>
           </w:p>
         </w:tc>
@@ -6981,7 +6981,7 @@
                 <w:sz w:val="14"/>
                 <w:szCs w:val="14"/>
               </w:rPr>
-              <w:t xml:space="preserve">248 ms</w:t>
+              <w:t xml:space="preserve">235 ms</w:t>
             </w:r>
           </w:p>
         </w:tc>
@@ -7226,7 +7226,7 @@
                 <w:sz w:val="17"/>
                 <w:szCs w:val="17"/>
               </w:rPr>
-              <w:t xml:space="preserve">durée non déclarée annoncée telle quelle ; quatre valeurs invalides refusées (0, -1, 101, 7.5) ; 10 ans déclarés → échéance 2036-08-04 portée par le manifeste, procédure QP-014 rév. B citée dans la lettre d'accompagnement</w:t>
+              <w:t xml:space="preserve">durée non déclarée annoncée telle quelle ; quatre valeurs invalides refusées (0, -1, 101, 7.5) ; 10 ans déclarés → échéance 2036-08-05 portée par le manifeste, procédure QP-014 rév. B citée dans la lettre d'accompagnement</w:t>
             </w:r>
           </w:p>
         </w:tc>
@@ -7265,7 +7265,7 @@
                 <w:sz w:val="14"/>
                 <w:szCs w:val="14"/>
               </w:rPr>
-              <w:t xml:space="preserve">152 ms</w:t>
+              <w:t xml:space="preserve">135 ms</w:t>
             </w:r>
           </w:p>
         </w:tc>
@@ -7407,7 +7407,7 @@
                 <w:sz w:val="14"/>
                 <w:szCs w:val="14"/>
               </w:rPr>
-              <w:t xml:space="preserve">167 ms</w:t>
+              <w:t xml:space="preserve">142 ms</w:t>
             </w:r>
           </w:p>
         </w:tc>
@@ -7833,7 +7833,7 @@
                 <w:sz w:val="14"/>
                 <w:szCs w:val="14"/>
               </w:rPr>
-              <w:t xml:space="preserve">25 ms</w:t>
+              <w:t xml:space="preserve">23 ms</w:t>
             </w:r>
           </w:p>
         </w:tc>
@@ -7936,7 +7936,7 @@
                 <w:sz w:val="17"/>
                 <w:szCs w:val="17"/>
               </w:rPr>
-              <w:t xml:space="preserve">173 fichier(s) source relus, aucune écriture dans la piste hors du module ; 9 empreintes comparées entre l'implémentation TypeScript et le miroir de la console serveur, toutes identiques</w:t>
+              <w:t xml:space="preserve">176 fichier(s) source relus, aucune écriture dans la piste hors du module ; 9 empreintes comparées entre l'implémentation TypeScript et le miroir de la console serveur, toutes identiques</w:t>
             </w:r>
           </w:p>
         </w:tc>
@@ -8401,7 +8401,7 @@
                 <w:sz w:val="14"/>
                 <w:szCs w:val="14"/>
               </w:rPr>
-              <w:t xml:space="preserve">237 ms</w:t>
+              <w:t xml:space="preserve">229 ms</w:t>
             </w:r>
           </w:p>
         </w:tc>
@@ -8504,7 +8504,7 @@
                 <w:sz w:val="17"/>
                 <w:szCs w:val="17"/>
               </w:rPr>
-              <w:t xml:space="preserve">173 fichier(s) source relus : aucune écriture de mot de passe hors des chemins autorisés ; une seule écriture dans les actions serveur, le changement personnel, qui exige l'ancien mot de passe ; l'outil d'urgence de la console émet un jeton et ne sait plus dériver de mot de passe ; aucun champ de mot de passe hors des 6 écrans où l'on saisit le sien</w:t>
+              <w:t xml:space="preserve">176 fichier(s) source relus : aucune écriture de mot de passe hors des chemins autorisés ; une seule écriture dans les actions serveur, le changement personnel, qui exige l'ancien mot de passe ; l'outil d'urgence de la console émet un jeton et ne sait plus dériver de mot de passe ; aucun champ de mot de passe hors des 6 écrans où l'on saisit le sien</w:t>
             </w:r>
           </w:p>
         </w:tc>
@@ -8543,7 +8543,7 @@
                 <w:sz w:val="14"/>
                 <w:szCs w:val="14"/>
               </w:rPr>
-              <w:t xml:space="preserve">28 ms</w:t>
+              <w:t xml:space="preserve">26 ms</w:t>
             </w:r>
           </w:p>
         </w:tc>
@@ -11413,7 +11413,7 @@
         <w:sz w:val="15"/>
         <w:szCs w:val="15"/>
       </w:rPr>
-      <w:t xml:space="preserve">   ·   Version 1.2.0 · rapport OQ exécuté le 4 août 2026 à 16:04 UTC</w:t>
+      <w:t xml:space="preserve">   ·   Version 1.2.0 · rapport OQ exécuté le 5 août 2026 à 09:21 UTC</w:t>
     </w:r>
   </w:p>
 </w:ftr>

</xml_diff>

<commit_message>
32 exigences, 29 cas : les chiffres du site sont lus, plus écrits en dur
Co-Authored-By: Claude Opus 5 <noreply@anthropic.com>
</commit_message>
<xml_diff>
--- a/docs/Dossier_de_validation_Filum.docx
+++ b/docs/Dossier_de_validation_Filum.docx
@@ -430,7 +430,7 @@
           <w:sz w:val="20"/>
           <w:szCs w:val="20"/>
         </w:rPr>
-        <w:t xml:space="preserve">Les 31 exigences ci-dessous énoncent ce que le logiciel doit faire. Le niveau de risque est celui de la DÉFAILLANCE de l'exigence, pas de son importance commerciale : il détermine la profondeur de vérification.</w:t>
+        <w:t xml:space="preserve">Les 32 exigences ci-dessous énoncent ce que le logiciel doit faire. Le niveau de risque est celui de la DÉFAILLANCE de l'exigence, pas de son importance commerciale : il détermine la profondeur de vérification.</w:t>
       </w:r>
     </w:p>
     <w:tbl>
@@ -4060,6 +4060,119 @@
           </w:p>
         </w:tc>
       </w:tr>
+      <w:tr>
+        <w:tc>
+          <w:tcPr>
+            <w:tcW w:type="pct" w:w="11%"/>
+            <w:shd w:fill="F8FAFC"/>
+            <w:tcMar>
+              <w:top w:type="dxa" w:w="80"/>
+              <w:left w:type="dxa" w:w="110"/>
+              <w:bottom w:type="dxa" w:w="80"/>
+              <w:right w:type="dxa" w:w="110"/>
+            </w:tcMar>
+          </w:tcPr>
+          <w:p>
+            <w:pPr>
+              <w:spacing w:after="60"/>
+            </w:pPr>
+            <w:r>
+              <w:rPr>
+                <w:b/>
+                <w:bCs/>
+                <w:color w:val="4338CA"/>
+                <w:sz w:val="17"/>
+                <w:szCs w:val="17"/>
+              </w:rPr>
+              <w:t xml:space="preserve">URS-32</w:t>
+            </w:r>
+          </w:p>
+          <w:p>
+            <w:pPr>
+              <w:spacing w:after="0"/>
+            </w:pPr>
+            <w:r>
+              <w:rPr>
+                <w:b/>
+                <w:bCs/>
+                <w:color w:val="DC2626"/>
+                <w:sz w:val="15"/>
+                <w:szCs w:val="15"/>
+              </w:rPr>
+              <w:t xml:space="preserve">Haut</w:t>
+            </w:r>
+          </w:p>
+        </w:tc>
+        <w:tc>
+          <w:tcPr>
+            <w:tcW w:type="pct" w:w="41%"/>
+            <w:tcMar>
+              <w:top w:type="dxa" w:w="80"/>
+              <w:left w:type="dxa" w:w="110"/>
+              <w:bottom w:type="dxa" w:w="80"/>
+              <w:right w:type="dxa" w:w="110"/>
+            </w:tcMar>
+          </w:tcPr>
+          <w:p>
+            <w:pPr>
+              <w:spacing w:after="0"/>
+            </w:pPr>
+            <w:r>
+              <w:rPr>
+                <w:sz w:val="17"/>
+                <w:szCs w:val="17"/>
+              </w:rPr>
+              <w:t xml:space="preserve">L'image livrée démarre et amorce une installation utilisable : les migrations s'appliquent, l'organisation, le programme, le compte administrateur et la bibliothèque de normes sont créés, la chaîne de piste d'audit est intacte, la version annoncée est celle du logiciel, et aucune donnée n'est servie sans session.</w:t>
+            </w:r>
+          </w:p>
+        </w:tc>
+        <w:tc>
+          <w:tcPr>
+            <w:tcW w:type="pct" w:w="28%"/>
+            <w:tcMar>
+              <w:top w:type="dxa" w:w="80"/>
+              <w:left w:type="dxa" w:w="110"/>
+              <w:bottom w:type="dxa" w:w="80"/>
+              <w:right w:type="dxa" w:w="110"/>
+            </w:tcMar>
+          </w:tcPr>
+          <w:p>
+            <w:pPr>
+              <w:spacing w:after="0"/>
+            </w:pPr>
+            <w:r>
+              <w:rPr>
+                <w:sz w:val="17"/>
+                <w:szCs w:val="17"/>
+              </w:rPr>
+              <w:t xml:space="preserve">C'est l'image qui est livrée, pas le code source. Tout ce que vérifient les autres cas s'exécute HORS du conteneur : ni le contrôle de types, ni la construction applicative, ni les cas de qualification ne voient ce que l'image contient réellement. Cet angle mort a produit une image qui ne pouvait pas démarrer du tout — le client de l'étape IQ-04 l'aurait découvert devant son infogérant — et un conteneur annonçant une version qui n'était pas la sienne.</w:t>
+            </w:r>
+          </w:p>
+        </w:tc>
+        <w:tc>
+          <w:tcPr>
+            <w:tcW w:type="pct" w:w="20%"/>
+            <w:tcMar>
+              <w:top w:type="dxa" w:w="80"/>
+              <w:left w:type="dxa" w:w="110"/>
+              <w:bottom w:type="dxa" w:w="80"/>
+              <w:right w:type="dxa" w:w="110"/>
+            </w:tcMar>
+          </w:tcPr>
+          <w:p>
+            <w:pPr>
+              <w:spacing w:after="0"/>
+            </w:pPr>
+            <w:r>
+              <w:rPr>
+                <w:sz w:val="17"/>
+                <w:szCs w:val="17"/>
+              </w:rPr>
+              <w:t xml:space="preserve">21 CFR 11.10(a) · 21 CFR 11.10(d)</w:t>
+            </w:r>
+          </w:p>
+        </w:tc>
+      </w:tr>
     </w:tbl>
     <w:p>
       <w:pPr>
@@ -4079,7 +4192,7 @@
           <w:sz w:val="20"/>
           <w:szCs w:val="20"/>
         </w:rPr>
-        <w:t xml:space="preserve">Répartition : 21 exigences à risque haut, 8 à risque moyen, 2 à risque bas. Les exigences à risque haut touchent toutes à l'intégrité ou à l'attribution des enregistrements : leur défaillance ne dégrade pas le confort d'usage, elle rend un enregistrement indéfendable. Elles font l'objet de cas de test dédiés, exécutés à chaque version.</w:t>
+        <w:t xml:space="preserve">Répartition : 22 exigences à risque haut, 8 à risque moyen, 2 à risque bas. Les exigences à risque haut touchent toutes à l'intégrité ou à l'attribution des enregistrements : leur défaillance ne dégrade pas le confort d'usage, elle rend un enregistrement indéfendable. Elles font l'objet de cas de test dédiés, exécutés à chaque version.</w:t>
       </w:r>
     </w:p>
     <w:p>
@@ -4230,7 +4343,7 @@
                 <w:sz w:val="17"/>
                 <w:szCs w:val="17"/>
               </w:rPr>
-              <w:t xml:space="preserve">5 août 2026 à 09:21</w:t>
+              <w:t xml:space="preserve">5 août 2026 à 10:08</w:t>
             </w:r>
           </w:p>
         </w:tc>
@@ -4433,7 +4546,7 @@
                 <w:sz w:val="17"/>
                 <w:szCs w:val="17"/>
               </w:rPr>
-              <w:t xml:space="preserve">28 cas sur 28 conformes — aucun écart</w:t>
+              <w:t xml:space="preserve">29 cas sur 29 conformes — aucun écart</w:t>
             </w:r>
           </w:p>
         </w:tc>
@@ -4812,7 +4925,7 @@
                 <w:sz w:val="17"/>
                 <w:szCs w:val="17"/>
               </w:rPr>
-              <w:t xml:space="preserve">empreintes distinctes pour un même mot de passe (34637ecf3dca… ≠ 6e8605f3a005…), vérification correcte, mot de passe faux et vide refusés</w:t>
+              <w:t xml:space="preserve">empreintes distinctes pour un même mot de passe (671e86ccff16… ≠ 075a3cac89f9…), vérification correcte, mot de passe faux et vide refusés</w:t>
             </w:r>
           </w:p>
         </w:tc>
@@ -4851,7 +4964,7 @@
                 <w:sz w:val="14"/>
                 <w:szCs w:val="14"/>
               </w:rPr>
-              <w:t xml:space="preserve">142 ms</w:t>
+              <w:t xml:space="preserve">159 ms</w:t>
             </w:r>
           </w:p>
         </w:tc>
@@ -4993,7 +5106,7 @@
                 <w:sz w:val="14"/>
                 <w:szCs w:val="14"/>
               </w:rPr>
-              <w:t xml:space="preserve">14 ms</w:t>
+              <w:t xml:space="preserve">16 ms</w:t>
             </w:r>
           </w:p>
         </w:tc>
@@ -5096,7 +5209,7 @@
                 <w:sz w:val="17"/>
                 <w:szCs w:val="17"/>
               </w:rPr>
-              <w:t xml:space="preserve">contenu gelé, empreinte 24604eb157d7fa54…, 10486 octets conservés, opération journalisée</w:t>
+              <w:t xml:space="preserve">contenu gelé, empreinte 24604eb157d7fa54…, 10484 octets conservés, opération journalisée</w:t>
             </w:r>
           </w:p>
         </w:tc>
@@ -5135,7 +5248,7 @@
                 <w:sz w:val="14"/>
                 <w:szCs w:val="14"/>
               </w:rPr>
-              <w:t xml:space="preserve">164 ms</w:t>
+              <w:t xml:space="preserve">123 ms</w:t>
             </w:r>
           </w:p>
         </w:tc>
@@ -5238,7 +5351,7 @@
                 <w:sz w:val="17"/>
                 <w:szCs w:val="17"/>
               </w:rPr>
-              <w:t xml:space="preserve">signature liée à l'instantané cmsfvncw…, empreinte attestée 3767 CD80 ACC9, manifestation « Testeur QA1 (QA1) · Approuvé · 05/08/2026 09:21:06 UTC · enregistrement 3767 CD80 ACC9 »</w:t>
+              <w:t xml:space="preserve">signature liée à l'instantané cmsfxcn8…, empreinte attestée 3767 CD80 ACC9, manifestation « Testeur QA1 (QA1) · Approuvé · 05/08/2026 10:08:45 UTC · enregistrement 3767 CD80 ACC9 »</w:t>
             </w:r>
           </w:p>
         </w:tc>
@@ -5277,7 +5390,7 @@
                 <w:sz w:val="14"/>
                 <w:szCs w:val="14"/>
               </w:rPr>
-              <w:t xml:space="preserve">48 ms</w:t>
+              <w:t xml:space="preserve">50 ms</w:t>
             </w:r>
           </w:p>
         </w:tc>
@@ -5380,7 +5493,7 @@
                 <w:sz w:val="17"/>
                 <w:szCs w:val="17"/>
               </w:rPr>
-              <w:t xml:space="preserve">10487 octets relus à l'identique ; inversion d'un octet en position 5243 détectée</w:t>
+              <w:t xml:space="preserve">10485 octets relus à l'identique ; inversion d'un octet en position 5242 détectée</w:t>
             </w:r>
           </w:p>
         </w:tc>
@@ -5419,7 +5532,7 @@
                 <w:sz w:val="14"/>
                 <w:szCs w:val="14"/>
               </w:rPr>
-              <w:t xml:space="preserve">55 ms</w:t>
+              <w:t xml:space="preserve">59 ms</w:t>
             </w:r>
           </w:p>
         </w:tc>
@@ -5561,7 +5674,7 @@
                 <w:sz w:val="14"/>
                 <w:szCs w:val="14"/>
               </w:rPr>
-              <w:t xml:space="preserve">51 ms</w:t>
+              <w:t xml:space="preserve">59 ms</w:t>
             </w:r>
           </w:p>
         </w:tc>
@@ -5703,7 +5816,7 @@
                 <w:sz w:val="14"/>
                 <w:szCs w:val="14"/>
               </w:rPr>
-              <w:t xml:space="preserve">51 ms</w:t>
+              <w:t xml:space="preserve">54 ms</w:t>
             </w:r>
           </w:p>
         </w:tc>
@@ -5845,7 +5958,7 @@
                 <w:sz w:val="14"/>
                 <w:szCs w:val="14"/>
               </w:rPr>
-              <w:t xml:space="preserve">74 ms</w:t>
+              <w:t xml:space="preserve">83 ms</w:t>
             </w:r>
           </w:p>
         </w:tc>
@@ -5987,7 +6100,7 @@
                 <w:sz w:val="14"/>
                 <w:szCs w:val="14"/>
               </w:rPr>
-              <w:t xml:space="preserve">76 ms</w:t>
+              <w:t xml:space="preserve">87 ms</w:t>
             </w:r>
           </w:p>
         </w:tc>
@@ -6129,7 +6242,7 @@
                 <w:sz w:val="14"/>
                 <w:szCs w:val="14"/>
               </w:rPr>
-              <w:t xml:space="preserve">74 ms</w:t>
+              <w:t xml:space="preserve">77 ms</w:t>
             </w:r>
           </w:p>
         </w:tc>
@@ -6271,7 +6384,7 @@
                 <w:sz w:val="14"/>
                 <w:szCs w:val="14"/>
               </w:rPr>
-              <w:t xml:space="preserve">24 ms</w:t>
+              <w:t xml:space="preserve">28 ms</w:t>
             </w:r>
           </w:p>
         </w:tc>
@@ -6413,7 +6526,7 @@
                 <w:sz w:val="14"/>
                 <w:szCs w:val="14"/>
               </w:rPr>
-              <w:t xml:space="preserve">28 ms</w:t>
+              <w:t xml:space="preserve">29 ms</w:t>
             </w:r>
           </w:p>
         </w:tc>
@@ -6839,7 +6952,7 @@
                 <w:sz w:val="14"/>
                 <w:szCs w:val="14"/>
               </w:rPr>
-              <w:t xml:space="preserve">340 ms</w:t>
+              <w:t xml:space="preserve">376 ms</w:t>
             </w:r>
           </w:p>
         </w:tc>
@@ -6942,7 +7055,7 @@
                 <w:sz w:val="17"/>
                 <w:szCs w:val="17"/>
               </w:rPr>
-              <w:t xml:space="preserve">13 enregistrement(s) archivé(s), 29 fichier(s) couverts par empreintes.sha256, 0 écart ; ancre fcee04af2ca384b8… ; octets du gel restitués à l'identique ; altération d'un octet détectée et signalée ALTÉRÉ, fichier conservé dans l'archive</w:t>
+              <w:t xml:space="preserve">13 enregistrement(s) archivé(s), 29 fichier(s) couverts par empreintes.sha256, 0 écart ; ancre 19cd40eb9e3b206c… ; octets du gel restitués à l'identique ; altération d'un octet détectée et signalée ALTÉRÉ, fichier conservé dans l'archive</w:t>
             </w:r>
           </w:p>
         </w:tc>
@@ -6981,7 +7094,7 @@
                 <w:sz w:val="14"/>
                 <w:szCs w:val="14"/>
               </w:rPr>
-              <w:t xml:space="preserve">235 ms</w:t>
+              <w:t xml:space="preserve">277 ms</w:t>
             </w:r>
           </w:p>
         </w:tc>
@@ -7123,7 +7236,7 @@
                 <w:sz w:val="14"/>
                 <w:szCs w:val="14"/>
               </w:rPr>
-              <w:t xml:space="preserve">14 ms</w:t>
+              <w:t xml:space="preserve">16 ms</w:t>
             </w:r>
           </w:p>
         </w:tc>
@@ -7265,7 +7378,7 @@
                 <w:sz w:val="14"/>
                 <w:szCs w:val="14"/>
               </w:rPr>
-              <w:t xml:space="preserve">135 ms</w:t>
+              <w:t xml:space="preserve">196 ms</w:t>
             </w:r>
           </w:p>
         </w:tc>
@@ -7407,7 +7520,7 @@
                 <w:sz w:val="14"/>
                 <w:szCs w:val="14"/>
               </w:rPr>
-              <w:t xml:space="preserve">142 ms</w:t>
+              <w:t xml:space="preserve">215 ms</w:t>
             </w:r>
           </w:p>
         </w:tc>
@@ -7833,7 +7946,7 @@
                 <w:sz w:val="14"/>
                 <w:szCs w:val="14"/>
               </w:rPr>
-              <w:t xml:space="preserve">23 ms</w:t>
+              <w:t xml:space="preserve">31 ms</w:t>
             </w:r>
           </w:p>
         </w:tc>
@@ -7936,7 +8049,7 @@
                 <w:sz w:val="17"/>
                 <w:szCs w:val="17"/>
               </w:rPr>
-              <w:t xml:space="preserve">176 fichier(s) source relus, aucune écriture dans la piste hors du module ; 9 empreintes comparées entre l'implémentation TypeScript et le miroir de la console serveur, toutes identiques</w:t>
+              <w:t xml:space="preserve">177 fichier(s) source relus, aucune écriture dans la piste hors du module ; 9 empreintes comparées entre l'implémentation TypeScript et le miroir de la console serveur, toutes identiques</w:t>
             </w:r>
           </w:p>
         </w:tc>
@@ -7975,7 +8088,7 @@
                 <w:sz w:val="14"/>
                 <w:szCs w:val="14"/>
               </w:rPr>
-              <w:t xml:space="preserve">23 ms</w:t>
+              <w:t xml:space="preserve">32 ms</w:t>
             </w:r>
           </w:p>
         </w:tc>
@@ -8117,7 +8230,7 @@
                 <w:sz w:val="14"/>
                 <w:szCs w:val="14"/>
               </w:rPr>
-              <w:t xml:space="preserve">0 ms</w:t>
+              <w:t xml:space="preserve">1 ms</w:t>
             </w:r>
           </w:p>
         </w:tc>
@@ -8259,7 +8372,7 @@
                 <w:sz w:val="14"/>
                 <w:szCs w:val="14"/>
               </w:rPr>
-              <w:t xml:space="preserve">8 ms</w:t>
+              <w:t xml:space="preserve">9 ms</w:t>
             </w:r>
           </w:p>
         </w:tc>
@@ -8401,7 +8514,7 @@
                 <w:sz w:val="14"/>
                 <w:szCs w:val="14"/>
               </w:rPr>
-              <w:t xml:space="preserve">229 ms</w:t>
+              <w:t xml:space="preserve">282 ms</w:t>
             </w:r>
           </w:p>
         </w:tc>
@@ -8504,7 +8617,7 @@
                 <w:sz w:val="17"/>
                 <w:szCs w:val="17"/>
               </w:rPr>
-              <w:t xml:space="preserve">176 fichier(s) source relus : aucune écriture de mot de passe hors des chemins autorisés ; une seule écriture dans les actions serveur, le changement personnel, qui exige l'ancien mot de passe ; l'outil d'urgence de la console émet un jeton et ne sait plus dériver de mot de passe ; aucun champ de mot de passe hors des 6 écrans où l'on saisit le sien</w:t>
+              <w:t xml:space="preserve">177 fichier(s) source relus : aucune écriture de mot de passe hors des chemins autorisés ; une seule écriture dans les actions serveur, le changement personnel, qui exige l'ancien mot de passe ; l'outil d'urgence de la console émet un jeton et ne sait plus dériver de mot de passe ; aucun champ de mot de passe hors des 6 écrans où l'on saisit le sien</w:t>
             </w:r>
           </w:p>
         </w:tc>
@@ -8543,7 +8656,149 @@
                 <w:sz w:val="14"/>
                 <w:szCs w:val="14"/>
               </w:rPr>
-              <w:t xml:space="preserve">26 ms</w:t>
+              <w:t xml:space="preserve">36 ms</w:t>
+            </w:r>
+          </w:p>
+        </w:tc>
+      </w:tr>
+      <w:tr>
+        <w:tc>
+          <w:tcPr>
+            <w:tcW w:type="pct" w:w="13%"/>
+            <w:shd w:fill="F8FAFC"/>
+            <w:tcMar>
+              <w:top w:type="dxa" w:w="80"/>
+              <w:left w:type="dxa" w:w="110"/>
+              <w:bottom w:type="dxa" w:w="80"/>
+              <w:right w:type="dxa" w:w="110"/>
+            </w:tcMar>
+          </w:tcPr>
+          <w:p>
+            <w:pPr>
+              <w:spacing w:after="50"/>
+            </w:pPr>
+            <w:r>
+              <w:rPr>
+                <w:b/>
+                <w:bCs/>
+                <w:color w:val="4338CA"/>
+                <w:sz w:val="17"/>
+                <w:szCs w:val="17"/>
+              </w:rPr>
+              <w:t xml:space="preserve">OQ-29</w:t>
+            </w:r>
+          </w:p>
+          <w:p>
+            <w:pPr>
+              <w:spacing w:after="0"/>
+            </w:pPr>
+            <w:r>
+              <w:rPr>
+                <w:color w:val="475569"/>
+                <w:sz w:val="15"/>
+                <w:szCs w:val="15"/>
+              </w:rPr>
+              <w:t xml:space="preserve">URS-32</w:t>
+            </w:r>
+          </w:p>
+        </w:tc>
+        <w:tc>
+          <w:tcPr>
+            <w:tcW w:type="pct" w:w="30%"/>
+            <w:tcMar>
+              <w:top w:type="dxa" w:w="80"/>
+              <w:left w:type="dxa" w:w="110"/>
+              <w:bottom w:type="dxa" w:w="80"/>
+              <w:right w:type="dxa" w:w="110"/>
+            </w:tcMar>
+          </w:tcPr>
+          <w:p>
+            <w:pPr>
+              <w:spacing w:after="50"/>
+            </w:pPr>
+            <w:r>
+              <w:rPr>
+                <w:b/>
+                <w:bCs/>
+                <w:sz w:val="17"/>
+                <w:szCs w:val="17"/>
+              </w:rPr>
+              <w:t xml:space="preserve">L'image livrée démarre, s'amorce, et ne divulgue rien</w:t>
+            </w:r>
+          </w:p>
+          <w:p>
+            <w:pPr>
+              <w:spacing w:after="0"/>
+            </w:pPr>
+            <w:r>
+              <w:rPr>
+                <w:color w:val="475569"/>
+                <w:sz w:val="15"/>
+                <w:szCs w:val="15"/>
+              </w:rPr>
+              <w:t xml:space="preserve">Démarrer un conteneur depuis l'image réellement construite, sur des volumes vierges, et vérifier dans SON journal et par SES réponses HTTP que l'installation aboutit — au lieu de le déduire du code source, qui ne dit rien de ce que l'image contient.</w:t>
+            </w:r>
+          </w:p>
+        </w:tc>
+        <w:tc>
+          <w:tcPr>
+            <w:tcW w:type="pct" w:w="45%"/>
+            <w:tcMar>
+              <w:top w:type="dxa" w:w="80"/>
+              <w:left w:type="dxa" w:w="110"/>
+              <w:bottom w:type="dxa" w:w="80"/>
+              <w:right w:type="dxa" w:w="110"/>
+            </w:tcMar>
+          </w:tcPr>
+          <w:p>
+            <w:pPr>
+              <w:spacing w:after="0"/>
+            </w:pPr>
+            <w:r>
+              <w:rPr>
+                <w:sz w:val="17"/>
+                <w:szCs w:val="17"/>
+              </w:rPr>
+              <w:t xml:space="preserve">image filum:latest démarrée sur volumes vierges, conteneur SAIN ; migrations appliquées, chaîne de piste d'audit intacte, organisation, programme, compte administrateur et bibliothèque de normes créés ; version 1.2.0 annoncée au journal ET portée par /app/VERSION ; /login répond 200 ; une route protégée rend l'écran de connexion (10431 octets) sans divulguer ni le nom de l'organisation ni celui du programme</w:t>
+            </w:r>
+          </w:p>
+        </w:tc>
+        <w:tc>
+          <w:tcPr>
+            <w:tcW w:type="pct" w:w="12%"/>
+            <w:tcMar>
+              <w:top w:type="dxa" w:w="80"/>
+              <w:left w:type="dxa" w:w="110"/>
+              <w:bottom w:type="dxa" w:w="80"/>
+              <w:right w:type="dxa" w:w="110"/>
+            </w:tcMar>
+          </w:tcPr>
+          <w:p>
+            <w:pPr>
+              <w:spacing w:after="40"/>
+            </w:pPr>
+            <w:r>
+              <w:rPr>
+                <w:b/>
+                <w:bCs/>
+                <w:color w:val="047857"/>
+                <w:sz w:val="17"/>
+                <w:szCs w:val="17"/>
+              </w:rPr>
+              <w:t xml:space="preserve">Conforme</w:t>
+            </w:r>
+          </w:p>
+          <w:p>
+            <w:pPr>
+              <w:spacing w:after="0"/>
+            </w:pPr>
+            <w:r>
+              <w:rPr>
+                <w:color w:val="475569"/>
+                <w:sz w:val="14"/>
+                <w:szCs w:val="14"/>
+              </w:rPr>
+              <w:t xml:space="preserve">9260 ms</w:t>
             </w:r>
           </w:p>
         </w:tc>
@@ -11054,6 +11309,83 @@
           </w:p>
         </w:tc>
       </w:tr>
+      <w:tr>
+        <w:tc>
+          <w:tcPr>
+            <w:tcW w:type="pct" w:w="12%"/>
+            <w:tcMar>
+              <w:top w:type="dxa" w:w="80"/>
+              <w:left w:type="dxa" w:w="110"/>
+              <w:bottom w:type="dxa" w:w="80"/>
+              <w:right w:type="dxa" w:w="110"/>
+            </w:tcMar>
+          </w:tcPr>
+          <w:p>
+            <w:pPr>
+              <w:spacing w:after="0"/>
+            </w:pPr>
+            <w:r>
+              <w:rPr>
+                <w:b/>
+                <w:bCs/>
+                <w:color w:val="4338CA"/>
+                <w:sz w:val="17"/>
+                <w:szCs w:val="17"/>
+              </w:rPr>
+              <w:t xml:space="preserve">URS-32</w:t>
+            </w:r>
+          </w:p>
+        </w:tc>
+        <w:tc>
+          <w:tcPr>
+            <w:tcW w:type="pct" w:w="22%"/>
+            <w:tcMar>
+              <w:top w:type="dxa" w:w="80"/>
+              <w:left w:type="dxa" w:w="110"/>
+              <w:bottom w:type="dxa" w:w="80"/>
+              <w:right w:type="dxa" w:w="110"/>
+            </w:tcMar>
+          </w:tcPr>
+          <w:p>
+            <w:pPr>
+              <w:spacing w:after="0"/>
+            </w:pPr>
+            <w:r>
+              <w:rPr>
+                <w:b/>
+                <w:bCs/>
+                <w:color w:val="047857"/>
+                <w:sz w:val="17"/>
+                <w:szCs w:val="17"/>
+              </w:rPr>
+              <w:t xml:space="preserve">OQ-29</w:t>
+            </w:r>
+          </w:p>
+        </w:tc>
+        <w:tc>
+          <w:tcPr>
+            <w:tcW w:type="pct" w:w="66%"/>
+            <w:tcMar>
+              <w:top w:type="dxa" w:w="80"/>
+              <w:left w:type="dxa" w:w="110"/>
+              <w:bottom w:type="dxa" w:w="80"/>
+              <w:right w:type="dxa" w:w="110"/>
+            </w:tcMar>
+          </w:tcPr>
+          <w:p>
+            <w:pPr>
+              <w:spacing w:after="0"/>
+            </w:pPr>
+            <w:r>
+              <w:rPr>
+                <w:sz w:val="17"/>
+                <w:szCs w:val="17"/>
+              </w:rPr>
+              <w:t xml:space="preserve">Cas de test automatisé exécuté par l'éditeur à chaque version, résultat en section 5.1.</w:t>
+            </w:r>
+          </w:p>
+        </w:tc>
+      </w:tr>
     </w:tbl>
     <w:p>
       <w:pPr>
@@ -11073,7 +11405,7 @@
           <w:sz w:val="20"/>
           <w:szCs w:val="20"/>
         </w:rPr>
-        <w:t xml:space="preserve">Sur les 31 exigences, 27 sont vérifiées automatiquement par l'éditeur et 4 doivent l'être chez vous. Ce n'est pas un partage arbitraire : ces 4 exigences ne sont pas observables sans navigateur, sans requête HTTP ou sans votre infrastructure. Les compter comme couvertes serait une affirmation invérifiable.</w:t>
+        <w:t xml:space="preserve">Sur les 32 exigences, 28 sont vérifiées automatiquement par l'éditeur et 4 doivent l'être chez vous. Ce n'est pas un partage arbitraire : ces 4 exigences ne sont pas observables sans navigateur, sans requête HTTP ou sans votre infrastructure. Les compter comme couvertes serait une affirmation invérifiable.</w:t>
       </w:r>
     </w:p>
     <w:p>
@@ -11413,7 +11745,7 @@
         <w:sz w:val="15"/>
         <w:szCs w:val="15"/>
       </w:rPr>
-      <w:t xml:space="preserve">   ·   Version 1.2.0 · rapport OQ exécuté le 5 août 2026 à 09:21 UTC</w:t>
+      <w:t xml:space="preserve">   ·   Version 1.2.0 · rapport OQ exécuté le 5 août 2026 à 10:08 UTC</w:t>
     </w:r>
   </w:p>
 </w:ftr>

</xml_diff>

<commit_message>
Documents de la version 1.2.1
Co-Authored-By: Claude Opus 5 <noreply@anthropic.com>
</commit_message>
<xml_diff>
--- a/docs/Dossier_de_validation_Filum.docx
+++ b/docs/Dossier_de_validation_Filum.docx
@@ -65,7 +65,7 @@
           <w:sz w:val="20"/>
           <w:szCs w:val="20"/>
         </w:rPr>
-        <w:t xml:space="preserve">Ce dossier documente la validation du logiciel Filum version 1.2.0 par son éditeur. Il est destiné à votre responsable qualité et peut être joint tel quel à votre dossier de qualification.</w:t>
+        <w:t xml:space="preserve">Ce dossier documente la validation du logiciel Filum version 1.2.1 par son éditeur. Il est destiné à votre responsable qualité et peut être joint tel quel à votre dossier de qualification.</w:t>
       </w:r>
     </w:p>
     <w:p>
@@ -4343,7 +4343,7 @@
                 <w:sz w:val="17"/>
                 <w:szCs w:val="17"/>
               </w:rPr>
-              <w:t xml:space="preserve">5 août 2026 à 10:08</w:t>
+              <w:t xml:space="preserve">5 août 2026 à 15:30</w:t>
             </w:r>
           </w:p>
         </w:tc>
@@ -4393,7 +4393,7 @@
                 <w:sz w:val="17"/>
                 <w:szCs w:val="17"/>
               </w:rPr>
-              <w:t xml:space="preserve">1.2.0</w:t>
+              <w:t xml:space="preserve">1.2.1</w:t>
             </w:r>
           </w:p>
         </w:tc>
@@ -4925,7 +4925,7 @@
                 <w:sz w:val="17"/>
                 <w:szCs w:val="17"/>
               </w:rPr>
-              <w:t xml:space="preserve">empreintes distinctes pour un même mot de passe (671e86ccff16… ≠ 075a3cac89f9…), vérification correcte, mot de passe faux et vide refusés</w:t>
+              <w:t xml:space="preserve">empreintes distinctes pour un même mot de passe (8bf65513b5a3… ≠ 8d19642f74c6…), vérification correcte, mot de passe faux et vide refusés</w:t>
             </w:r>
           </w:p>
         </w:tc>
@@ -4964,7 +4964,7 @@
                 <w:sz w:val="14"/>
                 <w:szCs w:val="14"/>
               </w:rPr>
-              <w:t xml:space="preserve">159 ms</w:t>
+              <w:t xml:space="preserve">154 ms</w:t>
             </w:r>
           </w:p>
         </w:tc>
@@ -5106,7 +5106,7 @@
                 <w:sz w:val="14"/>
                 <w:szCs w:val="14"/>
               </w:rPr>
-              <w:t xml:space="preserve">16 ms</w:t>
+              <w:t xml:space="preserve">15 ms</w:t>
             </w:r>
           </w:p>
         </w:tc>
@@ -5248,7 +5248,7 @@
                 <w:sz w:val="14"/>
                 <w:szCs w:val="14"/>
               </w:rPr>
-              <w:t xml:space="preserve">123 ms</w:t>
+              <w:t xml:space="preserve">118 ms</w:t>
             </w:r>
           </w:p>
         </w:tc>
@@ -5351,7 +5351,7 @@
                 <w:sz w:val="17"/>
                 <w:szCs w:val="17"/>
               </w:rPr>
-              <w:t xml:space="preserve">signature liée à l'instantané cmsfxcn8…, empreinte attestée 3767 CD80 ACC9, manifestation « Testeur QA1 (QA1) · Approuvé · 05/08/2026 10:08:45 UTC · enregistrement 3767 CD80 ACC9 »</w:t>
+              <w:t xml:space="preserve">signature liée à l'instantané cmsg8trr…, empreinte attestée 3767 CD80 ACC9, manifestation « Testeur QA1 (QA1) · Approuvé · 05/08/2026 15:30:00 UTC · enregistrement 3767 CD80 ACC9 »</w:t>
             </w:r>
           </w:p>
         </w:tc>
@@ -5390,7 +5390,7 @@
                 <w:sz w:val="14"/>
                 <w:szCs w:val="14"/>
               </w:rPr>
-              <w:t xml:space="preserve">50 ms</w:t>
+              <w:t xml:space="preserve">46 ms</w:t>
             </w:r>
           </w:p>
         </w:tc>
@@ -5532,7 +5532,7 @@
                 <w:sz w:val="14"/>
                 <w:szCs w:val="14"/>
               </w:rPr>
-              <w:t xml:space="preserve">59 ms</w:t>
+              <w:t xml:space="preserve">54 ms</w:t>
             </w:r>
           </w:p>
         </w:tc>
@@ -5816,7 +5816,7 @@
                 <w:sz w:val="14"/>
                 <w:szCs w:val="14"/>
               </w:rPr>
-              <w:t xml:space="preserve">54 ms</w:t>
+              <w:t xml:space="preserve">51 ms</w:t>
             </w:r>
           </w:p>
         </w:tc>
@@ -5958,7 +5958,7 @@
                 <w:sz w:val="14"/>
                 <w:szCs w:val="14"/>
               </w:rPr>
-              <w:t xml:space="preserve">83 ms</w:t>
+              <w:t xml:space="preserve">79 ms</w:t>
             </w:r>
           </w:p>
         </w:tc>
@@ -6061,7 +6061,7 @@
                 <w:sz w:val="17"/>
                 <w:szCs w:val="17"/>
               </w:rPr>
-              <w:t xml:space="preserve">2 instantanés conservés : le gel de revue reste lisible (10496 o, dépassé), l'enregistrement approuvé porte la même empreinte de contenu</w:t>
+              <w:t xml:space="preserve">2 instantanés conservés : le gel de revue reste lisible (10495 o, dépassé), l'enregistrement approuvé porte la même empreinte de contenu</w:t>
             </w:r>
           </w:p>
         </w:tc>
@@ -6100,7 +6100,7 @@
                 <w:sz w:val="14"/>
                 <w:szCs w:val="14"/>
               </w:rPr>
-              <w:t xml:space="preserve">87 ms</w:t>
+              <w:t xml:space="preserve">83 ms</w:t>
             </w:r>
           </w:p>
         </w:tc>
@@ -6242,7 +6242,7 @@
                 <w:sz w:val="14"/>
                 <w:szCs w:val="14"/>
               </w:rPr>
-              <w:t xml:space="preserve">77 ms</w:t>
+              <w:t xml:space="preserve">76 ms</w:t>
             </w:r>
           </w:p>
         </w:tc>
@@ -6384,7 +6384,7 @@
                 <w:sz w:val="14"/>
                 <w:szCs w:val="14"/>
               </w:rPr>
-              <w:t xml:space="preserve">28 ms</w:t>
+              <w:t xml:space="preserve">25 ms</w:t>
             </w:r>
           </w:p>
         </w:tc>
@@ -6526,7 +6526,7 @@
                 <w:sz w:val="14"/>
                 <w:szCs w:val="14"/>
               </w:rPr>
-              <w:t xml:space="preserve">29 ms</w:t>
+              <w:t xml:space="preserve">26 ms</w:t>
             </w:r>
           </w:p>
         </w:tc>
@@ -6952,7 +6952,7 @@
                 <w:sz w:val="14"/>
                 <w:szCs w:val="14"/>
               </w:rPr>
-              <w:t xml:space="preserve">376 ms</w:t>
+              <w:t xml:space="preserve">341 ms</w:t>
             </w:r>
           </w:p>
         </w:tc>
@@ -7055,7 +7055,7 @@
                 <w:sz w:val="17"/>
                 <w:szCs w:val="17"/>
               </w:rPr>
-              <w:t xml:space="preserve">13 enregistrement(s) archivé(s), 29 fichier(s) couverts par empreintes.sha256, 0 écart ; ancre 19cd40eb9e3b206c… ; octets du gel restitués à l'identique ; altération d'un octet détectée et signalée ALTÉRÉ, fichier conservé dans l'archive</w:t>
+              <w:t xml:space="preserve">13 enregistrement(s) archivé(s), 29 fichier(s) couverts par empreintes.sha256, 0 écart ; ancre a5ce45fb4f9e98cf… ; octets du gel restitués à l'identique ; altération d'un octet détectée et signalée ALTÉRÉ, fichier conservé dans l'archive</w:t>
             </w:r>
           </w:p>
         </w:tc>
@@ -7094,7 +7094,7 @@
                 <w:sz w:val="14"/>
                 <w:szCs w:val="14"/>
               </w:rPr>
-              <w:t xml:space="preserve">277 ms</w:t>
+              <w:t xml:space="preserve">256 ms</w:t>
             </w:r>
           </w:p>
         </w:tc>
@@ -7236,7 +7236,7 @@
                 <w:sz w:val="14"/>
                 <w:szCs w:val="14"/>
               </w:rPr>
-              <w:t xml:space="preserve">16 ms</w:t>
+              <w:t xml:space="preserve">15 ms</w:t>
             </w:r>
           </w:p>
         </w:tc>
@@ -7378,7 +7378,7 @@
                 <w:sz w:val="14"/>
                 <w:szCs w:val="14"/>
               </w:rPr>
-              <w:t xml:space="preserve">196 ms</w:t>
+              <w:t xml:space="preserve">138 ms</w:t>
             </w:r>
           </w:p>
         </w:tc>
@@ -7520,7 +7520,7 @@
                 <w:sz w:val="14"/>
                 <w:szCs w:val="14"/>
               </w:rPr>
-              <w:t xml:space="preserve">215 ms</w:t>
+              <w:t xml:space="preserve">214 ms</w:t>
             </w:r>
           </w:p>
         </w:tc>
@@ -8049,7 +8049,7 @@
                 <w:sz w:val="17"/>
                 <w:szCs w:val="17"/>
               </w:rPr>
-              <w:t xml:space="preserve">177 fichier(s) source relus, aucune écriture dans la piste hors du module ; 9 empreintes comparées entre l'implémentation TypeScript et le miroir de la console serveur, toutes identiques</w:t>
+              <w:t xml:space="preserve">179 fichier(s) source relus, aucune écriture dans la piste hors du module ; 9 empreintes comparées entre l'implémentation TypeScript et le miroir de la console serveur, toutes identiques</w:t>
             </w:r>
           </w:p>
         </w:tc>
@@ -8230,7 +8230,7 @@
                 <w:sz w:val="14"/>
                 <w:szCs w:val="14"/>
               </w:rPr>
-              <w:t xml:space="preserve">1 ms</w:t>
+              <w:t xml:space="preserve">0 ms</w:t>
             </w:r>
           </w:p>
         </w:tc>
@@ -8514,7 +8514,7 @@
                 <w:sz w:val="14"/>
                 <w:szCs w:val="14"/>
               </w:rPr>
-              <w:t xml:space="preserve">282 ms</w:t>
+              <w:t xml:space="preserve">346 ms</w:t>
             </w:r>
           </w:p>
         </w:tc>
@@ -8617,7 +8617,7 @@
                 <w:sz w:val="17"/>
                 <w:szCs w:val="17"/>
               </w:rPr>
-              <w:t xml:space="preserve">177 fichier(s) source relus : aucune écriture de mot de passe hors des chemins autorisés ; une seule écriture dans les actions serveur, le changement personnel, qui exige l'ancien mot de passe ; l'outil d'urgence de la console émet un jeton et ne sait plus dériver de mot de passe ; aucun champ de mot de passe hors des 6 écrans où l'on saisit le sien</w:t>
+              <w:t xml:space="preserve">179 fichier(s) source relus : aucune écriture de mot de passe hors des chemins autorisés ; une seule écriture dans les actions serveur, le changement personnel, qui exige l'ancien mot de passe ; l'outil d'urgence de la console émet un jeton et ne sait plus dériver de mot de passe ; aucun champ de mot de passe hors des 6 écrans où l'on saisit le sien</w:t>
             </w:r>
           </w:p>
         </w:tc>
@@ -8656,7 +8656,7 @@
                 <w:sz w:val="14"/>
                 <w:szCs w:val="14"/>
               </w:rPr>
-              <w:t xml:space="preserve">36 ms</w:t>
+              <w:t xml:space="preserve">39 ms</w:t>
             </w:r>
           </w:p>
         </w:tc>
@@ -8759,7 +8759,7 @@
                 <w:sz w:val="17"/>
                 <w:szCs w:val="17"/>
               </w:rPr>
-              <w:t xml:space="preserve">image filum:latest démarrée sur volumes vierges, conteneur SAIN ; migrations appliquées, chaîne de piste d'audit intacte, organisation, programme, compte administrateur et bibliothèque de normes créés ; version 1.2.0 annoncée au journal ET portée par /app/VERSION ; /login répond 200 ; une route protégée rend l'écran de connexion (10431 octets) sans divulguer ni le nom de l'organisation ni celui du programme</w:t>
+              <w:t xml:space="preserve">image filum:latest démarrée sur volumes vierges, conteneur SAIN ; migrations appliquées, chaîne de piste d'audit intacte, organisation, programme, compte administrateur et bibliothèque de normes créés ; version 1.2.1 annoncée au journal ET portée par /app/VERSION ; /login répond 200 ; une route protégée rend l'écran de connexion (10431 octets) sans divulguer ni le nom de l'organisation ni celui du programme</w:t>
             </w:r>
           </w:p>
         </w:tc>
@@ -8798,7 +8798,7 @@
                 <w:sz w:val="14"/>
                 <w:szCs w:val="14"/>
               </w:rPr>
-              <w:t xml:space="preserve">9260 ms</w:t>
+              <w:t xml:space="preserve">9281 ms</w:t>
             </w:r>
           </w:p>
         </w:tc>
@@ -11745,7 +11745,7 @@
         <w:sz w:val="15"/>
         <w:szCs w:val="15"/>
       </w:rPr>
-      <w:t xml:space="preserve">   ·   Version 1.2.0 · rapport OQ exécuté le 5 août 2026 à 10:08 UTC</w:t>
+      <w:t xml:space="preserve">   ·   Version 1.2.1 · rapport OQ exécuté le 5 août 2026 à 15:30 UTC</w:t>
     </w:r>
   </w:p>
 </w:ftr>

</xml_diff>

<commit_message>
Note de correspondance Annexe 11 · six documents anglais qui étaient périmés
La note Annexe 11 (FR + EN) rejoint les téléchargements : 14 chapitres du
projet du 7 juillet 2025, en disant d'emblée que l'Annexe 11 ne vise pas le
dispositif médical et qu'aucune conformité n'est revendiquée.

Les autres documents changent parce que l'audit de fraîcheur ne régénérait
que les versions françaises : les anglaises et les deux manuels passaient
pour à jour sans jamais être produits. La matrice Part 11 anglaise, servie
depuis ce site, annonçait « 31 exigences, 28 cas » quand la française en
comptait 32 et 29.

Co-Authored-By: Claude Opus 5 <noreply@anthropic.com>
</commit_message>
<xml_diff>
--- a/docs/Dossier_de_validation_Filum.docx
+++ b/docs/Dossier_de_validation_Filum.docx
@@ -4343,7 +4343,7 @@
                 <w:sz w:val="17"/>
                 <w:szCs w:val="17"/>
               </w:rPr>
-              <w:t xml:space="preserve">5 août 2026 à 15:30</w:t>
+              <w:t xml:space="preserve">5 août 2026 à 18:25</w:t>
             </w:r>
           </w:p>
         </w:tc>
@@ -4925,7 +4925,7 @@
                 <w:sz w:val="17"/>
                 <w:szCs w:val="17"/>
               </w:rPr>
-              <w:t xml:space="preserve">empreintes distinctes pour un même mot de passe (8bf65513b5a3… ≠ 8d19642f74c6…), vérification correcte, mot de passe faux et vide refusés</w:t>
+              <w:t xml:space="preserve">empreintes distinctes pour un même mot de passe (c6111623e1bd… ≠ 426d44bed6e9…), vérification correcte, mot de passe faux et vide refusés</w:t>
             </w:r>
           </w:p>
         </w:tc>
@@ -4964,7 +4964,7 @@
                 <w:sz w:val="14"/>
                 <w:szCs w:val="14"/>
               </w:rPr>
-              <w:t xml:space="preserve">154 ms</w:t>
+              <w:t xml:space="preserve">146 ms</w:t>
             </w:r>
           </w:p>
         </w:tc>
@@ -5106,7 +5106,7 @@
                 <w:sz w:val="14"/>
                 <w:szCs w:val="14"/>
               </w:rPr>
-              <w:t xml:space="preserve">15 ms</w:t>
+              <w:t xml:space="preserve">13 ms</w:t>
             </w:r>
           </w:p>
         </w:tc>
@@ -5209,7 +5209,7 @@
                 <w:sz w:val="17"/>
                 <w:szCs w:val="17"/>
               </w:rPr>
-              <w:t xml:space="preserve">contenu gelé, empreinte 24604eb157d7fa54…, 10484 octets conservés, opération journalisée</w:t>
+              <w:t xml:space="preserve">contenu gelé, empreinte 24604eb157d7fa54…, 10487 octets conservés, opération journalisée</w:t>
             </w:r>
           </w:p>
         </w:tc>
@@ -5248,7 +5248,7 @@
                 <w:sz w:val="14"/>
                 <w:szCs w:val="14"/>
               </w:rPr>
-              <w:t xml:space="preserve">118 ms</w:t>
+              <w:t xml:space="preserve">120 ms</w:t>
             </w:r>
           </w:p>
         </w:tc>
@@ -5351,7 +5351,7 @@
                 <w:sz w:val="17"/>
                 <w:szCs w:val="17"/>
               </w:rPr>
-              <w:t xml:space="preserve">signature liée à l'instantané cmsg8trr…, empreinte attestée 3767 CD80 ACC9, manifestation « Testeur QA1 (QA1) · Approuvé · 05/08/2026 15:30:00 UTC · enregistrement 3767 CD80 ACC9 »</w:t>
+              <w:t xml:space="preserve">signature liée à l'instantané cmsgf3r8…, empreinte attestée 3767 CD80 ACC9, manifestation « Testeur QA1 (QA1) · Approuvé · 05/08/2026 18:25:43 UTC · enregistrement 3767 CD80 ACC9 »</w:t>
             </w:r>
           </w:p>
         </w:tc>
@@ -5390,7 +5390,7 @@
                 <w:sz w:val="14"/>
                 <w:szCs w:val="14"/>
               </w:rPr>
-              <w:t xml:space="preserve">46 ms</w:t>
+              <w:t xml:space="preserve">47 ms</w:t>
             </w:r>
           </w:p>
         </w:tc>
@@ -5493,7 +5493,7 @@
                 <w:sz w:val="17"/>
                 <w:szCs w:val="17"/>
               </w:rPr>
-              <w:t xml:space="preserve">10485 octets relus à l'identique ; inversion d'un octet en position 5242 détectée</w:t>
+              <w:t xml:space="preserve">10488 octets relus à l'identique ; inversion d'un octet en position 5244 détectée</w:t>
             </w:r>
           </w:p>
         </w:tc>
@@ -5674,7 +5674,7 @@
                 <w:sz w:val="14"/>
                 <w:szCs w:val="14"/>
               </w:rPr>
-              <w:t xml:space="preserve">59 ms</w:t>
+              <w:t xml:space="preserve">69 ms</w:t>
             </w:r>
           </w:p>
         </w:tc>
@@ -5816,7 +5816,7 @@
                 <w:sz w:val="14"/>
                 <w:szCs w:val="14"/>
               </w:rPr>
-              <w:t xml:space="preserve">51 ms</w:t>
+              <w:t xml:space="preserve">50 ms</w:t>
             </w:r>
           </w:p>
         </w:tc>
@@ -5958,7 +5958,7 @@
                 <w:sz w:val="14"/>
                 <w:szCs w:val="14"/>
               </w:rPr>
-              <w:t xml:space="preserve">79 ms</w:t>
+              <w:t xml:space="preserve">75 ms</w:t>
             </w:r>
           </w:p>
         </w:tc>
@@ -6061,7 +6061,7 @@
                 <w:sz w:val="17"/>
                 <w:szCs w:val="17"/>
               </w:rPr>
-              <w:t xml:space="preserve">2 instantanés conservés : le gel de revue reste lisible (10495 o, dépassé), l'enregistrement approuvé porte la même empreinte de contenu</w:t>
+              <w:t xml:space="preserve">2 instantanés conservés : le gel de revue reste lisible (10496 o, dépassé), l'enregistrement approuvé porte la même empreinte de contenu</w:t>
             </w:r>
           </w:p>
         </w:tc>
@@ -6242,7 +6242,7 @@
                 <w:sz w:val="14"/>
                 <w:szCs w:val="14"/>
               </w:rPr>
-              <w:t xml:space="preserve">76 ms</w:t>
+              <w:t xml:space="preserve">74 ms</w:t>
             </w:r>
           </w:p>
         </w:tc>
@@ -6384,7 +6384,7 @@
                 <w:sz w:val="14"/>
                 <w:szCs w:val="14"/>
               </w:rPr>
-              <w:t xml:space="preserve">25 ms</w:t>
+              <w:t xml:space="preserve">23 ms</w:t>
             </w:r>
           </w:p>
         </w:tc>
@@ -6526,7 +6526,7 @@
                 <w:sz w:val="14"/>
                 <w:szCs w:val="14"/>
               </w:rPr>
-              <w:t xml:space="preserve">26 ms</w:t>
+              <w:t xml:space="preserve">29 ms</w:t>
             </w:r>
           </w:p>
         </w:tc>
@@ -6668,7 +6668,7 @@
                 <w:sz w:val="14"/>
                 <w:szCs w:val="14"/>
               </w:rPr>
-              <w:t xml:space="preserve">0 ms</w:t>
+              <w:t xml:space="preserve">1 ms</w:t>
             </w:r>
           </w:p>
         </w:tc>
@@ -6810,7 +6810,7 @@
                 <w:sz w:val="14"/>
                 <w:szCs w:val="14"/>
               </w:rPr>
-              <w:t xml:space="preserve">1 ms</w:t>
+              <w:t xml:space="preserve">0 ms</w:t>
             </w:r>
           </w:p>
         </w:tc>
@@ -6952,7 +6952,7 @@
                 <w:sz w:val="14"/>
                 <w:szCs w:val="14"/>
               </w:rPr>
-              <w:t xml:space="preserve">341 ms</w:t>
+              <w:t xml:space="preserve">338 ms</w:t>
             </w:r>
           </w:p>
         </w:tc>
@@ -7055,7 +7055,7 @@
                 <w:sz w:val="17"/>
                 <w:szCs w:val="17"/>
               </w:rPr>
-              <w:t xml:space="preserve">13 enregistrement(s) archivé(s), 29 fichier(s) couverts par empreintes.sha256, 0 écart ; ancre a5ce45fb4f9e98cf… ; octets du gel restitués à l'identique ; altération d'un octet détectée et signalée ALTÉRÉ, fichier conservé dans l'archive</w:t>
+              <w:t xml:space="preserve">13 enregistrement(s) archivé(s), 29 fichier(s) couverts par empreintes.sha256, 0 écart ; ancre a2da913bf11aa4eb… ; octets du gel restitués à l'identique ; altération d'un octet détectée et signalée ALTÉRÉ, fichier conservé dans l'archive</w:t>
             </w:r>
           </w:p>
         </w:tc>
@@ -7094,7 +7094,7 @@
                 <w:sz w:val="14"/>
                 <w:szCs w:val="14"/>
               </w:rPr>
-              <w:t xml:space="preserve">256 ms</w:t>
+              <w:t xml:space="preserve">230 ms</w:t>
             </w:r>
           </w:p>
         </w:tc>
@@ -7236,7 +7236,7 @@
                 <w:sz w:val="14"/>
                 <w:szCs w:val="14"/>
               </w:rPr>
-              <w:t xml:space="preserve">15 ms</w:t>
+              <w:t xml:space="preserve">13 ms</w:t>
             </w:r>
           </w:p>
         </w:tc>
@@ -7378,7 +7378,7 @@
                 <w:sz w:val="14"/>
                 <w:szCs w:val="14"/>
               </w:rPr>
-              <w:t xml:space="preserve">138 ms</w:t>
+              <w:t xml:space="preserve">162 ms</w:t>
             </w:r>
           </w:p>
         </w:tc>
@@ -7520,7 +7520,7 @@
                 <w:sz w:val="14"/>
                 <w:szCs w:val="14"/>
               </w:rPr>
-              <w:t xml:space="preserve">214 ms</w:t>
+              <w:t xml:space="preserve">170 ms</w:t>
             </w:r>
           </w:p>
         </w:tc>
@@ -7623,7 +7623,7 @@
                 <w:sz w:val="17"/>
                 <w:szCs w:val="17"/>
               </w:rPr>
-              <w:t xml:space="preserve">requête DER de 90 octets portant l'empreinte demandée ; jeton de 2418 octets lu exactement (date 2026-08-03T08:55:03.000Z, série 02, politique 1.3.6.1.4.1.99999.1.1) ; quatre refus obtenus : autre empreinte, autre nonce, réponse de rejet de l'autorité, jeton tronqué</w:t>
+              <w:t xml:space="preserve">requête DER de 89 octets portant l'empreinte demandée ; jeton de 2418 octets lu exactement (date 2026-08-03T08:55:03.000Z, série 02, politique 1.3.6.1.4.1.99999.1.1) ; quatre refus obtenus : autre empreinte, autre nonce, réponse de rejet de l'autorité, jeton tronqué</w:t>
             </w:r>
           </w:p>
         </w:tc>
@@ -7946,7 +7946,7 @@
                 <w:sz w:val="14"/>
                 <w:szCs w:val="14"/>
               </w:rPr>
-              <w:t xml:space="preserve">31 ms</w:t>
+              <w:t xml:space="preserve">26 ms</w:t>
             </w:r>
           </w:p>
         </w:tc>
@@ -8049,7 +8049,7 @@
                 <w:sz w:val="17"/>
                 <w:szCs w:val="17"/>
               </w:rPr>
-              <w:t xml:space="preserve">179 fichier(s) source relus, aucune écriture dans la piste hors du module ; 9 empreintes comparées entre l'implémentation TypeScript et le miroir de la console serveur, toutes identiques</w:t>
+              <w:t xml:space="preserve">184 fichier(s) source relus, aucune écriture dans la piste hors du module ; 9 empreintes comparées entre l'implémentation TypeScript et le miroir de la console serveur, toutes identiques</w:t>
             </w:r>
           </w:p>
         </w:tc>
@@ -8088,7 +8088,7 @@
                 <w:sz w:val="14"/>
                 <w:szCs w:val="14"/>
               </w:rPr>
-              <w:t xml:space="preserve">32 ms</w:t>
+              <w:t xml:space="preserve">24 ms</w:t>
             </w:r>
           </w:p>
         </w:tc>
@@ -8514,7 +8514,7 @@
                 <w:sz w:val="14"/>
                 <w:szCs w:val="14"/>
               </w:rPr>
-              <w:t xml:space="preserve">346 ms</w:t>
+              <w:t xml:space="preserve">240 ms</w:t>
             </w:r>
           </w:p>
         </w:tc>
@@ -8617,7 +8617,7 @@
                 <w:sz w:val="17"/>
                 <w:szCs w:val="17"/>
               </w:rPr>
-              <w:t xml:space="preserve">179 fichier(s) source relus : aucune écriture de mot de passe hors des chemins autorisés ; une seule écriture dans les actions serveur, le changement personnel, qui exige l'ancien mot de passe ; l'outil d'urgence de la console émet un jeton et ne sait plus dériver de mot de passe ; aucun champ de mot de passe hors des 6 écrans où l'on saisit le sien</w:t>
+              <w:t xml:space="preserve">184 fichier(s) source relus : aucune écriture de mot de passe hors des chemins autorisés ; une seule écriture dans les actions serveur, le changement personnel, qui exige l'ancien mot de passe ; l'outil d'urgence de la console émet un jeton et ne sait plus dériver de mot de passe ; aucun champ de mot de passe hors des 6 écrans où l'on saisit le sien</w:t>
             </w:r>
           </w:p>
         </w:tc>
@@ -8656,7 +8656,7 @@
                 <w:sz w:val="14"/>
                 <w:szCs w:val="14"/>
               </w:rPr>
-              <w:t xml:space="preserve">39 ms</w:t>
+              <w:t xml:space="preserve">33 ms</w:t>
             </w:r>
           </w:p>
         </w:tc>
@@ -8798,7 +8798,7 @@
                 <w:sz w:val="14"/>
                 <w:szCs w:val="14"/>
               </w:rPr>
-              <w:t xml:space="preserve">9281 ms</w:t>
+              <w:t xml:space="preserve">8902 ms</w:t>
             </w:r>
           </w:p>
         </w:tc>
@@ -11745,7 +11745,7 @@
         <w:sz w:val="15"/>
         <w:szCs w:val="15"/>
       </w:rPr>
-      <w:t xml:space="preserve">   ·   Version 1.2.1 · rapport OQ exécuté le 5 août 2026 à 15:30 UTC</w:t>
+      <w:t xml:space="preserve">   ·   Version 1.2.1 · rapport OQ exécuté le 5 août 2026 à 18:25 UTC</w:t>
     </w:r>
   </w:p>
 </w:ftr>

</xml_diff>

<commit_message>
Piste d'audit bilingue : 33 exigences, 30 cas
La piste d'audit se lit désormais dans la langue du lecteur — c'était la
seule limite linguistique déclarée dans la note de périmètre. Les documents
téléchargeables la reflètent : la matrice Part 11 (11.10(e)), la note
Annexe 11 et la note de périmètre, dont la limite change de nature plutôt
que de disparaître — les entrées déjà écrites ne se retraduisent pas.

Co-Authored-By: Claude Opus 5 <noreply@anthropic.com>
</commit_message>
<xml_diff>
--- a/docs/Dossier_de_validation_Filum.docx
+++ b/docs/Dossier_de_validation_Filum.docx
@@ -430,7 +430,7 @@
           <w:sz w:val="20"/>
           <w:szCs w:val="20"/>
         </w:rPr>
-        <w:t xml:space="preserve">Les 32 exigences ci-dessous énoncent ce que le logiciel doit faire. Le niveau de risque est celui de la DÉFAILLANCE de l'exigence, pas de son importance commerciale : il détermine la profondeur de vérification.</w:t>
+        <w:t xml:space="preserve">Les 33 exigences ci-dessous énoncent ce que le logiciel doit faire. Le niveau de risque est celui de la DÉFAILLANCE de l'exigence, pas de son importance commerciale : il détermine la profondeur de vérification.</w:t>
       </w:r>
     </w:p>
     <w:tbl>
@@ -4173,6 +4173,119 @@
           </w:p>
         </w:tc>
       </w:tr>
+      <w:tr>
+        <w:tc>
+          <w:tcPr>
+            <w:tcW w:type="pct" w:w="11%"/>
+            <w:shd w:fill="F8FAFC"/>
+            <w:tcMar>
+              <w:top w:type="dxa" w:w="80"/>
+              <w:left w:type="dxa" w:w="110"/>
+              <w:bottom w:type="dxa" w:w="80"/>
+              <w:right w:type="dxa" w:w="110"/>
+            </w:tcMar>
+          </w:tcPr>
+          <w:p>
+            <w:pPr>
+              <w:spacing w:after="60"/>
+            </w:pPr>
+            <w:r>
+              <w:rPr>
+                <w:b/>
+                <w:bCs/>
+                <w:color w:val="4338CA"/>
+                <w:sz w:val="17"/>
+                <w:szCs w:val="17"/>
+              </w:rPr>
+              <w:t xml:space="preserve">URS-33</w:t>
+            </w:r>
+          </w:p>
+          <w:p>
+            <w:pPr>
+              <w:spacing w:after="0"/>
+            </w:pPr>
+            <w:r>
+              <w:rPr>
+                <w:b/>
+                <w:bCs/>
+                <w:color w:val="B45309"/>
+                <w:sz w:val="15"/>
+                <w:szCs w:val="15"/>
+              </w:rPr>
+              <w:t xml:space="preserve">Moyen</w:t>
+            </w:r>
+          </w:p>
+        </w:tc>
+        <w:tc>
+          <w:tcPr>
+            <w:tcW w:type="pct" w:w="41%"/>
+            <w:tcMar>
+              <w:top w:type="dxa" w:w="80"/>
+              <w:left w:type="dxa" w:w="110"/>
+              <w:bottom w:type="dxa" w:w="80"/>
+              <w:right w:type="dxa" w:w="110"/>
+            </w:tcMar>
+          </w:tcPr>
+          <w:p>
+            <w:pPr>
+              <w:spacing w:after="0"/>
+            </w:pPr>
+            <w:r>
+              <w:rPr>
+                <w:sz w:val="17"/>
+                <w:szCs w:val="17"/>
+              </w:rPr>
+              <w:t xml:space="preserve">La piste d'audit se lit dans la langue du lecteur. Chaque entrée écrite par l'application porte la clé de son message et ses arguments ; le texte est rendu à la lecture, à l'écran, dans l'export CSV et dans l'archive d'inspection. Les valeurs d'énumération suivent la langue, les données saisies restent intactes, la clé et les arguments entrent dans l'empreinte de l'entrée, et les entrées antérieures restent lisibles avec leurs empreintes vérifiables.</w:t>
+            </w:r>
+          </w:p>
+        </w:tc>
+        <w:tc>
+          <w:tcPr>
+            <w:tcW w:type="pct" w:w="28%"/>
+            <w:tcMar>
+              <w:top w:type="dxa" w:w="80"/>
+              <w:left w:type="dxa" w:w="110"/>
+              <w:bottom w:type="dxa" w:w="80"/>
+              <w:right w:type="dxa" w:w="110"/>
+            </w:tcMar>
+          </w:tcPr>
+          <w:p>
+            <w:pPr>
+              <w:spacing w:after="0"/>
+            </w:pPr>
+            <w:r>
+              <w:rPr>
+                <w:sz w:val="17"/>
+                <w:szCs w:val="17"/>
+              </w:rPr>
+              <w:t xml:space="preserve">La piste d'audit est l'enregistrement qu'un auditeur lit en premier. Une équipe anglophone la consultait en français : elle ne pouvait ni la relire, ni la produire à son inspecteur, ni la revoir périodiquement comme le projet d'Annexe 11 l'attend. Le risque n'est pas la perte de donnée mais l'illisibilité d'un enregistrement réglementaire — et, si la traduction se faisait hors empreinte, la possibilité d'une version anglaise falsifiée que la chaîne déclarerait intacte.</w:t>
+            </w:r>
+          </w:p>
+        </w:tc>
+        <w:tc>
+          <w:tcPr>
+            <w:tcW w:type="pct" w:w="20%"/>
+            <w:tcMar>
+              <w:top w:type="dxa" w:w="80"/>
+              <w:left w:type="dxa" w:w="110"/>
+              <w:bottom w:type="dxa" w:w="80"/>
+              <w:right w:type="dxa" w:w="110"/>
+            </w:tcMar>
+          </w:tcPr>
+          <w:p>
+            <w:pPr>
+              <w:spacing w:after="0"/>
+            </w:pPr>
+            <w:r>
+              <w:rPr>
+                <w:sz w:val="17"/>
+                <w:szCs w:val="17"/>
+              </w:rPr>
+              <w:t xml:space="preserve">21 CFR 11.10(b) · 21 CFR 11.10(e)</w:t>
+            </w:r>
+          </w:p>
+        </w:tc>
+      </w:tr>
     </w:tbl>
     <w:p>
       <w:pPr>
@@ -4192,7 +4305,7 @@
           <w:sz w:val="20"/>
           <w:szCs w:val="20"/>
         </w:rPr>
-        <w:t xml:space="preserve">Répartition : 22 exigences à risque haut, 8 à risque moyen, 2 à risque bas. Les exigences à risque haut touchent toutes à l'intégrité ou à l'attribution des enregistrements : leur défaillance ne dégrade pas le confort d'usage, elle rend un enregistrement indéfendable. Elles font l'objet de cas de test dédiés, exécutés à chaque version.</w:t>
+        <w:t xml:space="preserve">Répartition : 22 exigences à risque haut, 9 à risque moyen, 2 à risque bas. Les exigences à risque haut touchent toutes à l'intégrité ou à l'attribution des enregistrements : leur défaillance ne dégrade pas le confort d'usage, elle rend un enregistrement indéfendable. Elles font l'objet de cas de test dédiés, exécutés à chaque version.</w:t>
       </w:r>
     </w:p>
     <w:p>
@@ -4343,7 +4456,7 @@
                 <w:sz w:val="17"/>
                 <w:szCs w:val="17"/>
               </w:rPr>
-              <w:t xml:space="preserve">5 août 2026 à 18:25</w:t>
+              <w:t xml:space="preserve">5 août 2026 à 19:25</w:t>
             </w:r>
           </w:p>
         </w:tc>
@@ -4546,7 +4659,7 @@
                 <w:sz w:val="17"/>
                 <w:szCs w:val="17"/>
               </w:rPr>
-              <w:t xml:space="preserve">29 cas sur 29 conformes — aucun écart</w:t>
+              <w:t xml:space="preserve">30 cas sur 30 conformes — aucun écart</w:t>
             </w:r>
           </w:p>
         </w:tc>
@@ -4822,7 +4935,7 @@
                 <w:sz w:val="14"/>
                 <w:szCs w:val="14"/>
               </w:rPr>
-              <w:t xml:space="preserve">0 ms</w:t>
+              <w:t xml:space="preserve">1 ms</w:t>
             </w:r>
           </w:p>
         </w:tc>
@@ -4925,7 +5038,7 @@
                 <w:sz w:val="17"/>
                 <w:szCs w:val="17"/>
               </w:rPr>
-              <w:t xml:space="preserve">empreintes distinctes pour un même mot de passe (c6111623e1bd… ≠ 426d44bed6e9…), vérification correcte, mot de passe faux et vide refusés</w:t>
+              <w:t xml:space="preserve">empreintes distinctes pour un même mot de passe (94a6e17aeed7… ≠ 2815ae7d17c4…), vérification correcte, mot de passe faux et vide refusés</w:t>
             </w:r>
           </w:p>
         </w:tc>
@@ -4964,7 +5077,7 @@
                 <w:sz w:val="14"/>
                 <w:szCs w:val="14"/>
               </w:rPr>
-              <w:t xml:space="preserve">146 ms</w:t>
+              <w:t xml:space="preserve">136 ms</w:t>
             </w:r>
           </w:p>
         </w:tc>
@@ -5106,7 +5219,7 @@
                 <w:sz w:val="14"/>
                 <w:szCs w:val="14"/>
               </w:rPr>
-              <w:t xml:space="preserve">13 ms</w:t>
+              <w:t xml:space="preserve">14 ms</w:t>
             </w:r>
           </w:p>
         </w:tc>
@@ -5209,7 +5322,7 @@
                 <w:sz w:val="17"/>
                 <w:szCs w:val="17"/>
               </w:rPr>
-              <w:t xml:space="preserve">contenu gelé, empreinte 24604eb157d7fa54…, 10487 octets conservés, opération journalisée</w:t>
+              <w:t xml:space="preserve">contenu gelé, empreinte 24604eb157d7fa54…, 10489 octets conservés, opération journalisée</w:t>
             </w:r>
           </w:p>
         </w:tc>
@@ -5248,7 +5361,7 @@
                 <w:sz w:val="14"/>
                 <w:szCs w:val="14"/>
               </w:rPr>
-              <w:t xml:space="preserve">120 ms</w:t>
+              <w:t xml:space="preserve">110 ms</w:t>
             </w:r>
           </w:p>
         </w:tc>
@@ -5351,7 +5464,7 @@
                 <w:sz w:val="17"/>
                 <w:szCs w:val="17"/>
               </w:rPr>
-              <w:t xml:space="preserve">signature liée à l'instantané cmsgf3r8…, empreinte attestée 3767 CD80 ACC9, manifestation « Testeur QA1 (QA1) · Approuvé · 05/08/2026 18:25:43 UTC · enregistrement 3767 CD80 ACC9 »</w:t>
+              <w:t xml:space="preserve">signature liée à l'instantané cmsgh8uo…, empreinte attestée 3767 CD80 ACC9, manifestation « Testeur QA1 (QA1) · Approuvé · 05/08/2026 19:25:40 UTC · enregistrement 3767 CD80 ACC9 »</w:t>
             </w:r>
           </w:p>
         </w:tc>
@@ -5390,7 +5503,7 @@
                 <w:sz w:val="14"/>
                 <w:szCs w:val="14"/>
               </w:rPr>
-              <w:t xml:space="preserve">47 ms</w:t>
+              <w:t xml:space="preserve">43 ms</w:t>
             </w:r>
           </w:p>
         </w:tc>
@@ -5493,7 +5606,7 @@
                 <w:sz w:val="17"/>
                 <w:szCs w:val="17"/>
               </w:rPr>
-              <w:t xml:space="preserve">10488 octets relus à l'identique ; inversion d'un octet en position 5244 détectée</w:t>
+              <w:t xml:space="preserve">10487 octets relus à l'identique ; inversion d'un octet en position 5243 détectée</w:t>
             </w:r>
           </w:p>
         </w:tc>
@@ -5532,7 +5645,7 @@
                 <w:sz w:val="14"/>
                 <w:szCs w:val="14"/>
               </w:rPr>
-              <w:t xml:space="preserve">54 ms</w:t>
+              <w:t xml:space="preserve">53 ms</w:t>
             </w:r>
           </w:p>
         </w:tc>
@@ -5674,7 +5787,7 @@
                 <w:sz w:val="14"/>
                 <w:szCs w:val="14"/>
               </w:rPr>
-              <w:t xml:space="preserve">69 ms</w:t>
+              <w:t xml:space="preserve">54 ms</w:t>
             </w:r>
           </w:p>
         </w:tc>
@@ -6061,7 +6174,7 @@
                 <w:sz w:val="17"/>
                 <w:szCs w:val="17"/>
               </w:rPr>
-              <w:t xml:space="preserve">2 instantanés conservés : le gel de revue reste lisible (10496 o, dépassé), l'enregistrement approuvé porte la même empreinte de contenu</w:t>
+              <w:t xml:space="preserve">2 instantanés conservés : le gel de revue reste lisible (10493 o, dépassé), l'enregistrement approuvé porte la même empreinte de contenu</w:t>
             </w:r>
           </w:p>
         </w:tc>
@@ -6100,7 +6213,7 @@
                 <w:sz w:val="14"/>
                 <w:szCs w:val="14"/>
               </w:rPr>
-              <w:t xml:space="preserve">83 ms</w:t>
+              <w:t xml:space="preserve">78 ms</w:t>
             </w:r>
           </w:p>
         </w:tc>
@@ -6242,7 +6355,7 @@
                 <w:sz w:val="14"/>
                 <w:szCs w:val="14"/>
               </w:rPr>
-              <w:t xml:space="preserve">74 ms</w:t>
+              <w:t xml:space="preserve">68 ms</w:t>
             </w:r>
           </w:p>
         </w:tc>
@@ -6345,7 +6458,7 @@
                 <w:sz w:val="17"/>
                 <w:szCs w:val="17"/>
               </w:rPr>
-              <w:t xml:space="preserve">136 fichiers source inspectés : aucune modification ni suppression d'entrée ; 1 fichiers en écriture seule</w:t>
+              <w:t xml:space="preserve">138 fichiers source inspectés : aucune modification ni suppression d'entrée ; 1 fichiers en écriture seule</w:t>
             </w:r>
           </w:p>
         </w:tc>
@@ -6384,7 +6497,7 @@
                 <w:sz w:val="14"/>
                 <w:szCs w:val="14"/>
               </w:rPr>
-              <w:t xml:space="preserve">23 ms</w:t>
+              <w:t xml:space="preserve">25 ms</w:t>
             </w:r>
           </w:p>
         </w:tc>
@@ -6526,7 +6639,7 @@
                 <w:sz w:val="14"/>
                 <w:szCs w:val="14"/>
               </w:rPr>
-              <w:t xml:space="preserve">29 ms</w:t>
+              <w:t xml:space="preserve">25 ms</w:t>
             </w:r>
           </w:p>
         </w:tc>
@@ -6668,7 +6781,7 @@
                 <w:sz w:val="14"/>
                 <w:szCs w:val="14"/>
               </w:rPr>
-              <w:t xml:space="preserve">1 ms</w:t>
+              <w:t xml:space="preserve">0 ms</w:t>
             </w:r>
           </w:p>
         </w:tc>
@@ -6810,7 +6923,7 @@
                 <w:sz w:val="14"/>
                 <w:szCs w:val="14"/>
               </w:rPr>
-              <w:t xml:space="preserve">0 ms</w:t>
+              <w:t xml:space="preserve">1 ms</w:t>
             </w:r>
           </w:p>
         </w:tc>
@@ -6952,7 +7065,7 @@
                 <w:sz w:val="14"/>
                 <w:szCs w:val="14"/>
               </w:rPr>
-              <w:t xml:space="preserve">338 ms</w:t>
+              <w:t xml:space="preserve">307 ms</w:t>
             </w:r>
           </w:p>
         </w:tc>
@@ -7055,7 +7168,7 @@
                 <w:sz w:val="17"/>
                 <w:szCs w:val="17"/>
               </w:rPr>
-              <w:t xml:space="preserve">13 enregistrement(s) archivé(s), 29 fichier(s) couverts par empreintes.sha256, 0 écart ; ancre a2da913bf11aa4eb… ; octets du gel restitués à l'identique ; altération d'un octet détectée et signalée ALTÉRÉ, fichier conservé dans l'archive</w:t>
+              <w:t xml:space="preserve">13 enregistrement(s) archivé(s), 29 fichier(s) couverts par empreintes.sha256, 0 écart ; ancre b64339ff9bf75bd4… ; octets du gel restitués à l'identique ; altération d'un octet détectée et signalée ALTÉRÉ, fichier conservé dans l'archive</w:t>
             </w:r>
           </w:p>
         </w:tc>
@@ -7094,7 +7207,7 @@
                 <w:sz w:val="14"/>
                 <w:szCs w:val="14"/>
               </w:rPr>
-              <w:t xml:space="preserve">230 ms</w:t>
+              <w:t xml:space="preserve">201 ms</w:t>
             </w:r>
           </w:p>
         </w:tc>
@@ -7236,7 +7349,7 @@
                 <w:sz w:val="14"/>
                 <w:szCs w:val="14"/>
               </w:rPr>
-              <w:t xml:space="preserve">13 ms</w:t>
+              <w:t xml:space="preserve">14 ms</w:t>
             </w:r>
           </w:p>
         </w:tc>
@@ -7378,7 +7491,7 @@
                 <w:sz w:val="14"/>
                 <w:szCs w:val="14"/>
               </w:rPr>
-              <w:t xml:space="preserve">162 ms</w:t>
+              <w:t xml:space="preserve">155 ms</w:t>
             </w:r>
           </w:p>
         </w:tc>
@@ -7520,7 +7633,7 @@
                 <w:sz w:val="14"/>
                 <w:szCs w:val="14"/>
               </w:rPr>
-              <w:t xml:space="preserve">170 ms</w:t>
+              <w:t xml:space="preserve">162 ms</w:t>
             </w:r>
           </w:p>
         </w:tc>
@@ -7623,7 +7736,7 @@
                 <w:sz w:val="17"/>
                 <w:szCs w:val="17"/>
               </w:rPr>
-              <w:t xml:space="preserve">requête DER de 89 octets portant l'empreinte demandée ; jeton de 2418 octets lu exactement (date 2026-08-03T08:55:03.000Z, série 02, politique 1.3.6.1.4.1.99999.1.1) ; quatre refus obtenus : autre empreinte, autre nonce, réponse de rejet de l'autorité, jeton tronqué</w:t>
+              <w:t xml:space="preserve">requête DER de 90 octets portant l'empreinte demandée ; jeton de 2418 octets lu exactement (date 2026-08-03T08:55:03.000Z, série 02, politique 1.3.6.1.4.1.99999.1.1) ; quatre refus obtenus : autre empreinte, autre nonce, réponse de rejet de l'autorité, jeton tronqué</w:t>
             </w:r>
           </w:p>
         </w:tc>
@@ -8049,7 +8162,7 @@
                 <w:sz w:val="17"/>
                 <w:szCs w:val="17"/>
               </w:rPr>
-              <w:t xml:space="preserve">184 fichier(s) source relus, aucune écriture dans la piste hors du module ; 9 empreintes comparées entre l'implémentation TypeScript et le miroir de la console serveur, toutes identiques</w:t>
+              <w:t xml:space="preserve">187 fichier(s) source relus, aucune écriture dans la piste hors du module ; 9 empreintes comparées entre l'implémentation TypeScript et le miroir de la console serveur, toutes identiques</w:t>
             </w:r>
           </w:p>
         </w:tc>
@@ -8088,7 +8201,7 @@
                 <w:sz w:val="14"/>
                 <w:szCs w:val="14"/>
               </w:rPr>
-              <w:t xml:space="preserve">24 ms</w:t>
+              <w:t xml:space="preserve">25 ms</w:t>
             </w:r>
           </w:p>
         </w:tc>
@@ -8372,7 +8485,7 @@
                 <w:sz w:val="14"/>
                 <w:szCs w:val="14"/>
               </w:rPr>
-              <w:t xml:space="preserve">9 ms</w:t>
+              <w:t xml:space="preserve">7 ms</w:t>
             </w:r>
           </w:p>
         </w:tc>
@@ -8514,7 +8627,7 @@
                 <w:sz w:val="14"/>
                 <w:szCs w:val="14"/>
               </w:rPr>
-              <w:t xml:space="preserve">240 ms</w:t>
+              <w:t xml:space="preserve">242 ms</w:t>
             </w:r>
           </w:p>
         </w:tc>
@@ -8617,7 +8730,7 @@
                 <w:sz w:val="17"/>
                 <w:szCs w:val="17"/>
               </w:rPr>
-              <w:t xml:space="preserve">184 fichier(s) source relus : aucune écriture de mot de passe hors des chemins autorisés ; une seule écriture dans les actions serveur, le changement personnel, qui exige l'ancien mot de passe ; l'outil d'urgence de la console émet un jeton et ne sait plus dériver de mot de passe ; aucun champ de mot de passe hors des 6 écrans où l'on saisit le sien</w:t>
+              <w:t xml:space="preserve">187 fichier(s) source relus : aucune écriture de mot de passe hors des chemins autorisés ; une seule écriture dans les actions serveur, le changement personnel, qui exige l'ancien mot de passe ; l'outil d'urgence de la console émet un jeton et ne sait plus dériver de mot de passe ; aucun champ de mot de passe hors des 6 écrans où l'on saisit le sien</w:t>
             </w:r>
           </w:p>
         </w:tc>
@@ -8656,7 +8769,7 @@
                 <w:sz w:val="14"/>
                 <w:szCs w:val="14"/>
               </w:rPr>
-              <w:t xml:space="preserve">33 ms</w:t>
+              <w:t xml:space="preserve">31 ms</w:t>
             </w:r>
           </w:p>
         </w:tc>
@@ -8798,7 +8911,149 @@
                 <w:sz w:val="14"/>
                 <w:szCs w:val="14"/>
               </w:rPr>
-              <w:t xml:space="preserve">8902 ms</w:t>
+              <w:t xml:space="preserve">8837 ms</w:t>
+            </w:r>
+          </w:p>
+        </w:tc>
+      </w:tr>
+      <w:tr>
+        <w:tc>
+          <w:tcPr>
+            <w:tcW w:type="pct" w:w="13%"/>
+            <w:shd w:fill="F8FAFC"/>
+            <w:tcMar>
+              <w:top w:type="dxa" w:w="80"/>
+              <w:left w:type="dxa" w:w="110"/>
+              <w:bottom w:type="dxa" w:w="80"/>
+              <w:right w:type="dxa" w:w="110"/>
+            </w:tcMar>
+          </w:tcPr>
+          <w:p>
+            <w:pPr>
+              <w:spacing w:after="50"/>
+            </w:pPr>
+            <w:r>
+              <w:rPr>
+                <w:b/>
+                <w:bCs/>
+                <w:color w:val="4338CA"/>
+                <w:sz w:val="17"/>
+                <w:szCs w:val="17"/>
+              </w:rPr>
+              <w:t xml:space="preserve">OQ-30</w:t>
+            </w:r>
+          </w:p>
+          <w:p>
+            <w:pPr>
+              <w:spacing w:after="0"/>
+            </w:pPr>
+            <w:r>
+              <w:rPr>
+                <w:color w:val="475569"/>
+                <w:sz w:val="15"/>
+                <w:szCs w:val="15"/>
+              </w:rPr>
+              <w:t xml:space="preserve">URS-33</w:t>
+            </w:r>
+          </w:p>
+        </w:tc>
+        <w:tc>
+          <w:tcPr>
+            <w:tcW w:type="pct" w:w="30%"/>
+            <w:tcMar>
+              <w:top w:type="dxa" w:w="80"/>
+              <w:left w:type="dxa" w:w="110"/>
+              <w:bottom w:type="dxa" w:w="80"/>
+              <w:right w:type="dxa" w:w="110"/>
+            </w:tcMar>
+          </w:tcPr>
+          <w:p>
+            <w:pPr>
+              <w:spacing w:after="50"/>
+            </w:pPr>
+            <w:r>
+              <w:rPr>
+                <w:b/>
+                <w:bCs/>
+                <w:sz w:val="17"/>
+                <w:szCs w:val="17"/>
+              </w:rPr>
+              <w:t xml:space="preserve">Piste d'audit bilingue — rendu, vocabulaire, données, et empreinte du message</w:t>
+            </w:r>
+          </w:p>
+          <w:p>
+            <w:pPr>
+              <w:spacing w:after="0"/>
+            </w:pPr>
+            <w:r>
+              <w:rPr>
+                <w:color w:val="475569"/>
+                <w:sz w:val="15"/>
+                <w:szCs w:val="15"/>
+              </w:rPr>
+              <w:t xml:space="preserve">Vérifier que le catalogue est complet dans les deux langues, qu'une entrée écrite par l'application se relit en français et en anglais, que le vocabulaire du logiciel suit la langue pendant que la donnée saisie reste intacte, que la clé et les arguments sont couverts par l'empreinte, et que les entrées antérieures gardent la leur.</w:t>
+            </w:r>
+          </w:p>
+        </w:tc>
+        <w:tc>
+          <w:tcPr>
+            <w:tcW w:type="pct" w:w="45%"/>
+            <w:tcMar>
+              <w:top w:type="dxa" w:w="80"/>
+              <w:left w:type="dxa" w:w="110"/>
+              <w:bottom w:type="dxa" w:w="80"/>
+              <w:right w:type="dxa" w:w="110"/>
+            </w:tcMar>
+          </w:tcPr>
+          <w:p>
+            <w:pPr>
+              <w:spacing w:after="0"/>
+            </w:pPr>
+            <w:r>
+              <w:rPr>
+                <w:sz w:val="17"/>
+                <w:szCs w:val="17"/>
+              </w:rPr>
+              <w:t xml:space="preserve">181 messages du catalogue complets dans les deux langues et à variables identiques ; entrée écrite par le point de passage relue « SPEC-OQ30 : En attente → Justifié — justification : ess… » et « SPEC-OQ30: Pending → Justified — justification: essai d… » ; le statut suit la langue, le motif saisi est restitué à l'identique dans les deux ; réécriture des arguments et changement de clé détectés au rang 64, chaîne rétablie après remise en état ; une entrée sans message se sérialise sur 9 champs comme avant, 11 avec, miroir de console identique sur les deux formes</w:t>
+            </w:r>
+          </w:p>
+        </w:tc>
+        <w:tc>
+          <w:tcPr>
+            <w:tcW w:type="pct" w:w="12%"/>
+            <w:tcMar>
+              <w:top w:type="dxa" w:w="80"/>
+              <w:left w:type="dxa" w:w="110"/>
+              <w:bottom w:type="dxa" w:w="80"/>
+              <w:right w:type="dxa" w:w="110"/>
+            </w:tcMar>
+          </w:tcPr>
+          <w:p>
+            <w:pPr>
+              <w:spacing w:after="40"/>
+            </w:pPr>
+            <w:r>
+              <w:rPr>
+                <w:b/>
+                <w:bCs/>
+                <w:color w:val="047857"/>
+                <w:sz w:val="17"/>
+                <w:szCs w:val="17"/>
+              </w:rPr>
+              <w:t xml:space="preserve">Conforme</w:t>
+            </w:r>
+          </w:p>
+          <w:p>
+            <w:pPr>
+              <w:spacing w:after="0"/>
+            </w:pPr>
+            <w:r>
+              <w:rPr>
+                <w:color w:val="475569"/>
+                <w:sz w:val="14"/>
+                <w:szCs w:val="14"/>
+              </w:rPr>
+              <w:t xml:space="preserve">22 ms</w:t>
             </w:r>
           </w:p>
         </w:tc>
@@ -11386,6 +11641,83 @@
           </w:p>
         </w:tc>
       </w:tr>
+      <w:tr>
+        <w:tc>
+          <w:tcPr>
+            <w:tcW w:type="pct" w:w="12%"/>
+            <w:tcMar>
+              <w:top w:type="dxa" w:w="80"/>
+              <w:left w:type="dxa" w:w="110"/>
+              <w:bottom w:type="dxa" w:w="80"/>
+              <w:right w:type="dxa" w:w="110"/>
+            </w:tcMar>
+          </w:tcPr>
+          <w:p>
+            <w:pPr>
+              <w:spacing w:after="0"/>
+            </w:pPr>
+            <w:r>
+              <w:rPr>
+                <w:b/>
+                <w:bCs/>
+                <w:color w:val="4338CA"/>
+                <w:sz w:val="17"/>
+                <w:szCs w:val="17"/>
+              </w:rPr>
+              <w:t xml:space="preserve">URS-33</w:t>
+            </w:r>
+          </w:p>
+        </w:tc>
+        <w:tc>
+          <w:tcPr>
+            <w:tcW w:type="pct" w:w="22%"/>
+            <w:tcMar>
+              <w:top w:type="dxa" w:w="80"/>
+              <w:left w:type="dxa" w:w="110"/>
+              <w:bottom w:type="dxa" w:w="80"/>
+              <w:right w:type="dxa" w:w="110"/>
+            </w:tcMar>
+          </w:tcPr>
+          <w:p>
+            <w:pPr>
+              <w:spacing w:after="0"/>
+            </w:pPr>
+            <w:r>
+              <w:rPr>
+                <w:b/>
+                <w:bCs/>
+                <w:color w:val="047857"/>
+                <w:sz w:val="17"/>
+                <w:szCs w:val="17"/>
+              </w:rPr>
+              <w:t xml:space="preserve">OQ-30</w:t>
+            </w:r>
+          </w:p>
+        </w:tc>
+        <w:tc>
+          <w:tcPr>
+            <w:tcW w:type="pct" w:w="66%"/>
+            <w:tcMar>
+              <w:top w:type="dxa" w:w="80"/>
+              <w:left w:type="dxa" w:w="110"/>
+              <w:bottom w:type="dxa" w:w="80"/>
+              <w:right w:type="dxa" w:w="110"/>
+            </w:tcMar>
+          </w:tcPr>
+          <w:p>
+            <w:pPr>
+              <w:spacing w:after="0"/>
+            </w:pPr>
+            <w:r>
+              <w:rPr>
+                <w:sz w:val="17"/>
+                <w:szCs w:val="17"/>
+              </w:rPr>
+              <w:t xml:space="preserve">Cas de test automatisé exécuté par l'éditeur à chaque version, résultat en section 5.1.</w:t>
+            </w:r>
+          </w:p>
+        </w:tc>
+      </w:tr>
     </w:tbl>
     <w:p>
       <w:pPr>
@@ -11405,7 +11737,7 @@
           <w:sz w:val="20"/>
           <w:szCs w:val="20"/>
         </w:rPr>
-        <w:t xml:space="preserve">Sur les 32 exigences, 28 sont vérifiées automatiquement par l'éditeur et 4 doivent l'être chez vous. Ce n'est pas un partage arbitraire : ces 4 exigences ne sont pas observables sans navigateur, sans requête HTTP ou sans votre infrastructure. Les compter comme couvertes serait une affirmation invérifiable.</w:t>
+        <w:t xml:space="preserve">Sur les 33 exigences, 29 sont vérifiées automatiquement par l'éditeur et 4 doivent l'être chez vous. Ce n'est pas un partage arbitraire : ces 4 exigences ne sont pas observables sans navigateur, sans requête HTTP ou sans votre infrastructure. Les compter comme couvertes serait une affirmation invérifiable.</w:t>
       </w:r>
     </w:p>
     <w:p>
@@ -11745,7 +12077,7 @@
         <w:sz w:val="15"/>
         <w:szCs w:val="15"/>
       </w:rPr>
-      <w:t xml:space="preserve">   ·   Version 1.2.1 · rapport OQ exécuté le 5 août 2026 à 18:25 UTC</w:t>
+      <w:t xml:space="preserve">   ·   Version 1.2.1 · rapport OQ exécuté le 5 août 2026 à 19:25 UTC</w:t>
     </w:r>
   </w:p>
 </w:ftr>

</xml_diff>

<commit_message>
Captures régénérées : l'écran d'audit anglais montre un journal anglais
Les deux jeux de captures sont refaits après la mise en bilingue de la
piste d'audit. Les françaises étaient jusqu'ici recopiées à la main et
dérivaient sans que rien ne le signale — elles passent désormais par le
générateur, comme les anglaises.

Co-Authored-By: Claude Opus 5 <noreply@anthropic.com>
</commit_message>
<xml_diff>
--- a/docs/Dossier_de_validation_Filum.docx
+++ b/docs/Dossier_de_validation_Filum.docx
@@ -4456,7 +4456,7 @@
                 <w:sz w:val="17"/>
                 <w:szCs w:val="17"/>
               </w:rPr>
-              <w:t xml:space="preserve">5 août 2026 à 19:25</w:t>
+              <w:t xml:space="preserve">6 août 2026 à 10:05</w:t>
             </w:r>
           </w:p>
         </w:tc>
@@ -4935,7 +4935,7 @@
                 <w:sz w:val="14"/>
                 <w:szCs w:val="14"/>
               </w:rPr>
-              <w:t xml:space="preserve">1 ms</w:t>
+              <w:t xml:space="preserve">0 ms</w:t>
             </w:r>
           </w:p>
         </w:tc>
@@ -5038,7 +5038,7 @@
                 <w:sz w:val="17"/>
                 <w:szCs w:val="17"/>
               </w:rPr>
-              <w:t xml:space="preserve">empreintes distinctes pour un même mot de passe (94a6e17aeed7… ≠ 2815ae7d17c4…), vérification correcte, mot de passe faux et vide refusés</w:t>
+              <w:t xml:space="preserve">empreintes distinctes pour un même mot de passe (c41f3fd50b65… ≠ b3ad3a6a2edf…), vérification correcte, mot de passe faux et vide refusés</w:t>
             </w:r>
           </w:p>
         </w:tc>
@@ -5077,7 +5077,7 @@
                 <w:sz w:val="14"/>
                 <w:szCs w:val="14"/>
               </w:rPr>
-              <w:t xml:space="preserve">136 ms</w:t>
+              <w:t xml:space="preserve">143 ms</w:t>
             </w:r>
           </w:p>
         </w:tc>
@@ -5322,7 +5322,7 @@
                 <w:sz w:val="17"/>
                 <w:szCs w:val="17"/>
               </w:rPr>
-              <w:t xml:space="preserve">contenu gelé, empreinte 24604eb157d7fa54…, 10489 octets conservés, opération journalisée</w:t>
+              <w:t xml:space="preserve">contenu gelé, empreinte 24604eb157d7fa54…, 10485 octets conservés, opération journalisée</w:t>
             </w:r>
           </w:p>
         </w:tc>
@@ -5361,7 +5361,7 @@
                 <w:sz w:val="14"/>
                 <w:szCs w:val="14"/>
               </w:rPr>
-              <w:t xml:space="preserve">110 ms</w:t>
+              <w:t xml:space="preserve">122 ms</w:t>
             </w:r>
           </w:p>
         </w:tc>
@@ -5464,7 +5464,7 @@
                 <w:sz w:val="17"/>
                 <w:szCs w:val="17"/>
               </w:rPr>
-              <w:t xml:space="preserve">signature liée à l'instantané cmsgh8uo…, empreinte attestée 3767 CD80 ACC9, manifestation « Testeur QA1 (QA1) · Approuvé · 05/08/2026 19:25:40 UTC · enregistrement 3767 CD80 ACC9 »</w:t>
+              <w:t xml:space="preserve">signature liée à l'instantané cmshcoim…, empreinte attestée 3767 CD80 ACC9, manifestation « Testeur QA1 (QA1) · Approuvé · 06/08/2026 10:05:39 UTC · enregistrement 3767 CD80 ACC9 »</w:t>
             </w:r>
           </w:p>
         </w:tc>
@@ -5503,7 +5503,7 @@
                 <w:sz w:val="14"/>
                 <w:szCs w:val="14"/>
               </w:rPr>
-              <w:t xml:space="preserve">43 ms</w:t>
+              <w:t xml:space="preserve">48 ms</w:t>
             </w:r>
           </w:p>
         </w:tc>
@@ -5606,7 +5606,7 @@
                 <w:sz w:val="17"/>
                 <w:szCs w:val="17"/>
               </w:rPr>
-              <w:t xml:space="preserve">10487 octets relus à l'identique ; inversion d'un octet en position 5243 détectée</w:t>
+              <w:t xml:space="preserve">10488 octets relus à l'identique ; inversion d'un octet en position 5244 détectée</w:t>
             </w:r>
           </w:p>
         </w:tc>
@@ -5645,7 +5645,7 @@
                 <w:sz w:val="14"/>
                 <w:szCs w:val="14"/>
               </w:rPr>
-              <w:t xml:space="preserve">53 ms</w:t>
+              <w:t xml:space="preserve">58 ms</w:t>
             </w:r>
           </w:p>
         </w:tc>
@@ -5787,7 +5787,7 @@
                 <w:sz w:val="14"/>
                 <w:szCs w:val="14"/>
               </w:rPr>
-              <w:t xml:space="preserve">54 ms</w:t>
+              <w:t xml:space="preserve">59 ms</w:t>
             </w:r>
           </w:p>
         </w:tc>
@@ -5929,7 +5929,7 @@
                 <w:sz w:val="14"/>
                 <w:szCs w:val="14"/>
               </w:rPr>
-              <w:t xml:space="preserve">50 ms</w:t>
+              <w:t xml:space="preserve">63 ms</w:t>
             </w:r>
           </w:p>
         </w:tc>
@@ -6071,7 +6071,7 @@
                 <w:sz w:val="14"/>
                 <w:szCs w:val="14"/>
               </w:rPr>
-              <w:t xml:space="preserve">75 ms</w:t>
+              <w:t xml:space="preserve">85 ms</w:t>
             </w:r>
           </w:p>
         </w:tc>
@@ -6174,7 +6174,7 @@
                 <w:sz w:val="17"/>
                 <w:szCs w:val="17"/>
               </w:rPr>
-              <w:t xml:space="preserve">2 instantanés conservés : le gel de revue reste lisible (10493 o, dépassé), l'enregistrement approuvé porte la même empreinte de contenu</w:t>
+              <w:t xml:space="preserve">2 instantanés conservés : le gel de revue reste lisible (10495 o, dépassé), l'enregistrement approuvé porte la même empreinte de contenu</w:t>
             </w:r>
           </w:p>
         </w:tc>
@@ -6213,7 +6213,7 @@
                 <w:sz w:val="14"/>
                 <w:szCs w:val="14"/>
               </w:rPr>
-              <w:t xml:space="preserve">78 ms</w:t>
+              <w:t xml:space="preserve">86 ms</w:t>
             </w:r>
           </w:p>
         </w:tc>
@@ -6355,7 +6355,7 @@
                 <w:sz w:val="14"/>
                 <w:szCs w:val="14"/>
               </w:rPr>
-              <w:t xml:space="preserve">68 ms</w:t>
+              <w:t xml:space="preserve">82 ms</w:t>
             </w:r>
           </w:p>
         </w:tc>
@@ -6497,7 +6497,7 @@
                 <w:sz w:val="14"/>
                 <w:szCs w:val="14"/>
               </w:rPr>
-              <w:t xml:space="preserve">25 ms</w:t>
+              <w:t xml:space="preserve">29 ms</w:t>
             </w:r>
           </w:p>
         </w:tc>
@@ -6639,7 +6639,7 @@
                 <w:sz w:val="14"/>
                 <w:szCs w:val="14"/>
               </w:rPr>
-              <w:t xml:space="preserve">25 ms</w:t>
+              <w:t xml:space="preserve">29 ms</w:t>
             </w:r>
           </w:p>
         </w:tc>
@@ -7065,7 +7065,7 @@
                 <w:sz w:val="14"/>
                 <w:szCs w:val="14"/>
               </w:rPr>
-              <w:t xml:space="preserve">307 ms</w:t>
+              <w:t xml:space="preserve">352 ms</w:t>
             </w:r>
           </w:p>
         </w:tc>
@@ -7168,7 +7168,7 @@
                 <w:sz w:val="17"/>
                 <w:szCs w:val="17"/>
               </w:rPr>
-              <w:t xml:space="preserve">13 enregistrement(s) archivé(s), 29 fichier(s) couverts par empreintes.sha256, 0 écart ; ancre b64339ff9bf75bd4… ; octets du gel restitués à l'identique ; altération d'un octet détectée et signalée ALTÉRÉ, fichier conservé dans l'archive</w:t>
+              <w:t xml:space="preserve">13 enregistrement(s) archivé(s), 29 fichier(s) couverts par empreintes.sha256, 0 écart ; ancre 2cf9ad9208d004c1… ; octets du gel restitués à l'identique ; altération d'un octet détectée et signalée ALTÉRÉ, fichier conservé dans l'archive</w:t>
             </w:r>
           </w:p>
         </w:tc>
@@ -7207,7 +7207,7 @@
                 <w:sz w:val="14"/>
                 <w:szCs w:val="14"/>
               </w:rPr>
-              <w:t xml:space="preserve">201 ms</w:t>
+              <w:t xml:space="preserve">234 ms</w:t>
             </w:r>
           </w:p>
         </w:tc>
@@ -7349,7 +7349,7 @@
                 <w:sz w:val="14"/>
                 <w:szCs w:val="14"/>
               </w:rPr>
-              <w:t xml:space="preserve">14 ms</w:t>
+              <w:t xml:space="preserve">13 ms</w:t>
             </w:r>
           </w:p>
         </w:tc>
@@ -7452,7 +7452,7 @@
                 <w:sz w:val="17"/>
                 <w:szCs w:val="17"/>
               </w:rPr>
-              <w:t xml:space="preserve">durée non déclarée annoncée telle quelle ; quatre valeurs invalides refusées (0, -1, 101, 7.5) ; 10 ans déclarés → échéance 2036-08-05 portée par le manifeste, procédure QP-014 rév. B citée dans la lettre d'accompagnement</w:t>
+              <w:t xml:space="preserve">durée non déclarée annoncée telle quelle ; quatre valeurs invalides refusées (0, -1, 101, 7.5) ; 10 ans déclarés → échéance 2036-08-06 portée par le manifeste, procédure QP-014 rév. B citée dans la lettre d'accompagnement</w:t>
             </w:r>
           </w:p>
         </w:tc>
@@ -7491,7 +7491,7 @@
                 <w:sz w:val="14"/>
                 <w:szCs w:val="14"/>
               </w:rPr>
-              <w:t xml:space="preserve">155 ms</w:t>
+              <w:t xml:space="preserve">139 ms</w:t>
             </w:r>
           </w:p>
         </w:tc>
@@ -7633,7 +7633,7 @@
                 <w:sz w:val="14"/>
                 <w:szCs w:val="14"/>
               </w:rPr>
-              <w:t xml:space="preserve">162 ms</w:t>
+              <w:t xml:space="preserve">160 ms</w:t>
             </w:r>
           </w:p>
         </w:tc>
@@ -7917,7 +7917,7 @@
                 <w:sz w:val="14"/>
                 <w:szCs w:val="14"/>
               </w:rPr>
-              <w:t xml:space="preserve">1 ms</w:t>
+              <w:t xml:space="preserve">0 ms</w:t>
             </w:r>
           </w:p>
         </w:tc>
@@ -8059,7 +8059,7 @@
                 <w:sz w:val="14"/>
                 <w:szCs w:val="14"/>
               </w:rPr>
-              <w:t xml:space="preserve">26 ms</w:t>
+              <w:t xml:space="preserve">29 ms</w:t>
             </w:r>
           </w:p>
         </w:tc>
@@ -8201,7 +8201,7 @@
                 <w:sz w:val="14"/>
                 <w:szCs w:val="14"/>
               </w:rPr>
-              <w:t xml:space="preserve">25 ms</w:t>
+              <w:t xml:space="preserve">26 ms</w:t>
             </w:r>
           </w:p>
         </w:tc>
@@ -8627,7 +8627,7 @@
                 <w:sz w:val="14"/>
                 <w:szCs w:val="14"/>
               </w:rPr>
-              <w:t xml:space="preserve">242 ms</w:t>
+              <w:t xml:space="preserve">247 ms</w:t>
             </w:r>
           </w:p>
         </w:tc>
@@ -8769,7 +8769,7 @@
                 <w:sz w:val="14"/>
                 <w:szCs w:val="14"/>
               </w:rPr>
-              <w:t xml:space="preserve">31 ms</w:t>
+              <w:t xml:space="preserve">30 ms</w:t>
             </w:r>
           </w:p>
         </w:tc>
@@ -8911,7 +8911,7 @@
                 <w:sz w:val="14"/>
                 <w:szCs w:val="14"/>
               </w:rPr>
-              <w:t xml:space="preserve">8837 ms</w:t>
+              <w:t xml:space="preserve">8916 ms</w:t>
             </w:r>
           </w:p>
         </w:tc>
@@ -9053,7 +9053,7 @@
                 <w:sz w:val="14"/>
                 <w:szCs w:val="14"/>
               </w:rPr>
-              <w:t xml:space="preserve">22 ms</w:t>
+              <w:t xml:space="preserve">24 ms</w:t>
             </w:r>
           </w:p>
         </w:tc>
@@ -12077,7 +12077,7 @@
         <w:sz w:val="15"/>
         <w:szCs w:val="15"/>
       </w:rPr>
-      <w:t xml:space="preserve">   ·   Version 1.2.1 · rapport OQ exécuté le 5 août 2026 à 19:25 UTC</w:t>
+      <w:t xml:space="preserve">   ·   Version 1.2.1 · rapport OQ exécuté le 6 août 2026 à 10:05 UTC</w:t>
     </w:r>
   </w:p>
 </w:ftr>

</xml_diff>

<commit_message>
Page « validation continue » · l'accueil anglais reste en anglais
/validation-continue.html et /en/validation-continue.html : les trois
gardes automatiques expliqués à un acheteur, chacun avec ce qu'il a déjà
attrapé, et une section sur ce qu'ils ne font pas.

Correction au passage : depuis l'accueil anglais, le lien vers l'étude de
cas menait à la version française. Les pages traduites étaient liées comme
si elles étaient partagées entre les deux langues.

Co-Authored-By: Claude Opus 5 <noreply@anthropic.com>
</commit_message>
<xml_diff>
--- a/docs/Dossier_de_validation_Filum.docx
+++ b/docs/Dossier_de_validation_Filum.docx
@@ -4456,7 +4456,7 @@
                 <w:sz w:val="17"/>
                 <w:szCs w:val="17"/>
               </w:rPr>
-              <w:t xml:space="preserve">6 août 2026 à 10:05</w:t>
+              <w:t xml:space="preserve">6 août 2026 à 10:40</w:t>
             </w:r>
           </w:p>
         </w:tc>
@@ -5038,7 +5038,7 @@
                 <w:sz w:val="17"/>
                 <w:szCs w:val="17"/>
               </w:rPr>
-              <w:t xml:space="preserve">empreintes distinctes pour un même mot de passe (c41f3fd50b65… ≠ b3ad3a6a2edf…), vérification correcte, mot de passe faux et vide refusés</w:t>
+              <w:t xml:space="preserve">empreintes distinctes pour un même mot de passe (3ada9e146eb2… ≠ ab0bef13d11f…), vérification correcte, mot de passe faux et vide refusés</w:t>
             </w:r>
           </w:p>
         </w:tc>
@@ -5077,7 +5077,7 @@
                 <w:sz w:val="14"/>
                 <w:szCs w:val="14"/>
               </w:rPr>
-              <w:t xml:space="preserve">143 ms</w:t>
+              <w:t xml:space="preserve">141 ms</w:t>
             </w:r>
           </w:p>
         </w:tc>
@@ -5219,7 +5219,7 @@
                 <w:sz w:val="14"/>
                 <w:szCs w:val="14"/>
               </w:rPr>
-              <w:t xml:space="preserve">14 ms</w:t>
+              <w:t xml:space="preserve">13 ms</w:t>
             </w:r>
           </w:p>
         </w:tc>
@@ -5361,7 +5361,7 @@
                 <w:sz w:val="14"/>
                 <w:szCs w:val="14"/>
               </w:rPr>
-              <w:t xml:space="preserve">122 ms</w:t>
+              <w:t xml:space="preserve">108 ms</w:t>
             </w:r>
           </w:p>
         </w:tc>
@@ -5464,7 +5464,7 @@
                 <w:sz w:val="17"/>
                 <w:szCs w:val="17"/>
               </w:rPr>
-              <w:t xml:space="preserve">signature liée à l'instantané cmshcoim…, empreinte attestée 3767 CD80 ACC9, manifestation « Testeur QA1 (QA1) · Approuvé · 06/08/2026 10:05:39 UTC · enregistrement 3767 CD80 ACC9 »</w:t>
+              <w:t xml:space="preserve">signature liée à l'instantané cmshdwut…, empreinte attestée 3767 CD80 ACC9, manifestation « Testeur QA1 (QA1) · Approuvé · 06/08/2026 10:40:08 UTC · enregistrement 3767 CD80 ACC9 »</w:t>
             </w:r>
           </w:p>
         </w:tc>
@@ -5503,7 +5503,7 @@
                 <w:sz w:val="14"/>
                 <w:szCs w:val="14"/>
               </w:rPr>
-              <w:t xml:space="preserve">48 ms</w:t>
+              <w:t xml:space="preserve">42 ms</w:t>
             </w:r>
           </w:p>
         </w:tc>
@@ -5606,7 +5606,7 @@
                 <w:sz w:val="17"/>
                 <w:szCs w:val="17"/>
               </w:rPr>
-              <w:t xml:space="preserve">10488 octets relus à l'identique ; inversion d'un octet en position 5244 détectée</w:t>
+              <w:t xml:space="preserve">10486 octets relus à l'identique ; inversion d'un octet en position 5243 détectée</w:t>
             </w:r>
           </w:p>
         </w:tc>
@@ -5645,7 +5645,7 @@
                 <w:sz w:val="14"/>
                 <w:szCs w:val="14"/>
               </w:rPr>
-              <w:t xml:space="preserve">58 ms</w:t>
+              <w:t xml:space="preserve">49 ms</w:t>
             </w:r>
           </w:p>
         </w:tc>
@@ -5787,7 +5787,7 @@
                 <w:sz w:val="14"/>
                 <w:szCs w:val="14"/>
               </w:rPr>
-              <w:t xml:space="preserve">59 ms</w:t>
+              <w:t xml:space="preserve">51 ms</w:t>
             </w:r>
           </w:p>
         </w:tc>
@@ -5929,7 +5929,7 @@
                 <w:sz w:val="14"/>
                 <w:szCs w:val="14"/>
               </w:rPr>
-              <w:t xml:space="preserve">63 ms</w:t>
+              <w:t xml:space="preserve">46 ms</w:t>
             </w:r>
           </w:p>
         </w:tc>
@@ -6071,7 +6071,7 @@
                 <w:sz w:val="14"/>
                 <w:szCs w:val="14"/>
               </w:rPr>
-              <w:t xml:space="preserve">85 ms</w:t>
+              <w:t xml:space="preserve">79 ms</w:t>
             </w:r>
           </w:p>
         </w:tc>
@@ -6174,7 +6174,7 @@
                 <w:sz w:val="17"/>
                 <w:szCs w:val="17"/>
               </w:rPr>
-              <w:t xml:space="preserve">2 instantanés conservés : le gel de revue reste lisible (10495 o, dépassé), l'enregistrement approuvé porte la même empreinte de contenu</w:t>
+              <w:t xml:space="preserve">2 instantanés conservés : le gel de revue reste lisible (10496 o, dépassé), l'enregistrement approuvé porte la même empreinte de contenu</w:t>
             </w:r>
           </w:p>
         </w:tc>
@@ -6213,7 +6213,7 @@
                 <w:sz w:val="14"/>
                 <w:szCs w:val="14"/>
               </w:rPr>
-              <w:t xml:space="preserve">86 ms</w:t>
+              <w:t xml:space="preserve">74 ms</w:t>
             </w:r>
           </w:p>
         </w:tc>
@@ -6355,7 +6355,7 @@
                 <w:sz w:val="14"/>
                 <w:szCs w:val="14"/>
               </w:rPr>
-              <w:t xml:space="preserve">82 ms</w:t>
+              <w:t xml:space="preserve">66 ms</w:t>
             </w:r>
           </w:p>
         </w:tc>
@@ -6497,7 +6497,7 @@
                 <w:sz w:val="14"/>
                 <w:szCs w:val="14"/>
               </w:rPr>
-              <w:t xml:space="preserve">29 ms</w:t>
+              <w:t xml:space="preserve">24 ms</w:t>
             </w:r>
           </w:p>
         </w:tc>
@@ -6639,7 +6639,7 @@
                 <w:sz w:val="14"/>
                 <w:szCs w:val="14"/>
               </w:rPr>
-              <w:t xml:space="preserve">29 ms</w:t>
+              <w:t xml:space="preserve">24 ms</w:t>
             </w:r>
           </w:p>
         </w:tc>
@@ -7065,7 +7065,7 @@
                 <w:sz w:val="14"/>
                 <w:szCs w:val="14"/>
               </w:rPr>
-              <w:t xml:space="preserve">352 ms</w:t>
+              <w:t xml:space="preserve">308 ms</w:t>
             </w:r>
           </w:p>
         </w:tc>
@@ -7168,7 +7168,7 @@
                 <w:sz w:val="17"/>
                 <w:szCs w:val="17"/>
               </w:rPr>
-              <w:t xml:space="preserve">13 enregistrement(s) archivé(s), 29 fichier(s) couverts par empreintes.sha256, 0 écart ; ancre 2cf9ad9208d004c1… ; octets du gel restitués à l'identique ; altération d'un octet détectée et signalée ALTÉRÉ, fichier conservé dans l'archive</w:t>
+              <w:t xml:space="preserve">13 enregistrement(s) archivé(s), 29 fichier(s) couverts par empreintes.sha256, 0 écart ; ancre b5e0acc3f3be422d… ; octets du gel restitués à l'identique ; altération d'un octet détectée et signalée ALTÉRÉ, fichier conservé dans l'archive</w:t>
             </w:r>
           </w:p>
         </w:tc>
@@ -7207,7 +7207,7 @@
                 <w:sz w:val="14"/>
                 <w:szCs w:val="14"/>
               </w:rPr>
-              <w:t xml:space="preserve">234 ms</w:t>
+              <w:t xml:space="preserve">202 ms</w:t>
             </w:r>
           </w:p>
         </w:tc>
@@ -7349,7 +7349,7 @@
                 <w:sz w:val="14"/>
                 <w:szCs w:val="14"/>
               </w:rPr>
-              <w:t xml:space="preserve">13 ms</w:t>
+              <w:t xml:space="preserve">12 ms</w:t>
             </w:r>
           </w:p>
         </w:tc>
@@ -7491,7 +7491,7 @@
                 <w:sz w:val="14"/>
                 <w:szCs w:val="14"/>
               </w:rPr>
-              <w:t xml:space="preserve">139 ms</w:t>
+              <w:t xml:space="preserve">156 ms</w:t>
             </w:r>
           </w:p>
         </w:tc>
@@ -7633,7 +7633,7 @@
                 <w:sz w:val="14"/>
                 <w:szCs w:val="14"/>
               </w:rPr>
-              <w:t xml:space="preserve">160 ms</w:t>
+              <w:t xml:space="preserve">154 ms</w:t>
             </w:r>
           </w:p>
         </w:tc>
@@ -7917,7 +7917,7 @@
                 <w:sz w:val="14"/>
                 <w:szCs w:val="14"/>
               </w:rPr>
-              <w:t xml:space="preserve">0 ms</w:t>
+              <w:t xml:space="preserve">1 ms</w:t>
             </w:r>
           </w:p>
         </w:tc>
@@ -8059,7 +8059,7 @@
                 <w:sz w:val="14"/>
                 <w:szCs w:val="14"/>
               </w:rPr>
-              <w:t xml:space="preserve">29 ms</w:t>
+              <w:t xml:space="preserve">24 ms</w:t>
             </w:r>
           </w:p>
         </w:tc>
@@ -8162,7 +8162,7 @@
                 <w:sz w:val="17"/>
                 <w:szCs w:val="17"/>
               </w:rPr>
-              <w:t xml:space="preserve">187 fichier(s) source relus, aucune écriture dans la piste hors du module ; 9 empreintes comparées entre l'implémentation TypeScript et le miroir de la console serveur, toutes identiques</w:t>
+              <w:t xml:space="preserve">188 fichier(s) source relus, aucune écriture dans la piste hors du module ; 9 empreintes comparées entre l'implémentation TypeScript et le miroir de la console serveur, toutes identiques</w:t>
             </w:r>
           </w:p>
         </w:tc>
@@ -8201,7 +8201,7 @@
                 <w:sz w:val="14"/>
                 <w:szCs w:val="14"/>
               </w:rPr>
-              <w:t xml:space="preserve">26 ms</w:t>
+              <w:t xml:space="preserve">25 ms</w:t>
             </w:r>
           </w:p>
         </w:tc>
@@ -8485,7 +8485,7 @@
                 <w:sz w:val="14"/>
                 <w:szCs w:val="14"/>
               </w:rPr>
-              <w:t xml:space="preserve">7 ms</w:t>
+              <w:t xml:space="preserve">8 ms</w:t>
             </w:r>
           </w:p>
         </w:tc>
@@ -8627,7 +8627,7 @@
                 <w:sz w:val="14"/>
                 <w:szCs w:val="14"/>
               </w:rPr>
-              <w:t xml:space="preserve">247 ms</w:t>
+              <w:t xml:space="preserve">240 ms</w:t>
             </w:r>
           </w:p>
         </w:tc>
@@ -8730,7 +8730,7 @@
                 <w:sz w:val="17"/>
                 <w:szCs w:val="17"/>
               </w:rPr>
-              <w:t xml:space="preserve">187 fichier(s) source relus : aucune écriture de mot de passe hors des chemins autorisés ; une seule écriture dans les actions serveur, le changement personnel, qui exige l'ancien mot de passe ; l'outil d'urgence de la console émet un jeton et ne sait plus dériver de mot de passe ; aucun champ de mot de passe hors des 6 écrans où l'on saisit le sien</w:t>
+              <w:t xml:space="preserve">188 fichier(s) source relus : aucune écriture de mot de passe hors des chemins autorisés ; une seule écriture dans les actions serveur, le changement personnel, qui exige l'ancien mot de passe ; l'outil d'urgence de la console émet un jeton et ne sait plus dériver de mot de passe ; aucun champ de mot de passe hors des 6 écrans où l'on saisit le sien</w:t>
             </w:r>
           </w:p>
         </w:tc>
@@ -8911,7 +8911,7 @@
                 <w:sz w:val="14"/>
                 <w:szCs w:val="14"/>
               </w:rPr>
-              <w:t xml:space="preserve">8916 ms</w:t>
+              <w:t xml:space="preserve">8768 ms</w:t>
             </w:r>
           </w:p>
         </w:tc>
@@ -12077,7 +12077,7 @@
         <w:sz w:val="15"/>
         <w:szCs w:val="15"/>
       </w:rPr>
-      <w:t xml:space="preserve">   ·   Version 1.2.1 · rapport OQ exécuté le 6 août 2026 à 10:05 UTC</w:t>
+      <w:t xml:space="preserve">   ·   Version 1.2.1 · rapport OQ exécuté le 6 août 2026 à 10:40 UTC</w:t>
     </w:r>
   </w:p>
 </w:ftr>

</xml_diff>

<commit_message>
Note de tenue sous charge : mesurée, et ce qui n'est pas mesuré
Nouveau document téléchargeable, bilingue. Le logiciel est caractérisé
jusqu'à 50 143 entrées de piste d'audit : l'écriture ne se dégrade pas
(2,3 ms constant), la vérification de la chaîne d'audit est linéaire et
atteint 800 ms au dernier palier — elle est rejouée à chaque affichage de
l'écran d'audit.

La note nomme aussi ce qu'elle ne mesure pas, à commencer par les
utilisateurs simultanés.

Co-Authored-By: Claude Opus 5 <noreply@anthropic.com>
</commit_message>
<xml_diff>
--- a/docs/Dossier_de_validation_Filum.docx
+++ b/docs/Dossier_de_validation_Filum.docx
@@ -4456,7 +4456,7 @@
                 <w:sz w:val="17"/>
                 <w:szCs w:val="17"/>
               </w:rPr>
-              <w:t xml:space="preserve">6 août 2026 à 10:40</w:t>
+              <w:t xml:space="preserve">6 août 2026 à 11:23</w:t>
             </w:r>
           </w:p>
         </w:tc>
@@ -5038,7 +5038,7 @@
                 <w:sz w:val="17"/>
                 <w:szCs w:val="17"/>
               </w:rPr>
-              <w:t xml:space="preserve">empreintes distinctes pour un même mot de passe (3ada9e146eb2… ≠ ab0bef13d11f…), vérification correcte, mot de passe faux et vide refusés</w:t>
+              <w:t xml:space="preserve">empreintes distinctes pour un même mot de passe (eacb5a49b286… ≠ 5ccbc7567c99…), vérification correcte, mot de passe faux et vide refusés</w:t>
             </w:r>
           </w:p>
         </w:tc>
@@ -5077,7 +5077,7 @@
                 <w:sz w:val="14"/>
                 <w:szCs w:val="14"/>
               </w:rPr>
-              <w:t xml:space="preserve">141 ms</w:t>
+              <w:t xml:space="preserve">138 ms</w:t>
             </w:r>
           </w:p>
         </w:tc>
@@ -5361,7 +5361,7 @@
                 <w:sz w:val="14"/>
                 <w:szCs w:val="14"/>
               </w:rPr>
-              <w:t xml:space="preserve">108 ms</w:t>
+              <w:t xml:space="preserve">107 ms</w:t>
             </w:r>
           </w:p>
         </w:tc>
@@ -5464,7 +5464,7 @@
                 <w:sz w:val="17"/>
                 <w:szCs w:val="17"/>
               </w:rPr>
-              <w:t xml:space="preserve">signature liée à l'instantané cmshdwut…, empreinte attestée 3767 CD80 ACC9, manifestation « Testeur QA1 (QA1) · Approuvé · 06/08/2026 10:40:08 UTC · enregistrement 3767 CD80 ACC9 »</w:t>
+              <w:t xml:space="preserve">signature liée à l'instantané cmshffrm…, empreinte attestée 3767 CD80 ACC9, manifestation « Testeur QA1 (QA1) · Approuvé · 06/08/2026 11:22:50 UTC · enregistrement 3767 CD80 ACC9 »</w:t>
             </w:r>
           </w:p>
         </w:tc>
@@ -5503,7 +5503,7 @@
                 <w:sz w:val="14"/>
                 <w:szCs w:val="14"/>
               </w:rPr>
-              <w:t xml:space="preserve">42 ms</w:t>
+              <w:t xml:space="preserve">43 ms</w:t>
             </w:r>
           </w:p>
         </w:tc>
@@ -5606,7 +5606,7 @@
                 <w:sz w:val="17"/>
                 <w:szCs w:val="17"/>
               </w:rPr>
-              <w:t xml:space="preserve">10486 octets relus à l'identique ; inversion d'un octet en position 5243 détectée</w:t>
+              <w:t xml:space="preserve">10487 octets relus à l'identique ; inversion d'un octet en position 5243 détectée</w:t>
             </w:r>
           </w:p>
         </w:tc>
@@ -5929,7 +5929,7 @@
                 <w:sz w:val="14"/>
                 <w:szCs w:val="14"/>
               </w:rPr>
-              <w:t xml:space="preserve">46 ms</w:t>
+              <w:t xml:space="preserve">47 ms</w:t>
             </w:r>
           </w:p>
         </w:tc>
@@ -6071,7 +6071,7 @@
                 <w:sz w:val="14"/>
                 <w:szCs w:val="14"/>
               </w:rPr>
-              <w:t xml:space="preserve">79 ms</w:t>
+              <w:t xml:space="preserve">72 ms</w:t>
             </w:r>
           </w:p>
         </w:tc>
@@ -6213,7 +6213,7 @@
                 <w:sz w:val="14"/>
                 <w:szCs w:val="14"/>
               </w:rPr>
-              <w:t xml:space="preserve">74 ms</w:t>
+              <w:t xml:space="preserve">76 ms</w:t>
             </w:r>
           </w:p>
         </w:tc>
@@ -6355,7 +6355,7 @@
                 <w:sz w:val="14"/>
                 <w:szCs w:val="14"/>
               </w:rPr>
-              <w:t xml:space="preserve">66 ms</w:t>
+              <w:t xml:space="preserve">68 ms</w:t>
             </w:r>
           </w:p>
         </w:tc>
@@ -6639,7 +6639,7 @@
                 <w:sz w:val="14"/>
                 <w:szCs w:val="14"/>
               </w:rPr>
-              <w:t xml:space="preserve">24 ms</w:t>
+              <w:t xml:space="preserve">22 ms</w:t>
             </w:r>
           </w:p>
         </w:tc>
@@ -6923,7 +6923,7 @@
                 <w:sz w:val="14"/>
                 <w:szCs w:val="14"/>
               </w:rPr>
-              <w:t xml:space="preserve">1 ms</w:t>
+              <w:t xml:space="preserve">0 ms</w:t>
             </w:r>
           </w:p>
         </w:tc>
@@ -7065,7 +7065,7 @@
                 <w:sz w:val="14"/>
                 <w:szCs w:val="14"/>
               </w:rPr>
-              <w:t xml:space="preserve">308 ms</w:t>
+              <w:t xml:space="preserve">301 ms</w:t>
             </w:r>
           </w:p>
         </w:tc>
@@ -7168,7 +7168,7 @@
                 <w:sz w:val="17"/>
                 <w:szCs w:val="17"/>
               </w:rPr>
-              <w:t xml:space="preserve">13 enregistrement(s) archivé(s), 29 fichier(s) couverts par empreintes.sha256, 0 écart ; ancre b5e0acc3f3be422d… ; octets du gel restitués à l'identique ; altération d'un octet détectée et signalée ALTÉRÉ, fichier conservé dans l'archive</w:t>
+              <w:t xml:space="preserve">13 enregistrement(s) archivé(s), 29 fichier(s) couverts par empreintes.sha256, 0 écart ; ancre 67bd2e669502d114… ; octets du gel restitués à l'identique ; altération d'un octet détectée et signalée ALTÉRÉ, fichier conservé dans l'archive</w:t>
             </w:r>
           </w:p>
         </w:tc>
@@ -7207,7 +7207,7 @@
                 <w:sz w:val="14"/>
                 <w:szCs w:val="14"/>
               </w:rPr>
-              <w:t xml:space="preserve">202 ms</w:t>
+              <w:t xml:space="preserve">226 ms</w:t>
             </w:r>
           </w:p>
         </w:tc>
@@ -7491,7 +7491,7 @@
                 <w:sz w:val="14"/>
                 <w:szCs w:val="14"/>
               </w:rPr>
-              <w:t xml:space="preserve">156 ms</w:t>
+              <w:t xml:space="preserve">144 ms</w:t>
             </w:r>
           </w:p>
         </w:tc>
@@ -7633,7 +7633,7 @@
                 <w:sz w:val="14"/>
                 <w:szCs w:val="14"/>
               </w:rPr>
-              <w:t xml:space="preserve">154 ms</w:t>
+              <w:t xml:space="preserve">157 ms</w:t>
             </w:r>
           </w:p>
         </w:tc>
@@ -7736,7 +7736,7 @@
                 <w:sz w:val="17"/>
                 <w:szCs w:val="17"/>
               </w:rPr>
-              <w:t xml:space="preserve">requête DER de 90 octets portant l'empreinte demandée ; jeton de 2418 octets lu exactement (date 2026-08-03T08:55:03.000Z, série 02, politique 1.3.6.1.4.1.99999.1.1) ; quatre refus obtenus : autre empreinte, autre nonce, réponse de rejet de l'autorité, jeton tronqué</w:t>
+              <w:t xml:space="preserve">requête DER de 89 octets portant l'empreinte demandée ; jeton de 2418 octets lu exactement (date 2026-08-03T08:55:03.000Z, série 02, politique 1.3.6.1.4.1.99999.1.1) ; quatre refus obtenus : autre empreinte, autre nonce, réponse de rejet de l'autorité, jeton tronqué</w:t>
             </w:r>
           </w:p>
         </w:tc>
@@ -7775,7 +7775,7 @@
                 <w:sz w:val="14"/>
                 <w:szCs w:val="14"/>
               </w:rPr>
-              <w:t xml:space="preserve">2 ms</w:t>
+              <w:t xml:space="preserve">1 ms</w:t>
             </w:r>
           </w:p>
         </w:tc>
@@ -8162,7 +8162,7 @@
                 <w:sz w:val="17"/>
                 <w:szCs w:val="17"/>
               </w:rPr>
-              <w:t xml:space="preserve">188 fichier(s) source relus, aucune écriture dans la piste hors du module ; 9 empreintes comparées entre l'implémentation TypeScript et le miroir de la console serveur, toutes identiques</w:t>
+              <w:t xml:space="preserve">190 fichier(s) source relus, aucune écriture dans la piste hors du module ; 9 empreintes comparées entre l'implémentation TypeScript et le miroir de la console serveur, toutes identiques</w:t>
             </w:r>
           </w:p>
         </w:tc>
@@ -8201,7 +8201,7 @@
                 <w:sz w:val="14"/>
                 <w:szCs w:val="14"/>
               </w:rPr>
-              <w:t xml:space="preserve">25 ms</w:t>
+              <w:t xml:space="preserve">23 ms</w:t>
             </w:r>
           </w:p>
         </w:tc>
@@ -8343,7 +8343,7 @@
                 <w:sz w:val="14"/>
                 <w:szCs w:val="14"/>
               </w:rPr>
-              <w:t xml:space="preserve">0 ms</w:t>
+              <w:t xml:space="preserve">1 ms</w:t>
             </w:r>
           </w:p>
         </w:tc>
@@ -8485,7 +8485,7 @@
                 <w:sz w:val="14"/>
                 <w:szCs w:val="14"/>
               </w:rPr>
-              <w:t xml:space="preserve">8 ms</w:t>
+              <w:t xml:space="preserve">7 ms</w:t>
             </w:r>
           </w:p>
         </w:tc>
@@ -8627,7 +8627,7 @@
                 <w:sz w:val="14"/>
                 <w:szCs w:val="14"/>
               </w:rPr>
-              <w:t xml:space="preserve">240 ms</w:t>
+              <w:t xml:space="preserve">222 ms</w:t>
             </w:r>
           </w:p>
         </w:tc>
@@ -8730,7 +8730,7 @@
                 <w:sz w:val="17"/>
                 <w:szCs w:val="17"/>
               </w:rPr>
-              <w:t xml:space="preserve">188 fichier(s) source relus : aucune écriture de mot de passe hors des chemins autorisés ; une seule écriture dans les actions serveur, le changement personnel, qui exige l'ancien mot de passe ; l'outil d'urgence de la console émet un jeton et ne sait plus dériver de mot de passe ; aucun champ de mot de passe hors des 6 écrans où l'on saisit le sien</w:t>
+              <w:t xml:space="preserve">190 fichier(s) source relus : aucune écriture de mot de passe hors des chemins autorisés ; une seule écriture dans les actions serveur, le changement personnel, qui exige l'ancien mot de passe ; l'outil d'urgence de la console émet un jeton et ne sait plus dériver de mot de passe ; aucun champ de mot de passe hors des 6 écrans où l'on saisit le sien</w:t>
             </w:r>
           </w:p>
         </w:tc>
@@ -8911,7 +8911,7 @@
                 <w:sz w:val="14"/>
                 <w:szCs w:val="14"/>
               </w:rPr>
-              <w:t xml:space="preserve">8768 ms</w:t>
+              <w:t xml:space="preserve">8888 ms</w:t>
             </w:r>
           </w:p>
         </w:tc>
@@ -9053,7 +9053,7 @@
                 <w:sz w:val="14"/>
                 <w:szCs w:val="14"/>
               </w:rPr>
-              <w:t xml:space="preserve">24 ms</w:t>
+              <w:t xml:space="preserve">20 ms</w:t>
             </w:r>
           </w:p>
         </w:tc>
@@ -11959,7 +11959,7 @@
           <w:sz w:val="20"/>
           <w:szCs w:val="20"/>
         </w:rPr>
-        <w:t xml:space="preserve">— La performance sous charge n'est pas qualifiée ici : les mesures de montée en charge existent mais relèvent de l'exploitation, pas de la validation fonctionnelle.</w:t>
+        <w:t xml:space="preserve">— La tenue sous charge fait l'objet d'une campagne mesurée à part, remise avec ce dossier (note de tenue sous charge) : le logiciel est caractérisé jusqu'à 50 143 entrées de piste d'audit. Ce qui n'y est PAS mesuré est nommé dans la note, à commencer par les utilisateurs simultanés — SQLite n'admet qu'un écrivain à la fois. Au-delà du domaine mesuré, le comportement n'est pas caractérisé.</w:t>
       </w:r>
     </w:p>
     <w:p>
@@ -12077,7 +12077,7 @@
         <w:sz w:val="15"/>
         <w:szCs w:val="15"/>
       </w:rPr>
-      <w:t xml:space="preserve">   ·   Version 1.2.1 · rapport OQ exécuté le 6 août 2026 à 10:40 UTC</w:t>
+      <w:t xml:space="preserve">   ·   Version 1.2.1 · rapport OQ exécuté le 6 août 2026 à 11:23 UTC</w:t>
     </w:r>
   </w:p>
 </w:ftr>

</xml_diff>

<commit_message>
34 exigences, 31 cas : la copie d'archivage PDF/A entre dans le dossier
Chaque enregistrement figé emporte dans l'archive d'inspection une copie
PDF/A-2b, police et profil colorimétrique embarqués — elle se lit sans
outil bureautique et porte les empreintes du .docx qui fait foi.

Le dossier de validation nomme la limite : aucun validateur indépendant
n'a été exécuté sur ces sorties. Format visé et contrôlé, pas certifié.

Co-Authored-By: Claude Opus 5 <noreply@anthropic.com>
</commit_message>
<xml_diff>
--- a/docs/Dossier_de_validation_Filum.docx
+++ b/docs/Dossier_de_validation_Filum.docx
@@ -430,7 +430,7 @@
           <w:sz w:val="20"/>
           <w:szCs w:val="20"/>
         </w:rPr>
-        <w:t xml:space="preserve">Les 33 exigences ci-dessous énoncent ce que le logiciel doit faire. Le niveau de risque est celui de la DÉFAILLANCE de l'exigence, pas de son importance commerciale : il détermine la profondeur de vérification.</w:t>
+        <w:t xml:space="preserve">Les 34 exigences ci-dessous énoncent ce que le logiciel doit faire. Le niveau de risque est celui de la DÉFAILLANCE de l'exigence, pas de son importance commerciale : il détermine la profondeur de vérification.</w:t>
       </w:r>
     </w:p>
     <w:tbl>
@@ -4286,6 +4286,119 @@
           </w:p>
         </w:tc>
       </w:tr>
+      <w:tr>
+        <w:tc>
+          <w:tcPr>
+            <w:tcW w:type="pct" w:w="11%"/>
+            <w:shd w:fill="F8FAFC"/>
+            <w:tcMar>
+              <w:top w:type="dxa" w:w="80"/>
+              <w:left w:type="dxa" w:w="110"/>
+              <w:bottom w:type="dxa" w:w="80"/>
+              <w:right w:type="dxa" w:w="110"/>
+            </w:tcMar>
+          </w:tcPr>
+          <w:p>
+            <w:pPr>
+              <w:spacing w:after="60"/>
+            </w:pPr>
+            <w:r>
+              <w:rPr>
+                <w:b/>
+                <w:bCs/>
+                <w:color w:val="4338CA"/>
+                <w:sz w:val="17"/>
+                <w:szCs w:val="17"/>
+              </w:rPr>
+              <w:t xml:space="preserve">URS-34</w:t>
+            </w:r>
+          </w:p>
+          <w:p>
+            <w:pPr>
+              <w:spacing w:after="0"/>
+            </w:pPr>
+            <w:r>
+              <w:rPr>
+                <w:b/>
+                <w:bCs/>
+                <w:color w:val="B45309"/>
+                <w:sz w:val="15"/>
+                <w:szCs w:val="15"/>
+              </w:rPr>
+              <w:t xml:space="preserve">Moyen</w:t>
+            </w:r>
+          </w:p>
+        </w:tc>
+        <w:tc>
+          <w:tcPr>
+            <w:tcW w:type="pct" w:w="41%"/>
+            <w:tcMar>
+              <w:top w:type="dxa" w:w="80"/>
+              <w:left w:type="dxa" w:w="110"/>
+              <w:bottom w:type="dxa" w:w="80"/>
+              <w:right w:type="dxa" w:w="110"/>
+            </w:tcMar>
+          </w:tcPr>
+          <w:p>
+            <w:pPr>
+              <w:spacing w:after="0"/>
+            </w:pPr>
+            <w:r>
+              <w:rPr>
+                <w:sz w:val="17"/>
+                <w:szCs w:val="17"/>
+              </w:rPr>
+              <w:t xml:space="preserve">Chaque enregistrement figé emporte dans l'archive d'inspection une copie d'archivage au format PDF/A-2b : police embarquée, profil colorimétrique embarqué, métadonnées déclarant la partie et le niveau de conformité, identifiant de fichier, aucun chiffrement ni script. La copie porte les empreintes du contenu et du fichier, énonce qu'elle n'est pas l'enregistrement, et son texte se retraduit en caractères par sa propre table de correspondance.</w:t>
+            </w:r>
+          </w:p>
+        </w:tc>
+        <w:tc>
+          <w:tcPr>
+            <w:tcW w:type="pct" w:w="28%"/>
+            <w:tcMar>
+              <w:top w:type="dxa" w:w="80"/>
+              <w:left w:type="dxa" w:w="110"/>
+              <w:bottom w:type="dxa" w:w="80"/>
+              <w:right w:type="dxa" w:w="110"/>
+            </w:tcMar>
+          </w:tcPr>
+          <w:p>
+            <w:pPr>
+              <w:spacing w:after="0"/>
+            </w:pPr>
+            <w:r>
+              <w:rPr>
+                <w:sz w:val="17"/>
+                <w:szCs w:val="17"/>
+              </w:rPr>
+              <w:t xml:space="preserve">L'enregistrement qui fait foi est un .docx, et sa lisibilité dans dix ans dépend d'un logiciel bureautique dont rien ne garantit l'existence. Le risque n'est pas la perte de la donnée — les octets sont conservés et leur empreinte est signée — mais l'impossibilité de la LIRE au moment d'une inspection. Une copie qui prétendrait être l'enregistrement serait pire que pas de copie : la signature porte sur l'empreinte du contenu gelé, et confondre les deux romprait la chaîne de preuve.</w:t>
+            </w:r>
+          </w:p>
+        </w:tc>
+        <w:tc>
+          <w:tcPr>
+            <w:tcW w:type="pct" w:w="20%"/>
+            <w:tcMar>
+              <w:top w:type="dxa" w:w="80"/>
+              <w:left w:type="dxa" w:w="110"/>
+              <w:bottom w:type="dxa" w:w="80"/>
+              <w:right w:type="dxa" w:w="110"/>
+            </w:tcMar>
+          </w:tcPr>
+          <w:p>
+            <w:pPr>
+              <w:spacing w:after="0"/>
+            </w:pPr>
+            <w:r>
+              <w:rPr>
+                <w:sz w:val="17"/>
+                <w:szCs w:val="17"/>
+              </w:rPr>
+              <w:t xml:space="preserve">21 CFR 11.10(b) · 21 CFR 11.10(c)</w:t>
+            </w:r>
+          </w:p>
+        </w:tc>
+      </w:tr>
     </w:tbl>
     <w:p>
       <w:pPr>
@@ -4305,7 +4418,7 @@
           <w:sz w:val="20"/>
           <w:szCs w:val="20"/>
         </w:rPr>
-        <w:t xml:space="preserve">Répartition : 22 exigences à risque haut, 9 à risque moyen, 2 à risque bas. Les exigences à risque haut touchent toutes à l'intégrité ou à l'attribution des enregistrements : leur défaillance ne dégrade pas le confort d'usage, elle rend un enregistrement indéfendable. Elles font l'objet de cas de test dédiés, exécutés à chaque version.</w:t>
+        <w:t xml:space="preserve">Répartition : 22 exigences à risque haut, 10 à risque moyen, 2 à risque bas. Les exigences à risque haut touchent toutes à l'intégrité ou à l'attribution des enregistrements : leur défaillance ne dégrade pas le confort d'usage, elle rend un enregistrement indéfendable. Elles font l'objet de cas de test dédiés, exécutés à chaque version.</w:t>
       </w:r>
     </w:p>
     <w:p>
@@ -4456,7 +4569,7 @@
                 <w:sz w:val="17"/>
                 <w:szCs w:val="17"/>
               </w:rPr>
-              <w:t xml:space="preserve">6 août 2026 à 11:23</w:t>
+              <w:t xml:space="preserve">6 août 2026 à 12:48</w:t>
             </w:r>
           </w:p>
         </w:tc>
@@ -4659,7 +4772,7 @@
                 <w:sz w:val="17"/>
                 <w:szCs w:val="17"/>
               </w:rPr>
-              <w:t xml:space="preserve">30 cas sur 30 conformes — aucun écart</w:t>
+              <w:t xml:space="preserve">31 cas sur 31 conformes — aucun écart</w:t>
             </w:r>
           </w:p>
         </w:tc>
@@ -5038,7 +5151,7 @@
                 <w:sz w:val="17"/>
                 <w:szCs w:val="17"/>
               </w:rPr>
-              <w:t xml:space="preserve">empreintes distinctes pour un même mot de passe (eacb5a49b286… ≠ 5ccbc7567c99…), vérification correcte, mot de passe faux et vide refusés</w:t>
+              <w:t xml:space="preserve">empreintes distinctes pour un même mot de passe (e35a7a10d9dc… ≠ bc6b81eaf761…), vérification correcte, mot de passe faux et vide refusés</w:t>
             </w:r>
           </w:p>
         </w:tc>
@@ -5077,7 +5190,7 @@
                 <w:sz w:val="14"/>
                 <w:szCs w:val="14"/>
               </w:rPr>
-              <w:t xml:space="preserve">138 ms</w:t>
+              <w:t xml:space="preserve">134 ms</w:t>
             </w:r>
           </w:p>
         </w:tc>
@@ -5219,7 +5332,7 @@
                 <w:sz w:val="14"/>
                 <w:szCs w:val="14"/>
               </w:rPr>
-              <w:t xml:space="preserve">13 ms</w:t>
+              <w:t xml:space="preserve">14 ms</w:t>
             </w:r>
           </w:p>
         </w:tc>
@@ -5322,7 +5435,7 @@
                 <w:sz w:val="17"/>
                 <w:szCs w:val="17"/>
               </w:rPr>
-              <w:t xml:space="preserve">contenu gelé, empreinte 24604eb157d7fa54…, 10485 octets conservés, opération journalisée</w:t>
+              <w:t xml:space="preserve">contenu gelé, empreinte 24604eb157d7fa54…, 10488 octets conservés, opération journalisée</w:t>
             </w:r>
           </w:p>
         </w:tc>
@@ -5361,7 +5474,7 @@
                 <w:sz w:val="14"/>
                 <w:szCs w:val="14"/>
               </w:rPr>
-              <w:t xml:space="preserve">107 ms</w:t>
+              <w:t xml:space="preserve">105 ms</w:t>
             </w:r>
           </w:p>
         </w:tc>
@@ -5464,7 +5577,7 @@
                 <w:sz w:val="17"/>
                 <w:szCs w:val="17"/>
               </w:rPr>
-              <w:t xml:space="preserve">signature liée à l'instantané cmshffrm…, empreinte attestée 3767 CD80 ACC9, manifestation « Testeur QA1 (QA1) · Approuvé · 06/08/2026 11:22:50 UTC · enregistrement 3767 CD80 ACC9 »</w:t>
+              <w:t xml:space="preserve">signature liée à l'instantané cmshihvb…, empreinte attestée 3767 CD80 ACC9, manifestation « Testeur QA1 (QA1) · Approuvé · 06/08/2026 12:48:27 UTC · enregistrement 3767 CD80 ACC9 »</w:t>
             </w:r>
           </w:p>
         </w:tc>
@@ -5503,7 +5616,7 @@
                 <w:sz w:val="14"/>
                 <w:szCs w:val="14"/>
               </w:rPr>
-              <w:t xml:space="preserve">43 ms</w:t>
+              <w:t xml:space="preserve">41 ms</w:t>
             </w:r>
           </w:p>
         </w:tc>
@@ -5606,7 +5719,7 @@
                 <w:sz w:val="17"/>
                 <w:szCs w:val="17"/>
               </w:rPr>
-              <w:t xml:space="preserve">10487 octets relus à l'identique ; inversion d'un octet en position 5243 détectée</w:t>
+              <w:t xml:space="preserve">10488 octets relus à l'identique ; inversion d'un octet en position 5244 détectée</w:t>
             </w:r>
           </w:p>
         </w:tc>
@@ -5645,7 +5758,7 @@
                 <w:sz w:val="14"/>
                 <w:szCs w:val="14"/>
               </w:rPr>
-              <w:t xml:space="preserve">49 ms</w:t>
+              <w:t xml:space="preserve">51 ms</w:t>
             </w:r>
           </w:p>
         </w:tc>
@@ -5787,7 +5900,7 @@
                 <w:sz w:val="14"/>
                 <w:szCs w:val="14"/>
               </w:rPr>
-              <w:t xml:space="preserve">51 ms</w:t>
+              <w:t xml:space="preserve">50 ms</w:t>
             </w:r>
           </w:p>
         </w:tc>
@@ -5929,7 +6042,7 @@
                 <w:sz w:val="14"/>
                 <w:szCs w:val="14"/>
               </w:rPr>
-              <w:t xml:space="preserve">47 ms</w:t>
+              <w:t xml:space="preserve">43 ms</w:t>
             </w:r>
           </w:p>
         </w:tc>
@@ -6071,7 +6184,7 @@
                 <w:sz w:val="14"/>
                 <w:szCs w:val="14"/>
               </w:rPr>
-              <w:t xml:space="preserve">72 ms</w:t>
+              <w:t xml:space="preserve">70 ms</w:t>
             </w:r>
           </w:p>
         </w:tc>
@@ -6458,7 +6571,7 @@
                 <w:sz w:val="17"/>
                 <w:szCs w:val="17"/>
               </w:rPr>
-              <w:t xml:space="preserve">138 fichiers source inspectés : aucune modification ni suppression d'entrée ; 1 fichiers en écriture seule</w:t>
+              <w:t xml:space="preserve">143 fichiers source inspectés : aucune modification ni suppression d'entrée ; 1 fichiers en écriture seule</w:t>
             </w:r>
           </w:p>
         </w:tc>
@@ -6497,7 +6610,7 @@
                 <w:sz w:val="14"/>
                 <w:szCs w:val="14"/>
               </w:rPr>
-              <w:t xml:space="preserve">24 ms</w:t>
+              <w:t xml:space="preserve">26 ms</w:t>
             </w:r>
           </w:p>
         </w:tc>
@@ -6639,7 +6752,7 @@
                 <w:sz w:val="14"/>
                 <w:szCs w:val="14"/>
               </w:rPr>
-              <w:t xml:space="preserve">22 ms</w:t>
+              <w:t xml:space="preserve">23 ms</w:t>
             </w:r>
           </w:p>
         </w:tc>
@@ -6923,7 +7036,7 @@
                 <w:sz w:val="14"/>
                 <w:szCs w:val="14"/>
               </w:rPr>
-              <w:t xml:space="preserve">0 ms</w:t>
+              <w:t xml:space="preserve">1 ms</w:t>
             </w:r>
           </w:p>
         </w:tc>
@@ -7065,7 +7178,7 @@
                 <w:sz w:val="14"/>
                 <w:szCs w:val="14"/>
               </w:rPr>
-              <w:t xml:space="preserve">301 ms</w:t>
+              <w:t xml:space="preserve">310 ms</w:t>
             </w:r>
           </w:p>
         </w:tc>
@@ -7168,7 +7281,7 @@
                 <w:sz w:val="17"/>
                 <w:szCs w:val="17"/>
               </w:rPr>
-              <w:t xml:space="preserve">13 enregistrement(s) archivé(s), 29 fichier(s) couverts par empreintes.sha256, 0 écart ; ancre 67bd2e669502d114… ; octets du gel restitués à l'identique ; altération d'un octet détectée et signalée ALTÉRÉ, fichier conservé dans l'archive</w:t>
+              <w:t xml:space="preserve">13 enregistrement(s) archivé(s), 42 fichier(s) couverts par empreintes.sha256, 0 écart ; ancre 21f27befcc9b7839… ; octets du gel restitués à l'identique ; altération d'un octet détectée et signalée ALTÉRÉ, fichier conservé dans l'archive</w:t>
             </w:r>
           </w:p>
         </w:tc>
@@ -7207,7 +7320,7 @@
                 <w:sz w:val="14"/>
                 <w:szCs w:val="14"/>
               </w:rPr>
-              <w:t xml:space="preserve">226 ms</w:t>
+              <w:t xml:space="preserve">430 ms</w:t>
             </w:r>
           </w:p>
         </w:tc>
@@ -7349,7 +7462,7 @@
                 <w:sz w:val="14"/>
                 <w:szCs w:val="14"/>
               </w:rPr>
-              <w:t xml:space="preserve">12 ms</w:t>
+              <w:t xml:space="preserve">13 ms</w:t>
             </w:r>
           </w:p>
         </w:tc>
@@ -7491,7 +7604,7 @@
                 <w:sz w:val="14"/>
                 <w:szCs w:val="14"/>
               </w:rPr>
-              <w:t xml:space="preserve">144 ms</w:t>
+              <w:t xml:space="preserve">439 ms</w:t>
             </w:r>
           </w:p>
         </w:tc>
@@ -7633,7 +7746,7 @@
                 <w:sz w:val="14"/>
                 <w:szCs w:val="14"/>
               </w:rPr>
-              <w:t xml:space="preserve">157 ms</w:t>
+              <w:t xml:space="preserve">301 ms</w:t>
             </w:r>
           </w:p>
         </w:tc>
@@ -7736,7 +7849,7 @@
                 <w:sz w:val="17"/>
                 <w:szCs w:val="17"/>
               </w:rPr>
-              <w:t xml:space="preserve">requête DER de 89 octets portant l'empreinte demandée ; jeton de 2418 octets lu exactement (date 2026-08-03T08:55:03.000Z, série 02, politique 1.3.6.1.4.1.99999.1.1) ; quatre refus obtenus : autre empreinte, autre nonce, réponse de rejet de l'autorité, jeton tronqué</w:t>
+              <w:t xml:space="preserve">requête DER de 90 octets portant l'empreinte demandée ; jeton de 2418 octets lu exactement (date 2026-08-03T08:55:03.000Z, série 02, politique 1.3.6.1.4.1.99999.1.1) ; quatre refus obtenus : autre empreinte, autre nonce, réponse de rejet de l'autorité, jeton tronqué</w:t>
             </w:r>
           </w:p>
         </w:tc>
@@ -7917,7 +8030,7 @@
                 <w:sz w:val="14"/>
                 <w:szCs w:val="14"/>
               </w:rPr>
-              <w:t xml:space="preserve">1 ms</w:t>
+              <w:t xml:space="preserve">2 ms</w:t>
             </w:r>
           </w:p>
         </w:tc>
@@ -8059,7 +8172,7 @@
                 <w:sz w:val="14"/>
                 <w:szCs w:val="14"/>
               </w:rPr>
-              <w:t xml:space="preserve">24 ms</w:t>
+              <w:t xml:space="preserve">38 ms</w:t>
             </w:r>
           </w:p>
         </w:tc>
@@ -8162,7 +8275,7 @@
                 <w:sz w:val="17"/>
                 <w:szCs w:val="17"/>
               </w:rPr>
-              <w:t xml:space="preserve">190 fichier(s) source relus, aucune écriture dans la piste hors du module ; 9 empreintes comparées entre l'implémentation TypeScript et le miroir de la console serveur, toutes identiques</w:t>
+              <w:t xml:space="preserve">195 fichier(s) source relus, aucune écriture dans la piste hors du module ; 9 empreintes comparées entre l'implémentation TypeScript et le miroir de la console serveur, toutes identiques</w:t>
             </w:r>
           </w:p>
         </w:tc>
@@ -8201,7 +8314,7 @@
                 <w:sz w:val="14"/>
                 <w:szCs w:val="14"/>
               </w:rPr>
-              <w:t xml:space="preserve">23 ms</w:t>
+              <w:t xml:space="preserve">29 ms</w:t>
             </w:r>
           </w:p>
         </w:tc>
@@ -8343,7 +8456,7 @@
                 <w:sz w:val="14"/>
                 <w:szCs w:val="14"/>
               </w:rPr>
-              <w:t xml:space="preserve">1 ms</w:t>
+              <w:t xml:space="preserve">0 ms</w:t>
             </w:r>
           </w:p>
         </w:tc>
@@ -8485,7 +8598,7 @@
                 <w:sz w:val="14"/>
                 <w:szCs w:val="14"/>
               </w:rPr>
-              <w:t xml:space="preserve">7 ms</w:t>
+              <w:t xml:space="preserve">11 ms</w:t>
             </w:r>
           </w:p>
         </w:tc>
@@ -8627,7 +8740,7 @@
                 <w:sz w:val="14"/>
                 <w:szCs w:val="14"/>
               </w:rPr>
-              <w:t xml:space="preserve">222 ms</w:t>
+              <w:t xml:space="preserve">266 ms</w:t>
             </w:r>
           </w:p>
         </w:tc>
@@ -8730,7 +8843,7 @@
                 <w:sz w:val="17"/>
                 <w:szCs w:val="17"/>
               </w:rPr>
-              <w:t xml:space="preserve">190 fichier(s) source relus : aucune écriture de mot de passe hors des chemins autorisés ; une seule écriture dans les actions serveur, le changement personnel, qui exige l'ancien mot de passe ; l'outil d'urgence de la console émet un jeton et ne sait plus dériver de mot de passe ; aucun champ de mot de passe hors des 6 écrans où l'on saisit le sien</w:t>
+              <w:t xml:space="preserve">195 fichier(s) source relus : aucune écriture de mot de passe hors des chemins autorisés ; une seule écriture dans les actions serveur, le changement personnel, qui exige l'ancien mot de passe ; l'outil d'urgence de la console émet un jeton et ne sait plus dériver de mot de passe ; aucun champ de mot de passe hors des 6 écrans où l'on saisit le sien</w:t>
             </w:r>
           </w:p>
         </w:tc>
@@ -8769,7 +8882,7 @@
                 <w:sz w:val="14"/>
                 <w:szCs w:val="14"/>
               </w:rPr>
-              <w:t xml:space="preserve">30 ms</w:t>
+              <w:t xml:space="preserve">43 ms</w:t>
             </w:r>
           </w:p>
         </w:tc>
@@ -8872,7 +8985,7 @@
                 <w:sz w:val="17"/>
                 <w:szCs w:val="17"/>
               </w:rPr>
-              <w:t xml:space="preserve">image filum:latest démarrée sur volumes vierges, conteneur SAIN ; migrations appliquées, chaîne de piste d'audit intacte, organisation, programme, compte administrateur et bibliothèque de normes créés ; version 1.2.1 annoncée au journal ET portée par /app/VERSION ; /login répond 200 ; une route protégée rend l'écran de connexion (10431 octets) sans divulguer ni le nom de l'organisation ni celui du programme</w:t>
+              <w:t xml:space="preserve">image filum:latest démarrée sur volumes vierges, conteneur SAIN ; migrations appliquées, chaîne de piste d'audit intacte, organisation, programme, compte administrateur et bibliothèque de normes créés ; version 1.2.1 annoncée au journal ET portée par /app/VERSION ; police et profil ICC des copies d'archivage présents dans l'image ; /login répond 200 ; une route protégée rend l'écran de connexion (10431 octets) sans divulguer ni le nom de l'organisation ni celui du programme</w:t>
             </w:r>
           </w:p>
         </w:tc>
@@ -8911,7 +9024,7 @@
                 <w:sz w:val="14"/>
                 <w:szCs w:val="14"/>
               </w:rPr>
-              <w:t xml:space="preserve">8888 ms</w:t>
+              <w:t xml:space="preserve">9070 ms</w:t>
             </w:r>
           </w:p>
         </w:tc>
@@ -9053,7 +9166,149 @@
                 <w:sz w:val="14"/>
                 <w:szCs w:val="14"/>
               </w:rPr>
-              <w:t xml:space="preserve">20 ms</w:t>
+              <w:t xml:space="preserve">28 ms</w:t>
+            </w:r>
+          </w:p>
+        </w:tc>
+      </w:tr>
+      <w:tr>
+        <w:tc>
+          <w:tcPr>
+            <w:tcW w:type="pct" w:w="13%"/>
+            <w:shd w:fill="F8FAFC"/>
+            <w:tcMar>
+              <w:top w:type="dxa" w:w="80"/>
+              <w:left w:type="dxa" w:w="110"/>
+              <w:bottom w:type="dxa" w:w="80"/>
+              <w:right w:type="dxa" w:w="110"/>
+            </w:tcMar>
+          </w:tcPr>
+          <w:p>
+            <w:pPr>
+              <w:spacing w:after="50"/>
+            </w:pPr>
+            <w:r>
+              <w:rPr>
+                <w:b/>
+                <w:bCs/>
+                <w:color w:val="4338CA"/>
+                <w:sz w:val="17"/>
+                <w:szCs w:val="17"/>
+              </w:rPr>
+              <w:t xml:space="preserve">OQ-31</w:t>
+            </w:r>
+          </w:p>
+          <w:p>
+            <w:pPr>
+              <w:spacing w:after="0"/>
+            </w:pPr>
+            <w:r>
+              <w:rPr>
+                <w:color w:val="475569"/>
+                <w:sz w:val="15"/>
+                <w:szCs w:val="15"/>
+              </w:rPr>
+              <w:t xml:space="preserve">URS-34</w:t>
+            </w:r>
+          </w:p>
+        </w:tc>
+        <w:tc>
+          <w:tcPr>
+            <w:tcW w:type="pct" w:w="30%"/>
+            <w:tcMar>
+              <w:top w:type="dxa" w:w="80"/>
+              <w:left w:type="dxa" w:w="110"/>
+              <w:bottom w:type="dxa" w:w="80"/>
+              <w:right w:type="dxa" w:w="110"/>
+            </w:tcMar>
+          </w:tcPr>
+          <w:p>
+            <w:pPr>
+              <w:spacing w:after="50"/>
+            </w:pPr>
+            <w:r>
+              <w:rPr>
+                <w:b/>
+                <w:bCs/>
+                <w:sz w:val="17"/>
+                <w:szCs w:val="17"/>
+              </w:rPr>
+              <w:t xml:space="preserve">Copie d'archivage PDF/A — structure, ressources embarquées, et texte relisible</w:t>
+            </w:r>
+          </w:p>
+          <w:p>
+            <w:pPr>
+              <w:spacing w:after="0"/>
+            </w:pPr>
+            <w:r>
+              <w:rPr>
+                <w:color w:val="475569"/>
+                <w:sz w:val="15"/>
+                <w:szCs w:val="15"/>
+              </w:rPr>
+              <w:t xml:space="preserve">Vérifier qu'un enregistrement figé produit une copie PDF/A-2b dont la police et le profil colorimétrique sont embarqués, dont les métadonnées déclarent la conformité visée, dont la table de références croisées pointe les vraies positions, et dont le texte se retraduit intégralement en caractères — accents compris.</w:t>
+            </w:r>
+          </w:p>
+        </w:tc>
+        <w:tc>
+          <w:tcPr>
+            <w:tcW w:type="pct" w:w="45%"/>
+            <w:tcMar>
+              <w:top w:type="dxa" w:w="80"/>
+              <w:left w:type="dxa" w:w="110"/>
+              <w:bottom w:type="dxa" w:w="80"/>
+              <w:right w:type="dxa" w:w="110"/>
+            </w:tcMar>
+          </w:tcPr>
+          <w:p>
+            <w:pPr>
+              <w:spacing w:after="0"/>
+            </w:pPr>
+            <w:r>
+              <w:rPr>
+                <w:sz w:val="17"/>
+                <w:szCs w:val="17"/>
+              </w:rPr>
+              <w:t xml:space="preserve">copie d'archivage de OQ-012-revision rév. 001 produite (69087 octets, 1 page·s) ; 29 contrôles structurels PDF/A-2b passés — police embarquée, profil ICC « acsp » de 3024 octets, métadonnées pdfaid partie 2 niveau B, décalages exacts ; texte intégralement relu par la table du fichier, 44 caractère·s accentué·s ou typographiques restitués ; production déterministe (deux exécutions octet pour octet identiques)</w:t>
+            </w:r>
+          </w:p>
+        </w:tc>
+        <w:tc>
+          <w:tcPr>
+            <w:tcW w:type="pct" w:w="12%"/>
+            <w:tcMar>
+              <w:top w:type="dxa" w:w="80"/>
+              <w:left w:type="dxa" w:w="110"/>
+              <w:bottom w:type="dxa" w:w="80"/>
+              <w:right w:type="dxa" w:w="110"/>
+            </w:tcMar>
+          </w:tcPr>
+          <w:p>
+            <w:pPr>
+              <w:spacing w:after="40"/>
+            </w:pPr>
+            <w:r>
+              <w:rPr>
+                <w:b/>
+                <w:bCs/>
+                <w:color w:val="047857"/>
+                <w:sz w:val="17"/>
+                <w:szCs w:val="17"/>
+              </w:rPr>
+              <w:t xml:space="preserve">Conforme</w:t>
+            </w:r>
+          </w:p>
+          <w:p>
+            <w:pPr>
+              <w:spacing w:after="0"/>
+            </w:pPr>
+            <w:r>
+              <w:rPr>
+                <w:color w:val="475569"/>
+                <w:sz w:val="14"/>
+                <w:szCs w:val="14"/>
+              </w:rPr>
+              <w:t xml:space="preserve">14 ms</w:t>
             </w:r>
           </w:p>
         </w:tc>
@@ -11718,6 +11973,83 @@
           </w:p>
         </w:tc>
       </w:tr>
+      <w:tr>
+        <w:tc>
+          <w:tcPr>
+            <w:tcW w:type="pct" w:w="12%"/>
+            <w:tcMar>
+              <w:top w:type="dxa" w:w="80"/>
+              <w:left w:type="dxa" w:w="110"/>
+              <w:bottom w:type="dxa" w:w="80"/>
+              <w:right w:type="dxa" w:w="110"/>
+            </w:tcMar>
+          </w:tcPr>
+          <w:p>
+            <w:pPr>
+              <w:spacing w:after="0"/>
+            </w:pPr>
+            <w:r>
+              <w:rPr>
+                <w:b/>
+                <w:bCs/>
+                <w:color w:val="4338CA"/>
+                <w:sz w:val="17"/>
+                <w:szCs w:val="17"/>
+              </w:rPr>
+              <w:t xml:space="preserve">URS-34</w:t>
+            </w:r>
+          </w:p>
+        </w:tc>
+        <w:tc>
+          <w:tcPr>
+            <w:tcW w:type="pct" w:w="22%"/>
+            <w:tcMar>
+              <w:top w:type="dxa" w:w="80"/>
+              <w:left w:type="dxa" w:w="110"/>
+              <w:bottom w:type="dxa" w:w="80"/>
+              <w:right w:type="dxa" w:w="110"/>
+            </w:tcMar>
+          </w:tcPr>
+          <w:p>
+            <w:pPr>
+              <w:spacing w:after="0"/>
+            </w:pPr>
+            <w:r>
+              <w:rPr>
+                <w:b/>
+                <w:bCs/>
+                <w:color w:val="047857"/>
+                <w:sz w:val="17"/>
+                <w:szCs w:val="17"/>
+              </w:rPr>
+              <w:t xml:space="preserve">OQ-31</w:t>
+            </w:r>
+          </w:p>
+        </w:tc>
+        <w:tc>
+          <w:tcPr>
+            <w:tcW w:type="pct" w:w="66%"/>
+            <w:tcMar>
+              <w:top w:type="dxa" w:w="80"/>
+              <w:left w:type="dxa" w:w="110"/>
+              <w:bottom w:type="dxa" w:w="80"/>
+              <w:right w:type="dxa" w:w="110"/>
+            </w:tcMar>
+          </w:tcPr>
+          <w:p>
+            <w:pPr>
+              <w:spacing w:after="0"/>
+            </w:pPr>
+            <w:r>
+              <w:rPr>
+                <w:sz w:val="17"/>
+                <w:szCs w:val="17"/>
+              </w:rPr>
+              <w:t xml:space="preserve">Cas de test automatisé exécuté par l'éditeur à chaque version, résultat en section 5.1.</w:t>
+            </w:r>
+          </w:p>
+        </w:tc>
+      </w:tr>
     </w:tbl>
     <w:p>
       <w:pPr>
@@ -11737,7 +12069,7 @@
           <w:sz w:val="20"/>
           <w:szCs w:val="20"/>
         </w:rPr>
-        <w:t xml:space="preserve">Sur les 33 exigences, 29 sont vérifiées automatiquement par l'éditeur et 4 doivent l'être chez vous. Ce n'est pas un partage arbitraire : ces 4 exigences ne sont pas observables sans navigateur, sans requête HTTP ou sans votre infrastructure. Les compter comme couvertes serait une affirmation invérifiable.</w:t>
+        <w:t xml:space="preserve">Sur les 34 exigences, 30 sont vérifiées automatiquement par l'éditeur et 4 doivent l'être chez vous. Ce n'est pas un partage arbitraire : ces 4 exigences ne sont pas observables sans navigateur, sans requête HTTP ou sans votre infrastructure. Les compter comme couvertes serait une affirmation invérifiable.</w:t>
       </w:r>
     </w:p>
     <w:p>
@@ -11974,6 +12306,18 @@
         <w:t xml:space="preserve">— Aucun test de pénétration n'a été conduit par un tiers indépendant. Les contrôles d'autorité sont vérifiés, la résistance à une attaque ciblée ne l'est pas.</w:t>
       </w:r>
     </w:p>
+    <w:p>
+      <w:pPr>
+        <w:spacing w:after="100"/>
+      </w:pPr>
+      <w:r>
+        <w:rPr>
+          <w:sz w:val="20"/>
+          <w:szCs w:val="20"/>
+        </w:rPr>
+        <w:t xml:space="preserve">— Les copies d'archivage sont produites au format PDF/A-2b et contrôlées par nos propres vérifications structurelles, rejouées à chaque version : police et profil colorimétrique embarqués, métadonnées de conformité, table de références croisées exacte, texte retraduisible par la table du fichier. Aucun VALIDATEUR INDÉPENDANT — veraPDF, l'implémentation de référence — n'a été exécuté sur ces sorties. Le format est donc visé et contrôlé, pas certifié.</w:t>
+      </w:r>
+    </w:p>
     <w:sectPr>
       <w:headerReference w:type="default" r:id="rId7"/>
       <w:footerReference w:type="default" r:id="rId8"/>
@@ -12077,7 +12421,7 @@
         <w:sz w:val="15"/>
         <w:szCs w:val="15"/>
       </w:rPr>
-      <w:t xml:space="preserve">   ·   Version 1.2.1 · rapport OQ exécuté le 6 août 2026 à 11:23 UTC</w:t>
+      <w:t xml:space="preserve">   ·   Version 1.2.1 · rapport OQ exécuté le 6 août 2026 à 12:48 UTC</w:t>
     </w:r>
   </w:p>
 </w:ftr>

</xml_diff>

<commit_message>
Site — validation continue à jour (D3)
Regénéré depuis la source bilingue en même temps que les présentations.

Co-Authored-By: Claude Opus 5 <noreply@anthropic.com>
</commit_message>
<xml_diff>
--- a/docs/Dossier_de_validation_Filum.docx
+++ b/docs/Dossier_de_validation_Filum.docx
@@ -4569,7 +4569,7 @@
                 <w:sz w:val="17"/>
                 <w:szCs w:val="17"/>
               </w:rPr>
-              <w:t xml:space="preserve">6 août 2026 à 12:48</w:t>
+              <w:t xml:space="preserve">6 août 2026 à 15:08</w:t>
             </w:r>
           </w:p>
         </w:tc>
@@ -5151,7 +5151,7 @@
                 <w:sz w:val="17"/>
                 <w:szCs w:val="17"/>
               </w:rPr>
-              <w:t xml:space="preserve">empreintes distinctes pour un même mot de passe (e35a7a10d9dc… ≠ bc6b81eaf761…), vérification correcte, mot de passe faux et vide refusés</w:t>
+              <w:t xml:space="preserve">empreintes distinctes pour un même mot de passe (f6ff71dca7c5… ≠ acb6ec025b08…), vérification correcte, mot de passe faux et vide refusés</w:t>
             </w:r>
           </w:p>
         </w:tc>
@@ -5190,7 +5190,7 @@
                 <w:sz w:val="14"/>
                 <w:szCs w:val="14"/>
               </w:rPr>
-              <w:t xml:space="preserve">134 ms</w:t>
+              <w:t xml:space="preserve">141 ms</w:t>
             </w:r>
           </w:p>
         </w:tc>
@@ -5435,7 +5435,7 @@
                 <w:sz w:val="17"/>
                 <w:szCs w:val="17"/>
               </w:rPr>
-              <w:t xml:space="preserve">contenu gelé, empreinte 24604eb157d7fa54…, 10488 octets conservés, opération journalisée</w:t>
+              <w:t xml:space="preserve">contenu gelé, empreinte 24604eb157d7fa54…, 10485 octets conservés, opération journalisée</w:t>
             </w:r>
           </w:p>
         </w:tc>
@@ -5474,7 +5474,7 @@
                 <w:sz w:val="14"/>
                 <w:szCs w:val="14"/>
               </w:rPr>
-              <w:t xml:space="preserve">105 ms</w:t>
+              <w:t xml:space="preserve">111 ms</w:t>
             </w:r>
           </w:p>
         </w:tc>
@@ -5577,7 +5577,7 @@
                 <w:sz w:val="17"/>
                 <w:szCs w:val="17"/>
               </w:rPr>
-              <w:t xml:space="preserve">signature liée à l'instantané cmshihvb…, empreinte attestée 3767 CD80 ACC9, manifestation « Testeur QA1 (QA1) · Approuvé · 06/08/2026 12:48:27 UTC · enregistrement 3767 CD80 ACC9 »</w:t>
+              <w:t xml:space="preserve">signature liée à l'instantané cmshni9d…, empreinte attestée 3767 CD80 ACC9, manifestation « Testeur QA1 (QA1) · Approuvé · 06/08/2026 15:08:43 UTC · enregistrement 3767 CD80 ACC9 »</w:t>
             </w:r>
           </w:p>
         </w:tc>
@@ -5616,7 +5616,7 @@
                 <w:sz w:val="14"/>
                 <w:szCs w:val="14"/>
               </w:rPr>
-              <w:t xml:space="preserve">41 ms</w:t>
+              <w:t xml:space="preserve">47 ms</w:t>
             </w:r>
           </w:p>
         </w:tc>
@@ -5719,7 +5719,7 @@
                 <w:sz w:val="17"/>
                 <w:szCs w:val="17"/>
               </w:rPr>
-              <w:t xml:space="preserve">10488 octets relus à l'identique ; inversion d'un octet en position 5244 détectée</w:t>
+              <w:t xml:space="preserve">10487 octets relus à l'identique ; inversion d'un octet en position 5243 détectée</w:t>
             </w:r>
           </w:p>
         </w:tc>
@@ -5900,7 +5900,7 @@
                 <w:sz w:val="14"/>
                 <w:szCs w:val="14"/>
               </w:rPr>
-              <w:t xml:space="preserve">50 ms</w:t>
+              <w:t xml:space="preserve">56 ms</w:t>
             </w:r>
           </w:p>
         </w:tc>
@@ -6042,7 +6042,7 @@
                 <w:sz w:val="14"/>
                 <w:szCs w:val="14"/>
               </w:rPr>
-              <w:t xml:space="preserve">43 ms</w:t>
+              <w:t xml:space="preserve">49 ms</w:t>
             </w:r>
           </w:p>
         </w:tc>
@@ -6184,7 +6184,7 @@
                 <w:sz w:val="14"/>
                 <w:szCs w:val="14"/>
               </w:rPr>
-              <w:t xml:space="preserve">70 ms</w:t>
+              <w:t xml:space="preserve">71 ms</w:t>
             </w:r>
           </w:p>
         </w:tc>
@@ -6287,7 +6287,7 @@
                 <w:sz w:val="17"/>
                 <w:szCs w:val="17"/>
               </w:rPr>
-              <w:t xml:space="preserve">2 instantanés conservés : le gel de revue reste lisible (10496 o, dépassé), l'enregistrement approuvé porte la même empreinte de contenu</w:t>
+              <w:t xml:space="preserve">2 instantanés conservés : le gel de revue reste lisible (10495 o, dépassé), l'enregistrement approuvé porte la même empreinte de contenu</w:t>
             </w:r>
           </w:p>
         </w:tc>
@@ -6326,7 +6326,7 @@
                 <w:sz w:val="14"/>
                 <w:szCs w:val="14"/>
               </w:rPr>
-              <w:t xml:space="preserve">76 ms</w:t>
+              <w:t xml:space="preserve">72 ms</w:t>
             </w:r>
           </w:p>
         </w:tc>
@@ -6610,7 +6610,7 @@
                 <w:sz w:val="14"/>
                 <w:szCs w:val="14"/>
               </w:rPr>
-              <w:t xml:space="preserve">26 ms</w:t>
+              <w:t xml:space="preserve">24 ms</w:t>
             </w:r>
           </w:p>
         </w:tc>
@@ -6752,7 +6752,7 @@
                 <w:sz w:val="14"/>
                 <w:szCs w:val="14"/>
               </w:rPr>
-              <w:t xml:space="preserve">23 ms</w:t>
+              <w:t xml:space="preserve">25 ms</w:t>
             </w:r>
           </w:p>
         </w:tc>
@@ -7036,7 +7036,7 @@
                 <w:sz w:val="14"/>
                 <w:szCs w:val="14"/>
               </w:rPr>
-              <w:t xml:space="preserve">1 ms</w:t>
+              <w:t xml:space="preserve">0 ms</w:t>
             </w:r>
           </w:p>
         </w:tc>
@@ -7178,7 +7178,7 @@
                 <w:sz w:val="14"/>
                 <w:szCs w:val="14"/>
               </w:rPr>
-              <w:t xml:space="preserve">310 ms</w:t>
+              <w:t xml:space="preserve">305 ms</w:t>
             </w:r>
           </w:p>
         </w:tc>
@@ -7281,7 +7281,7 @@
                 <w:sz w:val="17"/>
                 <w:szCs w:val="17"/>
               </w:rPr>
-              <w:t xml:space="preserve">13 enregistrement(s) archivé(s), 42 fichier(s) couverts par empreintes.sha256, 0 écart ; ancre 21f27befcc9b7839… ; octets du gel restitués à l'identique ; altération d'un octet détectée et signalée ALTÉRÉ, fichier conservé dans l'archive</w:t>
+              <w:t xml:space="preserve">13 enregistrement(s) archivé(s), 42 fichier(s) couverts par empreintes.sha256, 0 écart ; ancre e5e200019d3547f7… ; octets du gel restitués à l'identique ; altération d'un octet détectée et signalée ALTÉRÉ, fichier conservé dans l'archive</w:t>
             </w:r>
           </w:p>
         </w:tc>
@@ -7320,7 +7320,7 @@
                 <w:sz w:val="14"/>
                 <w:szCs w:val="14"/>
               </w:rPr>
-              <w:t xml:space="preserve">430 ms</w:t>
+              <w:t xml:space="preserve">411 ms</w:t>
             </w:r>
           </w:p>
         </w:tc>
@@ -7604,7 +7604,7 @@
                 <w:sz w:val="14"/>
                 <w:szCs w:val="14"/>
               </w:rPr>
-              <w:t xml:space="preserve">439 ms</w:t>
+              <w:t xml:space="preserve">346 ms</w:t>
             </w:r>
           </w:p>
         </w:tc>
@@ -7746,7 +7746,7 @@
                 <w:sz w:val="14"/>
                 <w:szCs w:val="14"/>
               </w:rPr>
-              <w:t xml:space="preserve">301 ms</w:t>
+              <w:t xml:space="preserve">300 ms</w:t>
             </w:r>
           </w:p>
         </w:tc>
@@ -7849,7 +7849,7 @@
                 <w:sz w:val="17"/>
                 <w:szCs w:val="17"/>
               </w:rPr>
-              <w:t xml:space="preserve">requête DER de 90 octets portant l'empreinte demandée ; jeton de 2418 octets lu exactement (date 2026-08-03T08:55:03.000Z, série 02, politique 1.3.6.1.4.1.99999.1.1) ; quatre refus obtenus : autre empreinte, autre nonce, réponse de rejet de l'autorité, jeton tronqué</w:t>
+              <w:t xml:space="preserve">requête DER de 89 octets portant l'empreinte demandée ; jeton de 2418 octets lu exactement (date 2026-08-03T08:55:03.000Z, série 02, politique 1.3.6.1.4.1.99999.1.1) ; quatre refus obtenus : autre empreinte, autre nonce, réponse de rejet de l'autorité, jeton tronqué</w:t>
             </w:r>
           </w:p>
         </w:tc>
@@ -8030,7 +8030,7 @@
                 <w:sz w:val="14"/>
                 <w:szCs w:val="14"/>
               </w:rPr>
-              <w:t xml:space="preserve">2 ms</w:t>
+              <w:t xml:space="preserve">1 ms</w:t>
             </w:r>
           </w:p>
         </w:tc>
@@ -8172,7 +8172,7 @@
                 <w:sz w:val="14"/>
                 <w:szCs w:val="14"/>
               </w:rPr>
-              <w:t xml:space="preserve">38 ms</w:t>
+              <w:t xml:space="preserve">30 ms</w:t>
             </w:r>
           </w:p>
         </w:tc>
@@ -8275,7 +8275,7 @@
                 <w:sz w:val="17"/>
                 <w:szCs w:val="17"/>
               </w:rPr>
-              <w:t xml:space="preserve">195 fichier(s) source relus, aucune écriture dans la piste hors du module ; 9 empreintes comparées entre l'implémentation TypeScript et le miroir de la console serveur, toutes identiques</w:t>
+              <w:t xml:space="preserve">196 fichier(s) source relus, aucune écriture dans la piste hors du module ; 9 empreintes comparées entre l'implémentation TypeScript et le miroir de la console serveur, toutes identiques</w:t>
             </w:r>
           </w:p>
         </w:tc>
@@ -8314,7 +8314,7 @@
                 <w:sz w:val="14"/>
                 <w:szCs w:val="14"/>
               </w:rPr>
-              <w:t xml:space="preserve">29 ms</w:t>
+              <w:t xml:space="preserve">26 ms</w:t>
             </w:r>
           </w:p>
         </w:tc>
@@ -8598,7 +8598,7 @@
                 <w:sz w:val="14"/>
                 <w:szCs w:val="14"/>
               </w:rPr>
-              <w:t xml:space="preserve">11 ms</w:t>
+              <w:t xml:space="preserve">8 ms</w:t>
             </w:r>
           </w:p>
         </w:tc>
@@ -8740,7 +8740,7 @@
                 <w:sz w:val="14"/>
                 <w:szCs w:val="14"/>
               </w:rPr>
-              <w:t xml:space="preserve">266 ms</w:t>
+              <w:t xml:space="preserve">226 ms</w:t>
             </w:r>
           </w:p>
         </w:tc>
@@ -8843,7 +8843,7 @@
                 <w:sz w:val="17"/>
                 <w:szCs w:val="17"/>
               </w:rPr>
-              <w:t xml:space="preserve">195 fichier(s) source relus : aucune écriture de mot de passe hors des chemins autorisés ; une seule écriture dans les actions serveur, le changement personnel, qui exige l'ancien mot de passe ; l'outil d'urgence de la console émet un jeton et ne sait plus dériver de mot de passe ; aucun champ de mot de passe hors des 6 écrans où l'on saisit le sien</w:t>
+              <w:t xml:space="preserve">196 fichier(s) source relus : aucune écriture de mot de passe hors des chemins autorisés ; une seule écriture dans les actions serveur, le changement personnel, qui exige l'ancien mot de passe ; l'outil d'urgence de la console émet un jeton et ne sait plus dériver de mot de passe ; aucun champ de mot de passe hors des 6 écrans où l'on saisit le sien</w:t>
             </w:r>
           </w:p>
         </w:tc>
@@ -8882,7 +8882,7 @@
                 <w:sz w:val="14"/>
                 <w:szCs w:val="14"/>
               </w:rPr>
-              <w:t xml:space="preserve">43 ms</w:t>
+              <w:t xml:space="preserve">33 ms</w:t>
             </w:r>
           </w:p>
         </w:tc>
@@ -9024,7 +9024,7 @@
                 <w:sz w:val="14"/>
                 <w:szCs w:val="14"/>
               </w:rPr>
-              <w:t xml:space="preserve">9070 ms</w:t>
+              <w:t xml:space="preserve">9123 ms</w:t>
             </w:r>
           </w:p>
         </w:tc>
@@ -9166,7 +9166,7 @@
                 <w:sz w:val="14"/>
                 <w:szCs w:val="14"/>
               </w:rPr>
-              <w:t xml:space="preserve">28 ms</w:t>
+              <w:t xml:space="preserve">29 ms</w:t>
             </w:r>
           </w:p>
         </w:tc>
@@ -9269,7 +9269,7 @@
                 <w:sz w:val="17"/>
                 <w:szCs w:val="17"/>
               </w:rPr>
-              <w:t xml:space="preserve">copie d'archivage de OQ-012-revision rév. 001 produite (69087 octets, 1 page·s) ; 29 contrôles structurels PDF/A-2b passés — police embarquée, profil ICC « acsp » de 3024 octets, métadonnées pdfaid partie 2 niveau B, décalages exacts ; texte intégralement relu par la table du fichier, 44 caractère·s accentué·s ou typographiques restitués ; production déterministe (deux exécutions octet pour octet identiques)</w:t>
+              <w:t xml:space="preserve">copie d'archivage de OQ-012-revision rév. 001 produite (69088 octets, 1 page·s) ; 29 contrôles structurels PDF/A-2b passés — police embarquée, profil ICC « acsp » de 3024 octets, métadonnées pdfaid partie 2 niveau B, décalages exacts ; texte intégralement relu par la table du fichier, 44 caractère·s accentué·s ou typographiques restitués ; production déterministe (deux exécutions octet pour octet identiques)</w:t>
             </w:r>
           </w:p>
         </w:tc>
@@ -9308,7 +9308,7 @@
                 <w:sz w:val="14"/>
                 <w:szCs w:val="14"/>
               </w:rPr>
-              <w:t xml:space="preserve">14 ms</w:t>
+              <w:t xml:space="preserve">16 ms</w:t>
             </w:r>
           </w:p>
         </w:tc>
@@ -12421,7 +12421,7 @@
         <w:sz w:val="15"/>
         <w:szCs w:val="15"/>
       </w:rPr>
-      <w:t xml:space="preserve">   ·   Version 1.2.1 · rapport OQ exécuté le 6 août 2026 à 12:48 UTC</w:t>
+      <w:t xml:space="preserve">   ·   Version 1.2.1 · rapport OQ exécuté le 6 août 2026 à 15:08 UTC</w:t>
     </w:r>
   </w:p>
 </w:ftr>

</xml_diff>

<commit_message>
Site — la piste d'audit se fait relire (A2)
Matrice Part 11, note Annexe 11, note de périmètre, manuel et captures
régénérés : le chapitre « Piste d'audit » de l'Annexe 11 passe de partiel à
implémenté.

Co-Authored-By: Claude Opus 5 <noreply@anthropic.com>
</commit_message>
<xml_diff>
--- a/docs/Dossier_de_validation_Filum.docx
+++ b/docs/Dossier_de_validation_Filum.docx
@@ -430,7 +430,7 @@
           <w:sz w:val="20"/>
           <w:szCs w:val="20"/>
         </w:rPr>
-        <w:t xml:space="preserve">Les 34 exigences ci-dessous énoncent ce que le logiciel doit faire. Le niveau de risque est celui de la DÉFAILLANCE de l'exigence, pas de son importance commerciale : il détermine la profondeur de vérification.</w:t>
+        <w:t xml:space="preserve">Les 36 exigences ci-dessous énoncent ce que le logiciel doit faire. Le niveau de risque est celui de la DÉFAILLANCE de l'exigence, pas de son importance commerciale : il détermine la profondeur de vérification.</w:t>
       </w:r>
     </w:p>
     <w:tbl>
@@ -4399,6 +4399,232 @@
           </w:p>
         </w:tc>
       </w:tr>
+      <w:tr>
+        <w:tc>
+          <w:tcPr>
+            <w:tcW w:type="pct" w:w="11%"/>
+            <w:shd w:fill="F8FAFC"/>
+            <w:tcMar>
+              <w:top w:type="dxa" w:w="80"/>
+              <w:left w:type="dxa" w:w="110"/>
+              <w:bottom w:type="dxa" w:w="80"/>
+              <w:right w:type="dxa" w:w="110"/>
+            </w:tcMar>
+          </w:tcPr>
+          <w:p>
+            <w:pPr>
+              <w:spacing w:after="60"/>
+            </w:pPr>
+            <w:r>
+              <w:rPr>
+                <w:b/>
+                <w:bCs/>
+                <w:color w:val="4338CA"/>
+                <w:sz w:val="17"/>
+                <w:szCs w:val="17"/>
+              </w:rPr>
+              <w:t xml:space="preserve">URS-35</w:t>
+            </w:r>
+          </w:p>
+          <w:p>
+            <w:pPr>
+              <w:spacing w:after="0"/>
+            </w:pPr>
+            <w:r>
+              <w:rPr>
+                <w:b/>
+                <w:bCs/>
+                <w:color w:val="DC2626"/>
+                <w:sz w:val="15"/>
+                <w:szCs w:val="15"/>
+              </w:rPr>
+              <w:t xml:space="preserve">Haut</w:t>
+            </w:r>
+          </w:p>
+        </w:tc>
+        <w:tc>
+          <w:tcPr>
+            <w:tcW w:type="pct" w:w="41%"/>
+            <w:tcMar>
+              <w:top w:type="dxa" w:w="80"/>
+              <w:left w:type="dxa" w:w="110"/>
+              <w:bottom w:type="dxa" w:w="80"/>
+              <w:right w:type="dxa" w:w="110"/>
+            </w:tcMar>
+          </w:tcPr>
+          <w:p>
+            <w:pPr>
+              <w:spacing w:after="0"/>
+            </w:pPr>
+            <w:r>
+              <w:rPr>
+                <w:sz w:val="17"/>
+                <w:szCs w:val="17"/>
+              </w:rPr>
+              <w:t xml:space="preserve">Les revues périodiques de la piste d'audit couvrent des plages de RANGS contiguës : une revue commence exactement au rang qui suit la dernière revue close, sa fenêtre est figée à l'ouverture, et le logiciel refuse d'ouvrir une seconde revue tant qu'une autre est en cours. Toute lacune de couverture est calculée et signalée.</w:t>
+            </w:r>
+          </w:p>
+        </w:tc>
+        <w:tc>
+          <w:tcPr>
+            <w:tcW w:type="pct" w:w="28%"/>
+            <w:tcMar>
+              <w:top w:type="dxa" w:w="80"/>
+              <w:left w:type="dxa" w:w="110"/>
+              <w:bottom w:type="dxa" w:w="80"/>
+              <w:right w:type="dxa" w:w="110"/>
+            </w:tcMar>
+          </w:tcPr>
+          <w:p>
+            <w:pPr>
+              <w:spacing w:after="0"/>
+            </w:pPr>
+            <w:r>
+              <w:rPr>
+                <w:sz w:val="17"/>
+                <w:szCs w:val="17"/>
+              </w:rPr>
+              <w:t xml:space="preserve">Une revue bornée par des dates laisse échapper ce qui s'écrit pendant qu'on la clôture : la revue suivante repartant du lendemain, ces entrées ne seront lues par personne, et rien ne le signalera. C'est le défaut qui vide la revue de sa valeur tout en produisant un enregistrement signé — donc la fausse assurance la plus coûteuse. Deux revues concurrentes produiraient le même effet à l'autre bout.</w:t>
+            </w:r>
+          </w:p>
+        </w:tc>
+        <w:tc>
+          <w:tcPr>
+            <w:tcW w:type="pct" w:w="20%"/>
+            <w:tcMar>
+              <w:top w:type="dxa" w:w="80"/>
+              <w:left w:type="dxa" w:w="110"/>
+              <w:bottom w:type="dxa" w:w="80"/>
+              <w:right w:type="dxa" w:w="110"/>
+            </w:tcMar>
+          </w:tcPr>
+          <w:p>
+            <w:pPr>
+              <w:spacing w:after="0"/>
+            </w:pPr>
+            <w:r>
+              <w:rPr>
+                <w:sz w:val="17"/>
+                <w:szCs w:val="17"/>
+              </w:rPr>
+              <w:t xml:space="preserve">21 CFR 11.10(e) · Annexe 11 (projet) — Piste d'audit</w:t>
+            </w:r>
+          </w:p>
+        </w:tc>
+      </w:tr>
+      <w:tr>
+        <w:tc>
+          <w:tcPr>
+            <w:tcW w:type="pct" w:w="11%"/>
+            <w:shd w:fill="F8FAFC"/>
+            <w:tcMar>
+              <w:top w:type="dxa" w:w="80"/>
+              <w:left w:type="dxa" w:w="110"/>
+              <w:bottom w:type="dxa" w:w="80"/>
+              <w:right w:type="dxa" w:w="110"/>
+            </w:tcMar>
+          </w:tcPr>
+          <w:p>
+            <w:pPr>
+              <w:spacing w:after="60"/>
+            </w:pPr>
+            <w:r>
+              <w:rPr>
+                <w:b/>
+                <w:bCs/>
+                <w:color w:val="4338CA"/>
+                <w:sz w:val="17"/>
+                <w:szCs w:val="17"/>
+              </w:rPr>
+              <w:t xml:space="preserve">URS-36</w:t>
+            </w:r>
+          </w:p>
+          <w:p>
+            <w:pPr>
+              <w:spacing w:after="0"/>
+            </w:pPr>
+            <w:r>
+              <w:rPr>
+                <w:b/>
+                <w:bCs/>
+                <w:color w:val="DC2626"/>
+                <w:sz w:val="15"/>
+                <w:szCs w:val="15"/>
+              </w:rPr>
+              <w:t xml:space="preserve">Haut</w:t>
+            </w:r>
+          </w:p>
+        </w:tc>
+        <w:tc>
+          <w:tcPr>
+            <w:tcW w:type="pct" w:w="41%"/>
+            <w:tcMar>
+              <w:top w:type="dxa" w:w="80"/>
+              <w:left w:type="dxa" w:w="110"/>
+              <w:bottom w:type="dxa" w:w="80"/>
+              <w:right w:type="dxa" w:w="110"/>
+            </w:tcMar>
+          </w:tcPr>
+          <w:p>
+            <w:pPr>
+              <w:spacing w:after="0"/>
+            </w:pPr>
+            <w:r>
+              <w:rPr>
+                <w:sz w:val="17"/>
+                <w:szCs w:val="17"/>
+              </w:rPr>
+              <w:t xml:space="preserve">La clôture d'une revue est une signature électronique : elle exige la ressaisie du mot de passe, porte le nom imprimé, la signification « Revu » et l'horodatage, et recopie l'empreinte du CONTENU revu — fenêtre, comptes, règles appliquées, verdicts et conclusion. Elle est refusée tant qu'une entrée retenue n'est pas statuée, tant que la conclusion est vide, et une revue close ne se rouvre pas.</w:t>
+            </w:r>
+          </w:p>
+        </w:tc>
+        <w:tc>
+          <w:tcPr>
+            <w:tcW w:type="pct" w:w="28%"/>
+            <w:tcMar>
+              <w:top w:type="dxa" w:w="80"/>
+              <w:left w:type="dxa" w:w="110"/>
+              <w:bottom w:type="dxa" w:w="80"/>
+              <w:right w:type="dxa" w:w="110"/>
+            </w:tcMar>
+          </w:tcPr>
+          <w:p>
+            <w:pPr>
+              <w:spacing w:after="0"/>
+            </w:pPr>
+            <w:r>
+              <w:rPr>
+                <w:sz w:val="17"/>
+                <w:szCs w:val="17"/>
+              </w:rPr>
+              <w:t xml:space="preserve">Une revue signée sans empreinte du contenu revu atteste d'une date, pas d'un travail : « revu le 6 août » ne dit pas QUOI a été revu, et le contenu pourrait changer ensuite sans que la signature en souffre. Une clôture possible sur des lignes non statuées permettrait de signer un travail non fait — l'inverse exact de ce que la revue prouve.</w:t>
+            </w:r>
+          </w:p>
+        </w:tc>
+        <w:tc>
+          <w:tcPr>
+            <w:tcW w:type="pct" w:w="20%"/>
+            <w:tcMar>
+              <w:top w:type="dxa" w:w="80"/>
+              <w:left w:type="dxa" w:w="110"/>
+              <w:bottom w:type="dxa" w:w="80"/>
+              <w:right w:type="dxa" w:w="110"/>
+            </w:tcMar>
+          </w:tcPr>
+          <w:p>
+            <w:pPr>
+              <w:spacing w:after="0"/>
+            </w:pPr>
+            <w:r>
+              <w:rPr>
+                <w:sz w:val="17"/>
+                <w:szCs w:val="17"/>
+              </w:rPr>
+              <w:t xml:space="preserve">21 CFR 11.50 · 21 CFR 11.70 · 21 CFR 11.200(a)(1) · Annexe 11 (projet) — Piste d'audit</w:t>
+            </w:r>
+          </w:p>
+        </w:tc>
+      </w:tr>
     </w:tbl>
     <w:p>
       <w:pPr>
@@ -4418,7 +4644,7 @@
           <w:sz w:val="20"/>
           <w:szCs w:val="20"/>
         </w:rPr>
-        <w:t xml:space="preserve">Répartition : 22 exigences à risque haut, 10 à risque moyen, 2 à risque bas. Les exigences à risque haut touchent toutes à l'intégrité ou à l'attribution des enregistrements : leur défaillance ne dégrade pas le confort d'usage, elle rend un enregistrement indéfendable. Elles font l'objet de cas de test dédiés, exécutés à chaque version.</w:t>
+        <w:t xml:space="preserve">Répartition : 24 exigences à risque haut, 10 à risque moyen, 2 à risque bas. Les exigences à risque haut touchent toutes à l'intégrité ou à l'attribution des enregistrements : leur défaillance ne dégrade pas le confort d'usage, elle rend un enregistrement indéfendable. Elles font l'objet de cas de test dédiés, exécutés à chaque version.</w:t>
       </w:r>
     </w:p>
     <w:p>
@@ -4569,7 +4795,7 @@
                 <w:sz w:val="17"/>
                 <w:szCs w:val="17"/>
               </w:rPr>
-              <w:t xml:space="preserve">6 août 2026 à 15:08</w:t>
+              <w:t xml:space="preserve">6 août 2026 à 17:59</w:t>
             </w:r>
           </w:p>
         </w:tc>
@@ -4772,7 +4998,7 @@
                 <w:sz w:val="17"/>
                 <w:szCs w:val="17"/>
               </w:rPr>
-              <w:t xml:space="preserve">31 cas sur 31 conformes — aucun écart</w:t>
+              <w:t xml:space="preserve">33 cas sur 33 conformes — aucun écart</w:t>
             </w:r>
           </w:p>
         </w:tc>
@@ -5151,7 +5377,7 @@
                 <w:sz w:val="17"/>
                 <w:szCs w:val="17"/>
               </w:rPr>
-              <w:t xml:space="preserve">empreintes distinctes pour un même mot de passe (f6ff71dca7c5… ≠ acb6ec025b08…), vérification correcte, mot de passe faux et vide refusés</w:t>
+              <w:t xml:space="preserve">empreintes distinctes pour un même mot de passe (a2b9030729d2… ≠ c124c47c008b…), vérification correcte, mot de passe faux et vide refusés</w:t>
             </w:r>
           </w:p>
         </w:tc>
@@ -5190,7 +5416,7 @@
                 <w:sz w:val="14"/>
                 <w:szCs w:val="14"/>
               </w:rPr>
-              <w:t xml:space="preserve">141 ms</w:t>
+              <w:t xml:space="preserve">137 ms</w:t>
             </w:r>
           </w:p>
         </w:tc>
@@ -5332,7 +5558,7 @@
                 <w:sz w:val="14"/>
                 <w:szCs w:val="14"/>
               </w:rPr>
-              <w:t xml:space="preserve">14 ms</w:t>
+              <w:t xml:space="preserve">13 ms</w:t>
             </w:r>
           </w:p>
         </w:tc>
@@ -5435,7 +5661,7 @@
                 <w:sz w:val="17"/>
                 <w:szCs w:val="17"/>
               </w:rPr>
-              <w:t xml:space="preserve">contenu gelé, empreinte 24604eb157d7fa54…, 10485 octets conservés, opération journalisée</w:t>
+              <w:t xml:space="preserve">contenu gelé, empreinte 24604eb157d7fa54…, 10486 octets conservés, opération journalisée</w:t>
             </w:r>
           </w:p>
         </w:tc>
@@ -5474,7 +5700,7 @@
                 <w:sz w:val="14"/>
                 <w:szCs w:val="14"/>
               </w:rPr>
-              <w:t xml:space="preserve">111 ms</w:t>
+              <w:t xml:space="preserve">113 ms</w:t>
             </w:r>
           </w:p>
         </w:tc>
@@ -5577,7 +5803,7 @@
                 <w:sz w:val="17"/>
                 <w:szCs w:val="17"/>
               </w:rPr>
-              <w:t xml:space="preserve">signature liée à l'instantané cmshni9d…, empreinte attestée 3767 CD80 ACC9, manifestation « Testeur QA1 (QA1) · Approuvé · 06/08/2026 15:08:43 UTC · enregistrement 3767 CD80 ACC9 »</w:t>
+              <w:t xml:space="preserve">signature liée à l'instantané cmshtlnf…, empreinte attestée 3767 CD80 ACC9, manifestation « Testeur QA1 (QA1) · Approuvé · 06/08/2026 17:59:19 UTC · enregistrement 3767 CD80 ACC9 »</w:t>
             </w:r>
           </w:p>
         </w:tc>
@@ -5616,7 +5842,7 @@
                 <w:sz w:val="14"/>
                 <w:szCs w:val="14"/>
               </w:rPr>
-              <w:t xml:space="preserve">47 ms</w:t>
+              <w:t xml:space="preserve">44 ms</w:t>
             </w:r>
           </w:p>
         </w:tc>
@@ -5719,7 +5945,7 @@
                 <w:sz w:val="17"/>
                 <w:szCs w:val="17"/>
               </w:rPr>
-              <w:t xml:space="preserve">10487 octets relus à l'identique ; inversion d'un octet en position 5243 détectée</w:t>
+              <w:t xml:space="preserve">10489 octets relus à l'identique ; inversion d'un octet en position 5244 détectée</w:t>
             </w:r>
           </w:p>
         </w:tc>
@@ -5758,7 +5984,7 @@
                 <w:sz w:val="14"/>
                 <w:szCs w:val="14"/>
               </w:rPr>
-              <w:t xml:space="preserve">51 ms</w:t>
+              <w:t xml:space="preserve">53 ms</w:t>
             </w:r>
           </w:p>
         </w:tc>
@@ -5900,7 +6126,7 @@
                 <w:sz w:val="14"/>
                 <w:szCs w:val="14"/>
               </w:rPr>
-              <w:t xml:space="preserve">56 ms</w:t>
+              <w:t xml:space="preserve">54 ms</w:t>
             </w:r>
           </w:p>
         </w:tc>
@@ -6042,7 +6268,7 @@
                 <w:sz w:val="14"/>
                 <w:szCs w:val="14"/>
               </w:rPr>
-              <w:t xml:space="preserve">49 ms</w:t>
+              <w:t xml:space="preserve">55 ms</w:t>
             </w:r>
           </w:p>
         </w:tc>
@@ -6184,7 +6410,7 @@
                 <w:sz w:val="14"/>
                 <w:szCs w:val="14"/>
               </w:rPr>
-              <w:t xml:space="preserve">71 ms</w:t>
+              <w:t xml:space="preserve">74 ms</w:t>
             </w:r>
           </w:p>
         </w:tc>
@@ -6287,7 +6513,7 @@
                 <w:sz w:val="17"/>
                 <w:szCs w:val="17"/>
               </w:rPr>
-              <w:t xml:space="preserve">2 instantanés conservés : le gel de revue reste lisible (10495 o, dépassé), l'enregistrement approuvé porte la même empreinte de contenu</w:t>
+              <w:t xml:space="preserve">2 instantanés conservés : le gel de revue reste lisible (10494 o, dépassé), l'enregistrement approuvé porte la même empreinte de contenu</w:t>
             </w:r>
           </w:p>
         </w:tc>
@@ -6326,7 +6552,7 @@
                 <w:sz w:val="14"/>
                 <w:szCs w:val="14"/>
               </w:rPr>
-              <w:t xml:space="preserve">72 ms</w:t>
+              <w:t xml:space="preserve">77 ms</w:t>
             </w:r>
           </w:p>
         </w:tc>
@@ -6571,7 +6797,7 @@
                 <w:sz w:val="17"/>
                 <w:szCs w:val="17"/>
               </w:rPr>
-              <w:t xml:space="preserve">143 fichiers source inspectés : aucune modification ni suppression d'entrée ; 1 fichiers en écriture seule</w:t>
+              <w:t xml:space="preserve">147 fichiers source inspectés : aucune modification ni suppression d'entrée ; 1 fichiers en écriture seule</w:t>
             </w:r>
           </w:p>
         </w:tc>
@@ -6610,7 +6836,7 @@
                 <w:sz w:val="14"/>
                 <w:szCs w:val="14"/>
               </w:rPr>
-              <w:t xml:space="preserve">24 ms</w:t>
+              <w:t xml:space="preserve">26 ms</w:t>
             </w:r>
           </w:p>
         </w:tc>
@@ -6752,7 +6978,7 @@
                 <w:sz w:val="14"/>
                 <w:szCs w:val="14"/>
               </w:rPr>
-              <w:t xml:space="preserve">25 ms</w:t>
+              <w:t xml:space="preserve">24 ms</w:t>
             </w:r>
           </w:p>
         </w:tc>
@@ -7036,7 +7262,7 @@
                 <w:sz w:val="14"/>
                 <w:szCs w:val="14"/>
               </w:rPr>
-              <w:t xml:space="preserve">0 ms</w:t>
+              <w:t xml:space="preserve">1 ms</w:t>
             </w:r>
           </w:p>
         </w:tc>
@@ -7178,7 +7404,7 @@
                 <w:sz w:val="14"/>
                 <w:szCs w:val="14"/>
               </w:rPr>
-              <w:t xml:space="preserve">305 ms</w:t>
+              <w:t xml:space="preserve">312 ms</w:t>
             </w:r>
           </w:p>
         </w:tc>
@@ -7281,7 +7507,7 @@
                 <w:sz w:val="17"/>
                 <w:szCs w:val="17"/>
               </w:rPr>
-              <w:t xml:space="preserve">13 enregistrement(s) archivé(s), 42 fichier(s) couverts par empreintes.sha256, 0 écart ; ancre e5e200019d3547f7… ; octets du gel restitués à l'identique ; altération d'un octet détectée et signalée ALTÉRÉ, fichier conservé dans l'archive</w:t>
+              <w:t xml:space="preserve">13 enregistrement(s) archivé(s), 43 fichier(s) couverts par empreintes.sha256, 0 écart ; ancre b220dc2af1cc3347… ; octets du gel restitués à l'identique ; altération d'un octet détectée et signalée ALTÉRÉ, fichier conservé dans l'archive</w:t>
             </w:r>
           </w:p>
         </w:tc>
@@ -7320,7 +7546,7 @@
                 <w:sz w:val="14"/>
                 <w:szCs w:val="14"/>
               </w:rPr>
-              <w:t xml:space="preserve">411 ms</w:t>
+              <w:t xml:space="preserve">449 ms</w:t>
             </w:r>
           </w:p>
         </w:tc>
@@ -7604,7 +7830,7 @@
                 <w:sz w:val="14"/>
                 <w:szCs w:val="14"/>
               </w:rPr>
-              <w:t xml:space="preserve">346 ms</w:t>
+              <w:t xml:space="preserve">378 ms</w:t>
             </w:r>
           </w:p>
         </w:tc>
@@ -7746,7 +7972,7 @@
                 <w:sz w:val="14"/>
                 <w:szCs w:val="14"/>
               </w:rPr>
-              <w:t xml:space="preserve">300 ms</w:t>
+              <w:t xml:space="preserve">312 ms</w:t>
             </w:r>
           </w:p>
         </w:tc>
@@ -7991,7 +8217,7 @@
                 <w:sz w:val="17"/>
                 <w:szCs w:val="17"/>
               </w:rPr>
-              <w:t xml:space="preserve">32 modèles déclarés, tous purgés ou détachés par prisma/seed.ts</w:t>
+              <w:t xml:space="preserve">34 modèles déclarés, tous purgés ou détachés par prisma/seed.ts</w:t>
             </w:r>
           </w:p>
         </w:tc>
@@ -8172,7 +8398,7 @@
                 <w:sz w:val="14"/>
                 <w:szCs w:val="14"/>
               </w:rPr>
-              <w:t xml:space="preserve">30 ms</w:t>
+              <w:t xml:space="preserve">24 ms</w:t>
             </w:r>
           </w:p>
         </w:tc>
@@ -8275,7 +8501,7 @@
                 <w:sz w:val="17"/>
                 <w:szCs w:val="17"/>
               </w:rPr>
-              <w:t xml:space="preserve">196 fichier(s) source relus, aucune écriture dans la piste hors du module ; 9 empreintes comparées entre l'implémentation TypeScript et le miroir de la console serveur, toutes identiques</w:t>
+              <w:t xml:space="preserve">200 fichier(s) source relus, aucune écriture dans la piste hors du module ; 9 empreintes comparées entre l'implémentation TypeScript et le miroir de la console serveur, toutes identiques</w:t>
             </w:r>
           </w:p>
         </w:tc>
@@ -8559,7 +8785,7 @@
                 <w:sz w:val="17"/>
                 <w:szCs w:val="17"/>
               </w:rPr>
-              <w:t xml:space="preserve">consommation de jeton et changement personnel horodatés et exigence levée, compte d'amorçage horodaté et marqué à renouveler ; requireUser() redirige vers l'écran de renouvellement ; 48 point(s) d'entrée relus, aucun ne s'authentifie hors du garde (3 exceptions nommées : mise en page, connexion, renouvellement)</w:t>
+              <w:t xml:space="preserve">consommation de jeton et changement personnel horodatés et exigence levée, compte d'amorçage horodaté et marqué à renouveler ; requireUser() redirige vers l'écran de renouvellement ; 50 point(s) d'entrée relus, aucun ne s'authentifie hors du garde (3 exceptions nommées : mise en page, connexion, renouvellement)</w:t>
             </w:r>
           </w:p>
         </w:tc>
@@ -8740,7 +8966,7 @@
                 <w:sz w:val="14"/>
                 <w:szCs w:val="14"/>
               </w:rPr>
-              <w:t xml:space="preserve">226 ms</w:t>
+              <w:t xml:space="preserve">227 ms</w:t>
             </w:r>
           </w:p>
         </w:tc>
@@ -8843,7 +9069,7 @@
                 <w:sz w:val="17"/>
                 <w:szCs w:val="17"/>
               </w:rPr>
-              <w:t xml:space="preserve">196 fichier(s) source relus : aucune écriture de mot de passe hors des chemins autorisés ; une seule écriture dans les actions serveur, le changement personnel, qui exige l'ancien mot de passe ; l'outil d'urgence de la console émet un jeton et ne sait plus dériver de mot de passe ; aucun champ de mot de passe hors des 6 écrans où l'on saisit le sien</w:t>
+              <w:t xml:space="preserve">200 fichier(s) source relus : aucune écriture de mot de passe hors des chemins autorisés ; une seule écriture dans les actions serveur, le changement personnel, qui exige l'ancien mot de passe ; l'outil d'urgence de la console émet un jeton et ne sait plus dériver de mot de passe ; aucun champ de mot de passe hors des 7 écrans où l'on saisit le sien</w:t>
             </w:r>
           </w:p>
         </w:tc>
@@ -8882,7 +9108,7 @@
                 <w:sz w:val="14"/>
                 <w:szCs w:val="14"/>
               </w:rPr>
-              <w:t xml:space="preserve">33 ms</w:t>
+              <w:t xml:space="preserve">32 ms</w:t>
             </w:r>
           </w:p>
         </w:tc>
@@ -9024,7 +9250,7 @@
                 <w:sz w:val="14"/>
                 <w:szCs w:val="14"/>
               </w:rPr>
-              <w:t xml:space="preserve">9123 ms</w:t>
+              <w:t xml:space="preserve">14219 ms</w:t>
             </w:r>
           </w:p>
         </w:tc>
@@ -9127,7 +9353,7 @@
                 <w:sz w:val="17"/>
                 <w:szCs w:val="17"/>
               </w:rPr>
-              <w:t xml:space="preserve">181 messages du catalogue complets dans les deux langues et à variables identiques ; entrée écrite par le point de passage relue « SPEC-OQ30 : En attente → Justifié — justification : ess… » et « SPEC-OQ30: Pending → Justified — justification: essai d… » ; le statut suit la langue, le motif saisi est restitué à l'identique dans les deux ; réécriture des arguments et changement de clé détectés au rang 64, chaîne rétablie après remise en état ; une entrée sans message se sérialise sur 9 champs comme avant, 11 avec, miroir de console identique sur les deux formes</w:t>
+              <w:t xml:space="preserve">187 messages du catalogue complets dans les deux langues et à variables identiques ; entrée écrite par le point de passage relue « SPEC-OQ30 : En attente → Justifié — justification : ess… » et « SPEC-OQ30: Pending → Justified — justification: essai d… » ; le statut suit la langue, le motif saisi est restitué à l'identique dans les deux ; réécriture des arguments et changement de clé détectés au rang 64, chaîne rétablie après remise en état ; une entrée sans message se sérialise sur 9 champs comme avant, 11 avec, miroir de console identique sur les deux formes</w:t>
             </w:r>
           </w:p>
         </w:tc>
@@ -9166,7 +9392,7 @@
                 <w:sz w:val="14"/>
                 <w:szCs w:val="14"/>
               </w:rPr>
-              <w:t xml:space="preserve">29 ms</w:t>
+              <w:t xml:space="preserve">23 ms</w:t>
             </w:r>
           </w:p>
         </w:tc>
@@ -9269,7 +9495,7 @@
                 <w:sz w:val="17"/>
                 <w:szCs w:val="17"/>
               </w:rPr>
-              <w:t xml:space="preserve">copie d'archivage de OQ-012-revision rév. 001 produite (69088 octets, 1 page·s) ; 29 contrôles structurels PDF/A-2b passés — police embarquée, profil ICC « acsp » de 3024 octets, métadonnées pdfaid partie 2 niveau B, décalages exacts ; texte intégralement relu par la table du fichier, 44 caractère·s accentué·s ou typographiques restitués ; production déterministe (deux exécutions octet pour octet identiques)</w:t>
+              <w:t xml:space="preserve">copie d'archivage de OQ-012-revision rév. 001 produite (69093 octets, 1 page·s) ; 29 contrôles structurels PDF/A-2b passés — police embarquée, profil ICC « acsp » de 3024 octets, métadonnées pdfaid partie 2 niveau B, décalages exacts ; texte intégralement relu par la table du fichier, 44 caractère·s accentué·s ou typographiques restitués ; production déterministe (deux exécutions octet pour octet identiques)</w:t>
             </w:r>
           </w:p>
         </w:tc>
@@ -9309,6 +9535,290 @@
                 <w:szCs w:val="14"/>
               </w:rPr>
               <w:t xml:space="preserve">16 ms</w:t>
+            </w:r>
+          </w:p>
+        </w:tc>
+      </w:tr>
+      <w:tr>
+        <w:tc>
+          <w:tcPr>
+            <w:tcW w:type="pct" w:w="13%"/>
+            <w:shd w:fill="F8FAFC"/>
+            <w:tcMar>
+              <w:top w:type="dxa" w:w="80"/>
+              <w:left w:type="dxa" w:w="110"/>
+              <w:bottom w:type="dxa" w:w="80"/>
+              <w:right w:type="dxa" w:w="110"/>
+            </w:tcMar>
+          </w:tcPr>
+          <w:p>
+            <w:pPr>
+              <w:spacing w:after="50"/>
+            </w:pPr>
+            <w:r>
+              <w:rPr>
+                <w:b/>
+                <w:bCs/>
+                <w:color w:val="4338CA"/>
+                <w:sz w:val="17"/>
+                <w:szCs w:val="17"/>
+              </w:rPr>
+              <w:t xml:space="preserve">OQ-32</w:t>
+            </w:r>
+          </w:p>
+          <w:p>
+            <w:pPr>
+              <w:spacing w:after="0"/>
+            </w:pPr>
+            <w:r>
+              <w:rPr>
+                <w:color w:val="475569"/>
+                <w:sz w:val="15"/>
+                <w:szCs w:val="15"/>
+              </w:rPr>
+              <w:t xml:space="preserve">URS-35</w:t>
+            </w:r>
+          </w:p>
+        </w:tc>
+        <w:tc>
+          <w:tcPr>
+            <w:tcW w:type="pct" w:w="30%"/>
+            <w:tcMar>
+              <w:top w:type="dxa" w:w="80"/>
+              <w:left w:type="dxa" w:w="110"/>
+              <w:bottom w:type="dxa" w:w="80"/>
+              <w:right w:type="dxa" w:w="110"/>
+            </w:tcMar>
+          </w:tcPr>
+          <w:p>
+            <w:pPr>
+              <w:spacing w:after="50"/>
+            </w:pPr>
+            <w:r>
+              <w:rPr>
+                <w:b/>
+                <w:bCs/>
+                <w:sz w:val="17"/>
+                <w:szCs w:val="17"/>
+              </w:rPr>
+              <w:t xml:space="preserve">Couverture des revues de piste : contiguë par rang, figée à l'ouverture, sans revue concurrente</w:t>
+            </w:r>
+          </w:p>
+          <w:p>
+            <w:pPr>
+              <w:spacing w:after="0"/>
+            </w:pPr>
+            <w:r>
+              <w:rPr>
+                <w:color w:val="475569"/>
+                <w:sz w:val="15"/>
+                <w:szCs w:val="15"/>
+              </w:rPr>
+              <w:t xml:space="preserve">Vérifier qu'une revue fige sa fenêtre à l'ouverture — les entrées écrites pendant qu'elle est ouverte, y compris celles qu'elle produit elle-même, tombent dans la suivante —, qu'aucune seconde revue ne peut être ouverte en parallèle, qu'une fenêtre vide est refusée, et que deux revues successives ne laissent ni lacune ni recouvrement.</w:t>
+            </w:r>
+          </w:p>
+        </w:tc>
+        <w:tc>
+          <w:tcPr>
+            <w:tcW w:type="pct" w:w="45%"/>
+            <w:tcMar>
+              <w:top w:type="dxa" w:w="80"/>
+              <w:left w:type="dxa" w:w="110"/>
+              <w:bottom w:type="dxa" w:w="80"/>
+              <w:right w:type="dxa" w:w="110"/>
+            </w:tcMar>
+          </w:tcPr>
+          <w:p>
+            <w:pPr>
+              <w:spacing w:after="0"/>
+            </w:pPr>
+            <w:r>
+              <w:rPr>
+                <w:sz w:val="17"/>
+                <w:szCs w:val="17"/>
+              </w:rPr>
+              <w:t xml:space="preserve">fenêtres successives 1-67 puis 68-70 : contiguës, sans recouvrement ni lacune ; ouverture concurrente refusée (« dejaOuverte ») ; l'entrée écrite PENDANT la première revue est tombée dans la seconde fenêtre, la fenêtre figée n'ayant pas bougé ; couverture atteinte au rang 74 sur 76, 0 lacune ; aucune rupture ajoutée à la chaîne sur 75 entrées</w:t>
+            </w:r>
+          </w:p>
+        </w:tc>
+        <w:tc>
+          <w:tcPr>
+            <w:tcW w:type="pct" w:w="12%"/>
+            <w:tcMar>
+              <w:top w:type="dxa" w:w="80"/>
+              <w:left w:type="dxa" w:w="110"/>
+              <w:bottom w:type="dxa" w:w="80"/>
+              <w:right w:type="dxa" w:w="110"/>
+            </w:tcMar>
+          </w:tcPr>
+          <w:p>
+            <w:pPr>
+              <w:spacing w:after="40"/>
+            </w:pPr>
+            <w:r>
+              <w:rPr>
+                <w:b/>
+                <w:bCs/>
+                <w:color w:val="047857"/>
+                <w:sz w:val="17"/>
+                <w:szCs w:val="17"/>
+              </w:rPr>
+              <w:t xml:space="preserve">Conforme</w:t>
+            </w:r>
+          </w:p>
+          <w:p>
+            <w:pPr>
+              <w:spacing w:after="0"/>
+            </w:pPr>
+            <w:r>
+              <w:rPr>
+                <w:color w:val="475569"/>
+                <w:sz w:val="14"/>
+                <w:szCs w:val="14"/>
+              </w:rPr>
+              <w:t xml:space="preserve">166 ms</w:t>
+            </w:r>
+          </w:p>
+        </w:tc>
+      </w:tr>
+      <w:tr>
+        <w:tc>
+          <w:tcPr>
+            <w:tcW w:type="pct" w:w="13%"/>
+            <w:shd w:fill="F8FAFC"/>
+            <w:tcMar>
+              <w:top w:type="dxa" w:w="80"/>
+              <w:left w:type="dxa" w:w="110"/>
+              <w:bottom w:type="dxa" w:w="80"/>
+              <w:right w:type="dxa" w:w="110"/>
+            </w:tcMar>
+          </w:tcPr>
+          <w:p>
+            <w:pPr>
+              <w:spacing w:after="50"/>
+            </w:pPr>
+            <w:r>
+              <w:rPr>
+                <w:b/>
+                <w:bCs/>
+                <w:color w:val="4338CA"/>
+                <w:sz w:val="17"/>
+                <w:szCs w:val="17"/>
+              </w:rPr>
+              <w:t xml:space="preserve">OQ-33</w:t>
+            </w:r>
+          </w:p>
+          <w:p>
+            <w:pPr>
+              <w:spacing w:after="0"/>
+            </w:pPr>
+            <w:r>
+              <w:rPr>
+                <w:color w:val="475569"/>
+                <w:sz w:val="15"/>
+                <w:szCs w:val="15"/>
+              </w:rPr>
+              <w:t xml:space="preserve">URS-36</w:t>
+            </w:r>
+          </w:p>
+        </w:tc>
+        <w:tc>
+          <w:tcPr>
+            <w:tcW w:type="pct" w:w="30%"/>
+            <w:tcMar>
+              <w:top w:type="dxa" w:w="80"/>
+              <w:left w:type="dxa" w:w="110"/>
+              <w:bottom w:type="dxa" w:w="80"/>
+              <w:right w:type="dxa" w:w="110"/>
+            </w:tcMar>
+          </w:tcPr>
+          <w:p>
+            <w:pPr>
+              <w:spacing w:after="50"/>
+            </w:pPr>
+            <w:r>
+              <w:rPr>
+                <w:b/>
+                <w:bCs/>
+                <w:sz w:val="17"/>
+                <w:szCs w:val="17"/>
+              </w:rPr>
+              <w:t xml:space="preserve">Clôture d'une revue : signature liée à l'empreinte du contenu revu, impossible sur des lignes non statuées</w:t>
+            </w:r>
+          </w:p>
+          <w:p>
+            <w:pPr>
+              <w:spacing w:after="0"/>
+            </w:pPr>
+            <w:r>
+              <w:rPr>
+                <w:color w:val="475569"/>
+                <w:sz w:val="15"/>
+                <w:szCs w:val="15"/>
+              </w:rPr>
+              <w:t xml:space="preserve">Vérifier qu'une revue refuse de se clore tant qu'une entrée retenue n'est pas statuée ou que la conclusion est vide, qu'un verdict affirmatif exige son motif, que la clôture produit une manifestation portant le nom imprimé, la signification « Revu » et l'empreinte du contenu, que cette empreinte se recalcule à l'identique hors du logiciel et change au moindre changement de contenu, que l'indépendance est mesurée sur le SIGNATAIRE, et qu'une revue close ne se rouvre pas.</w:t>
+            </w:r>
+          </w:p>
+        </w:tc>
+        <w:tc>
+          <w:tcPr>
+            <w:tcW w:type="pct" w:w="45%"/>
+            <w:tcMar>
+              <w:top w:type="dxa" w:w="80"/>
+              <w:left w:type="dxa" w:w="110"/>
+              <w:bottom w:type="dxa" w:w="80"/>
+              <w:right w:type="dxa" w:w="110"/>
+            </w:tcMar>
+          </w:tcPr>
+          <w:p>
+            <w:pPr>
+              <w:spacing w:after="0"/>
+            </w:pPr>
+            <w:r>
+              <w:rPr>
+                <w:sz w:val="17"/>
+                <w:szCs w:val="17"/>
+              </w:rPr>
+              <w:t xml:space="preserve">clôture refusée trois fois avant d'être permise — conclusion vide, 1 entrée(s) non statuée(s), verdict affirmatif sans motif ; manifestation « Testeur QR2 (QR2) · Revu · 06/08/2026 17:59:36 UTC · enregistrement 34AB 06E1 AC12 » portant le nom imprimé, la signification « Revu » et l'empreinte du contenu ; empreinte recalculée à l'identique hors du logiciel, et modifiée par le moindre changement de conclusion ou de verdict ; indépendance consignée sur le SIGNATAIRE (0 entrée·s écrite·s par lui, contre 5 par l'ouvreur) ; 10 règles de triage inscrites dans l'enregistrement ; re-clôture et re-statuage refusés ; aucune rupture ajoutée à la chaîne sur 82 entrées</w:t>
+            </w:r>
+          </w:p>
+        </w:tc>
+        <w:tc>
+          <w:tcPr>
+            <w:tcW w:type="pct" w:w="12%"/>
+            <w:tcMar>
+              <w:top w:type="dxa" w:w="80"/>
+              <w:left w:type="dxa" w:w="110"/>
+              <w:bottom w:type="dxa" w:w="80"/>
+              <w:right w:type="dxa" w:w="110"/>
+            </w:tcMar>
+          </w:tcPr>
+          <w:p>
+            <w:pPr>
+              <w:spacing w:after="40"/>
+            </w:pPr>
+            <w:r>
+              <w:rPr>
+                <w:b/>
+                <w:bCs/>
+                <w:color w:val="047857"/>
+                <w:sz w:val="17"/>
+                <w:szCs w:val="17"/>
+              </w:rPr>
+              <w:t xml:space="preserve">Conforme</w:t>
+            </w:r>
+          </w:p>
+          <w:p>
+            <w:pPr>
+              <w:spacing w:after="0"/>
+            </w:pPr>
+            <w:r>
+              <w:rPr>
+                <w:color w:val="475569"/>
+                <w:sz w:val="14"/>
+                <w:szCs w:val="14"/>
+              </w:rPr>
+              <w:t xml:space="preserve">111 ms</w:t>
             </w:r>
           </w:p>
         </w:tc>
@@ -12050,6 +12560,160 @@
           </w:p>
         </w:tc>
       </w:tr>
+      <w:tr>
+        <w:tc>
+          <w:tcPr>
+            <w:tcW w:type="pct" w:w="12%"/>
+            <w:tcMar>
+              <w:top w:type="dxa" w:w="80"/>
+              <w:left w:type="dxa" w:w="110"/>
+              <w:bottom w:type="dxa" w:w="80"/>
+              <w:right w:type="dxa" w:w="110"/>
+            </w:tcMar>
+          </w:tcPr>
+          <w:p>
+            <w:pPr>
+              <w:spacing w:after="0"/>
+            </w:pPr>
+            <w:r>
+              <w:rPr>
+                <w:b/>
+                <w:bCs/>
+                <w:color w:val="4338CA"/>
+                <w:sz w:val="17"/>
+                <w:szCs w:val="17"/>
+              </w:rPr>
+              <w:t xml:space="preserve">URS-35</w:t>
+            </w:r>
+          </w:p>
+        </w:tc>
+        <w:tc>
+          <w:tcPr>
+            <w:tcW w:type="pct" w:w="22%"/>
+            <w:tcMar>
+              <w:top w:type="dxa" w:w="80"/>
+              <w:left w:type="dxa" w:w="110"/>
+              <w:bottom w:type="dxa" w:w="80"/>
+              <w:right w:type="dxa" w:w="110"/>
+            </w:tcMar>
+          </w:tcPr>
+          <w:p>
+            <w:pPr>
+              <w:spacing w:after="0"/>
+            </w:pPr>
+            <w:r>
+              <w:rPr>
+                <w:b/>
+                <w:bCs/>
+                <w:color w:val="047857"/>
+                <w:sz w:val="17"/>
+                <w:szCs w:val="17"/>
+              </w:rPr>
+              <w:t xml:space="preserve">OQ-32</w:t>
+            </w:r>
+          </w:p>
+        </w:tc>
+        <w:tc>
+          <w:tcPr>
+            <w:tcW w:type="pct" w:w="66%"/>
+            <w:tcMar>
+              <w:top w:type="dxa" w:w="80"/>
+              <w:left w:type="dxa" w:w="110"/>
+              <w:bottom w:type="dxa" w:w="80"/>
+              <w:right w:type="dxa" w:w="110"/>
+            </w:tcMar>
+          </w:tcPr>
+          <w:p>
+            <w:pPr>
+              <w:spacing w:after="0"/>
+            </w:pPr>
+            <w:r>
+              <w:rPr>
+                <w:sz w:val="17"/>
+                <w:szCs w:val="17"/>
+              </w:rPr>
+              <w:t xml:space="preserve">Cas de test automatisé exécuté par l'éditeur à chaque version, résultat en section 5.1.</w:t>
+            </w:r>
+          </w:p>
+        </w:tc>
+      </w:tr>
+      <w:tr>
+        <w:tc>
+          <w:tcPr>
+            <w:tcW w:type="pct" w:w="12%"/>
+            <w:tcMar>
+              <w:top w:type="dxa" w:w="80"/>
+              <w:left w:type="dxa" w:w="110"/>
+              <w:bottom w:type="dxa" w:w="80"/>
+              <w:right w:type="dxa" w:w="110"/>
+            </w:tcMar>
+          </w:tcPr>
+          <w:p>
+            <w:pPr>
+              <w:spacing w:after="0"/>
+            </w:pPr>
+            <w:r>
+              <w:rPr>
+                <w:b/>
+                <w:bCs/>
+                <w:color w:val="4338CA"/>
+                <w:sz w:val="17"/>
+                <w:szCs w:val="17"/>
+              </w:rPr>
+              <w:t xml:space="preserve">URS-36</w:t>
+            </w:r>
+          </w:p>
+        </w:tc>
+        <w:tc>
+          <w:tcPr>
+            <w:tcW w:type="pct" w:w="22%"/>
+            <w:tcMar>
+              <w:top w:type="dxa" w:w="80"/>
+              <w:left w:type="dxa" w:w="110"/>
+              <w:bottom w:type="dxa" w:w="80"/>
+              <w:right w:type="dxa" w:w="110"/>
+            </w:tcMar>
+          </w:tcPr>
+          <w:p>
+            <w:pPr>
+              <w:spacing w:after="0"/>
+            </w:pPr>
+            <w:r>
+              <w:rPr>
+                <w:b/>
+                <w:bCs/>
+                <w:color w:val="047857"/>
+                <w:sz w:val="17"/>
+                <w:szCs w:val="17"/>
+              </w:rPr>
+              <w:t xml:space="preserve">OQ-33</w:t>
+            </w:r>
+          </w:p>
+        </w:tc>
+        <w:tc>
+          <w:tcPr>
+            <w:tcW w:type="pct" w:w="66%"/>
+            <w:tcMar>
+              <w:top w:type="dxa" w:w="80"/>
+              <w:left w:type="dxa" w:w="110"/>
+              <w:bottom w:type="dxa" w:w="80"/>
+              <w:right w:type="dxa" w:w="110"/>
+            </w:tcMar>
+          </w:tcPr>
+          <w:p>
+            <w:pPr>
+              <w:spacing w:after="0"/>
+            </w:pPr>
+            <w:r>
+              <w:rPr>
+                <w:sz w:val="17"/>
+                <w:szCs w:val="17"/>
+              </w:rPr>
+              <w:t xml:space="preserve">Cas de test automatisé exécuté par l'éditeur à chaque version, résultat en section 5.1.</w:t>
+            </w:r>
+          </w:p>
+        </w:tc>
+      </w:tr>
     </w:tbl>
     <w:p>
       <w:pPr>
@@ -12069,7 +12733,7 @@
           <w:sz w:val="20"/>
           <w:szCs w:val="20"/>
         </w:rPr>
-        <w:t xml:space="preserve">Sur les 34 exigences, 30 sont vérifiées automatiquement par l'éditeur et 4 doivent l'être chez vous. Ce n'est pas un partage arbitraire : ces 4 exigences ne sont pas observables sans navigateur, sans requête HTTP ou sans votre infrastructure. Les compter comme couvertes serait une affirmation invérifiable.</w:t>
+        <w:t xml:space="preserve">Sur les 36 exigences, 32 sont vérifiées automatiquement par l'éditeur et 4 doivent l'être chez vous. Ce n'est pas un partage arbitraire : ces 4 exigences ne sont pas observables sans navigateur, sans requête HTTP ou sans votre infrastructure. Les compter comme couvertes serait une affirmation invérifiable.</w:t>
       </w:r>
     </w:p>
     <w:p>
@@ -12421,7 +13085,7 @@
         <w:sz w:val="15"/>
         <w:szCs w:val="15"/>
       </w:rPr>
-      <w:t xml:space="preserve">   ·   Version 1.2.1 · rapport OQ exécuté le 6 août 2026 à 15:08 UTC</w:t>
+      <w:t xml:space="preserve">   ·   Version 1.2.1 · rapport OQ exécuté le 6 août 2026 à 17:59 UTC</w:t>
     </w:r>
   </w:p>
 </w:ftr>

</xml_diff>

<commit_message>
Site — qualité d'énoncé à la saisie (B1)
Note de périmètre, manuel et captures régénérés : dix lignes de périmètre au
lieu de neuf, 34 cas de qualification au lieu de 33.

Co-Authored-By: Claude Opus 5 <noreply@anthropic.com>
</commit_message>
<xml_diff>
--- a/docs/Dossier_de_validation_Filum.docx
+++ b/docs/Dossier_de_validation_Filum.docx
@@ -430,7 +430,7 @@
           <w:sz w:val="20"/>
           <w:szCs w:val="20"/>
         </w:rPr>
-        <w:t xml:space="preserve">Les 36 exigences ci-dessous énoncent ce que le logiciel doit faire. Le niveau de risque est celui de la DÉFAILLANCE de l'exigence, pas de son importance commerciale : il détermine la profondeur de vérification.</w:t>
+        <w:t xml:space="preserve">Les 37 exigences ci-dessous énoncent ce que le logiciel doit faire. Le niveau de risque est celui de la DÉFAILLANCE de l'exigence, pas de son importance commerciale : il détermine la profondeur de vérification.</w:t>
       </w:r>
     </w:p>
     <w:tbl>
@@ -4625,6 +4625,119 @@
           </w:p>
         </w:tc>
       </w:tr>
+      <w:tr>
+        <w:tc>
+          <w:tcPr>
+            <w:tcW w:type="pct" w:w="11%"/>
+            <w:shd w:fill="F8FAFC"/>
+            <w:tcMar>
+              <w:top w:type="dxa" w:w="80"/>
+              <w:left w:type="dxa" w:w="110"/>
+              <w:bottom w:type="dxa" w:w="80"/>
+              <w:right w:type="dxa" w:w="110"/>
+            </w:tcMar>
+          </w:tcPr>
+          <w:p>
+            <w:pPr>
+              <w:spacing w:after="60"/>
+            </w:pPr>
+            <w:r>
+              <w:rPr>
+                <w:b/>
+                <w:bCs/>
+                <w:color w:val="4338CA"/>
+                <w:sz w:val="17"/>
+                <w:szCs w:val="17"/>
+              </w:rPr>
+              <w:t xml:space="preserve">URS-37</w:t>
+            </w:r>
+          </w:p>
+          <w:p>
+            <w:pPr>
+              <w:spacing w:after="0"/>
+            </w:pPr>
+            <w:r>
+              <w:rPr>
+                <w:b/>
+                <w:bCs/>
+                <w:color w:val="B45309"/>
+                <w:sz w:val="15"/>
+                <w:szCs w:val="15"/>
+              </w:rPr>
+              <w:t xml:space="preserve">Moyen</w:t>
+            </w:r>
+          </w:p>
+        </w:tc>
+        <w:tc>
+          <w:tcPr>
+            <w:tcW w:type="pct" w:w="41%"/>
+            <w:tcMar>
+              <w:top w:type="dxa" w:w="80"/>
+              <w:left w:type="dxa" w:w="110"/>
+              <w:bottom w:type="dxa" w:w="80"/>
+              <w:right w:type="dxa" w:w="110"/>
+            </w:tcMar>
+          </w:tcPr>
+          <w:p>
+            <w:pPr>
+              <w:spacing w:after="0"/>
+            </w:pPr>
+            <w:r>
+              <w:rPr>
+                <w:sz w:val="17"/>
+                <w:szCs w:val="17"/>
+              </w:rPr>
+              <w:t xml:space="preserve">Les contrôles de qualité d'énoncé sont DÉTERMINISTES et sans effet de bord : ils s'exécutent sans clé d'API et sans accès réseau, rendent le même résultat pour le même énoncé, citent le fragment fautif tel qu'il a été écrit, n'écrivent jamais dans l'enregistrement et n'empêchent jamais de l'enregistrer.</w:t>
+            </w:r>
+          </w:p>
+        </w:tc>
+        <w:tc>
+          <w:tcPr>
+            <w:tcW w:type="pct" w:w="28%"/>
+            <w:tcMar>
+              <w:top w:type="dxa" w:w="80"/>
+              <w:left w:type="dxa" w:w="110"/>
+              <w:bottom w:type="dxa" w:w="80"/>
+              <w:right w:type="dxa" w:w="110"/>
+            </w:tcMar>
+          </w:tcPr>
+          <w:p>
+            <w:pPr>
+              <w:spacing w:after="0"/>
+            </w:pPr>
+            <w:r>
+              <w:rPr>
+                <w:sz w:val="17"/>
+                <w:szCs w:val="17"/>
+              </w:rPr>
+              <w:t xml:space="preserve">Un contrôle qui réécrirait l'énoncé changerait l'auteur d'un enregistrement sans que personne l'ait décidé — l'attribution ALCOA+ tomberait. Un contrôle qui bloquerait l'enregistrement serait contourné en retirant le mot déclencheur, et deviendrait une décoration qui donne l'illusion d'une maîtrise. Un contrôle dépendant d'un modèle de langue ne rendrait pas deux fois le même verdict et ne pourrait pas être qualifié.</w:t>
+            </w:r>
+          </w:p>
+        </w:tc>
+        <w:tc>
+          <w:tcPr>
+            <w:tcW w:type="pct" w:w="20%"/>
+            <w:tcMar>
+              <w:top w:type="dxa" w:w="80"/>
+              <w:left w:type="dxa" w:w="110"/>
+              <w:bottom w:type="dxa" w:w="80"/>
+              <w:right w:type="dxa" w:w="110"/>
+            </w:tcMar>
+          </w:tcPr>
+          <w:p>
+            <w:pPr>
+              <w:spacing w:after="0"/>
+            </w:pPr>
+            <w:r>
+              <w:rPr>
+                <w:sz w:val="17"/>
+                <w:szCs w:val="17"/>
+              </w:rPr>
+              <w:t xml:space="preserve">ISO 13485 §7.3.3 · IEC 62366-1 §5.1 · 21 CFR 820.30(c)</w:t>
+            </w:r>
+          </w:p>
+        </w:tc>
+      </w:tr>
     </w:tbl>
     <w:p>
       <w:pPr>
@@ -4644,7 +4757,7 @@
           <w:sz w:val="20"/>
           <w:szCs w:val="20"/>
         </w:rPr>
-        <w:t xml:space="preserve">Répartition : 24 exigences à risque haut, 10 à risque moyen, 2 à risque bas. Les exigences à risque haut touchent toutes à l'intégrité ou à l'attribution des enregistrements : leur défaillance ne dégrade pas le confort d'usage, elle rend un enregistrement indéfendable. Elles font l'objet de cas de test dédiés, exécutés à chaque version.</w:t>
+        <w:t xml:space="preserve">Répartition : 24 exigences à risque haut, 11 à risque moyen, 2 à risque bas. Les exigences à risque haut touchent toutes à l'intégrité ou à l'attribution des enregistrements : leur défaillance ne dégrade pas le confort d'usage, elle rend un enregistrement indéfendable. Elles font l'objet de cas de test dédiés, exécutés à chaque version.</w:t>
       </w:r>
     </w:p>
     <w:p>
@@ -4795,7 +4908,7 @@
                 <w:sz w:val="17"/>
                 <w:szCs w:val="17"/>
               </w:rPr>
-              <w:t xml:space="preserve">6 août 2026 à 17:59</w:t>
+              <w:t xml:space="preserve">6 août 2026 à 19:52</w:t>
             </w:r>
           </w:p>
         </w:tc>
@@ -4998,7 +5111,7 @@
                 <w:sz w:val="17"/>
                 <w:szCs w:val="17"/>
               </w:rPr>
-              <w:t xml:space="preserve">33 cas sur 33 conformes — aucun écart</w:t>
+              <w:t xml:space="preserve">34 cas sur 34 conformes — aucun écart</w:t>
             </w:r>
           </w:p>
         </w:tc>
@@ -5377,7 +5490,7 @@
                 <w:sz w:val="17"/>
                 <w:szCs w:val="17"/>
               </w:rPr>
-              <w:t xml:space="preserve">empreintes distinctes pour un même mot de passe (a2b9030729d2… ≠ c124c47c008b…), vérification correcte, mot de passe faux et vide refusés</w:t>
+              <w:t xml:space="preserve">empreintes distinctes pour un même mot de passe (770008180c66… ≠ d0bfb8df4d32…), vérification correcte, mot de passe faux et vide refusés</w:t>
             </w:r>
           </w:p>
         </w:tc>
@@ -5416,7 +5529,7 @@
                 <w:sz w:val="14"/>
                 <w:szCs w:val="14"/>
               </w:rPr>
-              <w:t xml:space="preserve">137 ms</w:t>
+              <w:t xml:space="preserve">144 ms</w:t>
             </w:r>
           </w:p>
         </w:tc>
@@ -5661,7 +5774,7 @@
                 <w:sz w:val="17"/>
                 <w:szCs w:val="17"/>
               </w:rPr>
-              <w:t xml:space="preserve">contenu gelé, empreinte 24604eb157d7fa54…, 10486 octets conservés, opération journalisée</w:t>
+              <w:t xml:space="preserve">contenu gelé, empreinte 24604eb157d7fa54…, 10487 octets conservés, opération journalisée</w:t>
             </w:r>
           </w:p>
         </w:tc>
@@ -5700,7 +5813,7 @@
                 <w:sz w:val="14"/>
                 <w:szCs w:val="14"/>
               </w:rPr>
-              <w:t xml:space="preserve">113 ms</w:t>
+              <w:t xml:space="preserve">125 ms</w:t>
             </w:r>
           </w:p>
         </w:tc>
@@ -5803,7 +5916,7 @@
                 <w:sz w:val="17"/>
                 <w:szCs w:val="17"/>
               </w:rPr>
-              <w:t xml:space="preserve">signature liée à l'instantané cmshtlnf…, empreinte attestée 3767 CD80 ACC9, manifestation « Testeur QA1 (QA1) · Approuvé · 06/08/2026 17:59:19 UTC · enregistrement 3767 CD80 ACC9 »</w:t>
+              <w:t xml:space="preserve">signature liée à l'instantané cmshxn9r…, empreinte attestée 3767 CD80 ACC9, manifestation « Testeur QA1 (QA1) · Approuvé · 06/08/2026 19:52:33 UTC · enregistrement 3767 CD80 ACC9 »</w:t>
             </w:r>
           </w:p>
         </w:tc>
@@ -5842,7 +5955,7 @@
                 <w:sz w:val="14"/>
                 <w:szCs w:val="14"/>
               </w:rPr>
-              <w:t xml:space="preserve">44 ms</w:t>
+              <w:t xml:space="preserve">42 ms</w:t>
             </w:r>
           </w:p>
         </w:tc>
@@ -5945,7 +6058,7 @@
                 <w:sz w:val="17"/>
                 <w:szCs w:val="17"/>
               </w:rPr>
-              <w:t xml:space="preserve">10489 octets relus à l'identique ; inversion d'un octet en position 5244 détectée</w:t>
+              <w:t xml:space="preserve">10488 octets relus à l'identique ; inversion d'un octet en position 5244 détectée</w:t>
             </w:r>
           </w:p>
         </w:tc>
@@ -5984,7 +6097,7 @@
                 <w:sz w:val="14"/>
                 <w:szCs w:val="14"/>
               </w:rPr>
-              <w:t xml:space="preserve">53 ms</w:t>
+              <w:t xml:space="preserve">58 ms</w:t>
             </w:r>
           </w:p>
         </w:tc>
@@ -6268,7 +6381,7 @@
                 <w:sz w:val="14"/>
                 <w:szCs w:val="14"/>
               </w:rPr>
-              <w:t xml:space="preserve">55 ms</w:t>
+              <w:t xml:space="preserve">49 ms</w:t>
             </w:r>
           </w:p>
         </w:tc>
@@ -6410,7 +6523,7 @@
                 <w:sz w:val="14"/>
                 <w:szCs w:val="14"/>
               </w:rPr>
-              <w:t xml:space="preserve">74 ms</w:t>
+              <w:t xml:space="preserve">77 ms</w:t>
             </w:r>
           </w:p>
         </w:tc>
@@ -6513,7 +6626,7 @@
                 <w:sz w:val="17"/>
                 <w:szCs w:val="17"/>
               </w:rPr>
-              <w:t xml:space="preserve">2 instantanés conservés : le gel de revue reste lisible (10494 o, dépassé), l'enregistrement approuvé porte la même empreinte de contenu</w:t>
+              <w:t xml:space="preserve">2 instantanés conservés : le gel de revue reste lisible (10497 o, dépassé), l'enregistrement approuvé porte la même empreinte de contenu</w:t>
             </w:r>
           </w:p>
         </w:tc>
@@ -6552,7 +6665,7 @@
                 <w:sz w:val="14"/>
                 <w:szCs w:val="14"/>
               </w:rPr>
-              <w:t xml:space="preserve">77 ms</w:t>
+              <w:t xml:space="preserve">78 ms</w:t>
             </w:r>
           </w:p>
         </w:tc>
@@ -6694,7 +6807,7 @@
                 <w:sz w:val="14"/>
                 <w:szCs w:val="14"/>
               </w:rPr>
-              <w:t xml:space="preserve">68 ms</w:t>
+              <w:t xml:space="preserve">79 ms</w:t>
             </w:r>
           </w:p>
         </w:tc>
@@ -6797,7 +6910,7 @@
                 <w:sz w:val="17"/>
                 <w:szCs w:val="17"/>
               </w:rPr>
-              <w:t xml:space="preserve">147 fichiers source inspectés : aucune modification ni suppression d'entrée ; 1 fichiers en écriture seule</w:t>
+              <w:t xml:space="preserve">150 fichiers source inspectés : aucune modification ni suppression d'entrée ; 1 fichiers en écriture seule</w:t>
             </w:r>
           </w:p>
         </w:tc>
@@ -6836,7 +6949,7 @@
                 <w:sz w:val="14"/>
                 <w:szCs w:val="14"/>
               </w:rPr>
-              <w:t xml:space="preserve">26 ms</w:t>
+              <w:t xml:space="preserve">28 ms</w:t>
             </w:r>
           </w:p>
         </w:tc>
@@ -6978,7 +7091,7 @@
                 <w:sz w:val="14"/>
                 <w:szCs w:val="14"/>
               </w:rPr>
-              <w:t xml:space="preserve">24 ms</w:t>
+              <w:t xml:space="preserve">23 ms</w:t>
             </w:r>
           </w:p>
         </w:tc>
@@ -7120,7 +7233,7 @@
                 <w:sz w:val="14"/>
                 <w:szCs w:val="14"/>
               </w:rPr>
-              <w:t xml:space="preserve">0 ms</w:t>
+              <w:t xml:space="preserve">1 ms</w:t>
             </w:r>
           </w:p>
         </w:tc>
@@ -7262,7 +7375,7 @@
                 <w:sz w:val="14"/>
                 <w:szCs w:val="14"/>
               </w:rPr>
-              <w:t xml:space="preserve">1 ms</w:t>
+              <w:t xml:space="preserve">0 ms</w:t>
             </w:r>
           </w:p>
         </w:tc>
@@ -7404,7 +7517,7 @@
                 <w:sz w:val="14"/>
                 <w:szCs w:val="14"/>
               </w:rPr>
-              <w:t xml:space="preserve">312 ms</w:t>
+              <w:t xml:space="preserve">314 ms</w:t>
             </w:r>
           </w:p>
         </w:tc>
@@ -7507,7 +7620,7 @@
                 <w:sz w:val="17"/>
                 <w:szCs w:val="17"/>
               </w:rPr>
-              <w:t xml:space="preserve">13 enregistrement(s) archivé(s), 43 fichier(s) couverts par empreintes.sha256, 0 écart ; ancre b220dc2af1cc3347… ; octets du gel restitués à l'identique ; altération d'un octet détectée et signalée ALTÉRÉ, fichier conservé dans l'archive</w:t>
+              <w:t xml:space="preserve">13 enregistrement(s) archivé(s), 43 fichier(s) couverts par empreintes.sha256, 0 écart ; ancre e1713d0c523fe513… ; octets du gel restitués à l'identique ; altération d'un octet détectée et signalée ALTÉRÉ, fichier conservé dans l'archive</w:t>
             </w:r>
           </w:p>
         </w:tc>
@@ -7546,7 +7659,7 @@
                 <w:sz w:val="14"/>
                 <w:szCs w:val="14"/>
               </w:rPr>
-              <w:t xml:space="preserve">449 ms</w:t>
+              <w:t xml:space="preserve">472 ms</w:t>
             </w:r>
           </w:p>
         </w:tc>
@@ -7688,7 +7801,7 @@
                 <w:sz w:val="14"/>
                 <w:szCs w:val="14"/>
               </w:rPr>
-              <w:t xml:space="preserve">13 ms</w:t>
+              <w:t xml:space="preserve">12 ms</w:t>
             </w:r>
           </w:p>
         </w:tc>
@@ -7830,7 +7943,7 @@
                 <w:sz w:val="14"/>
                 <w:szCs w:val="14"/>
               </w:rPr>
-              <w:t xml:space="preserve">378 ms</w:t>
+              <w:t xml:space="preserve">377 ms</w:t>
             </w:r>
           </w:p>
         </w:tc>
@@ -7972,7 +8085,7 @@
                 <w:sz w:val="14"/>
                 <w:szCs w:val="14"/>
               </w:rPr>
-              <w:t xml:space="preserve">312 ms</w:t>
+              <w:t xml:space="preserve">292 ms</w:t>
             </w:r>
           </w:p>
         </w:tc>
@@ -8114,7 +8227,7 @@
                 <w:sz w:val="14"/>
                 <w:szCs w:val="14"/>
               </w:rPr>
-              <w:t xml:space="preserve">1 ms</w:t>
+              <w:t xml:space="preserve">2 ms</w:t>
             </w:r>
           </w:p>
         </w:tc>
@@ -8398,7 +8511,7 @@
                 <w:sz w:val="14"/>
                 <w:szCs w:val="14"/>
               </w:rPr>
-              <w:t xml:space="preserve">24 ms</w:t>
+              <w:t xml:space="preserve">23 ms</w:t>
             </w:r>
           </w:p>
         </w:tc>
@@ -8501,7 +8614,7 @@
                 <w:sz w:val="17"/>
                 <w:szCs w:val="17"/>
               </w:rPr>
-              <w:t xml:space="preserve">200 fichier(s) source relus, aucune écriture dans la piste hors du module ; 9 empreintes comparées entre l'implémentation TypeScript et le miroir de la console serveur, toutes identiques</w:t>
+              <w:t xml:space="preserve">204 fichier(s) source relus, aucune écriture dans la piste hors du module ; 9 empreintes comparées entre l'implémentation TypeScript et le miroir de la console serveur, toutes identiques</w:t>
             </w:r>
           </w:p>
         </w:tc>
@@ -8540,7 +8653,7 @@
                 <w:sz w:val="14"/>
                 <w:szCs w:val="14"/>
               </w:rPr>
-              <w:t xml:space="preserve">26 ms</w:t>
+              <w:t xml:space="preserve">28 ms</w:t>
             </w:r>
           </w:p>
         </w:tc>
@@ -8824,7 +8937,7 @@
                 <w:sz w:val="14"/>
                 <w:szCs w:val="14"/>
               </w:rPr>
-              <w:t xml:space="preserve">8 ms</w:t>
+              <w:t xml:space="preserve">9 ms</w:t>
             </w:r>
           </w:p>
         </w:tc>
@@ -8966,7 +9079,7 @@
                 <w:sz w:val="14"/>
                 <w:szCs w:val="14"/>
               </w:rPr>
-              <w:t xml:space="preserve">227 ms</w:t>
+              <w:t xml:space="preserve">225 ms</w:t>
             </w:r>
           </w:p>
         </w:tc>
@@ -9069,7 +9182,7 @@
                 <w:sz w:val="17"/>
                 <w:szCs w:val="17"/>
               </w:rPr>
-              <w:t xml:space="preserve">200 fichier(s) source relus : aucune écriture de mot de passe hors des chemins autorisés ; une seule écriture dans les actions serveur, le changement personnel, qui exige l'ancien mot de passe ; l'outil d'urgence de la console émet un jeton et ne sait plus dériver de mot de passe ; aucun champ de mot de passe hors des 7 écrans où l'on saisit le sien</w:t>
+              <w:t xml:space="preserve">204 fichier(s) source relus : aucune écriture de mot de passe hors des chemins autorisés ; une seule écriture dans les actions serveur, le changement personnel, qui exige l'ancien mot de passe ; l'outil d'urgence de la console émet un jeton et ne sait plus dériver de mot de passe ; aucun champ de mot de passe hors des 7 écrans où l'on saisit le sien</w:t>
             </w:r>
           </w:p>
         </w:tc>
@@ -9250,7 +9363,7 @@
                 <w:sz w:val="14"/>
                 <w:szCs w:val="14"/>
               </w:rPr>
-              <w:t xml:space="preserve">14219 ms</w:t>
+              <w:t xml:space="preserve">9010 ms</w:t>
             </w:r>
           </w:p>
         </w:tc>
@@ -9392,7 +9505,7 @@
                 <w:sz w:val="14"/>
                 <w:szCs w:val="14"/>
               </w:rPr>
-              <w:t xml:space="preserve">23 ms</w:t>
+              <w:t xml:space="preserve">26 ms</w:t>
             </w:r>
           </w:p>
         </w:tc>
@@ -9495,7 +9608,7 @@
                 <w:sz w:val="17"/>
                 <w:szCs w:val="17"/>
               </w:rPr>
-              <w:t xml:space="preserve">copie d'archivage de OQ-012-revision rév. 001 produite (69093 octets, 1 page·s) ; 29 contrôles structurels PDF/A-2b passés — police embarquée, profil ICC « acsp » de 3024 octets, métadonnées pdfaid partie 2 niveau B, décalages exacts ; texte intégralement relu par la table du fichier, 44 caractère·s accentué·s ou typographiques restitués ; production déterministe (deux exécutions octet pour octet identiques)</w:t>
+              <w:t xml:space="preserve">copie d'archivage de OQ-012-revision rév. 001 produite (69081 octets, 1 page·s) ; 29 contrôles structurels PDF/A-2b passés — police embarquée, profil ICC « acsp » de 3024 octets, métadonnées pdfaid partie 2 niveau B, décalages exacts ; texte intégralement relu par la table du fichier, 44 caractère·s accentué·s ou typographiques restitués ; production déterministe (deux exécutions octet pour octet identiques)</w:t>
             </w:r>
           </w:p>
         </w:tc>
@@ -9676,7 +9789,7 @@
                 <w:sz w:val="14"/>
                 <w:szCs w:val="14"/>
               </w:rPr>
-              <w:t xml:space="preserve">166 ms</w:t>
+              <w:t xml:space="preserve">148 ms</w:t>
             </w:r>
           </w:p>
         </w:tc>
@@ -9779,7 +9892,7 @@
                 <w:sz w:val="17"/>
                 <w:szCs w:val="17"/>
               </w:rPr>
-              <w:t xml:space="preserve">clôture refusée trois fois avant d'être permise — conclusion vide, 1 entrée(s) non statuée(s), verdict affirmatif sans motif ; manifestation « Testeur QR2 (QR2) · Revu · 06/08/2026 17:59:36 UTC · enregistrement 34AB 06E1 AC12 » portant le nom imprimé, la signification « Revu » et l'empreinte du contenu ; empreinte recalculée à l'identique hors du logiciel, et modifiée par le moindre changement de conclusion ou de verdict ; indépendance consignée sur le SIGNATAIRE (0 entrée·s écrite·s par lui, contre 5 par l'ouvreur) ; 10 règles de triage inscrites dans l'enregistrement ; re-clôture et re-statuage refusés ; aucune rupture ajoutée à la chaîne sur 82 entrées</w:t>
+              <w:t xml:space="preserve">clôture refusée trois fois avant d'être permise — conclusion vide, 1 entrée(s) non statuée(s), verdict affirmatif sans motif ; manifestation « Testeur QR2 (QR2) · Revu · 06/08/2026 19:52:45 UTC · enregistrement B6FE 0DDE 145A » portant le nom imprimé, la signification « Revu » et l'empreinte du contenu ; empreinte recalculée à l'identique hors du logiciel, et modifiée par le moindre changement de conclusion ou de verdict ; indépendance consignée sur le SIGNATAIRE (0 entrée·s écrite·s par lui, contre 5 par l'ouvreur) ; 10 règles de triage inscrites dans l'enregistrement ; re-clôture et re-statuage refusés ; aucune rupture ajoutée à la chaîne sur 82 entrées</w:t>
             </w:r>
           </w:p>
         </w:tc>
@@ -9818,7 +9931,149 @@
                 <w:sz w:val="14"/>
                 <w:szCs w:val="14"/>
               </w:rPr>
-              <w:t xml:space="preserve">111 ms</w:t>
+              <w:t xml:space="preserve">110 ms</w:t>
+            </w:r>
+          </w:p>
+        </w:tc>
+      </w:tr>
+      <w:tr>
+        <w:tc>
+          <w:tcPr>
+            <w:tcW w:type="pct" w:w="13%"/>
+            <w:shd w:fill="F8FAFC"/>
+            <w:tcMar>
+              <w:top w:type="dxa" w:w="80"/>
+              <w:left w:type="dxa" w:w="110"/>
+              <w:bottom w:type="dxa" w:w="80"/>
+              <w:right w:type="dxa" w:w="110"/>
+            </w:tcMar>
+          </w:tcPr>
+          <w:p>
+            <w:pPr>
+              <w:spacing w:after="50"/>
+            </w:pPr>
+            <w:r>
+              <w:rPr>
+                <w:b/>
+                <w:bCs/>
+                <w:color w:val="4338CA"/>
+                <w:sz w:val="17"/>
+                <w:szCs w:val="17"/>
+              </w:rPr>
+              <w:t xml:space="preserve">OQ-34</w:t>
+            </w:r>
+          </w:p>
+          <w:p>
+            <w:pPr>
+              <w:spacing w:after="0"/>
+            </w:pPr>
+            <w:r>
+              <w:rPr>
+                <w:color w:val="475569"/>
+                <w:sz w:val="15"/>
+                <w:szCs w:val="15"/>
+              </w:rPr>
+              <w:t xml:space="preserve">URS-37</w:t>
+            </w:r>
+          </w:p>
+        </w:tc>
+        <w:tc>
+          <w:tcPr>
+            <w:tcW w:type="pct" w:w="30%"/>
+            <w:tcMar>
+              <w:top w:type="dxa" w:w="80"/>
+              <w:left w:type="dxa" w:w="110"/>
+              <w:bottom w:type="dxa" w:w="80"/>
+              <w:right w:type="dxa" w:w="110"/>
+            </w:tcMar>
+          </w:tcPr>
+          <w:p>
+            <w:pPr>
+              <w:spacing w:after="50"/>
+            </w:pPr>
+            <w:r>
+              <w:rPr>
+                <w:b/>
+                <w:bCs/>
+                <w:sz w:val="17"/>
+                <w:szCs w:val="17"/>
+              </w:rPr>
+              <w:t xml:space="preserve">Qualité d'énoncé : déterministe, sans réseau, sans écriture, sans blocage</w:t>
+            </w:r>
+          </w:p>
+          <w:p>
+            <w:pPr>
+              <w:spacing w:after="0"/>
+            </w:pPr>
+            <w:r>
+              <w:rPr>
+                <w:color w:val="475569"/>
+                <w:sz w:val="15"/>
+                <w:szCs w:val="15"/>
+              </w:rPr>
+              <w:t xml:space="preserve">Vérifier que les contrôles rendent le même verdict pour le même énoncé, qu'ils citent le fragment fautif tel qu'il a été écrit, qu'ils reconnaissent les motifs EARS, qu'ils ne crient pas sur des énoncés corrects — références normatives et numéros de programme compris — et que rien dans le module n'écrit en base, n'appelle le réseau, ni ne peut empêcher un enregistrement.</w:t>
+            </w:r>
+          </w:p>
+        </w:tc>
+        <w:tc>
+          <w:tcPr>
+            <w:tcW w:type="pct" w:w="45%"/>
+            <w:tcMar>
+              <w:top w:type="dxa" w:w="80"/>
+              <w:left w:type="dxa" w:w="110"/>
+              <w:bottom w:type="dxa" w:w="80"/>
+              <w:right w:type="dxa" w:w="110"/>
+            </w:tcMar>
+          </w:tcPr>
+          <w:p>
+            <w:pPr>
+              <w:spacing w:after="0"/>
+            </w:pPr>
+            <w:r>
+              <w:rPr>
+                <w:sz w:val="17"/>
+                <w:szCs w:val="17"/>
+              </w:rPr>
+              <w:t xml:space="preserve">11 règles déterministes éprouvées sur 11 énoncés fautifs : chacune s'est déclenchée et a cité le fragment exact de l'auteur ; aucun constat sur 5 énoncés corrects, références normatives (ISO 14971, CEI 60601-1) et numéro de programme (OD-300) compris ; 5 motifs EARS reconnus sur 7 énoncés dans les deux langues, et aucun motif rendu sur une phrase sans verbe d'obligation ; 16 analyses rejouées à l'identique (déterminisme) ; le module ne référence ni base, ni réseau, ni module serveur, et la création d'exigence ne le consulte pas — aucun constat ne peut donc empêcher un enregistrement</w:t>
+            </w:r>
+          </w:p>
+        </w:tc>
+        <w:tc>
+          <w:tcPr>
+            <w:tcW w:type="pct" w:w="12%"/>
+            <w:tcMar>
+              <w:top w:type="dxa" w:w="80"/>
+              <w:left w:type="dxa" w:w="110"/>
+              <w:bottom w:type="dxa" w:w="80"/>
+              <w:right w:type="dxa" w:w="110"/>
+            </w:tcMar>
+          </w:tcPr>
+          <w:p>
+            <w:pPr>
+              <w:spacing w:after="40"/>
+            </w:pPr>
+            <w:r>
+              <w:rPr>
+                <w:b/>
+                <w:bCs/>
+                <w:color w:val="047857"/>
+                <w:sz w:val="17"/>
+                <w:szCs w:val="17"/>
+              </w:rPr>
+              <w:t xml:space="preserve">Conforme</w:t>
+            </w:r>
+          </w:p>
+          <w:p>
+            <w:pPr>
+              <w:spacing w:after="0"/>
+            </w:pPr>
+            <w:r>
+              <w:rPr>
+                <w:color w:val="475569"/>
+                <w:sz w:val="14"/>
+                <w:szCs w:val="14"/>
+              </w:rPr>
+              <w:t xml:space="preserve">8 ms</w:t>
             </w:r>
           </w:p>
         </w:tc>
@@ -12714,6 +12969,83 @@
           </w:p>
         </w:tc>
       </w:tr>
+      <w:tr>
+        <w:tc>
+          <w:tcPr>
+            <w:tcW w:type="pct" w:w="12%"/>
+            <w:tcMar>
+              <w:top w:type="dxa" w:w="80"/>
+              <w:left w:type="dxa" w:w="110"/>
+              <w:bottom w:type="dxa" w:w="80"/>
+              <w:right w:type="dxa" w:w="110"/>
+            </w:tcMar>
+          </w:tcPr>
+          <w:p>
+            <w:pPr>
+              <w:spacing w:after="0"/>
+            </w:pPr>
+            <w:r>
+              <w:rPr>
+                <w:b/>
+                <w:bCs/>
+                <w:color w:val="4338CA"/>
+                <w:sz w:val="17"/>
+                <w:szCs w:val="17"/>
+              </w:rPr>
+              <w:t xml:space="preserve">URS-37</w:t>
+            </w:r>
+          </w:p>
+        </w:tc>
+        <w:tc>
+          <w:tcPr>
+            <w:tcW w:type="pct" w:w="22%"/>
+            <w:tcMar>
+              <w:top w:type="dxa" w:w="80"/>
+              <w:left w:type="dxa" w:w="110"/>
+              <w:bottom w:type="dxa" w:w="80"/>
+              <w:right w:type="dxa" w:w="110"/>
+            </w:tcMar>
+          </w:tcPr>
+          <w:p>
+            <w:pPr>
+              <w:spacing w:after="0"/>
+            </w:pPr>
+            <w:r>
+              <w:rPr>
+                <w:b/>
+                <w:bCs/>
+                <w:color w:val="047857"/>
+                <w:sz w:val="17"/>
+                <w:szCs w:val="17"/>
+              </w:rPr>
+              <w:t xml:space="preserve">OQ-34</w:t>
+            </w:r>
+          </w:p>
+        </w:tc>
+        <w:tc>
+          <w:tcPr>
+            <w:tcW w:type="pct" w:w="66%"/>
+            <w:tcMar>
+              <w:top w:type="dxa" w:w="80"/>
+              <w:left w:type="dxa" w:w="110"/>
+              <w:bottom w:type="dxa" w:w="80"/>
+              <w:right w:type="dxa" w:w="110"/>
+            </w:tcMar>
+          </w:tcPr>
+          <w:p>
+            <w:pPr>
+              <w:spacing w:after="0"/>
+            </w:pPr>
+            <w:r>
+              <w:rPr>
+                <w:sz w:val="17"/>
+                <w:szCs w:val="17"/>
+              </w:rPr>
+              <w:t xml:space="preserve">Cas de test automatisé exécuté par l'éditeur à chaque version, résultat en section 5.1.</w:t>
+            </w:r>
+          </w:p>
+        </w:tc>
+      </w:tr>
     </w:tbl>
     <w:p>
       <w:pPr>
@@ -12733,7 +13065,7 @@
           <w:sz w:val="20"/>
           <w:szCs w:val="20"/>
         </w:rPr>
-        <w:t xml:space="preserve">Sur les 36 exigences, 32 sont vérifiées automatiquement par l'éditeur et 4 doivent l'être chez vous. Ce n'est pas un partage arbitraire : ces 4 exigences ne sont pas observables sans navigateur, sans requête HTTP ou sans votre infrastructure. Les compter comme couvertes serait une affirmation invérifiable.</w:t>
+        <w:t xml:space="preserve">Sur les 37 exigences, 33 sont vérifiées automatiquement par l'éditeur et 4 doivent l'être chez vous. Ce n'est pas un partage arbitraire : ces 4 exigences ne sont pas observables sans navigateur, sans requête HTTP ou sans votre infrastructure. Les compter comme couvertes serait une affirmation invérifiable.</w:t>
       </w:r>
     </w:p>
     <w:p>
@@ -13085,7 +13417,7 @@
         <w:sz w:val="15"/>
         <w:szCs w:val="15"/>
       </w:rPr>
-      <w:t xml:space="preserve">   ·   Version 1.2.1 · rapport OQ exécuté le 6 août 2026 à 17:59 UTC</w:t>
+      <w:t xml:space="preserve">   ·   Version 1.2.1 · rapport OQ exécuté le 6 août 2026 à 19:52 UTC</w:t>
     </w:r>
   </w:p>
 </w:ftr>

</xml_diff>

<commit_message>
Site — reprise des classeurs et documents (B2)
Note de périmètre, manuel et présentation régénérés : 35 cas de qualification,
38 exigences de validation.

Co-Authored-By: Claude Opus 5 <noreply@anthropic.com>
</commit_message>
<xml_diff>
--- a/docs/Dossier_de_validation_Filum.docx
+++ b/docs/Dossier_de_validation_Filum.docx
@@ -430,7 +430,7 @@
           <w:sz w:val="20"/>
           <w:szCs w:val="20"/>
         </w:rPr>
-        <w:t xml:space="preserve">Les 37 exigences ci-dessous énoncent ce que le logiciel doit faire. Le niveau de risque est celui de la DÉFAILLANCE de l'exigence, pas de son importance commerciale : il détermine la profondeur de vérification.</w:t>
+        <w:t xml:space="preserve">Les 38 exigences ci-dessous énoncent ce que le logiciel doit faire. Le niveau de risque est celui de la DÉFAILLANCE de l'exigence, pas de son importance commerciale : il détermine la profondeur de vérification.</w:t>
       </w:r>
     </w:p>
     <w:tbl>
@@ -4738,6 +4738,119 @@
           </w:p>
         </w:tc>
       </w:tr>
+      <w:tr>
+        <w:tc>
+          <w:tcPr>
+            <w:tcW w:type="pct" w:w="11%"/>
+            <w:shd w:fill="F8FAFC"/>
+            <w:tcMar>
+              <w:top w:type="dxa" w:w="80"/>
+              <w:left w:type="dxa" w:w="110"/>
+              <w:bottom w:type="dxa" w:w="80"/>
+              <w:right w:type="dxa" w:w="110"/>
+            </w:tcMar>
+          </w:tcPr>
+          <w:p>
+            <w:pPr>
+              <w:spacing w:after="60"/>
+            </w:pPr>
+            <w:r>
+              <w:rPr>
+                <w:b/>
+                <w:bCs/>
+                <w:color w:val="4338CA"/>
+                <w:sz w:val="17"/>
+                <w:szCs w:val="17"/>
+              </w:rPr>
+              <w:t xml:space="preserve">URS-38</w:t>
+            </w:r>
+          </w:p>
+          <w:p>
+            <w:pPr>
+              <w:spacing w:after="0"/>
+            </w:pPr>
+            <w:r>
+              <w:rPr>
+                <w:b/>
+                <w:bCs/>
+                <w:color w:val="DC2626"/>
+                <w:sz w:val="15"/>
+                <w:szCs w:val="15"/>
+              </w:rPr>
+              <w:t xml:space="preserve">Haut</w:t>
+            </w:r>
+          </w:p>
+        </w:tc>
+        <w:tc>
+          <w:tcPr>
+            <w:tcW w:type="pct" w:w="41%"/>
+            <w:tcMar>
+              <w:top w:type="dxa" w:w="80"/>
+              <w:left w:type="dxa" w:w="110"/>
+              <w:bottom w:type="dxa" w:w="80"/>
+              <w:right w:type="dxa" w:w="110"/>
+            </w:tcMar>
+          </w:tcPr>
+          <w:p>
+            <w:pPr>
+              <w:spacing w:after="0"/>
+            </w:pPr>
+            <w:r>
+              <w:rPr>
+                <w:sz w:val="17"/>
+                <w:szCs w:val="17"/>
+              </w:rPr>
+              <w:t xml:space="preserve">Un classeur .xlsx et un document .docx sont lus sans conversion préalable : chaque tableau est restitué avec ses en-têtes d'origine, les cellules vides conservent leur position, et le tableau retenu passe par le MÊME aperçu à blanc que le CSV. Les valeurs d'énumération sont ramenées aux valeurs internes, quelle que soit la langue du fichier ; une valeur non reconnue est signalée et ignorée, jamais stockée telle quelle.</w:t>
+            </w:r>
+          </w:p>
+        </w:tc>
+        <w:tc>
+          <w:tcPr>
+            <w:tcW w:type="pct" w:w="28%"/>
+            <w:tcMar>
+              <w:top w:type="dxa" w:w="80"/>
+              <w:left w:type="dxa" w:w="110"/>
+              <w:bottom w:type="dxa" w:w="80"/>
+              <w:right w:type="dxa" w:w="110"/>
+            </w:tcMar>
+          </w:tcPr>
+          <w:p>
+            <w:pPr>
+              <w:spacing w:after="0"/>
+            </w:pPr>
+            <w:r>
+              <w:rPr>
+                <w:sz w:val="17"/>
+                <w:szCs w:val="17"/>
+              </w:rPr>
+              <w:t xml:space="preserve">Une cellule vide non conservée décale toutes les suivantes : la justification d'une exigence se retrouve dans le sous-système, et rien ne le signale — c'est le défaut le plus silencieux qu'un import puisse produire. Une valeur d'énumération stockée telle quelle est aussi grave dans l'autre sens : une exigence « Haute » importée d'un fichier français s'affiche comme faible et sort des filtres de criticité, si bien que l'exigence la plus critique du dossier devient la moins visible.</w:t>
+            </w:r>
+          </w:p>
+        </w:tc>
+        <w:tc>
+          <w:tcPr>
+            <w:tcW w:type="pct" w:w="20%"/>
+            <w:tcMar>
+              <w:top w:type="dxa" w:w="80"/>
+              <w:left w:type="dxa" w:w="110"/>
+              <w:bottom w:type="dxa" w:w="80"/>
+              <w:right w:type="dxa" w:w="110"/>
+            </w:tcMar>
+          </w:tcPr>
+          <w:p>
+            <w:pPr>
+              <w:spacing w:after="0"/>
+            </w:pPr>
+            <w:r>
+              <w:rPr>
+                <w:sz w:val="17"/>
+                <w:szCs w:val="17"/>
+              </w:rPr>
+              <w:t xml:space="preserve">ISO 13485 §4.2.5 · 21 CFR 11.10(a) · ALCOA+ — exact et complet</w:t>
+            </w:r>
+          </w:p>
+        </w:tc>
+      </w:tr>
     </w:tbl>
     <w:p>
       <w:pPr>
@@ -4757,7 +4870,7 @@
           <w:sz w:val="20"/>
           <w:szCs w:val="20"/>
         </w:rPr>
-        <w:t xml:space="preserve">Répartition : 24 exigences à risque haut, 11 à risque moyen, 2 à risque bas. Les exigences à risque haut touchent toutes à l'intégrité ou à l'attribution des enregistrements : leur défaillance ne dégrade pas le confort d'usage, elle rend un enregistrement indéfendable. Elles font l'objet de cas de test dédiés, exécutés à chaque version.</w:t>
+        <w:t xml:space="preserve">Répartition : 25 exigences à risque haut, 11 à risque moyen, 2 à risque bas. Les exigences à risque haut touchent toutes à l'intégrité ou à l'attribution des enregistrements : leur défaillance ne dégrade pas le confort d'usage, elle rend un enregistrement indéfendable. Elles font l'objet de cas de test dédiés, exécutés à chaque version.</w:t>
       </w:r>
     </w:p>
     <w:p>
@@ -4908,7 +5021,7 @@
                 <w:sz w:val="17"/>
                 <w:szCs w:val="17"/>
               </w:rPr>
-              <w:t xml:space="preserve">6 août 2026 à 19:52</w:t>
+              <w:t xml:space="preserve">7 août 2026 à 08:22</w:t>
             </w:r>
           </w:p>
         </w:tc>
@@ -5111,7 +5224,7 @@
                 <w:sz w:val="17"/>
                 <w:szCs w:val="17"/>
               </w:rPr>
-              <w:t xml:space="preserve">34 cas sur 34 conformes — aucun écart</w:t>
+              <w:t xml:space="preserve">35 cas sur 35 conformes — aucun écart</w:t>
             </w:r>
           </w:p>
         </w:tc>
@@ -5490,7 +5603,7 @@
                 <w:sz w:val="17"/>
                 <w:szCs w:val="17"/>
               </w:rPr>
-              <w:t xml:space="preserve">empreintes distinctes pour un même mot de passe (770008180c66… ≠ d0bfb8df4d32…), vérification correcte, mot de passe faux et vide refusés</w:t>
+              <w:t xml:space="preserve">empreintes distinctes pour un même mot de passe (5393c913df98… ≠ 0a8ab3e14942…), vérification correcte, mot de passe faux et vide refusés</w:t>
             </w:r>
           </w:p>
         </w:tc>
@@ -5529,7 +5642,7 @@
                 <w:sz w:val="14"/>
                 <w:szCs w:val="14"/>
               </w:rPr>
-              <w:t xml:space="preserve">144 ms</w:t>
+              <w:t xml:space="preserve">136 ms</w:t>
             </w:r>
           </w:p>
         </w:tc>
@@ -5774,7 +5887,7 @@
                 <w:sz w:val="17"/>
                 <w:szCs w:val="17"/>
               </w:rPr>
-              <w:t xml:space="preserve">contenu gelé, empreinte 24604eb157d7fa54…, 10487 octets conservés, opération journalisée</w:t>
+              <w:t xml:space="preserve">contenu gelé, empreinte 24604eb157d7fa54…, 10486 octets conservés, opération journalisée</w:t>
             </w:r>
           </w:p>
         </w:tc>
@@ -5813,7 +5926,7 @@
                 <w:sz w:val="14"/>
                 <w:szCs w:val="14"/>
               </w:rPr>
-              <w:t xml:space="preserve">125 ms</w:t>
+              <w:t xml:space="preserve">109 ms</w:t>
             </w:r>
           </w:p>
         </w:tc>
@@ -5916,7 +6029,7 @@
                 <w:sz w:val="17"/>
                 <w:szCs w:val="17"/>
               </w:rPr>
-              <w:t xml:space="preserve">signature liée à l'instantané cmshxn9r…, empreinte attestée 3767 CD80 ACC9, manifestation « Testeur QA1 (QA1) · Approuvé · 06/08/2026 19:52:33 UTC · enregistrement 3767 CD80 ACC9 »</w:t>
+              <w:t xml:space="preserve">signature liée à l'instantané cmsiofen…, empreinte attestée 3767 CD80 ACC9, manifestation « Testeur QA1 (QA1) · Approuvé · 07/08/2026 08:22:16 UTC · enregistrement 3767 CD80 ACC9 »</w:t>
             </w:r>
           </w:p>
         </w:tc>
@@ -5955,7 +6068,7 @@
                 <w:sz w:val="14"/>
                 <w:szCs w:val="14"/>
               </w:rPr>
-              <w:t xml:space="preserve">42 ms</w:t>
+              <w:t xml:space="preserve">40 ms</w:t>
             </w:r>
           </w:p>
         </w:tc>
@@ -6058,7 +6171,7 @@
                 <w:sz w:val="17"/>
                 <w:szCs w:val="17"/>
               </w:rPr>
-              <w:t xml:space="preserve">10488 octets relus à l'identique ; inversion d'un octet en position 5244 détectée</w:t>
+              <w:t xml:space="preserve">10487 octets relus à l'identique ; inversion d'un octet en position 5243 détectée</w:t>
             </w:r>
           </w:p>
         </w:tc>
@@ -6097,7 +6210,7 @@
                 <w:sz w:val="14"/>
                 <w:szCs w:val="14"/>
               </w:rPr>
-              <w:t xml:space="preserve">58 ms</w:t>
+              <w:t xml:space="preserve">51 ms</w:t>
             </w:r>
           </w:p>
         </w:tc>
@@ -6239,7 +6352,7 @@
                 <w:sz w:val="14"/>
                 <w:szCs w:val="14"/>
               </w:rPr>
-              <w:t xml:space="preserve">54 ms</w:t>
+              <w:t xml:space="preserve">47 ms</w:t>
             </w:r>
           </w:p>
         </w:tc>
@@ -6381,7 +6494,7 @@
                 <w:sz w:val="14"/>
                 <w:szCs w:val="14"/>
               </w:rPr>
-              <w:t xml:space="preserve">49 ms</w:t>
+              <w:t xml:space="preserve">46 ms</w:t>
             </w:r>
           </w:p>
         </w:tc>
@@ -6523,7 +6636,7 @@
                 <w:sz w:val="14"/>
                 <w:szCs w:val="14"/>
               </w:rPr>
-              <w:t xml:space="preserve">77 ms</w:t>
+              <w:t xml:space="preserve">76 ms</w:t>
             </w:r>
           </w:p>
         </w:tc>
@@ -6626,7 +6739,7 @@
                 <w:sz w:val="17"/>
                 <w:szCs w:val="17"/>
               </w:rPr>
-              <w:t xml:space="preserve">2 instantanés conservés : le gel de revue reste lisible (10497 o, dépassé), l'enregistrement approuvé porte la même empreinte de contenu</w:t>
+              <w:t xml:space="preserve">2 instantanés conservés : le gel de revue reste lisible (10495 o, dépassé), l'enregistrement approuvé porte la même empreinte de contenu</w:t>
             </w:r>
           </w:p>
         </w:tc>
@@ -6665,7 +6778,7 @@
                 <w:sz w:val="14"/>
                 <w:szCs w:val="14"/>
               </w:rPr>
-              <w:t xml:space="preserve">78 ms</w:t>
+              <w:t xml:space="preserve">72 ms</w:t>
             </w:r>
           </w:p>
         </w:tc>
@@ -6807,7 +6920,7 @@
                 <w:sz w:val="14"/>
                 <w:szCs w:val="14"/>
               </w:rPr>
-              <w:t xml:space="preserve">79 ms</w:t>
+              <w:t xml:space="preserve">65 ms</w:t>
             </w:r>
           </w:p>
         </w:tc>
@@ -6910,7 +7023,7 @@
                 <w:sz w:val="17"/>
                 <w:szCs w:val="17"/>
               </w:rPr>
-              <w:t xml:space="preserve">150 fichiers source inspectés : aucune modification ni suppression d'entrée ; 1 fichiers en écriture seule</w:t>
+              <w:t xml:space="preserve">151 fichiers source inspectés : aucune modification ni suppression d'entrée ; 1 fichiers en écriture seule</w:t>
             </w:r>
           </w:p>
         </w:tc>
@@ -7091,7 +7204,7 @@
                 <w:sz w:val="14"/>
                 <w:szCs w:val="14"/>
               </w:rPr>
-              <w:t xml:space="preserve">23 ms</w:t>
+              <w:t xml:space="preserve">21 ms</w:t>
             </w:r>
           </w:p>
         </w:tc>
@@ -7233,7 +7346,7 @@
                 <w:sz w:val="14"/>
                 <w:szCs w:val="14"/>
               </w:rPr>
-              <w:t xml:space="preserve">1 ms</w:t>
+              <w:t xml:space="preserve">0 ms</w:t>
             </w:r>
           </w:p>
         </w:tc>
@@ -7375,7 +7488,7 @@
                 <w:sz w:val="14"/>
                 <w:szCs w:val="14"/>
               </w:rPr>
-              <w:t xml:space="preserve">0 ms</w:t>
+              <w:t xml:space="preserve">1 ms</w:t>
             </w:r>
           </w:p>
         </w:tc>
@@ -7517,7 +7630,7 @@
                 <w:sz w:val="14"/>
                 <w:szCs w:val="14"/>
               </w:rPr>
-              <w:t xml:space="preserve">314 ms</w:t>
+              <w:t xml:space="preserve">303 ms</w:t>
             </w:r>
           </w:p>
         </w:tc>
@@ -7620,7 +7733,7 @@
                 <w:sz w:val="17"/>
                 <w:szCs w:val="17"/>
               </w:rPr>
-              <w:t xml:space="preserve">13 enregistrement(s) archivé(s), 43 fichier(s) couverts par empreintes.sha256, 0 écart ; ancre e1713d0c523fe513… ; octets du gel restitués à l'identique ; altération d'un octet détectée et signalée ALTÉRÉ, fichier conservé dans l'archive</w:t>
+              <w:t xml:space="preserve">13 enregistrement(s) archivé(s), 43 fichier(s) couverts par empreintes.sha256, 0 écart ; ancre 3b9ab364d9804cdc… ; octets du gel restitués à l'identique ; altération d'un octet détectée et signalée ALTÉRÉ, fichier conservé dans l'archive</w:t>
             </w:r>
           </w:p>
         </w:tc>
@@ -7659,7 +7772,7 @@
                 <w:sz w:val="14"/>
                 <w:szCs w:val="14"/>
               </w:rPr>
-              <w:t xml:space="preserve">472 ms</w:t>
+              <w:t xml:space="preserve">450 ms</w:t>
             </w:r>
           </w:p>
         </w:tc>
@@ -7801,7 +7914,7 @@
                 <w:sz w:val="14"/>
                 <w:szCs w:val="14"/>
               </w:rPr>
-              <w:t xml:space="preserve">12 ms</w:t>
+              <w:t xml:space="preserve">18 ms</w:t>
             </w:r>
           </w:p>
         </w:tc>
@@ -7904,7 +8017,7 @@
                 <w:sz w:val="17"/>
                 <w:szCs w:val="17"/>
               </w:rPr>
-              <w:t xml:space="preserve">durée non déclarée annoncée telle quelle ; quatre valeurs invalides refusées (0, -1, 101, 7.5) ; 10 ans déclarés → échéance 2036-08-06 portée par le manifeste, procédure QP-014 rév. B citée dans la lettre d'accompagnement</w:t>
+              <w:t xml:space="preserve">durée non déclarée annoncée telle quelle ; quatre valeurs invalides refusées (0, -1, 101, 7.5) ; 10 ans déclarés → échéance 2036-08-07 portée par le manifeste, procédure QP-014 rév. B citée dans la lettre d'accompagnement</w:t>
             </w:r>
           </w:p>
         </w:tc>
@@ -7943,7 +8056,7 @@
                 <w:sz w:val="14"/>
                 <w:szCs w:val="14"/>
               </w:rPr>
-              <w:t xml:space="preserve">377 ms</w:t>
+              <w:t xml:space="preserve">442 ms</w:t>
             </w:r>
           </w:p>
         </w:tc>
@@ -8085,7 +8198,7 @@
                 <w:sz w:val="14"/>
                 <w:szCs w:val="14"/>
               </w:rPr>
-              <w:t xml:space="preserve">292 ms</w:t>
+              <w:t xml:space="preserve">365 ms</w:t>
             </w:r>
           </w:p>
         </w:tc>
@@ -8188,7 +8301,7 @@
                 <w:sz w:val="17"/>
                 <w:szCs w:val="17"/>
               </w:rPr>
-              <w:t xml:space="preserve">requête DER de 89 octets portant l'empreinte demandée ; jeton de 2418 octets lu exactement (date 2026-08-03T08:55:03.000Z, série 02, politique 1.3.6.1.4.1.99999.1.1) ; quatre refus obtenus : autre empreinte, autre nonce, réponse de rejet de l'autorité, jeton tronqué</w:t>
+              <w:t xml:space="preserve">requête DER de 90 octets portant l'empreinte demandée ; jeton de 2418 octets lu exactement (date 2026-08-03T08:55:03.000Z, série 02, politique 1.3.6.1.4.1.99999.1.1) ; quatre refus obtenus : autre empreinte, autre nonce, réponse de rejet de l'autorité, jeton tronqué</w:t>
             </w:r>
           </w:p>
         </w:tc>
@@ -8227,7 +8340,7 @@
                 <w:sz w:val="14"/>
                 <w:szCs w:val="14"/>
               </w:rPr>
-              <w:t xml:space="preserve">2 ms</w:t>
+              <w:t xml:space="preserve">1 ms</w:t>
             </w:r>
           </w:p>
         </w:tc>
@@ -8511,7 +8624,7 @@
                 <w:sz w:val="14"/>
                 <w:szCs w:val="14"/>
               </w:rPr>
-              <w:t xml:space="preserve">23 ms</w:t>
+              <w:t xml:space="preserve">33 ms</w:t>
             </w:r>
           </w:p>
         </w:tc>
@@ -8614,7 +8727,7 @@
                 <w:sz w:val="17"/>
                 <w:szCs w:val="17"/>
               </w:rPr>
-              <w:t xml:space="preserve">204 fichier(s) source relus, aucune écriture dans la piste hors du module ; 9 empreintes comparées entre l'implémentation TypeScript et le miroir de la console serveur, toutes identiques</w:t>
+              <w:t xml:space="preserve">205 fichier(s) source relus, aucune écriture dans la piste hors du module ; 9 empreintes comparées entre l'implémentation TypeScript et le miroir de la console serveur, toutes identiques</w:t>
             </w:r>
           </w:p>
         </w:tc>
@@ -8653,7 +8766,7 @@
                 <w:sz w:val="14"/>
                 <w:szCs w:val="14"/>
               </w:rPr>
-              <w:t xml:space="preserve">28 ms</w:t>
+              <w:t xml:space="preserve">33 ms</w:t>
             </w:r>
           </w:p>
         </w:tc>
@@ -9079,7 +9192,7 @@
                 <w:sz w:val="14"/>
                 <w:szCs w:val="14"/>
               </w:rPr>
-              <w:t xml:space="preserve">225 ms</w:t>
+              <w:t xml:space="preserve">262 ms</w:t>
             </w:r>
           </w:p>
         </w:tc>
@@ -9182,7 +9295,7 @@
                 <w:sz w:val="17"/>
                 <w:szCs w:val="17"/>
               </w:rPr>
-              <w:t xml:space="preserve">204 fichier(s) source relus : aucune écriture de mot de passe hors des chemins autorisés ; une seule écriture dans les actions serveur, le changement personnel, qui exige l'ancien mot de passe ; l'outil d'urgence de la console émet un jeton et ne sait plus dériver de mot de passe ; aucun champ de mot de passe hors des 7 écrans où l'on saisit le sien</w:t>
+              <w:t xml:space="preserve">205 fichier(s) source relus : aucune écriture de mot de passe hors des chemins autorisés ; une seule écriture dans les actions serveur, le changement personnel, qui exige l'ancien mot de passe ; l'outil d'urgence de la console émet un jeton et ne sait plus dériver de mot de passe ; aucun champ de mot de passe hors des 7 écrans où l'on saisit le sien</w:t>
             </w:r>
           </w:p>
         </w:tc>
@@ -9221,7 +9334,7 @@
                 <w:sz w:val="14"/>
                 <w:szCs w:val="14"/>
               </w:rPr>
-              <w:t xml:space="preserve">32 ms</w:t>
+              <w:t xml:space="preserve">35 ms</w:t>
             </w:r>
           </w:p>
         </w:tc>
@@ -9363,7 +9476,7 @@
                 <w:sz w:val="14"/>
                 <w:szCs w:val="14"/>
               </w:rPr>
-              <w:t xml:space="preserve">9010 ms</w:t>
+              <w:t xml:space="preserve">8998 ms</w:t>
             </w:r>
           </w:p>
         </w:tc>
@@ -9505,7 +9618,7 @@
                 <w:sz w:val="14"/>
                 <w:szCs w:val="14"/>
               </w:rPr>
-              <w:t xml:space="preserve">26 ms</w:t>
+              <w:t xml:space="preserve">31 ms</w:t>
             </w:r>
           </w:p>
         </w:tc>
@@ -9608,7 +9721,7 @@
                 <w:sz w:val="17"/>
                 <w:szCs w:val="17"/>
               </w:rPr>
-              <w:t xml:space="preserve">copie d'archivage de OQ-012-revision rév. 001 produite (69081 octets, 1 page·s) ; 29 contrôles structurels PDF/A-2b passés — police embarquée, profil ICC « acsp » de 3024 octets, métadonnées pdfaid partie 2 niveau B, décalages exacts ; texte intégralement relu par la table du fichier, 44 caractère·s accentué·s ou typographiques restitués ; production déterministe (deux exécutions octet pour octet identiques)</w:t>
+              <w:t xml:space="preserve">copie d'archivage de OQ-012-revision rév. 001 produite (69087 octets, 1 page·s) ; 29 contrôles structurels PDF/A-2b passés — police embarquée, profil ICC « acsp » de 3024 octets, métadonnées pdfaid partie 2 niveau B, décalages exacts ; texte intégralement relu par la table du fichier, 44 caractère·s accentué·s ou typographiques restitués ; production déterministe (deux exécutions octet pour octet identiques)</w:t>
             </w:r>
           </w:p>
         </w:tc>
@@ -9647,7 +9760,7 @@
                 <w:sz w:val="14"/>
                 <w:szCs w:val="14"/>
               </w:rPr>
-              <w:t xml:space="preserve">16 ms</w:t>
+              <w:t xml:space="preserve">15 ms</w:t>
             </w:r>
           </w:p>
         </w:tc>
@@ -9789,7 +9902,7 @@
                 <w:sz w:val="14"/>
                 <w:szCs w:val="14"/>
               </w:rPr>
-              <w:t xml:space="preserve">148 ms</w:t>
+              <w:t xml:space="preserve">193 ms</w:t>
             </w:r>
           </w:p>
         </w:tc>
@@ -9892,7 +10005,7 @@
                 <w:sz w:val="17"/>
                 <w:szCs w:val="17"/>
               </w:rPr>
-              <w:t xml:space="preserve">clôture refusée trois fois avant d'être permise — conclusion vide, 1 entrée(s) non statuée(s), verdict affirmatif sans motif ; manifestation « Testeur QR2 (QR2) · Revu · 06/08/2026 19:52:45 UTC · enregistrement B6FE 0DDE 145A » portant le nom imprimé, la signification « Revu » et l'empreinte du contenu ; empreinte recalculée à l'identique hors du logiciel, et modifiée par le moindre changement de conclusion ou de verdict ; indépendance consignée sur le SIGNATAIRE (0 entrée·s écrite·s par lui, contre 5 par l'ouvreur) ; 10 règles de triage inscrites dans l'enregistrement ; re-clôture et re-statuage refusés ; aucune rupture ajoutée à la chaîne sur 82 entrées</w:t>
+              <w:t xml:space="preserve">clôture refusée trois fois avant d'être permise — conclusion vide, 1 entrée(s) non statuée(s), verdict affirmatif sans motif ; manifestation « Testeur QR2 (QR2) · Revu · 07/08/2026 08:22:28 UTC · enregistrement E0F0 5795 EBB1 » portant le nom imprimé, la signification « Revu » et l'empreinte du contenu ; empreinte recalculée à l'identique hors du logiciel, et modifiée par le moindre changement de conclusion ou de verdict ; indépendance consignée sur le SIGNATAIRE (0 entrée·s écrite·s par lui, contre 5 par l'ouvreur) ; 10 règles de triage inscrites dans l'enregistrement ; re-clôture et re-statuage refusés ; aucune rupture ajoutée à la chaîne sur 82 entrées</w:t>
             </w:r>
           </w:p>
         </w:tc>
@@ -9931,7 +10044,7 @@
                 <w:sz w:val="14"/>
                 <w:szCs w:val="14"/>
               </w:rPr>
-              <w:t xml:space="preserve">110 ms</w:t>
+              <w:t xml:space="preserve">143 ms</w:t>
             </w:r>
           </w:p>
         </w:tc>
@@ -10074,6 +10187,148 @@
                 <w:szCs w:val="14"/>
               </w:rPr>
               <w:t xml:space="preserve">8 ms</w:t>
+            </w:r>
+          </w:p>
+        </w:tc>
+      </w:tr>
+      <w:tr>
+        <w:tc>
+          <w:tcPr>
+            <w:tcW w:type="pct" w:w="13%"/>
+            <w:shd w:fill="F8FAFC"/>
+            <w:tcMar>
+              <w:top w:type="dxa" w:w="80"/>
+              <w:left w:type="dxa" w:w="110"/>
+              <w:bottom w:type="dxa" w:w="80"/>
+              <w:right w:type="dxa" w:w="110"/>
+            </w:tcMar>
+          </w:tcPr>
+          <w:p>
+            <w:pPr>
+              <w:spacing w:after="50"/>
+            </w:pPr>
+            <w:r>
+              <w:rPr>
+                <w:b/>
+                <w:bCs/>
+                <w:color w:val="4338CA"/>
+                <w:sz w:val="17"/>
+                <w:szCs w:val="17"/>
+              </w:rPr>
+              <w:t xml:space="preserve">OQ-35</w:t>
+            </w:r>
+          </w:p>
+          <w:p>
+            <w:pPr>
+              <w:spacing w:after="0"/>
+            </w:pPr>
+            <w:r>
+              <w:rPr>
+                <w:color w:val="475569"/>
+                <w:sz w:val="15"/>
+                <w:szCs w:val="15"/>
+              </w:rPr>
+              <w:t xml:space="preserve">URS-38</w:t>
+            </w:r>
+          </w:p>
+        </w:tc>
+        <w:tc>
+          <w:tcPr>
+            <w:tcW w:type="pct" w:w="30%"/>
+            <w:tcMar>
+              <w:top w:type="dxa" w:w="80"/>
+              <w:left w:type="dxa" w:w="110"/>
+              <w:bottom w:type="dxa" w:w="80"/>
+              <w:right w:type="dxa" w:w="110"/>
+            </w:tcMar>
+          </w:tcPr>
+          <w:p>
+            <w:pPr>
+              <w:spacing w:after="50"/>
+            </w:pPr>
+            <w:r>
+              <w:rPr>
+                <w:b/>
+                <w:bCs/>
+                <w:sz w:val="17"/>
+                <w:szCs w:val="17"/>
+              </w:rPr>
+              <w:t xml:space="preserve">Reprise d'un classeur et d'un document : extraction fidèle, correspondance des colonnes, même aperçu à blanc</w:t>
+            </w:r>
+          </w:p>
+          <w:p>
+            <w:pPr>
+              <w:spacing w:after="0"/>
+            </w:pPr>
+            <w:r>
+              <w:rPr>
+                <w:color w:val="475569"/>
+                <w:sz w:val="15"/>
+                <w:szCs w:val="15"/>
+              </w:rPr>
+              <w:t xml:space="preserve">Vérifier, sur des fichiers produits par Excel et Word eux-mêmes, que chaque tableau est restitué avec ses en-têtes d'origine, qu'une cellule vide au milieu d'une ligne ne décale pas les suivantes, que les intitulés maison sont assignables à la main, que les valeurs d'énumération françaises sont ramenées aux valeurs internes, et que le tableau retenu traverse le même aperçu à blanc et la même écriture que le CSV.</w:t>
+            </w:r>
+          </w:p>
+        </w:tc>
+        <w:tc>
+          <w:tcPr>
+            <w:tcW w:type="pct" w:w="45%"/>
+            <w:tcMar>
+              <w:top w:type="dxa" w:w="80"/>
+              <w:left w:type="dxa" w:w="110"/>
+              <w:bottom w:type="dxa" w:w="80"/>
+              <w:right w:type="dxa" w:w="110"/>
+            </w:tcMar>
+          </w:tcPr>
+          <w:p>
+            <w:pPr>
+              <w:spacing w:after="0"/>
+            </w:pPr>
+            <w:r>
+              <w:rPr>
+                <w:sz w:val="17"/>
+                <w:szCs w:val="17"/>
+              </w:rPr>
+              <w:t xml:space="preserve">classeur Excel : 2 feuille(s) restituée(s) avec leurs noms réels et leurs 5 en-têtes d'origine, dont trois que Filum ne reconnaît pas (« Req ID », « Description of requirement », « Crit. ») ; la cellule vide au milieu de SYS-102 est conservée à sa place et « PM » n'a pas glissé d'une colonne ; document Word : 3 lignes lues d'un vrai tableau. Après assignation manuelle des trois colonnes, le tableau traverse l'aperçu à blanc EXISTANT : 3 à créer, 0 rejetée, et les criticités « Haute » sont ramenées à « High ». Une criticité inconnue est signalée et laissée vide plutôt que stockée. Un fichier non-zip et un format non pris en charge sont refusés avec leur motif propre</w:t>
+            </w:r>
+          </w:p>
+        </w:tc>
+        <w:tc>
+          <w:tcPr>
+            <w:tcW w:type="pct" w:w="12%"/>
+            <w:tcMar>
+              <w:top w:type="dxa" w:w="80"/>
+              <w:left w:type="dxa" w:w="110"/>
+              <w:bottom w:type="dxa" w:w="80"/>
+              <w:right w:type="dxa" w:w="110"/>
+            </w:tcMar>
+          </w:tcPr>
+          <w:p>
+            <w:pPr>
+              <w:spacing w:after="40"/>
+            </w:pPr>
+            <w:r>
+              <w:rPr>
+                <w:b/>
+                <w:bCs/>
+                <w:color w:val="047857"/>
+                <w:sz w:val="17"/>
+                <w:szCs w:val="17"/>
+              </w:rPr>
+              <w:t xml:space="preserve">Conforme</w:t>
+            </w:r>
+          </w:p>
+          <w:p>
+            <w:pPr>
+              <w:spacing w:after="0"/>
+            </w:pPr>
+            <w:r>
+              <w:rPr>
+                <w:color w:val="475569"/>
+                <w:sz w:val="14"/>
+                <w:szCs w:val="14"/>
+              </w:rPr>
+              <w:t xml:space="preserve">104 ms</w:t>
             </w:r>
           </w:p>
         </w:tc>
@@ -13046,6 +13301,83 @@
           </w:p>
         </w:tc>
       </w:tr>
+      <w:tr>
+        <w:tc>
+          <w:tcPr>
+            <w:tcW w:type="pct" w:w="12%"/>
+            <w:tcMar>
+              <w:top w:type="dxa" w:w="80"/>
+              <w:left w:type="dxa" w:w="110"/>
+              <w:bottom w:type="dxa" w:w="80"/>
+              <w:right w:type="dxa" w:w="110"/>
+            </w:tcMar>
+          </w:tcPr>
+          <w:p>
+            <w:pPr>
+              <w:spacing w:after="0"/>
+            </w:pPr>
+            <w:r>
+              <w:rPr>
+                <w:b/>
+                <w:bCs/>
+                <w:color w:val="4338CA"/>
+                <w:sz w:val="17"/>
+                <w:szCs w:val="17"/>
+              </w:rPr>
+              <w:t xml:space="preserve">URS-38</w:t>
+            </w:r>
+          </w:p>
+        </w:tc>
+        <w:tc>
+          <w:tcPr>
+            <w:tcW w:type="pct" w:w="22%"/>
+            <w:tcMar>
+              <w:top w:type="dxa" w:w="80"/>
+              <w:left w:type="dxa" w:w="110"/>
+              <w:bottom w:type="dxa" w:w="80"/>
+              <w:right w:type="dxa" w:w="110"/>
+            </w:tcMar>
+          </w:tcPr>
+          <w:p>
+            <w:pPr>
+              <w:spacing w:after="0"/>
+            </w:pPr>
+            <w:r>
+              <w:rPr>
+                <w:b/>
+                <w:bCs/>
+                <w:color w:val="047857"/>
+                <w:sz w:val="17"/>
+                <w:szCs w:val="17"/>
+              </w:rPr>
+              <w:t xml:space="preserve">OQ-35</w:t>
+            </w:r>
+          </w:p>
+        </w:tc>
+        <w:tc>
+          <w:tcPr>
+            <w:tcW w:type="pct" w:w="66%"/>
+            <w:tcMar>
+              <w:top w:type="dxa" w:w="80"/>
+              <w:left w:type="dxa" w:w="110"/>
+              <w:bottom w:type="dxa" w:w="80"/>
+              <w:right w:type="dxa" w:w="110"/>
+            </w:tcMar>
+          </w:tcPr>
+          <w:p>
+            <w:pPr>
+              <w:spacing w:after="0"/>
+            </w:pPr>
+            <w:r>
+              <w:rPr>
+                <w:sz w:val="17"/>
+                <w:szCs w:val="17"/>
+              </w:rPr>
+              <w:t xml:space="preserve">Cas de test automatisé exécuté par l'éditeur à chaque version, résultat en section 5.1.</w:t>
+            </w:r>
+          </w:p>
+        </w:tc>
+      </w:tr>
     </w:tbl>
     <w:p>
       <w:pPr>
@@ -13065,7 +13397,7 @@
           <w:sz w:val="20"/>
           <w:szCs w:val="20"/>
         </w:rPr>
-        <w:t xml:space="preserve">Sur les 37 exigences, 33 sont vérifiées automatiquement par l'éditeur et 4 doivent l'être chez vous. Ce n'est pas un partage arbitraire : ces 4 exigences ne sont pas observables sans navigateur, sans requête HTTP ou sans votre infrastructure. Les compter comme couvertes serait une affirmation invérifiable.</w:t>
+        <w:t xml:space="preserve">Sur les 38 exigences, 34 sont vérifiées automatiquement par l'éditeur et 4 doivent l'être chez vous. Ce n'est pas un partage arbitraire : ces 4 exigences ne sont pas observables sans navigateur, sans requête HTTP ou sans votre infrastructure. Les compter comme couvertes serait une affirmation invérifiable.</w:t>
       </w:r>
     </w:p>
     <w:p>
@@ -13417,7 +13749,7 @@
         <w:sz w:val="15"/>
         <w:szCs w:val="15"/>
       </w:rPr>
-      <w:t xml:space="preserve">   ·   Version 1.2.1 · rapport OQ exécuté le 6 août 2026 à 19:52 UTC</w:t>
+      <w:t xml:space="preserve">   ·   Version 1.2.1 · rapport OQ exécuté le 7 août 2026 à 08:22 UTC</w:t>
     </w:r>
   </w:p>
 </w:ftr>

</xml_diff>

<commit_message>
Site — dossier technique par programme (A5)
Note de périmètre, manuel et présentation régénérés : 36 cas de qualification,
39 exigences de validation, onze lignes de périmètre.

Co-Authored-By: Claude Opus 5 <noreply@anthropic.com>
</commit_message>
<xml_diff>
--- a/docs/Dossier_de_validation_Filum.docx
+++ b/docs/Dossier_de_validation_Filum.docx
@@ -430,7 +430,7 @@
           <w:sz w:val="20"/>
           <w:szCs w:val="20"/>
         </w:rPr>
-        <w:t xml:space="preserve">Les 38 exigences ci-dessous énoncent ce que le logiciel doit faire. Le niveau de risque est celui de la DÉFAILLANCE de l'exigence, pas de son importance commerciale : il détermine la profondeur de vérification.</w:t>
+        <w:t xml:space="preserve">Les 39 exigences ci-dessous énoncent ce que le logiciel doit faire. Le niveau de risque est celui de la DÉFAILLANCE de l'exigence, pas de son importance commerciale : il détermine la profondeur de vérification.</w:t>
       </w:r>
     </w:p>
     <w:tbl>
@@ -4851,6 +4851,119 @@
           </w:p>
         </w:tc>
       </w:tr>
+      <w:tr>
+        <w:tc>
+          <w:tcPr>
+            <w:tcW w:type="pct" w:w="11%"/>
+            <w:shd w:fill="F8FAFC"/>
+            <w:tcMar>
+              <w:top w:type="dxa" w:w="80"/>
+              <w:left w:type="dxa" w:w="110"/>
+              <w:bottom w:type="dxa" w:w="80"/>
+              <w:right w:type="dxa" w:w="110"/>
+            </w:tcMar>
+          </w:tcPr>
+          <w:p>
+            <w:pPr>
+              <w:spacing w:after="60"/>
+            </w:pPr>
+            <w:r>
+              <w:rPr>
+                <w:b/>
+                <w:bCs/>
+                <w:color w:val="4338CA"/>
+                <w:sz w:val="17"/>
+                <w:szCs w:val="17"/>
+              </w:rPr>
+              <w:t xml:space="preserve">URS-39</w:t>
+            </w:r>
+          </w:p>
+          <w:p>
+            <w:pPr>
+              <w:spacing w:after="0"/>
+            </w:pPr>
+            <w:r>
+              <w:rPr>
+                <w:b/>
+                <w:bCs/>
+                <w:color w:val="B45309"/>
+                <w:sz w:val="15"/>
+                <w:szCs w:val="15"/>
+              </w:rPr>
+              <w:t xml:space="preserve">Moyen</w:t>
+            </w:r>
+          </w:p>
+        </w:tc>
+        <w:tc>
+          <w:tcPr>
+            <w:tcW w:type="pct" w:w="41%"/>
+            <w:tcMar>
+              <w:top w:type="dxa" w:w="80"/>
+              <w:left w:type="dxa" w:w="110"/>
+              <w:bottom w:type="dxa" w:w="80"/>
+              <w:right w:type="dxa" w:w="110"/>
+            </w:tcMar>
+          </w:tcPr>
+          <w:p>
+            <w:pPr>
+              <w:spacing w:after="0"/>
+            </w:pPr>
+            <w:r>
+              <w:rPr>
+                <w:sz w:val="17"/>
+                <w:szCs w:val="17"/>
+              </w:rPr>
+              <w:t xml:space="preserve">Le dossier technique exporté indexe le contenu du programme sur le référentiel de diagnostic — le MÊME que celui de la trame remise en amont — et déduit chaque statut du graphe, jamais d'une saisie. Les éléments hors du périmètre de Filum sont nommés comme tels avec la source dont ils doivent venir, et l'index ne peut pas contredire le paquet qu'il indexe. L'export est journalisé avec l'état de l'index au moment où il sort.</w:t>
+            </w:r>
+          </w:p>
+        </w:tc>
+        <w:tc>
+          <w:tcPr>
+            <w:tcW w:type="pct" w:w="28%"/>
+            <w:tcMar>
+              <w:top w:type="dxa" w:w="80"/>
+              <w:left w:type="dxa" w:w="110"/>
+              <w:bottom w:type="dxa" w:w="80"/>
+              <w:right w:type="dxa" w:w="110"/>
+            </w:tcMar>
+          </w:tcPr>
+          <w:p>
+            <w:pPr>
+              <w:spacing w:after="0"/>
+            </w:pPr>
+            <w:r>
+              <w:rPr>
+                <w:sz w:val="17"/>
+                <w:szCs w:val="17"/>
+              </w:rPr>
+              <w:t xml:space="preserve">Un index qui annonce « aucune revue de conception » pendant que la revue figure trois lignes plus bas dans le même paquet détruit la crédibilité de tout le dossier devant un inspecteur — et c'est un défaut silencieux, puisque l'index a l'air complet. Un index qui tairait les éléments hors périmètre serait pire encore : il laisserait croire à un dossier technique complet là où il n'y a que la conception, et l'écart serait découvert par l'auditeur plutôt que par le fabricant.</w:t>
+            </w:r>
+          </w:p>
+        </w:tc>
+        <w:tc>
+          <w:tcPr>
+            <w:tcW w:type="pct" w:w="20%"/>
+            <w:tcMar>
+              <w:top w:type="dxa" w:w="80"/>
+              <w:left w:type="dxa" w:w="110"/>
+              <w:bottom w:type="dxa" w:w="80"/>
+              <w:right w:type="dxa" w:w="110"/>
+            </w:tcMar>
+          </w:tcPr>
+          <w:p>
+            <w:pPr>
+              <w:spacing w:after="0"/>
+            </w:pPr>
+            <w:r>
+              <w:rPr>
+                <w:sz w:val="17"/>
+                <w:szCs w:val="17"/>
+              </w:rPr>
+              <w:t xml:space="preserve">ISO 13485 §4.2.3 · 21 CFR 820.30(j) · MDR (UE) 2017/745 Annexe II</w:t>
+            </w:r>
+          </w:p>
+        </w:tc>
+      </w:tr>
     </w:tbl>
     <w:p>
       <w:pPr>
@@ -4870,7 +4983,7 @@
           <w:sz w:val="20"/>
           <w:szCs w:val="20"/>
         </w:rPr>
-        <w:t xml:space="preserve">Répartition : 25 exigences à risque haut, 11 à risque moyen, 2 à risque bas. Les exigences à risque haut touchent toutes à l'intégrité ou à l'attribution des enregistrements : leur défaillance ne dégrade pas le confort d'usage, elle rend un enregistrement indéfendable. Elles font l'objet de cas de test dédiés, exécutés à chaque version.</w:t>
+        <w:t xml:space="preserve">Répartition : 25 exigences à risque haut, 12 à risque moyen, 2 à risque bas. Les exigences à risque haut touchent toutes à l'intégrité ou à l'attribution des enregistrements : leur défaillance ne dégrade pas le confort d'usage, elle rend un enregistrement indéfendable. Elles font l'objet de cas de test dédiés, exécutés à chaque version.</w:t>
       </w:r>
     </w:p>
     <w:p>
@@ -5021,7 +5134,7 @@
                 <w:sz w:val="17"/>
                 <w:szCs w:val="17"/>
               </w:rPr>
-              <w:t xml:space="preserve">7 août 2026 à 08:22</w:t>
+              <w:t xml:space="preserve">7 août 2026 à 09:04</w:t>
             </w:r>
           </w:p>
         </w:tc>
@@ -5224,7 +5337,7 @@
                 <w:sz w:val="17"/>
                 <w:szCs w:val="17"/>
               </w:rPr>
-              <w:t xml:space="preserve">35 cas sur 35 conformes — aucun écart</w:t>
+              <w:t xml:space="preserve">36 cas sur 36 conformes — aucun écart</w:t>
             </w:r>
           </w:p>
         </w:tc>
@@ -5603,7 +5716,7 @@
                 <w:sz w:val="17"/>
                 <w:szCs w:val="17"/>
               </w:rPr>
-              <w:t xml:space="preserve">empreintes distinctes pour un même mot de passe (5393c913df98… ≠ 0a8ab3e14942…), vérification correcte, mot de passe faux et vide refusés</w:t>
+              <w:t xml:space="preserve">empreintes distinctes pour un même mot de passe (b51b47a89425… ≠ e5f7648a7846…), vérification correcte, mot de passe faux et vide refusés</w:t>
             </w:r>
           </w:p>
         </w:tc>
@@ -5642,7 +5755,7 @@
                 <w:sz w:val="14"/>
                 <w:szCs w:val="14"/>
               </w:rPr>
-              <w:t xml:space="preserve">136 ms</w:t>
+              <w:t xml:space="preserve">169 ms</w:t>
             </w:r>
           </w:p>
         </w:tc>
@@ -5784,7 +5897,7 @@
                 <w:sz w:val="14"/>
                 <w:szCs w:val="14"/>
               </w:rPr>
-              <w:t xml:space="preserve">13 ms</w:t>
+              <w:t xml:space="preserve">17 ms</w:t>
             </w:r>
           </w:p>
         </w:tc>
@@ -5887,7 +6000,7 @@
                 <w:sz w:val="17"/>
                 <w:szCs w:val="17"/>
               </w:rPr>
-              <w:t xml:space="preserve">contenu gelé, empreinte 24604eb157d7fa54…, 10486 octets conservés, opération journalisée</w:t>
+              <w:t xml:space="preserve">contenu gelé, empreinte 24604eb157d7fa54…, 10487 octets conservés, opération journalisée</w:t>
             </w:r>
           </w:p>
         </w:tc>
@@ -5926,7 +6039,7 @@
                 <w:sz w:val="14"/>
                 <w:szCs w:val="14"/>
               </w:rPr>
-              <w:t xml:space="preserve">109 ms</w:t>
+              <w:t xml:space="preserve">144 ms</w:t>
             </w:r>
           </w:p>
         </w:tc>
@@ -6029,7 +6142,7 @@
                 <w:sz w:val="17"/>
                 <w:szCs w:val="17"/>
               </w:rPr>
-              <w:t xml:space="preserve">signature liée à l'instantané cmsiofen…, empreinte attestée 3767 CD80 ACC9, manifestation « Testeur QA1 (QA1) · Approuvé · 07/08/2026 08:22:16 UTC · enregistrement 3767 CD80 ACC9 »</w:t>
+              <w:t xml:space="preserve">signature liée à l'instantané cmsipxsn…, empreinte attestée 3767 CD80 ACC9, manifestation « Testeur QA1 (QA1) · Approuvé · 07/08/2026 09:04:33 UTC · enregistrement 3767 CD80 ACC9 »</w:t>
             </w:r>
           </w:p>
         </w:tc>
@@ -6068,7 +6181,7 @@
                 <w:sz w:val="14"/>
                 <w:szCs w:val="14"/>
               </w:rPr>
-              <w:t xml:space="preserve">40 ms</w:t>
+              <w:t xml:space="preserve">53 ms</w:t>
             </w:r>
           </w:p>
         </w:tc>
@@ -6171,7 +6284,7 @@
                 <w:sz w:val="17"/>
                 <w:szCs w:val="17"/>
               </w:rPr>
-              <w:t xml:space="preserve">10487 octets relus à l'identique ; inversion d'un octet en position 5243 détectée</w:t>
+              <w:t xml:space="preserve">10488 octets relus à l'identique ; inversion d'un octet en position 5244 détectée</w:t>
             </w:r>
           </w:p>
         </w:tc>
@@ -6210,7 +6323,7 @@
                 <w:sz w:val="14"/>
                 <w:szCs w:val="14"/>
               </w:rPr>
-              <w:t xml:space="preserve">51 ms</w:t>
+              <w:t xml:space="preserve">63 ms</w:t>
             </w:r>
           </w:p>
         </w:tc>
@@ -6352,7 +6465,7 @@
                 <w:sz w:val="14"/>
                 <w:szCs w:val="14"/>
               </w:rPr>
-              <w:t xml:space="preserve">47 ms</w:t>
+              <w:t xml:space="preserve">63 ms</w:t>
             </w:r>
           </w:p>
         </w:tc>
@@ -6494,7 +6607,7 @@
                 <w:sz w:val="14"/>
                 <w:szCs w:val="14"/>
               </w:rPr>
-              <w:t xml:space="preserve">46 ms</w:t>
+              <w:t xml:space="preserve">62 ms</w:t>
             </w:r>
           </w:p>
         </w:tc>
@@ -6636,7 +6749,7 @@
                 <w:sz w:val="14"/>
                 <w:szCs w:val="14"/>
               </w:rPr>
-              <w:t xml:space="preserve">76 ms</w:t>
+              <w:t xml:space="preserve">85 ms</w:t>
             </w:r>
           </w:p>
         </w:tc>
@@ -6778,7 +6891,7 @@
                 <w:sz w:val="14"/>
                 <w:szCs w:val="14"/>
               </w:rPr>
-              <w:t xml:space="preserve">72 ms</w:t>
+              <w:t xml:space="preserve">86 ms</w:t>
             </w:r>
           </w:p>
         </w:tc>
@@ -6920,7 +7033,7 @@
                 <w:sz w:val="14"/>
                 <w:szCs w:val="14"/>
               </w:rPr>
-              <w:t xml:space="preserve">65 ms</w:t>
+              <w:t xml:space="preserve">80 ms</w:t>
             </w:r>
           </w:p>
         </w:tc>
@@ -7023,7 +7136,7 @@
                 <w:sz w:val="17"/>
                 <w:szCs w:val="17"/>
               </w:rPr>
-              <w:t xml:space="preserve">151 fichiers source inspectés : aucune modification ni suppression d'entrée ; 1 fichiers en écriture seule</w:t>
+              <w:t xml:space="preserve">154 fichiers source inspectés : aucune modification ni suppression d'entrée ; 1 fichiers en écriture seule</w:t>
             </w:r>
           </w:p>
         </w:tc>
@@ -7062,7 +7175,7 @@
                 <w:sz w:val="14"/>
                 <w:szCs w:val="14"/>
               </w:rPr>
-              <w:t xml:space="preserve">28 ms</w:t>
+              <w:t xml:space="preserve">33 ms</w:t>
             </w:r>
           </w:p>
         </w:tc>
@@ -7204,7 +7317,7 @@
                 <w:sz w:val="14"/>
                 <w:szCs w:val="14"/>
               </w:rPr>
-              <w:t xml:space="preserve">21 ms</w:t>
+              <w:t xml:space="preserve">31 ms</w:t>
             </w:r>
           </w:p>
         </w:tc>
@@ -7630,7 +7743,7 @@
                 <w:sz w:val="14"/>
                 <w:szCs w:val="14"/>
               </w:rPr>
-              <w:t xml:space="preserve">303 ms</w:t>
+              <w:t xml:space="preserve">335 ms</w:t>
             </w:r>
           </w:p>
         </w:tc>
@@ -7733,7 +7846,7 @@
                 <w:sz w:val="17"/>
                 <w:szCs w:val="17"/>
               </w:rPr>
-              <w:t xml:space="preserve">13 enregistrement(s) archivé(s), 43 fichier(s) couverts par empreintes.sha256, 0 écart ; ancre 3b9ab364d9804cdc… ; octets du gel restitués à l'identique ; altération d'un octet détectée et signalée ALTÉRÉ, fichier conservé dans l'archive</w:t>
+              <w:t xml:space="preserve">13 enregistrement(s) archivé(s), 43 fichier(s) couverts par empreintes.sha256, 0 écart ; ancre b0bd8c6833b205ae… ; octets du gel restitués à l'identique ; altération d'un octet détectée et signalée ALTÉRÉ, fichier conservé dans l'archive</w:t>
             </w:r>
           </w:p>
         </w:tc>
@@ -7772,7 +7885,7 @@
                 <w:sz w:val="14"/>
                 <w:szCs w:val="14"/>
               </w:rPr>
-              <w:t xml:space="preserve">450 ms</w:t>
+              <w:t xml:space="preserve">458 ms</w:t>
             </w:r>
           </w:p>
         </w:tc>
@@ -7914,7 +8027,7 @@
                 <w:sz w:val="14"/>
                 <w:szCs w:val="14"/>
               </w:rPr>
-              <w:t xml:space="preserve">18 ms</w:t>
+              <w:t xml:space="preserve">14 ms</w:t>
             </w:r>
           </w:p>
         </w:tc>
@@ -8056,7 +8169,7 @@
                 <w:sz w:val="14"/>
                 <w:szCs w:val="14"/>
               </w:rPr>
-              <w:t xml:space="preserve">442 ms</w:t>
+              <w:t xml:space="preserve">396 ms</w:t>
             </w:r>
           </w:p>
         </w:tc>
@@ -8198,7 +8311,7 @@
                 <w:sz w:val="14"/>
                 <w:szCs w:val="14"/>
               </w:rPr>
-              <w:t xml:space="preserve">365 ms</w:t>
+              <w:t xml:space="preserve">285 ms</w:t>
             </w:r>
           </w:p>
         </w:tc>
@@ -8301,7 +8414,7 @@
                 <w:sz w:val="17"/>
                 <w:szCs w:val="17"/>
               </w:rPr>
-              <w:t xml:space="preserve">requête DER de 90 octets portant l'empreinte demandée ; jeton de 2418 octets lu exactement (date 2026-08-03T08:55:03.000Z, série 02, politique 1.3.6.1.4.1.99999.1.1) ; quatre refus obtenus : autre empreinte, autre nonce, réponse de rejet de l'autorité, jeton tronqué</w:t>
+              <w:t xml:space="preserve">requête DER de 89 octets portant l'empreinte demandée ; jeton de 2418 octets lu exactement (date 2026-08-03T08:55:03.000Z, série 02, politique 1.3.6.1.4.1.99999.1.1) ; quatre refus obtenus : autre empreinte, autre nonce, réponse de rejet de l'autorité, jeton tronqué</w:t>
             </w:r>
           </w:p>
         </w:tc>
@@ -8482,7 +8595,7 @@
                 <w:sz w:val="14"/>
                 <w:szCs w:val="14"/>
               </w:rPr>
-              <w:t xml:space="preserve">1 ms</w:t>
+              <w:t xml:space="preserve">0 ms</w:t>
             </w:r>
           </w:p>
         </w:tc>
@@ -8624,7 +8737,7 @@
                 <w:sz w:val="14"/>
                 <w:szCs w:val="14"/>
               </w:rPr>
-              <w:t xml:space="preserve">33 ms</w:t>
+              <w:t xml:space="preserve">25 ms</w:t>
             </w:r>
           </w:p>
         </w:tc>
@@ -8727,7 +8840,7 @@
                 <w:sz w:val="17"/>
                 <w:szCs w:val="17"/>
               </w:rPr>
-              <w:t xml:space="preserve">205 fichier(s) source relus, aucune écriture dans la piste hors du module ; 9 empreintes comparées entre l'implémentation TypeScript et le miroir de la console serveur, toutes identiques</w:t>
+              <w:t xml:space="preserve">209 fichier(s) source relus, aucune écriture dans la piste hors du module ; 9 empreintes comparées entre l'implémentation TypeScript et le miroir de la console serveur, toutes identiques</w:t>
             </w:r>
           </w:p>
         </w:tc>
@@ -8766,7 +8879,7 @@
                 <w:sz w:val="14"/>
                 <w:szCs w:val="14"/>
               </w:rPr>
-              <w:t xml:space="preserve">33 ms</w:t>
+              <w:t xml:space="preserve">26 ms</w:t>
             </w:r>
           </w:p>
         </w:tc>
@@ -9011,7 +9124,7 @@
                 <w:sz w:val="17"/>
                 <w:szCs w:val="17"/>
               </w:rPr>
-              <w:t xml:space="preserve">consommation de jeton et changement personnel horodatés et exigence levée, compte d'amorçage horodaté et marqué à renouveler ; requireUser() redirige vers l'écran de renouvellement ; 50 point(s) d'entrée relus, aucun ne s'authentifie hors du garde (3 exceptions nommées : mise en page, connexion, renouvellement)</w:t>
+              <w:t xml:space="preserve">consommation de jeton et changement personnel horodatés et exigence levée, compte d'amorçage horodaté et marqué à renouveler ; requireUser() redirige vers l'écran de renouvellement ; 51 point(s) d'entrée relus, aucun ne s'authentifie hors du garde (3 exceptions nommées : mise en page, connexion, renouvellement)</w:t>
             </w:r>
           </w:p>
         </w:tc>
@@ -9192,7 +9305,7 @@
                 <w:sz w:val="14"/>
                 <w:szCs w:val="14"/>
               </w:rPr>
-              <w:t xml:space="preserve">262 ms</w:t>
+              <w:t xml:space="preserve">221 ms</w:t>
             </w:r>
           </w:p>
         </w:tc>
@@ -9295,7 +9408,7 @@
                 <w:sz w:val="17"/>
                 <w:szCs w:val="17"/>
               </w:rPr>
-              <w:t xml:space="preserve">205 fichier(s) source relus : aucune écriture de mot de passe hors des chemins autorisés ; une seule écriture dans les actions serveur, le changement personnel, qui exige l'ancien mot de passe ; l'outil d'urgence de la console émet un jeton et ne sait plus dériver de mot de passe ; aucun champ de mot de passe hors des 7 écrans où l'on saisit le sien</w:t>
+              <w:t xml:space="preserve">209 fichier(s) source relus : aucune écriture de mot de passe hors des chemins autorisés ; une seule écriture dans les actions serveur, le changement personnel, qui exige l'ancien mot de passe ; l'outil d'urgence de la console émet un jeton et ne sait plus dériver de mot de passe ; aucun champ de mot de passe hors des 7 écrans où l'on saisit le sien</w:t>
             </w:r>
           </w:p>
         </w:tc>
@@ -9334,7 +9447,7 @@
                 <w:sz w:val="14"/>
                 <w:szCs w:val="14"/>
               </w:rPr>
-              <w:t xml:space="preserve">35 ms</w:t>
+              <w:t xml:space="preserve">33 ms</w:t>
             </w:r>
           </w:p>
         </w:tc>
@@ -9476,7 +9589,7 @@
                 <w:sz w:val="14"/>
                 <w:szCs w:val="14"/>
               </w:rPr>
-              <w:t xml:space="preserve">8998 ms</w:t>
+              <w:t xml:space="preserve">8972 ms</w:t>
             </w:r>
           </w:p>
         </w:tc>
@@ -9579,7 +9692,7 @@
                 <w:sz w:val="17"/>
                 <w:szCs w:val="17"/>
               </w:rPr>
-              <w:t xml:space="preserve">187 messages du catalogue complets dans les deux langues et à variables identiques ; entrée écrite par le point de passage relue « SPEC-OQ30 : En attente → Justifié — justification : ess… » et « SPEC-OQ30: Pending → Justified — justification: essai d… » ; le statut suit la langue, le motif saisi est restitué à l'identique dans les deux ; réécriture des arguments et changement de clé détectés au rang 64, chaîne rétablie après remise en état ; une entrée sans message se sérialise sur 9 champs comme avant, 11 avec, miroir de console identique sur les deux formes</w:t>
+              <w:t xml:space="preserve">188 messages du catalogue complets dans les deux langues et à variables identiques ; entrée écrite par le point de passage relue « SPEC-OQ30 : En attente → Justifié — justification : ess… » et « SPEC-OQ30: Pending → Justified — justification: essai d… » ; le statut suit la langue, le motif saisi est restitué à l'identique dans les deux ; réécriture des arguments et changement de clé détectés au rang 64, chaîne rétablie après remise en état ; une entrée sans message se sérialise sur 9 champs comme avant, 11 avec, miroir de console identique sur les deux formes</w:t>
             </w:r>
           </w:p>
         </w:tc>
@@ -9618,7 +9731,7 @@
                 <w:sz w:val="14"/>
                 <w:szCs w:val="14"/>
               </w:rPr>
-              <w:t xml:space="preserve">31 ms</w:t>
+              <w:t xml:space="preserve">23 ms</w:t>
             </w:r>
           </w:p>
         </w:tc>
@@ -9721,7 +9834,7 @@
                 <w:sz w:val="17"/>
                 <w:szCs w:val="17"/>
               </w:rPr>
-              <w:t xml:space="preserve">copie d'archivage de OQ-012-revision rév. 001 produite (69087 octets, 1 page·s) ; 29 contrôles structurels PDF/A-2b passés — police embarquée, profil ICC « acsp » de 3024 octets, métadonnées pdfaid partie 2 niveau B, décalages exacts ; texte intégralement relu par la table du fichier, 44 caractère·s accentué·s ou typographiques restitués ; production déterministe (deux exécutions octet pour octet identiques)</w:t>
+              <w:t xml:space="preserve">copie d'archivage de OQ-012-revision rév. 001 produite (69088 octets, 1 page·s) ; 29 contrôles structurels PDF/A-2b passés — police embarquée, profil ICC « acsp » de 3024 octets, métadonnées pdfaid partie 2 niveau B, décalages exacts ; texte intégralement relu par la table du fichier, 44 caractère·s accentué·s ou typographiques restitués ; production déterministe (deux exécutions octet pour octet identiques)</w:t>
             </w:r>
           </w:p>
         </w:tc>
@@ -9760,7 +9873,7 @@
                 <w:sz w:val="14"/>
                 <w:szCs w:val="14"/>
               </w:rPr>
-              <w:t xml:space="preserve">15 ms</w:t>
+              <w:t xml:space="preserve">14 ms</w:t>
             </w:r>
           </w:p>
         </w:tc>
@@ -9902,7 +10015,7 @@
                 <w:sz w:val="14"/>
                 <w:szCs w:val="14"/>
               </w:rPr>
-              <w:t xml:space="preserve">193 ms</w:t>
+              <w:t xml:space="preserve">153 ms</w:t>
             </w:r>
           </w:p>
         </w:tc>
@@ -10005,7 +10118,7 @@
                 <w:sz w:val="17"/>
                 <w:szCs w:val="17"/>
               </w:rPr>
-              <w:t xml:space="preserve">clôture refusée trois fois avant d'être permise — conclusion vide, 1 entrée(s) non statuée(s), verdict affirmatif sans motif ; manifestation « Testeur QR2 (QR2) · Revu · 07/08/2026 08:22:28 UTC · enregistrement E0F0 5795 EBB1 » portant le nom imprimé, la signification « Revu » et l'empreinte du contenu ; empreinte recalculée à l'identique hors du logiciel, et modifiée par le moindre changement de conclusion ou de verdict ; indépendance consignée sur le SIGNATAIRE (0 entrée·s écrite·s par lui, contre 5 par l'ouvreur) ; 10 règles de triage inscrites dans l'enregistrement ; re-clôture et re-statuage refusés ; aucune rupture ajoutée à la chaîne sur 82 entrées</w:t>
+              <w:t xml:space="preserve">clôture refusée trois fois avant d'être permise — conclusion vide, 1 entrée(s) non statuée(s), verdict affirmatif sans motif ; manifestation « Testeur QR2 (QR2) · Revu · 07/08/2026 09:04:45 UTC · enregistrement DF2C 80CE D134 » portant le nom imprimé, la signification « Revu » et l'empreinte du contenu ; empreinte recalculée à l'identique hors du logiciel, et modifiée par le moindre changement de conclusion ou de verdict ; indépendance consignée sur le SIGNATAIRE (0 entrée·s écrite·s par lui, contre 5 par l'ouvreur) ; 10 règles de triage inscrites dans l'enregistrement ; re-clôture et re-statuage refusés ; aucune rupture ajoutée à la chaîne sur 82 entrées</w:t>
             </w:r>
           </w:p>
         </w:tc>
@@ -10044,7 +10157,7 @@
                 <w:sz w:val="14"/>
                 <w:szCs w:val="14"/>
               </w:rPr>
-              <w:t xml:space="preserve">143 ms</w:t>
+              <w:t xml:space="preserve">106 ms</w:t>
             </w:r>
           </w:p>
         </w:tc>
@@ -10186,7 +10299,7 @@
                 <w:sz w:val="14"/>
                 <w:szCs w:val="14"/>
               </w:rPr>
-              <w:t xml:space="preserve">8 ms</w:t>
+              <w:t xml:space="preserve">9 ms</w:t>
             </w:r>
           </w:p>
         </w:tc>
@@ -10328,7 +10441,149 @@
                 <w:sz w:val="14"/>
                 <w:szCs w:val="14"/>
               </w:rPr>
-              <w:t xml:space="preserve">104 ms</w:t>
+              <w:t xml:space="preserve">71 ms</w:t>
+            </w:r>
+          </w:p>
+        </w:tc>
+      </w:tr>
+      <w:tr>
+        <w:tc>
+          <w:tcPr>
+            <w:tcW w:type="pct" w:w="13%"/>
+            <w:shd w:fill="F8FAFC"/>
+            <w:tcMar>
+              <w:top w:type="dxa" w:w="80"/>
+              <w:left w:type="dxa" w:w="110"/>
+              <w:bottom w:type="dxa" w:w="80"/>
+              <w:right w:type="dxa" w:w="110"/>
+            </w:tcMar>
+          </w:tcPr>
+          <w:p>
+            <w:pPr>
+              <w:spacing w:after="50"/>
+            </w:pPr>
+            <w:r>
+              <w:rPr>
+                <w:b/>
+                <w:bCs/>
+                <w:color w:val="4338CA"/>
+                <w:sz w:val="17"/>
+                <w:szCs w:val="17"/>
+              </w:rPr>
+              <w:t xml:space="preserve">OQ-36</w:t>
+            </w:r>
+          </w:p>
+          <w:p>
+            <w:pPr>
+              <w:spacing w:after="0"/>
+            </w:pPr>
+            <w:r>
+              <w:rPr>
+                <w:color w:val="475569"/>
+                <w:sz w:val="15"/>
+                <w:szCs w:val="15"/>
+              </w:rPr>
+              <w:t xml:space="preserve">URS-39</w:t>
+            </w:r>
+          </w:p>
+        </w:tc>
+        <w:tc>
+          <w:tcPr>
+            <w:tcW w:type="pct" w:w="30%"/>
+            <w:tcMar>
+              <w:top w:type="dxa" w:w="80"/>
+              <w:left w:type="dxa" w:w="110"/>
+              <w:bottom w:type="dxa" w:w="80"/>
+              <w:right w:type="dxa" w:w="110"/>
+            </w:tcMar>
+          </w:tcPr>
+          <w:p>
+            <w:pPr>
+              <w:spacing w:after="50"/>
+            </w:pPr>
+            <w:r>
+              <w:rPr>
+                <w:b/>
+                <w:bCs/>
+                <w:sz w:val="17"/>
+                <w:szCs w:val="17"/>
+              </w:rPr>
+              <w:t xml:space="preserve">Dossier technique : index déduit du graphe, hors-périmètre nommé, et aucune contradiction avec le paquet</w:t>
+            </w:r>
+          </w:p>
+          <w:p>
+            <w:pPr>
+              <w:spacing w:after="0"/>
+            </w:pPr>
+            <w:r>
+              <w:rPr>
+                <w:color w:val="475569"/>
+                <w:sz w:val="15"/>
+                <w:szCs w:val="15"/>
+              </w:rPr>
+              <w:t xml:space="preserve">Vérifier que l'index couvre les 50 éléments du référentiel de diagnostic, que chaque statut se déduit du graphe et change quand le graphe change, que les éléments hors périmètre sont nommés avec leur source, que l'index ne déclare jamais absent un type de document présent dans le paquet, et que les empreintes couvrent tous les fichiers.</w:t>
+            </w:r>
+          </w:p>
+        </w:tc>
+        <w:tc>
+          <w:tcPr>
+            <w:tcW w:type="pct" w:w="45%"/>
+            <w:tcMar>
+              <w:top w:type="dxa" w:w="80"/>
+              <w:left w:type="dxa" w:w="110"/>
+              <w:bottom w:type="dxa" w:w="80"/>
+              <w:right w:type="dxa" w:w="110"/>
+            </w:tcMar>
+          </w:tcPr>
+          <w:p>
+            <w:pPr>
+              <w:spacing w:after="0"/>
+            </w:pPr>
+            <w:r>
+              <w:rPr>
+                <w:sz w:val="17"/>
+                <w:szCs w:val="17"/>
+              </w:rPr>
+              <w:t xml:space="preserve">index de 50 éléments, identique au référentiel de diagnostic remis en amont ; sur un programme vide, 0 élément couvert et 15 hors périmètre, chacun nommant la source dont la pièce doit venir ; la création d'une seule exigence fait passer INP-1 d'« absent » à « couvert » — le statut suit le graphe et n'est pas saisi ; sur le dossier de démonstration, aucun élément n'est déclaré absent alors qu'un document de son type est publié dans le même paquet, les empreintes couvrent les 4 autres fichiers, et la lettre d'accompagnement énonce que le paquet n'est pas un dossier technique complet</w:t>
+            </w:r>
+          </w:p>
+        </w:tc>
+        <w:tc>
+          <w:tcPr>
+            <w:tcW w:type="pct" w:w="12%"/>
+            <w:tcMar>
+              <w:top w:type="dxa" w:w="80"/>
+              <w:left w:type="dxa" w:w="110"/>
+              <w:bottom w:type="dxa" w:w="80"/>
+              <w:right w:type="dxa" w:w="110"/>
+            </w:tcMar>
+          </w:tcPr>
+          <w:p>
+            <w:pPr>
+              <w:spacing w:after="40"/>
+            </w:pPr>
+            <w:r>
+              <w:rPr>
+                <w:b/>
+                <w:bCs/>
+                <w:color w:val="047857"/>
+                <w:sz w:val="17"/>
+                <w:szCs w:val="17"/>
+              </w:rPr>
+              <w:t xml:space="preserve">Conforme</w:t>
+            </w:r>
+          </w:p>
+          <w:p>
+            <w:pPr>
+              <w:spacing w:after="0"/>
+            </w:pPr>
+            <w:r>
+              <w:rPr>
+                <w:color w:val="475569"/>
+                <w:sz w:val="14"/>
+                <w:szCs w:val="14"/>
+              </w:rPr>
+              <w:t xml:space="preserve">49 ms</w:t>
             </w:r>
           </w:p>
         </w:tc>
@@ -13378,6 +13633,83 @@
           </w:p>
         </w:tc>
       </w:tr>
+      <w:tr>
+        <w:tc>
+          <w:tcPr>
+            <w:tcW w:type="pct" w:w="12%"/>
+            <w:tcMar>
+              <w:top w:type="dxa" w:w="80"/>
+              <w:left w:type="dxa" w:w="110"/>
+              <w:bottom w:type="dxa" w:w="80"/>
+              <w:right w:type="dxa" w:w="110"/>
+            </w:tcMar>
+          </w:tcPr>
+          <w:p>
+            <w:pPr>
+              <w:spacing w:after="0"/>
+            </w:pPr>
+            <w:r>
+              <w:rPr>
+                <w:b/>
+                <w:bCs/>
+                <w:color w:val="4338CA"/>
+                <w:sz w:val="17"/>
+                <w:szCs w:val="17"/>
+              </w:rPr>
+              <w:t xml:space="preserve">URS-39</w:t>
+            </w:r>
+          </w:p>
+        </w:tc>
+        <w:tc>
+          <w:tcPr>
+            <w:tcW w:type="pct" w:w="22%"/>
+            <w:tcMar>
+              <w:top w:type="dxa" w:w="80"/>
+              <w:left w:type="dxa" w:w="110"/>
+              <w:bottom w:type="dxa" w:w="80"/>
+              <w:right w:type="dxa" w:w="110"/>
+            </w:tcMar>
+          </w:tcPr>
+          <w:p>
+            <w:pPr>
+              <w:spacing w:after="0"/>
+            </w:pPr>
+            <w:r>
+              <w:rPr>
+                <w:b/>
+                <w:bCs/>
+                <w:color w:val="047857"/>
+                <w:sz w:val="17"/>
+                <w:szCs w:val="17"/>
+              </w:rPr>
+              <w:t xml:space="preserve">OQ-36</w:t>
+            </w:r>
+          </w:p>
+        </w:tc>
+        <w:tc>
+          <w:tcPr>
+            <w:tcW w:type="pct" w:w="66%"/>
+            <w:tcMar>
+              <w:top w:type="dxa" w:w="80"/>
+              <w:left w:type="dxa" w:w="110"/>
+              <w:bottom w:type="dxa" w:w="80"/>
+              <w:right w:type="dxa" w:w="110"/>
+            </w:tcMar>
+          </w:tcPr>
+          <w:p>
+            <w:pPr>
+              <w:spacing w:after="0"/>
+            </w:pPr>
+            <w:r>
+              <w:rPr>
+                <w:sz w:val="17"/>
+                <w:szCs w:val="17"/>
+              </w:rPr>
+              <w:t xml:space="preserve">Cas de test automatisé exécuté par l'éditeur à chaque version, résultat en section 5.1.</w:t>
+            </w:r>
+          </w:p>
+        </w:tc>
+      </w:tr>
     </w:tbl>
     <w:p>
       <w:pPr>
@@ -13397,7 +13729,7 @@
           <w:sz w:val="20"/>
           <w:szCs w:val="20"/>
         </w:rPr>
-        <w:t xml:space="preserve">Sur les 38 exigences, 34 sont vérifiées automatiquement par l'éditeur et 4 doivent l'être chez vous. Ce n'est pas un partage arbitraire : ces 4 exigences ne sont pas observables sans navigateur, sans requête HTTP ou sans votre infrastructure. Les compter comme couvertes serait une affirmation invérifiable.</w:t>
+        <w:t xml:space="preserve">Sur les 39 exigences, 35 sont vérifiées automatiquement par l'éditeur et 4 doivent l'être chez vous. Ce n'est pas un partage arbitraire : ces 4 exigences ne sont pas observables sans navigateur, sans requête HTTP ou sans votre infrastructure. Les compter comme couvertes serait une affirmation invérifiable.</w:t>
       </w:r>
     </w:p>
     <w:p>
@@ -13749,7 +14081,7 @@
         <w:sz w:val="15"/>
         <w:szCs w:val="15"/>
       </w:rPr>
-      <w:t xml:space="preserve">   ·   Version 1.2.1 · rapport OQ exécuté le 7 août 2026 à 08:22 UTC</w:t>
+      <w:t xml:space="preserve">   ·   Version 1.2.1 · rapport OQ exécuté le 7 août 2026 à 09:04 UTC</w:t>
     </w:r>
   </w:p>
 </w:ftr>

</xml_diff>

<commit_message>
Site — réplication continue documentée (C6)
Note de périmètre, manuel et pack de validation régénérés : 37 cas de
qualification, 40 exigences de validation.

Co-Authored-By: Claude Opus 5 <noreply@anthropic.com>
</commit_message>
<xml_diff>
--- a/docs/Dossier_de_validation_Filum.docx
+++ b/docs/Dossier_de_validation_Filum.docx
@@ -430,7 +430,7 @@
           <w:sz w:val="20"/>
           <w:szCs w:val="20"/>
         </w:rPr>
-        <w:t xml:space="preserve">Les 39 exigences ci-dessous énoncent ce que le logiciel doit faire. Le niveau de risque est celui de la DÉFAILLANCE de l'exigence, pas de son importance commerciale : il détermine la profondeur de vérification.</w:t>
+        <w:t xml:space="preserve">Les 40 exigences ci-dessous énoncent ce que le logiciel doit faire. Le niveau de risque est celui de la DÉFAILLANCE de l'exigence, pas de son importance commerciale : il détermine la profondeur de vérification.</w:t>
       </w:r>
     </w:p>
     <w:tbl>
@@ -4964,6 +4964,119 @@
           </w:p>
         </w:tc>
       </w:tr>
+      <w:tr>
+        <w:tc>
+          <w:tcPr>
+            <w:tcW w:type="pct" w:w="11%"/>
+            <w:shd w:fill="F8FAFC"/>
+            <w:tcMar>
+              <w:top w:type="dxa" w:w="80"/>
+              <w:left w:type="dxa" w:w="110"/>
+              <w:bottom w:type="dxa" w:w="80"/>
+              <w:right w:type="dxa" w:w="110"/>
+            </w:tcMar>
+          </w:tcPr>
+          <w:p>
+            <w:pPr>
+              <w:spacing w:after="60"/>
+            </w:pPr>
+            <w:r>
+              <w:rPr>
+                <w:b/>
+                <w:bCs/>
+                <w:color w:val="4338CA"/>
+                <w:sz w:val="17"/>
+                <w:szCs w:val="17"/>
+              </w:rPr>
+              <w:t xml:space="preserve">URS-40</w:t>
+            </w:r>
+          </w:p>
+          <w:p>
+            <w:pPr>
+              <w:spacing w:after="0"/>
+            </w:pPr>
+            <w:r>
+              <w:rPr>
+                <w:b/>
+                <w:bCs/>
+                <w:color w:val="DC2626"/>
+                <w:sz w:val="15"/>
+                <w:szCs w:val="15"/>
+              </w:rPr>
+              <w:t xml:space="preserve">Haut</w:t>
+            </w:r>
+          </w:p>
+        </w:tc>
+        <w:tc>
+          <w:tcPr>
+            <w:tcW w:type="pct" w:w="41%"/>
+            <w:tcMar>
+              <w:top w:type="dxa" w:w="80"/>
+              <w:left w:type="dxa" w:w="110"/>
+              <w:bottom w:type="dxa" w:w="80"/>
+              <w:right w:type="dxa" w:w="110"/>
+            </w:tcMar>
+          </w:tcPr>
+          <w:p>
+            <w:pPr>
+              <w:spacing w:after="0"/>
+            </w:pPr>
+            <w:r>
+              <w:rPr>
+                <w:sz w:val="17"/>
+                <w:szCs w:val="17"/>
+              </w:rPr>
+              <w:t xml:space="preserve">La base est en journalisation WAL, et le passage est appliqué au démarrage de façon idempotente. Le volume des fichiers est en AJOUT SEUL : aucun chemin du logiciel n'y supprime ni n'y écrase. Un contrôle relit chaque pièce référencée par la base et distingue une pièce ABSENTE — fichiers en retard sur la base — d'une pièce ALTÉRÉE — octets changés hors du logiciel.</w:t>
+            </w:r>
+          </w:p>
+        </w:tc>
+        <w:tc>
+          <w:tcPr>
+            <w:tcW w:type="pct" w:w="28%"/>
+            <w:tcMar>
+              <w:top w:type="dxa" w:w="80"/>
+              <w:left w:type="dxa" w:w="110"/>
+              <w:bottom w:type="dxa" w:w="80"/>
+              <w:right w:type="dxa" w:w="110"/>
+            </w:tcMar>
+          </w:tcPr>
+          <w:p>
+            <w:pPr>
+              <w:spacing w:after="0"/>
+            </w:pPr>
+            <w:r>
+              <w:rPr>
+                <w:sz w:val="17"/>
+                <w:szCs w:val="17"/>
+              </w:rPr>
+              <w:t xml:space="preserve">La réplication continue ne réplique que la base. Sans la propriété d'ajout seul du volume des fichiers, aucune règle d'ordre de restauration ne serait sûre, et une restauration produirait des enregistrements approuvés dont les octets manquent — un dossier réglementaire amputé sans que rien ne le signale. Sans WAL, une installation « avec réplication » répliquerait du vide. Et confondre une pièce absente avec une pièce altérée ferait traiter une atteinte à l'intégrité comme un incident d'exploitation.</w:t>
+            </w:r>
+          </w:p>
+        </w:tc>
+        <w:tc>
+          <w:tcPr>
+            <w:tcW w:type="pct" w:w="20%"/>
+            <w:tcMar>
+              <w:top w:type="dxa" w:w="80"/>
+              <w:left w:type="dxa" w:w="110"/>
+              <w:bottom w:type="dxa" w:w="80"/>
+              <w:right w:type="dxa" w:w="110"/>
+            </w:tcMar>
+          </w:tcPr>
+          <w:p>
+            <w:pPr>
+              <w:spacing w:after="0"/>
+            </w:pPr>
+            <w:r>
+              <w:rPr>
+                <w:sz w:val="17"/>
+                <w:szCs w:val="17"/>
+              </w:rPr>
+              <w:t xml:space="preserve">21 CFR 11.10(c) · Annexe 11 (projet) — Sauvegarde et restauration · ISO 13485 §4.2.5</w:t>
+            </w:r>
+          </w:p>
+        </w:tc>
+      </w:tr>
     </w:tbl>
     <w:p>
       <w:pPr>
@@ -4983,7 +5096,7 @@
           <w:sz w:val="20"/>
           <w:szCs w:val="20"/>
         </w:rPr>
-        <w:t xml:space="preserve">Répartition : 25 exigences à risque haut, 12 à risque moyen, 2 à risque bas. Les exigences à risque haut touchent toutes à l'intégrité ou à l'attribution des enregistrements : leur défaillance ne dégrade pas le confort d'usage, elle rend un enregistrement indéfendable. Elles font l'objet de cas de test dédiés, exécutés à chaque version.</w:t>
+        <w:t xml:space="preserve">Répartition : 26 exigences à risque haut, 12 à risque moyen, 2 à risque bas. Les exigences à risque haut touchent toutes à l'intégrité ou à l'attribution des enregistrements : leur défaillance ne dégrade pas le confort d'usage, elle rend un enregistrement indéfendable. Elles font l'objet de cas de test dédiés, exécutés à chaque version.</w:t>
       </w:r>
     </w:p>
     <w:p>
@@ -5134,7 +5247,7 @@
                 <w:sz w:val="17"/>
                 <w:szCs w:val="17"/>
               </w:rPr>
-              <w:t xml:space="preserve">7 août 2026 à 09:04</w:t>
+              <w:t xml:space="preserve">7 août 2026 à 10:24</w:t>
             </w:r>
           </w:p>
         </w:tc>
@@ -5337,7 +5450,7 @@
                 <w:sz w:val="17"/>
                 <w:szCs w:val="17"/>
               </w:rPr>
-              <w:t xml:space="preserve">36 cas sur 36 conformes — aucun écart</w:t>
+              <w:t xml:space="preserve">37 cas sur 37 conformes — aucun écart</w:t>
             </w:r>
           </w:p>
         </w:tc>
@@ -5716,7 +5829,7 @@
                 <w:sz w:val="17"/>
                 <w:szCs w:val="17"/>
               </w:rPr>
-              <w:t xml:space="preserve">empreintes distinctes pour un même mot de passe (b51b47a89425… ≠ e5f7648a7846…), vérification correcte, mot de passe faux et vide refusés</w:t>
+              <w:t xml:space="preserve">empreintes distinctes pour un même mot de passe (48e2b8a0c608… ≠ deeb761bd128…), vérification correcte, mot de passe faux et vide refusés</w:t>
             </w:r>
           </w:p>
         </w:tc>
@@ -5755,7 +5868,7 @@
                 <w:sz w:val="14"/>
                 <w:szCs w:val="14"/>
               </w:rPr>
-              <w:t xml:space="preserve">169 ms</w:t>
+              <w:t xml:space="preserve">144 ms</w:t>
             </w:r>
           </w:p>
         </w:tc>
@@ -5897,7 +6010,7 @@
                 <w:sz w:val="14"/>
                 <w:szCs w:val="14"/>
               </w:rPr>
-              <w:t xml:space="preserve">17 ms</w:t>
+              <w:t xml:space="preserve">15 ms</w:t>
             </w:r>
           </w:p>
         </w:tc>
@@ -6000,7 +6113,7 @@
                 <w:sz w:val="17"/>
                 <w:szCs w:val="17"/>
               </w:rPr>
-              <w:t xml:space="preserve">contenu gelé, empreinte 24604eb157d7fa54…, 10487 octets conservés, opération journalisée</w:t>
+              <w:t xml:space="preserve">contenu gelé, empreinte 24604eb157d7fa54…, 10485 octets conservés, opération journalisée</w:t>
             </w:r>
           </w:p>
         </w:tc>
@@ -6039,7 +6152,7 @@
                 <w:sz w:val="14"/>
                 <w:szCs w:val="14"/>
               </w:rPr>
-              <w:t xml:space="preserve">144 ms</w:t>
+              <w:t xml:space="preserve">119 ms</w:t>
             </w:r>
           </w:p>
         </w:tc>
@@ -6142,7 +6255,7 @@
                 <w:sz w:val="17"/>
                 <w:szCs w:val="17"/>
               </w:rPr>
-              <w:t xml:space="preserve">signature liée à l'instantané cmsipxsn…, empreinte attestée 3767 CD80 ACC9, manifestation « Testeur QA1 (QA1) · Approuvé · 07/08/2026 09:04:33 UTC · enregistrement 3767 CD80 ACC9 »</w:t>
+              <w:t xml:space="preserve">signature liée à l'instantané cmsissaz…, empreinte attestée 3767 CD80 ACC9, manifestation « Testeur QA1 (QA1) · Approuvé · 07/08/2026 10:24:16 UTC · enregistrement 3767 CD80 ACC9 »</w:t>
             </w:r>
           </w:p>
         </w:tc>
@@ -6181,7 +6294,7 @@
                 <w:sz w:val="14"/>
                 <w:szCs w:val="14"/>
               </w:rPr>
-              <w:t xml:space="preserve">53 ms</w:t>
+              <w:t xml:space="preserve">30 ms</w:t>
             </w:r>
           </w:p>
         </w:tc>
@@ -6284,7 +6397,7 @@
                 <w:sz w:val="17"/>
                 <w:szCs w:val="17"/>
               </w:rPr>
-              <w:t xml:space="preserve">10488 octets relus à l'identique ; inversion d'un octet en position 5244 détectée</w:t>
+              <w:t xml:space="preserve">10487 octets relus à l'identique ; inversion d'un octet en position 5243 détectée</w:t>
             </w:r>
           </w:p>
         </w:tc>
@@ -6323,7 +6436,7 @@
                 <w:sz w:val="14"/>
                 <w:szCs w:val="14"/>
               </w:rPr>
-              <w:t xml:space="preserve">63 ms</w:t>
+              <w:t xml:space="preserve">46 ms</w:t>
             </w:r>
           </w:p>
         </w:tc>
@@ -6465,7 +6578,7 @@
                 <w:sz w:val="14"/>
                 <w:szCs w:val="14"/>
               </w:rPr>
-              <w:t xml:space="preserve">63 ms</w:t>
+              <w:t xml:space="preserve">39 ms</w:t>
             </w:r>
           </w:p>
         </w:tc>
@@ -6607,7 +6720,7 @@
                 <w:sz w:val="14"/>
                 <w:szCs w:val="14"/>
               </w:rPr>
-              <w:t xml:space="preserve">62 ms</w:t>
+              <w:t xml:space="preserve">34 ms</w:t>
             </w:r>
           </w:p>
         </w:tc>
@@ -6749,7 +6862,7 @@
                 <w:sz w:val="14"/>
                 <w:szCs w:val="14"/>
               </w:rPr>
-              <w:t xml:space="preserve">85 ms</w:t>
+              <w:t xml:space="preserve">52 ms</w:t>
             </w:r>
           </w:p>
         </w:tc>
@@ -6891,7 +7004,7 @@
                 <w:sz w:val="14"/>
                 <w:szCs w:val="14"/>
               </w:rPr>
-              <w:t xml:space="preserve">86 ms</w:t>
+              <w:t xml:space="preserve">57 ms</w:t>
             </w:r>
           </w:p>
         </w:tc>
@@ -7033,7 +7146,7 @@
                 <w:sz w:val="14"/>
                 <w:szCs w:val="14"/>
               </w:rPr>
-              <w:t xml:space="preserve">80 ms</w:t>
+              <w:t xml:space="preserve">53 ms</w:t>
             </w:r>
           </w:p>
         </w:tc>
@@ -7136,7 +7249,7 @@
                 <w:sz w:val="17"/>
                 <w:szCs w:val="17"/>
               </w:rPr>
-              <w:t xml:space="preserve">154 fichiers source inspectés : aucune modification ni suppression d'entrée ; 1 fichiers en écriture seule</w:t>
+              <w:t xml:space="preserve">155 fichiers source inspectés : aucune modification ni suppression d'entrée ; 1 fichiers en écriture seule</w:t>
             </w:r>
           </w:p>
         </w:tc>
@@ -7175,7 +7288,7 @@
                 <w:sz w:val="14"/>
                 <w:szCs w:val="14"/>
               </w:rPr>
-              <w:t xml:space="preserve">33 ms</w:t>
+              <w:t xml:space="preserve">29 ms</w:t>
             </w:r>
           </w:p>
         </w:tc>
@@ -7317,7 +7430,7 @@
                 <w:sz w:val="14"/>
                 <w:szCs w:val="14"/>
               </w:rPr>
-              <w:t xml:space="preserve">31 ms</w:t>
+              <w:t xml:space="preserve">14 ms</w:t>
             </w:r>
           </w:p>
         </w:tc>
@@ -7743,7 +7856,7 @@
                 <w:sz w:val="14"/>
                 <w:szCs w:val="14"/>
               </w:rPr>
-              <w:t xml:space="preserve">335 ms</w:t>
+              <w:t xml:space="preserve">325 ms</w:t>
             </w:r>
           </w:p>
         </w:tc>
@@ -7846,7 +7959,7 @@
                 <w:sz w:val="17"/>
                 <w:szCs w:val="17"/>
               </w:rPr>
-              <w:t xml:space="preserve">13 enregistrement(s) archivé(s), 43 fichier(s) couverts par empreintes.sha256, 0 écart ; ancre b0bd8c6833b205ae… ; octets du gel restitués à l'identique ; altération d'un octet détectée et signalée ALTÉRÉ, fichier conservé dans l'archive</w:t>
+              <w:t xml:space="preserve">13 enregistrement(s) archivé(s), 43 fichier(s) couverts par empreintes.sha256, 0 écart ; ancre 794671292a5b7169… ; octets du gel restitués à l'identique ; altération d'un octet détectée et signalée ALTÉRÉ, fichier conservé dans l'archive</w:t>
             </w:r>
           </w:p>
         </w:tc>
@@ -7885,7 +7998,7 @@
                 <w:sz w:val="14"/>
                 <w:szCs w:val="14"/>
               </w:rPr>
-              <w:t xml:space="preserve">458 ms</w:t>
+              <w:t xml:space="preserve">438 ms</w:t>
             </w:r>
           </w:p>
         </w:tc>
@@ -8027,7 +8140,7 @@
                 <w:sz w:val="14"/>
                 <w:szCs w:val="14"/>
               </w:rPr>
-              <w:t xml:space="preserve">14 ms</w:t>
+              <w:t xml:space="preserve">10 ms</w:t>
             </w:r>
           </w:p>
         </w:tc>
@@ -8169,7 +8282,7 @@
                 <w:sz w:val="14"/>
                 <w:szCs w:val="14"/>
               </w:rPr>
-              <w:t xml:space="preserve">396 ms</w:t>
+              <w:t xml:space="preserve">370 ms</w:t>
             </w:r>
           </w:p>
         </w:tc>
@@ -8311,7 +8424,7 @@
                 <w:sz w:val="14"/>
                 <w:szCs w:val="14"/>
               </w:rPr>
-              <w:t xml:space="preserve">285 ms</w:t>
+              <w:t xml:space="preserve">262 ms</w:t>
             </w:r>
           </w:p>
         </w:tc>
@@ -8414,7 +8527,7 @@
                 <w:sz w:val="17"/>
                 <w:szCs w:val="17"/>
               </w:rPr>
-              <w:t xml:space="preserve">requête DER de 89 octets portant l'empreinte demandée ; jeton de 2418 octets lu exactement (date 2026-08-03T08:55:03.000Z, série 02, politique 1.3.6.1.4.1.99999.1.1) ; quatre refus obtenus : autre empreinte, autre nonce, réponse de rejet de l'autorité, jeton tronqué</w:t>
+              <w:t xml:space="preserve">requête DER de 90 octets portant l'empreinte demandée ; jeton de 2418 octets lu exactement (date 2026-08-03T08:55:03.000Z, série 02, politique 1.3.6.1.4.1.99999.1.1) ; quatre refus obtenus : autre empreinte, autre nonce, réponse de rejet de l'autorité, jeton tronqué</w:t>
             </w:r>
           </w:p>
         </w:tc>
@@ -8453,7 +8566,7 @@
                 <w:sz w:val="14"/>
                 <w:szCs w:val="14"/>
               </w:rPr>
-              <w:t xml:space="preserve">1 ms</w:t>
+              <w:t xml:space="preserve">2 ms</w:t>
             </w:r>
           </w:p>
         </w:tc>
@@ -8595,7 +8708,7 @@
                 <w:sz w:val="14"/>
                 <w:szCs w:val="14"/>
               </w:rPr>
-              <w:t xml:space="preserve">0 ms</w:t>
+              <w:t xml:space="preserve">1 ms</w:t>
             </w:r>
           </w:p>
         </w:tc>
@@ -8737,7 +8850,7 @@
                 <w:sz w:val="14"/>
                 <w:szCs w:val="14"/>
               </w:rPr>
-              <w:t xml:space="preserve">25 ms</w:t>
+              <w:t xml:space="preserve">15 ms</w:t>
             </w:r>
           </w:p>
         </w:tc>
@@ -8840,7 +8953,7 @@
                 <w:sz w:val="17"/>
                 <w:szCs w:val="17"/>
               </w:rPr>
-              <w:t xml:space="preserve">209 fichier(s) source relus, aucune écriture dans la piste hors du module ; 9 empreintes comparées entre l'implémentation TypeScript et le miroir de la console serveur, toutes identiques</w:t>
+              <w:t xml:space="preserve">211 fichier(s) source relus, aucune écriture dans la piste hors du module ; 9 empreintes comparées entre l'implémentation TypeScript et le miroir de la console serveur, toutes identiques</w:t>
             </w:r>
           </w:p>
         </w:tc>
@@ -8879,7 +8992,7 @@
                 <w:sz w:val="14"/>
                 <w:szCs w:val="14"/>
               </w:rPr>
-              <w:t xml:space="preserve">26 ms</w:t>
+              <w:t xml:space="preserve">29 ms</w:t>
             </w:r>
           </w:p>
         </w:tc>
@@ -9305,7 +9418,7 @@
                 <w:sz w:val="14"/>
                 <w:szCs w:val="14"/>
               </w:rPr>
-              <w:t xml:space="preserve">221 ms</w:t>
+              <w:t xml:space="preserve">249 ms</w:t>
             </w:r>
           </w:p>
         </w:tc>
@@ -9408,7 +9521,7 @@
                 <w:sz w:val="17"/>
                 <w:szCs w:val="17"/>
               </w:rPr>
-              <w:t xml:space="preserve">209 fichier(s) source relus : aucune écriture de mot de passe hors des chemins autorisés ; une seule écriture dans les actions serveur, le changement personnel, qui exige l'ancien mot de passe ; l'outil d'urgence de la console émet un jeton et ne sait plus dériver de mot de passe ; aucun champ de mot de passe hors des 7 écrans où l'on saisit le sien</w:t>
+              <w:t xml:space="preserve">211 fichier(s) source relus : aucune écriture de mot de passe hors des chemins autorisés ; une seule écriture dans les actions serveur, le changement personnel, qui exige l'ancien mot de passe ; l'outil d'urgence de la console émet un jeton et ne sait plus dériver de mot de passe ; aucun champ de mot de passe hors des 7 écrans où l'on saisit le sien</w:t>
             </w:r>
           </w:p>
         </w:tc>
@@ -9447,7 +9560,7 @@
                 <w:sz w:val="14"/>
                 <w:szCs w:val="14"/>
               </w:rPr>
-              <w:t xml:space="preserve">33 ms</w:t>
+              <w:t xml:space="preserve">48 ms</w:t>
             </w:r>
           </w:p>
         </w:tc>
@@ -9589,7 +9702,7 @@
                 <w:sz w:val="14"/>
                 <w:szCs w:val="14"/>
               </w:rPr>
-              <w:t xml:space="preserve">8972 ms</w:t>
+              <w:t xml:space="preserve">9136 ms</w:t>
             </w:r>
           </w:p>
         </w:tc>
@@ -9731,7 +9844,7 @@
                 <w:sz w:val="14"/>
                 <w:szCs w:val="14"/>
               </w:rPr>
-              <w:t xml:space="preserve">23 ms</w:t>
+              <w:t xml:space="preserve">25 ms</w:t>
             </w:r>
           </w:p>
         </w:tc>
@@ -9834,7 +9947,7 @@
                 <w:sz w:val="17"/>
                 <w:szCs w:val="17"/>
               </w:rPr>
-              <w:t xml:space="preserve">copie d'archivage de OQ-012-revision rév. 001 produite (69088 octets, 1 page·s) ; 29 contrôles structurels PDF/A-2b passés — police embarquée, profil ICC « acsp » de 3024 octets, métadonnées pdfaid partie 2 niveau B, décalages exacts ; texte intégralement relu par la table du fichier, 44 caractère·s accentué·s ou typographiques restitués ; production déterministe (deux exécutions octet pour octet identiques)</w:t>
+              <w:t xml:space="preserve">copie d'archivage de OQ-012-revision rév. 001 produite (69090 octets, 1 page·s) ; 29 contrôles structurels PDF/A-2b passés — police embarquée, profil ICC « acsp » de 3024 octets, métadonnées pdfaid partie 2 niveau B, décalages exacts ; texte intégralement relu par la table du fichier, 44 caractère·s accentué·s ou typographiques restitués ; production déterministe (deux exécutions octet pour octet identiques)</w:t>
             </w:r>
           </w:p>
         </w:tc>
@@ -9873,7 +9986,7 @@
                 <w:sz w:val="14"/>
                 <w:szCs w:val="14"/>
               </w:rPr>
-              <w:t xml:space="preserve">14 ms</w:t>
+              <w:t xml:space="preserve">16 ms</w:t>
             </w:r>
           </w:p>
         </w:tc>
@@ -10015,7 +10128,7 @@
                 <w:sz w:val="14"/>
                 <w:szCs w:val="14"/>
               </w:rPr>
-              <w:t xml:space="preserve">153 ms</w:t>
+              <w:t xml:space="preserve">90 ms</w:t>
             </w:r>
           </w:p>
         </w:tc>
@@ -10118,7 +10231,7 @@
                 <w:sz w:val="17"/>
                 <w:szCs w:val="17"/>
               </w:rPr>
-              <w:t xml:space="preserve">clôture refusée trois fois avant d'être permise — conclusion vide, 1 entrée(s) non statuée(s), verdict affirmatif sans motif ; manifestation « Testeur QR2 (QR2) · Revu · 07/08/2026 09:04:45 UTC · enregistrement DF2C 80CE D134 » portant le nom imprimé, la signification « Revu » et l'empreinte du contenu ; empreinte recalculée à l'identique hors du logiciel, et modifiée par le moindre changement de conclusion ou de verdict ; indépendance consignée sur le SIGNATAIRE (0 entrée·s écrite·s par lui, contre 5 par l'ouvreur) ; 10 règles de triage inscrites dans l'enregistrement ; re-clôture et re-statuage refusés ; aucune rupture ajoutée à la chaîne sur 82 entrées</w:t>
+              <w:t xml:space="preserve">clôture refusée trois fois avant d'être permise — conclusion vide, 1 entrée(s) non statuée(s), verdict affirmatif sans motif ; manifestation « Testeur QR2 (QR2) · Revu · 07/08/2026 10:24:27 UTC · enregistrement 99CD ECE8 3E48 » portant le nom imprimé, la signification « Revu » et l'empreinte du contenu ; empreinte recalculée à l'identique hors du logiciel, et modifiée par le moindre changement de conclusion ou de verdict ; indépendance consignée sur le SIGNATAIRE (0 entrée·s écrite·s par lui, contre 5 par l'ouvreur) ; 10 règles de triage inscrites dans l'enregistrement ; re-clôture et re-statuage refusés ; aucune rupture ajoutée à la chaîne sur 82 entrées</w:t>
             </w:r>
           </w:p>
         </w:tc>
@@ -10157,7 +10270,7 @@
                 <w:sz w:val="14"/>
                 <w:szCs w:val="14"/>
               </w:rPr>
-              <w:t xml:space="preserve">106 ms</w:t>
+              <w:t xml:space="preserve">93 ms</w:t>
             </w:r>
           </w:p>
         </w:tc>
@@ -10299,7 +10412,7 @@
                 <w:sz w:val="14"/>
                 <w:szCs w:val="14"/>
               </w:rPr>
-              <w:t xml:space="preserve">9 ms</w:t>
+              <w:t xml:space="preserve">8 ms</w:t>
             </w:r>
           </w:p>
         </w:tc>
@@ -10441,7 +10554,7 @@
                 <w:sz w:val="14"/>
                 <w:szCs w:val="14"/>
               </w:rPr>
-              <w:t xml:space="preserve">71 ms</w:t>
+              <w:t xml:space="preserve">16 ms</w:t>
             </w:r>
           </w:p>
         </w:tc>
@@ -10583,7 +10696,149 @@
                 <w:sz w:val="14"/>
                 <w:szCs w:val="14"/>
               </w:rPr>
-              <w:t xml:space="preserve">49 ms</w:t>
+              <w:t xml:space="preserve">55 ms</w:t>
+            </w:r>
+          </w:p>
+        </w:tc>
+      </w:tr>
+      <w:tr>
+        <w:tc>
+          <w:tcPr>
+            <w:tcW w:type="pct" w:w="13%"/>
+            <w:shd w:fill="F8FAFC"/>
+            <w:tcMar>
+              <w:top w:type="dxa" w:w="80"/>
+              <w:left w:type="dxa" w:w="110"/>
+              <w:bottom w:type="dxa" w:w="80"/>
+              <w:right w:type="dxa" w:w="110"/>
+            </w:tcMar>
+          </w:tcPr>
+          <w:p>
+            <w:pPr>
+              <w:spacing w:after="50"/>
+            </w:pPr>
+            <w:r>
+              <w:rPr>
+                <w:b/>
+                <w:bCs/>
+                <w:color w:val="4338CA"/>
+                <w:sz w:val="17"/>
+                <w:szCs w:val="17"/>
+              </w:rPr>
+              <w:t xml:space="preserve">OQ-37</w:t>
+            </w:r>
+          </w:p>
+          <w:p>
+            <w:pPr>
+              <w:spacing w:after="0"/>
+            </w:pPr>
+            <w:r>
+              <w:rPr>
+                <w:color w:val="475569"/>
+                <w:sz w:val="15"/>
+                <w:szCs w:val="15"/>
+              </w:rPr>
+              <w:t xml:space="preserve">URS-40</w:t>
+            </w:r>
+          </w:p>
+        </w:tc>
+        <w:tc>
+          <w:tcPr>
+            <w:tcW w:type="pct" w:w="30%"/>
+            <w:tcMar>
+              <w:top w:type="dxa" w:w="80"/>
+              <w:left w:type="dxa" w:w="110"/>
+              <w:bottom w:type="dxa" w:w="80"/>
+              <w:right w:type="dxa" w:w="110"/>
+            </w:tcMar>
+          </w:tcPr>
+          <w:p>
+            <w:pPr>
+              <w:spacing w:after="50"/>
+            </w:pPr>
+            <w:r>
+              <w:rPr>
+                <w:b/>
+                <w:bCs/>
+                <w:sz w:val="17"/>
+                <w:szCs w:val="17"/>
+              </w:rPr>
+              <w:t xml:space="preserve">Sauvegarde continue : journalisation WAL, volume en ajout seul, et cohérence base ↔ fichiers vérifiable</w:t>
+            </w:r>
+          </w:p>
+          <w:p>
+            <w:pPr>
+              <w:spacing w:after="0"/>
+            </w:pPr>
+            <w:r>
+              <w:rPr>
+                <w:color w:val="475569"/>
+                <w:sz w:val="15"/>
+                <w:szCs w:val="15"/>
+              </w:rPr>
+              <w:t xml:space="preserve">Vérifier que la base est en journalisation WAL — condition de toute réplication continue —, que le passage est idempotent, qu'aucun chemin du logiciel ne supprime ni n'écrase dans le volume des fichiers, et que le contrôle de restauration distingue une pièce absente d'une pièce altérée en nommant celle qui manque.</w:t>
+            </w:r>
+          </w:p>
+        </w:tc>
+        <w:tc>
+          <w:tcPr>
+            <w:tcW w:type="pct" w:w="45%"/>
+            <w:tcMar>
+              <w:top w:type="dxa" w:w="80"/>
+              <w:left w:type="dxa" w:w="110"/>
+              <w:bottom w:type="dxa" w:w="80"/>
+              <w:right w:type="dxa" w:w="110"/>
+            </w:tcMar>
+          </w:tcPr>
+          <w:p>
+            <w:pPr>
+              <w:spacing w:after="0"/>
+            </w:pPr>
+            <w:r>
+              <w:rPr>
+                <w:sz w:val="17"/>
+                <w:szCs w:val="17"/>
+              </w:rPr>
+              <w:t xml:space="preserve">base en journalisation WAL, passage idempotent ; 162 fichier(s) source relus, aucun chemin ne supprime ni n'écrase dans le volume des fichiers hors de la purge des imports — c'est cette propriété d'ajout seul qui rend sûre la règle « restaurer les fichiers à un instant égal ou postérieur à la base » ; sur 19 pièce(s) référencée(s), le retrait d'un enregistrement approuvé est signalé ABSENT et nommé (OQ-014-restauration), sa modification hors du logiciel est signalée ALTÉRÉE, les deux défauts ne sont jamais confondus, et le rapport redevient cohérent une fois la pièce remise en place</w:t>
+            </w:r>
+          </w:p>
+        </w:tc>
+        <w:tc>
+          <w:tcPr>
+            <w:tcW w:type="pct" w:w="12%"/>
+            <w:tcMar>
+              <w:top w:type="dxa" w:w="80"/>
+              <w:left w:type="dxa" w:w="110"/>
+              <w:bottom w:type="dxa" w:w="80"/>
+              <w:right w:type="dxa" w:w="110"/>
+            </w:tcMar>
+          </w:tcPr>
+          <w:p>
+            <w:pPr>
+              <w:spacing w:after="40"/>
+            </w:pPr>
+            <w:r>
+              <w:rPr>
+                <w:b/>
+                <w:bCs/>
+                <w:color w:val="047857"/>
+                <w:sz w:val="17"/>
+                <w:szCs w:val="17"/>
+              </w:rPr>
+              <w:t xml:space="preserve">Conforme</w:t>
+            </w:r>
+          </w:p>
+          <w:p>
+            <w:pPr>
+              <w:spacing w:after="0"/>
+            </w:pPr>
+            <w:r>
+              <w:rPr>
+                <w:color w:val="475569"/>
+                <w:sz w:val="14"/>
+                <w:szCs w:val="14"/>
+              </w:rPr>
+              <w:t xml:space="preserve">156 ms</w:t>
             </w:r>
           </w:p>
         </w:tc>
@@ -13710,6 +13965,83 @@
           </w:p>
         </w:tc>
       </w:tr>
+      <w:tr>
+        <w:tc>
+          <w:tcPr>
+            <w:tcW w:type="pct" w:w="12%"/>
+            <w:tcMar>
+              <w:top w:type="dxa" w:w="80"/>
+              <w:left w:type="dxa" w:w="110"/>
+              <w:bottom w:type="dxa" w:w="80"/>
+              <w:right w:type="dxa" w:w="110"/>
+            </w:tcMar>
+          </w:tcPr>
+          <w:p>
+            <w:pPr>
+              <w:spacing w:after="0"/>
+            </w:pPr>
+            <w:r>
+              <w:rPr>
+                <w:b/>
+                <w:bCs/>
+                <w:color w:val="4338CA"/>
+                <w:sz w:val="17"/>
+                <w:szCs w:val="17"/>
+              </w:rPr>
+              <w:t xml:space="preserve">URS-40</w:t>
+            </w:r>
+          </w:p>
+        </w:tc>
+        <w:tc>
+          <w:tcPr>
+            <w:tcW w:type="pct" w:w="22%"/>
+            <w:tcMar>
+              <w:top w:type="dxa" w:w="80"/>
+              <w:left w:type="dxa" w:w="110"/>
+              <w:bottom w:type="dxa" w:w="80"/>
+              <w:right w:type="dxa" w:w="110"/>
+            </w:tcMar>
+          </w:tcPr>
+          <w:p>
+            <w:pPr>
+              <w:spacing w:after="0"/>
+            </w:pPr>
+            <w:r>
+              <w:rPr>
+                <w:b/>
+                <w:bCs/>
+                <w:color w:val="047857"/>
+                <w:sz w:val="17"/>
+                <w:szCs w:val="17"/>
+              </w:rPr>
+              <w:t xml:space="preserve">OQ-37</w:t>
+            </w:r>
+          </w:p>
+        </w:tc>
+        <w:tc>
+          <w:tcPr>
+            <w:tcW w:type="pct" w:w="66%"/>
+            <w:tcMar>
+              <w:top w:type="dxa" w:w="80"/>
+              <w:left w:type="dxa" w:w="110"/>
+              <w:bottom w:type="dxa" w:w="80"/>
+              <w:right w:type="dxa" w:w="110"/>
+            </w:tcMar>
+          </w:tcPr>
+          <w:p>
+            <w:pPr>
+              <w:spacing w:after="0"/>
+            </w:pPr>
+            <w:r>
+              <w:rPr>
+                <w:sz w:val="17"/>
+                <w:szCs w:val="17"/>
+              </w:rPr>
+              <w:t xml:space="preserve">Cas de test automatisé exécuté par l'éditeur à chaque version, résultat en section 5.1.</w:t>
+            </w:r>
+          </w:p>
+        </w:tc>
+      </w:tr>
     </w:tbl>
     <w:p>
       <w:pPr>
@@ -13729,7 +14061,7 @@
           <w:sz w:val="20"/>
           <w:szCs w:val="20"/>
         </w:rPr>
-        <w:t xml:space="preserve">Sur les 39 exigences, 35 sont vérifiées automatiquement par l'éditeur et 4 doivent l'être chez vous. Ce n'est pas un partage arbitraire : ces 4 exigences ne sont pas observables sans navigateur, sans requête HTTP ou sans votre infrastructure. Les compter comme couvertes serait une affirmation invérifiable.</w:t>
+        <w:t xml:space="preserve">Sur les 40 exigences, 36 sont vérifiées automatiquement par l'éditeur et 4 doivent l'être chez vous. Ce n'est pas un partage arbitraire : ces 4 exigences ne sont pas observables sans navigateur, sans requête HTTP ou sans votre infrastructure. Les compter comme couvertes serait une affirmation invérifiable.</w:t>
       </w:r>
     </w:p>
     <w:p>
@@ -14081,7 +14413,7 @@
         <w:sz w:val="15"/>
         <w:szCs w:val="15"/>
       </w:rPr>
-      <w:t xml:space="preserve">   ·   Version 1.2.1 · rapport OQ exécuté le 7 août 2026 à 09:04 UTC</w:t>
+      <w:t xml:space="preserve">   ·   Version 1.2.1 · rapport OQ exécuté le 7 août 2026 à 10:24 UTC</w:t>
     </w:r>
   </w:p>
 </w:ftr>

</xml_diff>

<commit_message>
Site : 44 cas, 47 exigences, et la limite PDF/A réécrite
Le site affichait 43 cas sur 46 exigences pendant que les documents téléchargeables
en annonçaient 44 sur 47. Un prospect qui compare la page et le PDF y voit une
contradiction, et il a raison de s'y arrêter.

Les chiffres sont lus depuis le rapport de qualification à chaque construction,
jamais saisis : c'est le garde de fraîcheur qui a vu l'écart, pas moi.

Nouveauté portée par cette passe : la conformité PDF/A des copies d'archivage est
désormais prononcée par veraPDF, l'implémentation de référence — dont le premier
passage a trouvé quatre enregistrements non conformes sur quinze.

Co-Authored-By: Claude Opus 5 <noreply@anthropic.com>
</commit_message>
<xml_diff>
--- a/docs/Dossier_de_validation_Filum.docx
+++ b/docs/Dossier_de_validation_Filum.docx
@@ -430,7 +430,7 @@
           <w:sz w:val="20"/>
           <w:szCs w:val="20"/>
         </w:rPr>
-        <w:t xml:space="preserve">Les 40 exigences ci-dessous énoncent ce que le logiciel doit faire. Le niveau de risque est celui de la DÉFAILLANCE de l'exigence, pas de son importance commerciale : il détermine la profondeur de vérification.</w:t>
+        <w:t xml:space="preserve">Les 47 exigences ci-dessous énoncent ce que le logiciel doit faire. Le niveau de risque est celui de la DÉFAILLANCE de l'exigence, pas de son importance commerciale : il détermine la profondeur de vérification.</w:t>
       </w:r>
     </w:p>
     <w:tbl>
@@ -5077,6 +5077,797 @@
           </w:p>
         </w:tc>
       </w:tr>
+      <w:tr>
+        <w:tc>
+          <w:tcPr>
+            <w:tcW w:type="pct" w:w="11%"/>
+            <w:shd w:fill="F8FAFC"/>
+            <w:tcMar>
+              <w:top w:type="dxa" w:w="80"/>
+              <w:left w:type="dxa" w:w="110"/>
+              <w:bottom w:type="dxa" w:w="80"/>
+              <w:right w:type="dxa" w:w="110"/>
+            </w:tcMar>
+          </w:tcPr>
+          <w:p>
+            <w:pPr>
+              <w:spacing w:after="60"/>
+            </w:pPr>
+            <w:r>
+              <w:rPr>
+                <w:b/>
+                <w:bCs/>
+                <w:color w:val="4338CA"/>
+                <w:sz w:val="17"/>
+                <w:szCs w:val="17"/>
+              </w:rPr>
+              <w:t xml:space="preserve">URS-41</w:t>
+            </w:r>
+          </w:p>
+          <w:p>
+            <w:pPr>
+              <w:spacing w:after="0"/>
+            </w:pPr>
+            <w:r>
+              <w:rPr>
+                <w:b/>
+                <w:bCs/>
+                <w:color w:val="B45309"/>
+                <w:sz w:val="15"/>
+                <w:szCs w:val="15"/>
+              </w:rPr>
+              <w:t xml:space="preserve">Moyen</w:t>
+            </w:r>
+          </w:p>
+        </w:tc>
+        <w:tc>
+          <w:tcPr>
+            <w:tcW w:type="pct" w:w="41%"/>
+            <w:tcMar>
+              <w:top w:type="dxa" w:w="80"/>
+              <w:left w:type="dxa" w:w="110"/>
+              <w:bottom w:type="dxa" w:w="80"/>
+              <w:right w:type="dxa" w:w="110"/>
+            </w:tcMar>
+          </w:tcPr>
+          <w:p>
+            <w:pPr>
+              <w:spacing w:after="0"/>
+            </w:pPr>
+            <w:r>
+              <w:rPr>
+                <w:sz w:val="17"/>
+                <w:szCs w:val="17"/>
+              </w:rPr>
+              <w:t xml:space="preserve">Une installation déclarée « démonstration » annonce sur CHAQUE écran, y compris avant toute connexion, qu'elle porte des données fictives, qu'elle est effacée périodiquement, et qu'elle n'est pas une installation qualifiée. L'avertissement ne se ferme pas. Le mode est éteint par défaut et n'accepte qu'une valeur explicite. Il ne modifie RIEN de ce que le logiciel enregistre : aucun module produisant des données ou des documents n'en dépend.</w:t>
+            </w:r>
+          </w:p>
+        </w:tc>
+        <w:tc>
+          <w:tcPr>
+            <w:tcW w:type="pct" w:w="28%"/>
+            <w:tcMar>
+              <w:top w:type="dxa" w:w="80"/>
+              <w:left w:type="dxa" w:w="110"/>
+              <w:bottom w:type="dxa" w:w="80"/>
+              <w:right w:type="dxa" w:w="110"/>
+            </w:tcMar>
+          </w:tcPr>
+          <w:p>
+            <w:pPr>
+              <w:spacing w:after="0"/>
+            </w:pPr>
+            <w:r>
+              <w:rPr>
+                <w:sz w:val="17"/>
+                <w:szCs w:val="17"/>
+              </w:rPr>
+              <w:t xml:space="preserve">Une instance publique est identique à une vraie — c'est l'intérêt même d'une démonstration, et c'est ce qui la rend trompeuse. Un visiteur qui y dépose un dossier de conception réel le rend public ET le perd à la remise à zéro suivante ; un visiteur qui prend l'instance pour une installation qualifiée s'appuie sur des signatures qui ne valent rien. L'avertissement doit donc apparaître AVANT la connexion, puisque c'est là que la décision de déposer un fichier se prend. En sens inverse, un mode qui s'allumerait par une variable mal recopiée ferait porter « données fictives » à toutes les captures d'écran du dossier de validation d'un client.</w:t>
+            </w:r>
+          </w:p>
+        </w:tc>
+        <w:tc>
+          <w:tcPr>
+            <w:tcW w:type="pct" w:w="20%"/>
+            <w:tcMar>
+              <w:top w:type="dxa" w:w="80"/>
+              <w:left w:type="dxa" w:w="110"/>
+              <w:bottom w:type="dxa" w:w="80"/>
+              <w:right w:type="dxa" w:w="110"/>
+            </w:tcMar>
+          </w:tcPr>
+          <w:p>
+            <w:pPr>
+              <w:spacing w:after="0"/>
+            </w:pPr>
+            <w:r>
+              <w:rPr>
+                <w:sz w:val="17"/>
+                <w:szCs w:val="17"/>
+              </w:rPr>
+              <w:t xml:space="preserve">21 CFR 11.10(a) · ALCOA+ — attribuable et exact · ISO 13485 §4.2.4</w:t>
+            </w:r>
+          </w:p>
+        </w:tc>
+      </w:tr>
+      <w:tr>
+        <w:tc>
+          <w:tcPr>
+            <w:tcW w:type="pct" w:w="11%"/>
+            <w:shd w:fill="F8FAFC"/>
+            <w:tcMar>
+              <w:top w:type="dxa" w:w="80"/>
+              <w:left w:type="dxa" w:w="110"/>
+              <w:bottom w:type="dxa" w:w="80"/>
+              <w:right w:type="dxa" w:w="110"/>
+            </w:tcMar>
+          </w:tcPr>
+          <w:p>
+            <w:pPr>
+              <w:spacing w:after="60"/>
+            </w:pPr>
+            <w:r>
+              <w:rPr>
+                <w:b/>
+                <w:bCs/>
+                <w:color w:val="4338CA"/>
+                <w:sz w:val="17"/>
+                <w:szCs w:val="17"/>
+              </w:rPr>
+              <w:t xml:space="preserve">URS-42</w:t>
+            </w:r>
+          </w:p>
+          <w:p>
+            <w:pPr>
+              <w:spacing w:after="0"/>
+            </w:pPr>
+            <w:r>
+              <w:rPr>
+                <w:b/>
+                <w:bCs/>
+                <w:color w:val="B45309"/>
+                <w:sz w:val="15"/>
+                <w:szCs w:val="15"/>
+              </w:rPr>
+              <w:t xml:space="preserve">Moyen</w:t>
+            </w:r>
+          </w:p>
+        </w:tc>
+        <w:tc>
+          <w:tcPr>
+            <w:tcW w:type="pct" w:w="41%"/>
+            <w:tcMar>
+              <w:top w:type="dxa" w:w="80"/>
+              <w:left w:type="dxa" w:w="110"/>
+              <w:bottom w:type="dxa" w:w="80"/>
+              <w:right w:type="dxa" w:w="110"/>
+            </w:tcMar>
+          </w:tcPr>
+          <w:p>
+            <w:pPr>
+              <w:spacing w:after="0"/>
+            </w:pPr>
+            <w:r>
+              <w:rPr>
+                <w:sz w:val="17"/>
+                <w:szCs w:val="17"/>
+              </w:rPr>
+              <w:t xml:space="preserve">La vue par programme porte une ligne pour ce qui n'est rattaché à AUCUN programme, et rapproche chaque indicateur d'un total demandé séparément à la base — jamais obtenu en additionnant ses propres lignes. Tout écart est affiché au lieu d'être tu. Les documents dont le programme contredit celui de leur activité sont nommés. La règle « exigence couverte » y est celle du reste du produit.</w:t>
+            </w:r>
+          </w:p>
+        </w:tc>
+        <w:tc>
+          <w:tcPr>
+            <w:tcW w:type="pct" w:w="28%"/>
+            <w:tcMar>
+              <w:top w:type="dxa" w:w="80"/>
+              <w:left w:type="dxa" w:w="110"/>
+              <w:bottom w:type="dxa" w:w="80"/>
+              <w:right w:type="dxa" w:w="110"/>
+            </w:tcMar>
+          </w:tcPr>
+          <w:p>
+            <w:pPr>
+              <w:spacing w:after="0"/>
+            </w:pPr>
+            <w:r>
+              <w:rPr>
+                <w:sz w:val="17"/>
+                <w:szCs w:val="17"/>
+              </w:rPr>
+              <w:t xml:space="preserve">Le rattachement à un programme est facultatif presque partout dans le schéma. Un tableau qui ne listerait que les programmes montrerait donc une organisation en ordre pendant qu'une partie du dossier n'y figure nulle part — chaque ligne étant juste prise séparément, personne ne le verrait. C'est la faute déjà commise ici avec un taux de couverture à 100 % affiché au-dessus de trente-sept exigences que rien ne couvrait : le taux était juste, son dénominateur ne l'était pas. Un tableau qui se contrôlerait en additionnant ses propres lignes ne pourrait jamais se contredire, donc ne prouverait rien. Et une seconde définition de « couverte » ferait dire à l'écran autre chose qu'au dossier technique exporté, sans qu'on puisse savoir lequel ment.</w:t>
+            </w:r>
+          </w:p>
+        </w:tc>
+        <w:tc>
+          <w:tcPr>
+            <w:tcW w:type="pct" w:w="20%"/>
+            <w:tcMar>
+              <w:top w:type="dxa" w:w="80"/>
+              <w:left w:type="dxa" w:w="110"/>
+              <w:bottom w:type="dxa" w:w="80"/>
+              <w:right w:type="dxa" w:w="110"/>
+            </w:tcMar>
+          </w:tcPr>
+          <w:p>
+            <w:pPr>
+              <w:spacing w:after="0"/>
+            </w:pPr>
+            <w:r>
+              <w:rPr>
+                <w:sz w:val="17"/>
+                <w:szCs w:val="17"/>
+              </w:rPr>
+              <w:t xml:space="preserve">ISO 13485 §4.2.3 · 21 CFR 820.30(j) · ALCOA+ — complet</w:t>
+            </w:r>
+          </w:p>
+        </w:tc>
+      </w:tr>
+      <w:tr>
+        <w:tc>
+          <w:tcPr>
+            <w:tcW w:type="pct" w:w="11%"/>
+            <w:shd w:fill="F8FAFC"/>
+            <w:tcMar>
+              <w:top w:type="dxa" w:w="80"/>
+              <w:left w:type="dxa" w:w="110"/>
+              <w:bottom w:type="dxa" w:w="80"/>
+              <w:right w:type="dxa" w:w="110"/>
+            </w:tcMar>
+          </w:tcPr>
+          <w:p>
+            <w:pPr>
+              <w:spacing w:after="60"/>
+            </w:pPr>
+            <w:r>
+              <w:rPr>
+                <w:b/>
+                <w:bCs/>
+                <w:color w:val="4338CA"/>
+                <w:sz w:val="17"/>
+                <w:szCs w:val="17"/>
+              </w:rPr>
+              <w:t xml:space="preserve">URS-43</w:t>
+            </w:r>
+          </w:p>
+          <w:p>
+            <w:pPr>
+              <w:spacing w:after="0"/>
+            </w:pPr>
+            <w:r>
+              <w:rPr>
+                <w:b/>
+                <w:bCs/>
+                <w:color w:val="DC2626"/>
+                <w:sz w:val="15"/>
+                <w:szCs w:val="15"/>
+              </w:rPr>
+              <w:t xml:space="preserve">Haut</w:t>
+            </w:r>
+          </w:p>
+        </w:tc>
+        <w:tc>
+          <w:tcPr>
+            <w:tcW w:type="pct" w:w="41%"/>
+            <w:tcMar>
+              <w:top w:type="dxa" w:w="80"/>
+              <w:left w:type="dxa" w:w="110"/>
+              <w:bottom w:type="dxa" w:w="80"/>
+              <w:right w:type="dxa" w:w="110"/>
+            </w:tcMar>
+          </w:tcPr>
+          <w:p>
+            <w:pPr>
+              <w:spacing w:after="0"/>
+            </w:pPr>
+            <w:r>
+              <w:rPr>
+                <w:sz w:val="17"/>
+                <w:szCs w:val="17"/>
+              </w:rPr>
+              <w:t xml:space="preserve">La reprise d'un classeur ou d'un document déplie les cellules fusionnées : la valeur d'une fusion verticale est reprise sur les lignes qu'elle couvre, et une fusion horizontale ne décale aucune colonne sans être recopiée dans les champs voisins. Les feuilles sont nommées quel que soit le producteur du fichier. Les dates sont rendues lisibles. Une formule sans valeur calculée est comptée et signalée au lieu de rendre une cellule vide. Tout ce que l'extraction a fait ou n'a pas pu faire est affiché AVANT le choix du tableau.</w:t>
+            </w:r>
+          </w:p>
+        </w:tc>
+        <w:tc>
+          <w:tcPr>
+            <w:tcW w:type="pct" w:w="28%"/>
+            <w:tcMar>
+              <w:top w:type="dxa" w:w="80"/>
+              <w:left w:type="dxa" w:w="110"/>
+              <w:bottom w:type="dxa" w:w="80"/>
+              <w:right w:type="dxa" w:w="110"/>
+            </w:tcMar>
+          </w:tcPr>
+          <w:p>
+            <w:pPr>
+              <w:spacing w:after="0"/>
+            </w:pPr>
+            <w:r>
+              <w:rPr>
+                <w:sz w:val="17"/>
+                <w:szCs w:val="17"/>
+              </w:rPr>
+              <w:t xml:space="preserve">Une matrice de traçabilité range presque toujours une exigence en face de plusieurs spécifications en fusionnant sa cellule. La valeur n'existe qu'UNE FOIS dans le fichier : sans dépliage, les lignes suivantes arrivent sans code d'exigence, et l'import les rejette — ou les crée rattachées à rien. Une fusion horizontale n'écrit qu'une cellule pour plusieurs colonnes : sans complément, toute la fin de la ligne se décale et le statut atterrit dans la colonne du responsable. Ces deux défauts sont SILENCIEUX : le fichier a l'air repris, le compte de lignes est juste, et l'erreur ne se découvre qu'à la revue du dossier. Une formule dont la valeur n'a pas été calculée produit une cellule vide qu'aucun signe ne distingue d'une cellule réellement vide.</w:t>
+            </w:r>
+          </w:p>
+        </w:tc>
+        <w:tc>
+          <w:tcPr>
+            <w:tcW w:type="pct" w:w="20%"/>
+            <w:tcMar>
+              <w:top w:type="dxa" w:w="80"/>
+              <w:left w:type="dxa" w:w="110"/>
+              <w:bottom w:type="dxa" w:w="80"/>
+              <w:right w:type="dxa" w:w="110"/>
+            </w:tcMar>
+          </w:tcPr>
+          <w:p>
+            <w:pPr>
+              <w:spacing w:after="0"/>
+            </w:pPr>
+            <w:r>
+              <w:rPr>
+                <w:sz w:val="17"/>
+                <w:szCs w:val="17"/>
+              </w:rPr>
+              <w:t xml:space="preserve">21 CFR 11.10(a) · ALCOA+ — exact et complet · ISO 13485 §7.3.3</w:t>
+            </w:r>
+          </w:p>
+        </w:tc>
+      </w:tr>
+      <w:tr>
+        <w:tc>
+          <w:tcPr>
+            <w:tcW w:type="pct" w:w="11%"/>
+            <w:shd w:fill="F8FAFC"/>
+            <w:tcMar>
+              <w:top w:type="dxa" w:w="80"/>
+              <w:left w:type="dxa" w:w="110"/>
+              <w:bottom w:type="dxa" w:w="80"/>
+              <w:right w:type="dxa" w:w="110"/>
+            </w:tcMar>
+          </w:tcPr>
+          <w:p>
+            <w:pPr>
+              <w:spacing w:after="60"/>
+            </w:pPr>
+            <w:r>
+              <w:rPr>
+                <w:b/>
+                <w:bCs/>
+                <w:color w:val="4338CA"/>
+                <w:sz w:val="17"/>
+                <w:szCs w:val="17"/>
+              </w:rPr>
+              <w:t xml:space="preserve">URS-44</w:t>
+            </w:r>
+          </w:p>
+          <w:p>
+            <w:pPr>
+              <w:spacing w:after="0"/>
+            </w:pPr>
+            <w:r>
+              <w:rPr>
+                <w:b/>
+                <w:bCs/>
+                <w:color w:val="DC2626"/>
+                <w:sz w:val="15"/>
+                <w:szCs w:val="15"/>
+              </w:rPr>
+              <w:t xml:space="preserve">Haut</w:t>
+            </w:r>
+          </w:p>
+        </w:tc>
+        <w:tc>
+          <w:tcPr>
+            <w:tcW w:type="pct" w:w="41%"/>
+            <w:tcMar>
+              <w:top w:type="dxa" w:w="80"/>
+              <w:left w:type="dxa" w:w="110"/>
+              <w:bottom w:type="dxa" w:w="80"/>
+              <w:right w:type="dxa" w:w="110"/>
+            </w:tcMar>
+          </w:tcPr>
+          <w:p>
+            <w:pPr>
+              <w:spacing w:after="0"/>
+            </w:pPr>
+            <w:r>
+              <w:rPr>
+                <w:sz w:val="17"/>
+                <w:szCs w:val="17"/>
+              </w:rPr>
+              <w:t xml:space="preserve">L'authentification déléguée à un annuaire ouvre une SESSION et rien d'autre : le second composant de signature reste un secret local, redemandé à chaque apposition, et aucun module du chemin de signature ne dépend du SSO. Un jeton d'identité n'est accepté qu'après vérification de sa signature RS256, de son émetteur, de son destinataire, de sa péremption et de son nonce. Aucune personne n'est créée depuis l'annuaire. Quand l'installation n'ouvre les sessions que par l'annuaire, le refus de la connexion locale est appliqué côté serveur.</w:t>
+            </w:r>
+          </w:p>
+        </w:tc>
+        <w:tc>
+          <w:tcPr>
+            <w:tcW w:type="pct" w:w="28%"/>
+            <w:tcMar>
+              <w:top w:type="dxa" w:w="80"/>
+              <w:left w:type="dxa" w:w="110"/>
+              <w:bottom w:type="dxa" w:w="80"/>
+              <w:right w:type="dxa" w:w="110"/>
+            </w:tcMar>
+          </w:tcPr>
+          <w:p>
+            <w:pPr>
+              <w:spacing w:after="0"/>
+            </w:pPr>
+            <w:r>
+              <w:rPr>
+                <w:sz w:val="17"/>
+                <w:szCs w:val="17"/>
+              </w:rPr>
+              <w:t xml:space="preserve">21 CFR 11.200(a)(1) exige deux composants d'identification distincts à la signature. Déléguer la connexion retire le second : l'installation ne voit plus aucun secret de l'utilisateur. Renvoyer vers l'annuaire à chaque signature ne le rétablit pas — le fournisseur peut réémettre un jeton sans avoir challengé qui que ce soit, sur la foi de sa propre session, et le logiciel n'a aucun moyen de distinguer les deux cas : on revendiquerait un composant invérifiable. Côté jeton, « alg: none » et la confusion RS256/HS256 ouvrent une session sous l'identité de n'importe qui ; un nonce non vérifié permet de rejouer un jeton obtenu ailleurs. Et créer une personne parce qu'un annuaire l'a nommée transférerait à cet annuaire la vérification d'identité du §11.100(b) et la formation du §11.10(i), rendant attribuable à quelqu'un une signature que personne n'a habilitée.</w:t>
+            </w:r>
+          </w:p>
+        </w:tc>
+        <w:tc>
+          <w:tcPr>
+            <w:tcW w:type="pct" w:w="20%"/>
+            <w:tcMar>
+              <w:top w:type="dxa" w:w="80"/>
+              <w:left w:type="dxa" w:w="110"/>
+              <w:bottom w:type="dxa" w:w="80"/>
+              <w:right w:type="dxa" w:w="110"/>
+            </w:tcMar>
+          </w:tcPr>
+          <w:p>
+            <w:pPr>
+              <w:spacing w:after="0"/>
+            </w:pPr>
+            <w:r>
+              <w:rPr>
+                <w:sz w:val="17"/>
+                <w:szCs w:val="17"/>
+              </w:rPr>
+              <w:t xml:space="preserve">21 CFR 11.200(a)(1) · 21 CFR 11.100(b) · 21 CFR 11.10(d) · 21 CFR 11.300(d)</w:t>
+            </w:r>
+          </w:p>
+        </w:tc>
+      </w:tr>
+      <w:tr>
+        <w:tc>
+          <w:tcPr>
+            <w:tcW w:type="pct" w:w="11%"/>
+            <w:shd w:fill="F8FAFC"/>
+            <w:tcMar>
+              <w:top w:type="dxa" w:w="80"/>
+              <w:left w:type="dxa" w:w="110"/>
+              <w:bottom w:type="dxa" w:w="80"/>
+              <w:right w:type="dxa" w:w="110"/>
+            </w:tcMar>
+          </w:tcPr>
+          <w:p>
+            <w:pPr>
+              <w:spacing w:after="60"/>
+            </w:pPr>
+            <w:r>
+              <w:rPr>
+                <w:b/>
+                <w:bCs/>
+                <w:color w:val="4338CA"/>
+                <w:sz w:val="17"/>
+                <w:szCs w:val="17"/>
+              </w:rPr>
+              <w:t xml:space="preserve">URS-45</w:t>
+            </w:r>
+          </w:p>
+          <w:p>
+            <w:pPr>
+              <w:spacing w:after="0"/>
+            </w:pPr>
+            <w:r>
+              <w:rPr>
+                <w:b/>
+                <w:bCs/>
+                <w:color w:val="B45309"/>
+                <w:sz w:val="15"/>
+                <w:szCs w:val="15"/>
+              </w:rPr>
+              <w:t xml:space="preserve">Moyen</w:t>
+            </w:r>
+          </w:p>
+        </w:tc>
+        <w:tc>
+          <w:tcPr>
+            <w:tcW w:type="pct" w:w="41%"/>
+            <w:tcMar>
+              <w:top w:type="dxa" w:w="80"/>
+              <w:left w:type="dxa" w:w="110"/>
+              <w:bottom w:type="dxa" w:w="80"/>
+              <w:right w:type="dxa" w:w="110"/>
+            </w:tcMar>
+          </w:tcPr>
+          <w:p>
+            <w:pPr>
+              <w:spacing w:after="0"/>
+            </w:pPr>
+            <w:r>
+              <w:rPr>
+                <w:sz w:val="17"/>
+                <w:szCs w:val="17"/>
+              </w:rPr>
+              <w:t xml:space="preserve">Les points du logiciel dont le comportement dépend du MOTEUR de base de données — et non de la base — sont inventoriés, et l'inventaire est relu sur la source à chaque version : un point apparu hors de l'inventaire fait échouer le contrôle. Le logiciel est qualifié sur le moteur que le dossier de validation nomme, et ne revendique aucun autre.</w:t>
+            </w:r>
+          </w:p>
+        </w:tc>
+        <w:tc>
+          <w:tcPr>
+            <w:tcW w:type="pct" w:w="28%"/>
+            <w:tcMar>
+              <w:top w:type="dxa" w:w="80"/>
+              <w:left w:type="dxa" w:w="110"/>
+              <w:bottom w:type="dxa" w:w="80"/>
+              <w:right w:type="dxa" w:w="110"/>
+            </w:tcMar>
+          </w:tcPr>
+          <w:p>
+            <w:pPr>
+              <w:spacing w:after="0"/>
+            </w:pPr>
+            <w:r>
+              <w:rPr>
+                <w:sz w:val="17"/>
+                <w:szCs w:val="17"/>
+              </w:rPr>
+              <w:t xml:space="preserve">Un moteur fournit gratuitement des propriétés que le code ne demande jamais, et qui deviennent invisibles précisément parce qu'elles fonctionnent. Le chaînage de la piste d'audit lit la tête puis écrit : la continuité des maillons repose sur le fait que le moteur n'admet qu'un écrivain à la fois, ce qui n'est écrit nulle part dans le code. Les recherches par « contains » ignorent la casse pour la même raison — sous un autre moteur elles cesseraient de trouver, sans erreur, ce qui est pire qu'une panne. Ces dépendances se découvriraient chez un client, en production, sur les fonctions qui font foi. Un inventaire rédigé dans un document se périme au premier ajout ; relu sur la source, il ne le peut pas.</w:t>
+            </w:r>
+          </w:p>
+        </w:tc>
+        <w:tc>
+          <w:tcPr>
+            <w:tcW w:type="pct" w:w="20%"/>
+            <w:tcMar>
+              <w:top w:type="dxa" w:w="80"/>
+              <w:left w:type="dxa" w:w="110"/>
+              <w:bottom w:type="dxa" w:w="80"/>
+              <w:right w:type="dxa" w:w="110"/>
+            </w:tcMar>
+          </w:tcPr>
+          <w:p>
+            <w:pPr>
+              <w:spacing w:after="0"/>
+            </w:pPr>
+            <w:r>
+              <w:rPr>
+                <w:sz w:val="17"/>
+                <w:szCs w:val="17"/>
+              </w:rPr>
+              <w:t xml:space="preserve">21 CFR 11.10(a) · GAMP 5 — infrastructure qualifiée · ISO 13485 §4.1.6</w:t>
+            </w:r>
+          </w:p>
+        </w:tc>
+      </w:tr>
+      <w:tr>
+        <w:tc>
+          <w:tcPr>
+            <w:tcW w:type="pct" w:w="11%"/>
+            <w:shd w:fill="F8FAFC"/>
+            <w:tcMar>
+              <w:top w:type="dxa" w:w="80"/>
+              <w:left w:type="dxa" w:w="110"/>
+              <w:bottom w:type="dxa" w:w="80"/>
+              <w:right w:type="dxa" w:w="110"/>
+            </w:tcMar>
+          </w:tcPr>
+          <w:p>
+            <w:pPr>
+              <w:spacing w:after="60"/>
+            </w:pPr>
+            <w:r>
+              <w:rPr>
+                <w:b/>
+                <w:bCs/>
+                <w:color w:val="4338CA"/>
+                <w:sz w:val="17"/>
+                <w:szCs w:val="17"/>
+              </w:rPr>
+              <w:t xml:space="preserve">URS-46</w:t>
+            </w:r>
+          </w:p>
+          <w:p>
+            <w:pPr>
+              <w:spacing w:after="0"/>
+            </w:pPr>
+            <w:r>
+              <w:rPr>
+                <w:b/>
+                <w:bCs/>
+                <w:color w:val="DC2626"/>
+                <w:sz w:val="15"/>
+                <w:szCs w:val="15"/>
+              </w:rPr>
+              <w:t xml:space="preserve">Haut</w:t>
+            </w:r>
+          </w:p>
+        </w:tc>
+        <w:tc>
+          <w:tcPr>
+            <w:tcW w:type="pct" w:w="41%"/>
+            <w:tcMar>
+              <w:top w:type="dxa" w:w="80"/>
+              <w:left w:type="dxa" w:w="110"/>
+              <w:bottom w:type="dxa" w:w="80"/>
+              <w:right w:type="dxa" w:w="110"/>
+            </w:tcMar>
+          </w:tcPr>
+          <w:p>
+            <w:pPr>
+              <w:spacing w:after="0"/>
+            </w:pPr>
+            <w:r>
+              <w:rPr>
+                <w:sz w:val="17"/>
+                <w:szCs w:val="17"/>
+              </w:rPr>
+              <w:t xml:space="preserve">L'accès applicatif au dossier est en LECTURE SEULE : aucune route de l'API n'écrit dans le graphe de conception, et la propriété est établie en relisant la source. Chaque route passe par une garde unique qui exige un jeton, journalise l'accès au nom de ce jeton, et refuse sans distinguer un jeton absent d'un jeton révoqué. Le jeton n'est conservé que par son empreinte. Chaque réponse porte l'empreinte de ses données et l'ancrage de la chaîne d'audit à l'instant de l'extraction, selon une règle de calcul écrite dans la réponse elle-même.</w:t>
+            </w:r>
+          </w:p>
+        </w:tc>
+        <w:tc>
+          <w:tcPr>
+            <w:tcW w:type="pct" w:w="28%"/>
+            <w:tcMar>
+              <w:top w:type="dxa" w:w="80"/>
+              <w:left w:type="dxa" w:w="110"/>
+              <w:bottom w:type="dxa" w:w="80"/>
+              <w:right w:type="dxa" w:w="110"/>
+            </w:tcMar>
+          </w:tcPr>
+          <w:p>
+            <w:pPr>
+              <w:spacing w:after="0"/>
+            </w:pPr>
+            <w:r>
+              <w:rPr>
+                <w:sz w:val="17"/>
+                <w:szCs w:val="17"/>
+              </w:rPr>
+              <w:t xml:space="preserve">Une porte d'écriture ouverte à une machine contournerait tout ce qui fait la valeur du dossier : le cycle de vie, le gel du contenu, la signature. Une donnée entrée par un script ne serait attribuable à personne, et l'affirmation « le graphe est la seule porte d'entrée » deviendrait fausse sans que rien ne le signale. La propriété doit donc être relue dans la source à chaque version, pas promise. Côté sortie, un export qui quitte le système cesse d'être vérifiable : sans empreinte le destinataire ne peut pas établir qu'il détient le document produit, et sans ancrage il ne peut pas dire à quel état du dossier il correspond — devant un écart six mois plus tard, c'est l'exploitant qui porte le doute. Et un jeton conservé en clair serait réutilisable par quiconque atteint la base, sans que personne ne le change jamais : contrairement à un mot de passe, un script ne se plaint pas.</w:t>
+            </w:r>
+          </w:p>
+        </w:tc>
+        <w:tc>
+          <w:tcPr>
+            <w:tcW w:type="pct" w:w="20%"/>
+            <w:tcMar>
+              <w:top w:type="dxa" w:w="80"/>
+              <w:left w:type="dxa" w:w="110"/>
+              <w:bottom w:type="dxa" w:w="80"/>
+              <w:right w:type="dxa" w:w="110"/>
+            </w:tcMar>
+          </w:tcPr>
+          <w:p>
+            <w:pPr>
+              <w:spacing w:after="0"/>
+            </w:pPr>
+            <w:r>
+              <w:rPr>
+                <w:sz w:val="17"/>
+                <w:szCs w:val="17"/>
+              </w:rPr>
+              <w:t xml:space="preserve">21 CFR 11.10(a) · 21 CFR 11.10(d) · 21 CFR 11.10(e) · ALCOA+ — attribuable et exact</w:t>
+            </w:r>
+          </w:p>
+        </w:tc>
+      </w:tr>
+      <w:tr>
+        <w:tc>
+          <w:tcPr>
+            <w:tcW w:type="pct" w:w="11%"/>
+            <w:shd w:fill="F8FAFC"/>
+            <w:tcMar>
+              <w:top w:type="dxa" w:w="80"/>
+              <w:left w:type="dxa" w:w="110"/>
+              <w:bottom w:type="dxa" w:w="80"/>
+              <w:right w:type="dxa" w:w="110"/>
+            </w:tcMar>
+          </w:tcPr>
+          <w:p>
+            <w:pPr>
+              <w:spacing w:after="60"/>
+            </w:pPr>
+            <w:r>
+              <w:rPr>
+                <w:b/>
+                <w:bCs/>
+                <w:color w:val="4338CA"/>
+                <w:sz w:val="17"/>
+                <w:szCs w:val="17"/>
+              </w:rPr>
+              <w:t xml:space="preserve">URS-47</w:t>
+            </w:r>
+          </w:p>
+          <w:p>
+            <w:pPr>
+              <w:spacing w:after="0"/>
+            </w:pPr>
+            <w:r>
+              <w:rPr>
+                <w:b/>
+                <w:bCs/>
+                <w:color w:val="B45309"/>
+                <w:sz w:val="15"/>
+                <w:szCs w:val="15"/>
+              </w:rPr>
+              <w:t xml:space="preserve">Moyen</w:t>
+            </w:r>
+          </w:p>
+        </w:tc>
+        <w:tc>
+          <w:tcPr>
+            <w:tcW w:type="pct" w:w="41%"/>
+            <w:tcMar>
+              <w:top w:type="dxa" w:w="80"/>
+              <w:left w:type="dxa" w:w="110"/>
+              <w:bottom w:type="dxa" w:w="80"/>
+              <w:right w:type="dxa" w:w="110"/>
+            </w:tcMar>
+          </w:tcPr>
+          <w:p>
+            <w:pPr>
+              <w:spacing w:after="0"/>
+            </w:pPr>
+            <w:r>
+              <w:rPr>
+                <w:sz w:val="17"/>
+                <w:szCs w:val="17"/>
+              </w:rPr>
+              <w:t xml:space="preserve">La conformité PDF/A des copies d'archivage est établie par un VALIDATEUR INDÉPENDANT — veraPDF, l'implémentation de référence — et non par les seuls contrôles de Filum. La vérification s'exécute sur un document bâti pour la mettre en défaut, et le harnais porte un témoin délibérément non conforme : si le validateur laisse passer le témoin, aucun autre résultat de l'exécution n'est retenu. Tout caractère absent de la police embarquée est remplacé — jamais rendu par le glyphe .notdef, que le format interdit — et chaque copie DÉCLARE les substitutions qu'elle porte.</w:t>
+            </w:r>
+          </w:p>
+        </w:tc>
+        <w:tc>
+          <w:tcPr>
+            <w:tcW w:type="pct" w:w="28%"/>
+            <w:tcMar>
+              <w:top w:type="dxa" w:w="80"/>
+              <w:left w:type="dxa" w:w="110"/>
+              <w:bottom w:type="dxa" w:w="80"/>
+              <w:right w:type="dxa" w:w="110"/>
+            </w:tcMar>
+          </w:tcPr>
+          <w:p>
+            <w:pPr>
+              <w:spacing w:after="0"/>
+            </w:pPr>
+            <w:r>
+              <w:rPr>
+                <w:sz w:val="17"/>
+                <w:szCs w:val="17"/>
+              </w:rPr>
+              <w:t xml:space="preserve">Un vérificateur écrit par l'auteur du code partage exactement ses angles morts : ce qu'on n'a pas pensé à produire, on ne pense pas non plus à le chercher. La démonstration n'est pas théorique — le contrôle structurel de Filum a déclaré conformes, pendant deux mois, des enregistrements qui référençaient le glyphe .notdef, et veraPDF l'a trouvé au premier passage sur 4 fichiers de 15. Le risque propre n'est pas le format : c'est qu'une archive remise à une inspection porte des métadonnées affirmant une conformité que personne d'extérieur n'a mesurée. Le témoin répond au risque symétrique — un harnais qui ne sait plus dire « non conforme » rendrait un vert permanent, c'est-à-dire un garde décoratif.</w:t>
+            </w:r>
+          </w:p>
+        </w:tc>
+        <w:tc>
+          <w:tcPr>
+            <w:tcW w:type="pct" w:w="20%"/>
+            <w:tcMar>
+              <w:top w:type="dxa" w:w="80"/>
+              <w:left w:type="dxa" w:w="110"/>
+              <w:bottom w:type="dxa" w:w="80"/>
+              <w:right w:type="dxa" w:w="110"/>
+            </w:tcMar>
+          </w:tcPr>
+          <w:p>
+            <w:pPr>
+              <w:spacing w:after="0"/>
+            </w:pPr>
+            <w:r>
+              <w:rPr>
+                <w:sz w:val="17"/>
+                <w:szCs w:val="17"/>
+              </w:rPr>
+              <w:t xml:space="preserve">21 CFR 11.10(b) · 21 CFR 11.10(c) · ISO 19005-2:2011</w:t>
+            </w:r>
+          </w:p>
+        </w:tc>
+      </w:tr>
     </w:tbl>
     <w:p>
       <w:pPr>
@@ -5096,7 +5887,7 @@
           <w:sz w:val="20"/>
           <w:szCs w:val="20"/>
         </w:rPr>
-        <w:t xml:space="preserve">Répartition : 26 exigences à risque haut, 12 à risque moyen, 2 à risque bas. Les exigences à risque haut touchent toutes à l'intégrité ou à l'attribution des enregistrements : leur défaillance ne dégrade pas le confort d'usage, elle rend un enregistrement indéfendable. Elles font l'objet de cas de test dédiés, exécutés à chaque version.</w:t>
+        <w:t xml:space="preserve">Répartition : 29 exigences à risque haut, 16 à risque moyen, 2 à risque bas. Les exigences à risque haut touchent toutes à l'intégrité ou à l'attribution des enregistrements : leur défaillance ne dégrade pas le confort d'usage, elle rend un enregistrement indéfendable. Elles font l'objet de cas de test dédiés, exécutés à chaque version.</w:t>
       </w:r>
     </w:p>
     <w:p>
@@ -5247,7 +6038,7 @@
                 <w:sz w:val="17"/>
                 <w:szCs w:val="17"/>
               </w:rPr>
-              <w:t xml:space="preserve">7 août 2026 à 10:24</w:t>
+              <w:t xml:space="preserve">9 août 2026 à 11:08</w:t>
             </w:r>
           </w:p>
         </w:tc>
@@ -5450,7 +6241,7 @@
                 <w:sz w:val="17"/>
                 <w:szCs w:val="17"/>
               </w:rPr>
-              <w:t xml:space="preserve">37 cas sur 37 conformes — aucun écart</w:t>
+              <w:t xml:space="preserve">44 cas sur 44 conformes — aucun écart</w:t>
             </w:r>
           </w:p>
         </w:tc>
@@ -5829,7 +6620,7 @@
                 <w:sz w:val="17"/>
                 <w:szCs w:val="17"/>
               </w:rPr>
-              <w:t xml:space="preserve">empreintes distinctes pour un même mot de passe (48e2b8a0c608… ≠ deeb761bd128…), vérification correcte, mot de passe faux et vide refusés</w:t>
+              <w:t xml:space="preserve">empreintes distinctes pour un même mot de passe (fa821c43cdaa… ≠ a05851cac422…), vérification correcte, mot de passe faux et vide refusés</w:t>
             </w:r>
           </w:p>
         </w:tc>
@@ -5868,7 +6659,7 @@
                 <w:sz w:val="14"/>
                 <w:szCs w:val="14"/>
               </w:rPr>
-              <w:t xml:space="preserve">144 ms</w:t>
+              <w:t xml:space="preserve">136 ms</w:t>
             </w:r>
           </w:p>
         </w:tc>
@@ -6010,7 +6801,7 @@
                 <w:sz w:val="14"/>
                 <w:szCs w:val="14"/>
               </w:rPr>
-              <w:t xml:space="preserve">15 ms</w:t>
+              <w:t xml:space="preserve">14 ms</w:t>
             </w:r>
           </w:p>
         </w:tc>
@@ -6113,7 +6904,7 @@
                 <w:sz w:val="17"/>
                 <w:szCs w:val="17"/>
               </w:rPr>
-              <w:t xml:space="preserve">contenu gelé, empreinte 24604eb157d7fa54…, 10485 octets conservés, opération journalisée</w:t>
+              <w:t xml:space="preserve">contenu gelé, empreinte 24604eb157d7fa54…, 10486 octets conservés, opération journalisée</w:t>
             </w:r>
           </w:p>
         </w:tc>
@@ -6152,7 +6943,7 @@
                 <w:sz w:val="14"/>
                 <w:szCs w:val="14"/>
               </w:rPr>
-              <w:t xml:space="preserve">119 ms</w:t>
+              <w:t xml:space="preserve">123 ms</w:t>
             </w:r>
           </w:p>
         </w:tc>
@@ -6255,7 +7046,7 @@
                 <w:sz w:val="17"/>
                 <w:szCs w:val="17"/>
               </w:rPr>
-              <w:t xml:space="preserve">signature liée à l'instantané cmsissaz…, empreinte attestée 3767 CD80 ACC9, manifestation « Testeur QA1 (QA1) · Approuvé · 07/08/2026 10:24:16 UTC · enregistrement 3767 CD80 ACC9 »</w:t>
+              <w:t xml:space="preserve">signature liée à l'instantané cmslp8xj…, empreinte attestée 3767 CD80 ACC9, manifestation « Testeur QA1 (QA1) · Approuvé · 09/08/2026 11:08:32 UTC · enregistrement 3767 CD80 ACC9 »</w:t>
             </w:r>
           </w:p>
         </w:tc>
@@ -6294,7 +7085,7 @@
                 <w:sz w:val="14"/>
                 <w:szCs w:val="14"/>
               </w:rPr>
-              <w:t xml:space="preserve">30 ms</w:t>
+              <w:t xml:space="preserve">28 ms</w:t>
             </w:r>
           </w:p>
         </w:tc>
@@ -6397,7 +7188,7 @@
                 <w:sz w:val="17"/>
                 <w:szCs w:val="17"/>
               </w:rPr>
-              <w:t xml:space="preserve">10487 octets relus à l'identique ; inversion d'un octet en position 5243 détectée</w:t>
+              <w:t xml:space="preserve">10486 octets relus à l'identique ; inversion d'un octet en position 5243 détectée</w:t>
             </w:r>
           </w:p>
         </w:tc>
@@ -6436,7 +7227,7 @@
                 <w:sz w:val="14"/>
                 <w:szCs w:val="14"/>
               </w:rPr>
-              <w:t xml:space="preserve">46 ms</w:t>
+              <w:t xml:space="preserve">43 ms</w:t>
             </w:r>
           </w:p>
         </w:tc>
@@ -6578,7 +7369,7 @@
                 <w:sz w:val="14"/>
                 <w:szCs w:val="14"/>
               </w:rPr>
-              <w:t xml:space="preserve">39 ms</w:t>
+              <w:t xml:space="preserve">34 ms</w:t>
             </w:r>
           </w:p>
         </w:tc>
@@ -6720,7 +7511,7 @@
                 <w:sz w:val="14"/>
                 <w:szCs w:val="14"/>
               </w:rPr>
-              <w:t xml:space="preserve">34 ms</w:t>
+              <w:t xml:space="preserve">33 ms</w:t>
             </w:r>
           </w:p>
         </w:tc>
@@ -6862,7 +7653,7 @@
                 <w:sz w:val="14"/>
                 <w:szCs w:val="14"/>
               </w:rPr>
-              <w:t xml:space="preserve">52 ms</w:t>
+              <w:t xml:space="preserve">51 ms</w:t>
             </w:r>
           </w:p>
         </w:tc>
@@ -7004,7 +7795,7 @@
                 <w:sz w:val="14"/>
                 <w:szCs w:val="14"/>
               </w:rPr>
-              <w:t xml:space="preserve">57 ms</w:t>
+              <w:t xml:space="preserve">56 ms</w:t>
             </w:r>
           </w:p>
         </w:tc>
@@ -7146,7 +7937,7 @@
                 <w:sz w:val="14"/>
                 <w:szCs w:val="14"/>
               </w:rPr>
-              <w:t xml:space="preserve">53 ms</w:t>
+              <w:t xml:space="preserve">49 ms</w:t>
             </w:r>
           </w:p>
         </w:tc>
@@ -7249,7 +8040,7 @@
                 <w:sz w:val="17"/>
                 <w:szCs w:val="17"/>
               </w:rPr>
-              <w:t xml:space="preserve">155 fichiers source inspectés : aucune modification ni suppression d'entrée ; 1 fichiers en écriture seule</w:t>
+              <w:t xml:space="preserve">171 fichiers source inspectés : aucune modification ni suppression d'entrée ; 1 fichiers en écriture seule</w:t>
             </w:r>
           </w:p>
         </w:tc>
@@ -7288,7 +8079,7 @@
                 <w:sz w:val="14"/>
                 <w:szCs w:val="14"/>
               </w:rPr>
-              <w:t xml:space="preserve">29 ms</w:t>
+              <w:t xml:space="preserve">60 ms</w:t>
             </w:r>
           </w:p>
         </w:tc>
@@ -7856,7 +8647,7 @@
                 <w:sz w:val="14"/>
                 <w:szCs w:val="14"/>
               </w:rPr>
-              <w:t xml:space="preserve">325 ms</w:t>
+              <w:t xml:space="preserve">310 ms</w:t>
             </w:r>
           </w:p>
         </w:tc>
@@ -7959,7 +8750,7 @@
                 <w:sz w:val="17"/>
                 <w:szCs w:val="17"/>
               </w:rPr>
-              <w:t xml:space="preserve">13 enregistrement(s) archivé(s), 43 fichier(s) couverts par empreintes.sha256, 0 écart ; ancre 794671292a5b7169… ; octets du gel restitués à l'identique ; altération d'un octet détectée et signalée ALTÉRÉ, fichier conservé dans l'archive</w:t>
+              <w:t xml:space="preserve">13 enregistrement(s) archivé(s), 43 fichier(s) couverts par empreintes.sha256, 0 écart ; ancre 9ff2befaf906e096… ; octets du gel restitués à l'identique ; altération d'un octet détectée et signalée ALTÉRÉ, fichier conservé dans l'archive</w:t>
             </w:r>
           </w:p>
         </w:tc>
@@ -7998,7 +8789,7 @@
                 <w:sz w:val="14"/>
                 <w:szCs w:val="14"/>
               </w:rPr>
-              <w:t xml:space="preserve">438 ms</w:t>
+              <w:t xml:space="preserve">376 ms</w:t>
             </w:r>
           </w:p>
         </w:tc>
@@ -8140,7 +8931,7 @@
                 <w:sz w:val="14"/>
                 <w:szCs w:val="14"/>
               </w:rPr>
-              <w:t xml:space="preserve">10 ms</w:t>
+              <w:t xml:space="preserve">7 ms</w:t>
             </w:r>
           </w:p>
         </w:tc>
@@ -8243,7 +9034,7 @@
                 <w:sz w:val="17"/>
                 <w:szCs w:val="17"/>
               </w:rPr>
-              <w:t xml:space="preserve">durée non déclarée annoncée telle quelle ; quatre valeurs invalides refusées (0, -1, 101, 7.5) ; 10 ans déclarés → échéance 2036-08-07 portée par le manifeste, procédure QP-014 rév. B citée dans la lettre d'accompagnement</w:t>
+              <w:t xml:space="preserve">durée non déclarée annoncée telle quelle ; quatre valeurs invalides refusées (0, -1, 101, 7.5) ; 10 ans déclarés → échéance 2036-08-09 portée par le manifeste, procédure QP-014 rév. B citée dans la lettre d'accompagnement</w:t>
             </w:r>
           </w:p>
         </w:tc>
@@ -8282,7 +9073,7 @@
                 <w:sz w:val="14"/>
                 <w:szCs w:val="14"/>
               </w:rPr>
-              <w:t xml:space="preserve">370 ms</w:t>
+              <w:t xml:space="preserve">300 ms</w:t>
             </w:r>
           </w:p>
         </w:tc>
@@ -8424,7 +9215,7 @@
                 <w:sz w:val="14"/>
                 <w:szCs w:val="14"/>
               </w:rPr>
-              <w:t xml:space="preserve">262 ms</w:t>
+              <w:t xml:space="preserve">238 ms</w:t>
             </w:r>
           </w:p>
         </w:tc>
@@ -8669,7 +9460,7 @@
                 <w:sz w:val="17"/>
                 <w:szCs w:val="17"/>
               </w:rPr>
-              <w:t xml:space="preserve">34 modèles déclarés, tous purgés ou détachés par prisma/seed.ts</w:t>
+              <w:t xml:space="preserve">35 modèles déclarés, tous purgés ou détachés par prisma/seed.ts</w:t>
             </w:r>
           </w:p>
         </w:tc>
@@ -8850,7 +9641,7 @@
                 <w:sz w:val="14"/>
                 <w:szCs w:val="14"/>
               </w:rPr>
-              <w:t xml:space="preserve">15 ms</w:t>
+              <w:t xml:space="preserve">14 ms</w:t>
             </w:r>
           </w:p>
         </w:tc>
@@ -8953,7 +9744,7 @@
                 <w:sz w:val="17"/>
                 <w:szCs w:val="17"/>
               </w:rPr>
-              <w:t xml:space="preserve">211 fichier(s) source relus, aucune écriture dans la piste hors du module ; 9 empreintes comparées entre l'implémentation TypeScript et le miroir de la console serveur, toutes identiques</w:t>
+              <w:t xml:space="preserve">235 fichier(s) source relus, aucune écriture dans la piste hors du module ; 9 empreintes comparées entre l'implémentation TypeScript et le miroir de la console serveur, toutes identiques</w:t>
             </w:r>
           </w:p>
         </w:tc>
@@ -8992,7 +9783,7 @@
                 <w:sz w:val="14"/>
                 <w:szCs w:val="14"/>
               </w:rPr>
-              <w:t xml:space="preserve">29 ms</w:t>
+              <w:t xml:space="preserve">54 ms</w:t>
             </w:r>
           </w:p>
         </w:tc>
@@ -9134,7 +9925,7 @@
                 <w:sz w:val="14"/>
                 <w:szCs w:val="14"/>
               </w:rPr>
-              <w:t xml:space="preserve">0 ms</w:t>
+              <w:t xml:space="preserve">1 ms</w:t>
             </w:r>
           </w:p>
         </w:tc>
@@ -9237,7 +10028,7 @@
                 <w:sz w:val="17"/>
                 <w:szCs w:val="17"/>
               </w:rPr>
-              <w:t xml:space="preserve">consommation de jeton et changement personnel horodatés et exigence levée, compte d'amorçage horodaté et marqué à renouveler ; requireUser() redirige vers l'écran de renouvellement ; 51 point(s) d'entrée relus, aucun ne s'authentifie hors du garde (3 exceptions nommées : mise en page, connexion, renouvellement)</w:t>
+              <w:t xml:space="preserve">consommation de jeton et changement personnel horodatés et exigence levée, compte d'amorçage horodaté et marqué à renouveler ; requireUser() redirige vers l'écran de renouvellement ; 57 point(s) d'entrée relus, aucun ne s'authentifie hors du garde (3 exceptions nommées : mise en page, connexion, renouvellement)</w:t>
             </w:r>
           </w:p>
         </w:tc>
@@ -9276,7 +10067,7 @@
                 <w:sz w:val="14"/>
                 <w:szCs w:val="14"/>
               </w:rPr>
-              <w:t xml:space="preserve">9 ms</w:t>
+              <w:t xml:space="preserve">18 ms</w:t>
             </w:r>
           </w:p>
         </w:tc>
@@ -9418,7 +10209,7 @@
                 <w:sz w:val="14"/>
                 <w:szCs w:val="14"/>
               </w:rPr>
-              <w:t xml:space="preserve">249 ms</w:t>
+              <w:t xml:space="preserve">193 ms</w:t>
             </w:r>
           </w:p>
         </w:tc>
@@ -9521,7 +10312,7 @@
                 <w:sz w:val="17"/>
                 <w:szCs w:val="17"/>
               </w:rPr>
-              <w:t xml:space="preserve">211 fichier(s) source relus : aucune écriture de mot de passe hors des chemins autorisés ; une seule écriture dans les actions serveur, le changement personnel, qui exige l'ancien mot de passe ; l'outil d'urgence de la console émet un jeton et ne sait plus dériver de mot de passe ; aucun champ de mot de passe hors des 7 écrans où l'on saisit le sien</w:t>
+              <w:t xml:space="preserve">235 fichier(s) source relus : aucune écriture de mot de passe hors des chemins autorisés ; une seule écriture dans les actions serveur, le changement personnel, qui exige l'ancien mot de passe ; l'outil d'urgence de la console émet un jeton et ne sait plus dériver de mot de passe ; aucun champ de mot de passe hors des 7 écrans où l'on saisit le sien</w:t>
             </w:r>
           </w:p>
         </w:tc>
@@ -9560,7 +10351,7 @@
                 <w:sz w:val="14"/>
                 <w:szCs w:val="14"/>
               </w:rPr>
-              <w:t xml:space="preserve">48 ms</w:t>
+              <w:t xml:space="preserve">83 ms</w:t>
             </w:r>
           </w:p>
         </w:tc>
@@ -9663,7 +10454,7 @@
                 <w:sz w:val="17"/>
                 <w:szCs w:val="17"/>
               </w:rPr>
-              <w:t xml:space="preserve">image filum:latest démarrée sur volumes vierges, conteneur SAIN ; migrations appliquées, chaîne de piste d'audit intacte, organisation, programme, compte administrateur et bibliothèque de normes créés ; version 1.2.1 annoncée au journal ET portée par /app/VERSION ; police et profil ICC des copies d'archivage présents dans l'image ; /login répond 200 ; une route protégée rend l'écran de connexion (10431 octets) sans divulguer ni le nom de l'organisation ni celui du programme</w:t>
+              <w:t xml:space="preserve">image filum:latest démarrée sur volumes vierges, conteneur SAIN ; migrations appliquées, chaîne de piste d'audit intacte, organisation, programme, compte administrateur et bibliothèque de normes créés ; version 1.2.1 annoncée au journal ET portée par /app/VERSION ; police et profil ICC des copies d'archivage présents dans l'image ; /login répond 200 ; une route protégée rend l'écran de connexion (10462 octets) sans divulguer ni le nom de l'organisation ni celui du programme</w:t>
             </w:r>
           </w:p>
         </w:tc>
@@ -9702,7 +10493,7 @@
                 <w:sz w:val="14"/>
                 <w:szCs w:val="14"/>
               </w:rPr>
-              <w:t xml:space="preserve">9136 ms</w:t>
+              <w:t xml:space="preserve">8979 ms</w:t>
             </w:r>
           </w:p>
         </w:tc>
@@ -9805,7 +10596,7 @@
                 <w:sz w:val="17"/>
                 <w:szCs w:val="17"/>
               </w:rPr>
-              <w:t xml:space="preserve">188 messages du catalogue complets dans les deux langues et à variables identiques ; entrée écrite par le point de passage relue « SPEC-OQ30 : En attente → Justifié — justification : ess… » et « SPEC-OQ30: Pending → Justified — justification: essai d… » ; le statut suit la langue, le motif saisi est restitué à l'identique dans les deux ; réécriture des arguments et changement de clé détectés au rang 64, chaîne rétablie après remise en état ; une entrée sans message se sérialise sur 9 champs comme avant, 11 avec, miroir de console identique sur les deux formes</w:t>
+              <w:t xml:space="preserve">193 messages du catalogue complets dans les deux langues et à variables identiques ; entrée écrite par le point de passage relue « SPEC-OQ30 : En attente → Justifié — justification : ess… » et « SPEC-OQ30: Pending → Justified — justification: essai d… » ; le statut suit la langue, le motif saisi est restitué à l'identique dans les deux ; réécriture des arguments et changement de clé détectés au rang 64, chaîne rétablie après remise en état ; une entrée sans message se sérialise sur 9 champs comme avant, 11 avec, miroir de console identique sur les deux formes</w:t>
             </w:r>
           </w:p>
         </w:tc>
@@ -9844,7 +10635,7 @@
                 <w:sz w:val="14"/>
                 <w:szCs w:val="14"/>
               </w:rPr>
-              <w:t xml:space="preserve">25 ms</w:t>
+              <w:t xml:space="preserve">22 ms</w:t>
             </w:r>
           </w:p>
         </w:tc>
@@ -9947,7 +10738,7 @@
                 <w:sz w:val="17"/>
                 <w:szCs w:val="17"/>
               </w:rPr>
-              <w:t xml:space="preserve">copie d'archivage de OQ-012-revision rév. 001 produite (69090 octets, 1 page·s) ; 29 contrôles structurels PDF/A-2b passés — police embarquée, profil ICC « acsp » de 3024 octets, métadonnées pdfaid partie 2 niveau B, décalages exacts ; texte intégralement relu par la table du fichier, 44 caractère·s accentué·s ou typographiques restitués ; production déterministe (deux exécutions octet pour octet identiques)</w:t>
+              <w:t xml:space="preserve">copie d'archivage de OQ-012-revision rév. 001 produite (69084 octets, 1 page·s) ; 30 contrôles structurels PDF/A-2b passés — police embarquée, profil ICC « acsp » de 3024 octets, métadonnées pdfaid partie 2 niveau B, décalages exacts ; texte intégralement relu par la table du fichier, 44 caractère·s accentué·s ou typographiques restitués ; production déterministe (deux exécutions octet pour octet identiques)</w:t>
             </w:r>
           </w:p>
         </w:tc>
@@ -10128,7 +10919,7 @@
                 <w:sz w:val="14"/>
                 <w:szCs w:val="14"/>
               </w:rPr>
-              <w:t xml:space="preserve">90 ms</w:t>
+              <w:t xml:space="preserve">83 ms</w:t>
             </w:r>
           </w:p>
         </w:tc>
@@ -10231,7 +11022,7 @@
                 <w:sz w:val="17"/>
                 <w:szCs w:val="17"/>
               </w:rPr>
-              <w:t xml:space="preserve">clôture refusée trois fois avant d'être permise — conclusion vide, 1 entrée(s) non statuée(s), verdict affirmatif sans motif ; manifestation « Testeur QR2 (QR2) · Revu · 07/08/2026 10:24:27 UTC · enregistrement 99CD ECE8 3E48 » portant le nom imprimé, la signification « Revu » et l'empreinte du contenu ; empreinte recalculée à l'identique hors du logiciel, et modifiée par le moindre changement de conclusion ou de verdict ; indépendance consignée sur le SIGNATAIRE (0 entrée·s écrite·s par lui, contre 5 par l'ouvreur) ; 10 règles de triage inscrites dans l'enregistrement ; re-clôture et re-statuage refusés ; aucune rupture ajoutée à la chaîne sur 82 entrées</w:t>
+              <w:t xml:space="preserve">clôture refusée trois fois avant d'être permise — conclusion vide, 1 entrée(s) non statuée(s), verdict affirmatif sans motif ; manifestation « Testeur QR2 (QR2) · Revu · 09/08/2026 11:08:43 UTC · enregistrement 507D 9BFA FBDF » portant le nom imprimé, la signification « Revu » et l'empreinte du contenu ; empreinte recalculée à l'identique hors du logiciel, et modifiée par le moindre changement de conclusion ou de verdict ; indépendance consignée sur le SIGNATAIRE (0 entrée·s écrite·s par lui, contre 5 par l'ouvreur) ; 10 règles de triage inscrites dans l'enregistrement ; re-clôture et re-statuage refusés ; aucune rupture ajoutée à la chaîne sur 82 entrées</w:t>
             </w:r>
           </w:p>
         </w:tc>
@@ -10270,7 +11061,7 @@
                 <w:sz w:val="14"/>
                 <w:szCs w:val="14"/>
               </w:rPr>
-              <w:t xml:space="preserve">93 ms</w:t>
+              <w:t xml:space="preserve">88 ms</w:t>
             </w:r>
           </w:p>
         </w:tc>
@@ -10554,7 +11345,7 @@
                 <w:sz w:val="14"/>
                 <w:szCs w:val="14"/>
               </w:rPr>
-              <w:t xml:space="preserve">16 ms</w:t>
+              <w:t xml:space="preserve">15 ms</w:t>
             </w:r>
           </w:p>
         </w:tc>
@@ -10696,7 +11487,7 @@
                 <w:sz w:val="14"/>
                 <w:szCs w:val="14"/>
               </w:rPr>
-              <w:t xml:space="preserve">55 ms</w:t>
+              <w:t xml:space="preserve">44 ms</w:t>
             </w:r>
           </w:p>
         </w:tc>
@@ -10799,7 +11590,7 @@
                 <w:sz w:val="17"/>
                 <w:szCs w:val="17"/>
               </w:rPr>
-              <w:t xml:space="preserve">base en journalisation WAL, passage idempotent ; 162 fichier(s) source relus, aucun chemin ne supprime ni n'écrase dans le volume des fichiers hors de la purge des imports — c'est cette propriété d'ajout seul qui rend sûre la règle « restaurer les fichiers à un instant égal ou postérieur à la base » ; sur 19 pièce(s) référencée(s), le retrait d'un enregistrement approuvé est signalé ABSENT et nommé (OQ-014-restauration), sa modification hors du logiciel est signalée ALTÉRÉE, les deux défauts ne sont jamais confondus, et le rapport redevient cohérent une fois la pièce remise en place</w:t>
+              <w:t xml:space="preserve">base en journalisation WAL, passage idempotent ; 178 fichier(s) source relus, aucun chemin ne supprime ni n'écrase dans le volume des fichiers hors de la purge des imports — c'est cette propriété d'ajout seul qui rend sûre la règle « restaurer les fichiers à un instant égal ou postérieur à la base » ; sur 19 pièce(s) référencée(s), le retrait d'un enregistrement approuvé est signalé ABSENT et nommé (OQ-014-restauration), sa modification hors du logiciel est signalée ALTÉRÉE, les deux défauts ne sont jamais confondus, et le rapport redevient cohérent une fois la pièce remise en place</w:t>
             </w:r>
           </w:p>
         </w:tc>
@@ -10838,7 +11629,1001 @@
                 <w:sz w:val="14"/>
                 <w:szCs w:val="14"/>
               </w:rPr>
-              <w:t xml:space="preserve">156 ms</w:t>
+              <w:t xml:space="preserve">167 ms</w:t>
+            </w:r>
+          </w:p>
+        </w:tc>
+      </w:tr>
+      <w:tr>
+        <w:tc>
+          <w:tcPr>
+            <w:tcW w:type="pct" w:w="13%"/>
+            <w:shd w:fill="F8FAFC"/>
+            <w:tcMar>
+              <w:top w:type="dxa" w:w="80"/>
+              <w:left w:type="dxa" w:w="110"/>
+              <w:bottom w:type="dxa" w:w="80"/>
+              <w:right w:type="dxa" w:w="110"/>
+            </w:tcMar>
+          </w:tcPr>
+          <w:p>
+            <w:pPr>
+              <w:spacing w:after="50"/>
+            </w:pPr>
+            <w:r>
+              <w:rPr>
+                <w:b/>
+                <w:bCs/>
+                <w:color w:val="4338CA"/>
+                <w:sz w:val="17"/>
+                <w:szCs w:val="17"/>
+              </w:rPr>
+              <w:t xml:space="preserve">OQ-38</w:t>
+            </w:r>
+          </w:p>
+          <w:p>
+            <w:pPr>
+              <w:spacing w:after="0"/>
+            </w:pPr>
+            <w:r>
+              <w:rPr>
+                <w:color w:val="475569"/>
+                <w:sz w:val="15"/>
+                <w:szCs w:val="15"/>
+              </w:rPr>
+              <w:t xml:space="preserve">URS-41</w:t>
+            </w:r>
+          </w:p>
+        </w:tc>
+        <w:tc>
+          <w:tcPr>
+            <w:tcW w:type="pct" w:w="30%"/>
+            <w:tcMar>
+              <w:top w:type="dxa" w:w="80"/>
+              <w:left w:type="dxa" w:w="110"/>
+              <w:bottom w:type="dxa" w:w="80"/>
+              <w:right w:type="dxa" w:w="110"/>
+            </w:tcMar>
+          </w:tcPr>
+          <w:p>
+            <w:pPr>
+              <w:spacing w:after="50"/>
+            </w:pPr>
+            <w:r>
+              <w:rPr>
+                <w:b/>
+                <w:bCs/>
+                <w:sz w:val="17"/>
+                <w:szCs w:val="17"/>
+              </w:rPr>
+              <w:t xml:space="preserve">Mode démonstration : éteint par défaut, annoncé avant connexion, infermable, et sans effet sur les enregistrements</w:t>
+            </w:r>
+          </w:p>
+          <w:p>
+            <w:pPr>
+              <w:spacing w:after="0"/>
+            </w:pPr>
+            <w:r>
+              <w:rPr>
+                <w:color w:val="475569"/>
+                <w:sz w:val="15"/>
+                <w:szCs w:val="15"/>
+              </w:rPr>
+              <w:t xml:space="preserve">Vérifier que le mode démonstration ne s'allume que sur une valeur explicite, que la période annoncée retombe sur un repli sûr plutôt que d'afficher une valeur absurde, que le bandeau RENDU dit les trois choses qu'il doit dire dans les deux langues et n'offre aucun moyen de le fermer, qu'il est posé AVANT la porte d'authentification — donc visible sur l'écran de connexion — et qu'aucun module produisant des données ou des documents ne dépend de ce mode.</w:t>
+            </w:r>
+          </w:p>
+        </w:tc>
+        <w:tc>
+          <w:tcPr>
+            <w:tcW w:type="pct" w:w="45%"/>
+            <w:tcMar>
+              <w:top w:type="dxa" w:w="80"/>
+              <w:left w:type="dxa" w:w="110"/>
+              <w:bottom w:type="dxa" w:w="80"/>
+              <w:right w:type="dxa" w:w="110"/>
+            </w:tcMar>
+          </w:tcPr>
+          <w:p>
+            <w:pPr>
+              <w:spacing w:after="0"/>
+            </w:pPr>
+            <w:r>
+              <w:rPr>
+                <w:sz w:val="17"/>
+                <w:szCs w:val="17"/>
+              </w:rPr>
+              <w:t xml:space="preserve">mode éteint sans FILUM_DEMO et sur 10 valeurs voisines (« true », « oui », « 0 », « 1 » avec espace…), allumé sur « 1 » seul ; période annoncée bornée sur 12 valeurs, repli à 6 h pour une valeur absurde ou absente ; bandeau RENDU dans les deux langues portant les trois mentions dues — données fictives, effacement périodique, installation non qualifiée —, sans aucun bouton de fermeture et avec le rôle « alert » ; rendu AVANT la porte d'authentification, donc présent sur l'écran de connexion ; 176 fichier(s) source relus, aucun module hors de la coque ne dépend du mode</w:t>
+            </w:r>
+          </w:p>
+        </w:tc>
+        <w:tc>
+          <w:tcPr>
+            <w:tcW w:type="pct" w:w="12%"/>
+            <w:tcMar>
+              <w:top w:type="dxa" w:w="80"/>
+              <w:left w:type="dxa" w:w="110"/>
+              <w:bottom w:type="dxa" w:w="80"/>
+              <w:right w:type="dxa" w:w="110"/>
+            </w:tcMar>
+          </w:tcPr>
+          <w:p>
+            <w:pPr>
+              <w:spacing w:after="40"/>
+            </w:pPr>
+            <w:r>
+              <w:rPr>
+                <w:b/>
+                <w:bCs/>
+                <w:color w:val="047857"/>
+                <w:sz w:val="17"/>
+                <w:szCs w:val="17"/>
+              </w:rPr>
+              <w:t xml:space="preserve">Conforme</w:t>
+            </w:r>
+          </w:p>
+          <w:p>
+            <w:pPr>
+              <w:spacing w:after="0"/>
+            </w:pPr>
+            <w:r>
+              <w:rPr>
+                <w:color w:val="475569"/>
+                <w:sz w:val="14"/>
+                <w:szCs w:val="14"/>
+              </w:rPr>
+              <w:t xml:space="preserve">130 ms</w:t>
+            </w:r>
+          </w:p>
+        </w:tc>
+      </w:tr>
+      <w:tr>
+        <w:tc>
+          <w:tcPr>
+            <w:tcW w:type="pct" w:w="13%"/>
+            <w:shd w:fill="F8FAFC"/>
+            <w:tcMar>
+              <w:top w:type="dxa" w:w="80"/>
+              <w:left w:type="dxa" w:w="110"/>
+              <w:bottom w:type="dxa" w:w="80"/>
+              <w:right w:type="dxa" w:w="110"/>
+            </w:tcMar>
+          </w:tcPr>
+          <w:p>
+            <w:pPr>
+              <w:spacing w:after="50"/>
+            </w:pPr>
+            <w:r>
+              <w:rPr>
+                <w:b/>
+                <w:bCs/>
+                <w:color w:val="4338CA"/>
+                <w:sz w:val="17"/>
+                <w:szCs w:val="17"/>
+              </w:rPr>
+              <w:t xml:space="preserve">OQ-39</w:t>
+            </w:r>
+          </w:p>
+          <w:p>
+            <w:pPr>
+              <w:spacing w:after="0"/>
+            </w:pPr>
+            <w:r>
+              <w:rPr>
+                <w:color w:val="475569"/>
+                <w:sz w:val="15"/>
+                <w:szCs w:val="15"/>
+              </w:rPr>
+              <w:t xml:space="preserve">URS-42</w:t>
+            </w:r>
+          </w:p>
+        </w:tc>
+        <w:tc>
+          <w:tcPr>
+            <w:tcW w:type="pct" w:w="30%"/>
+            <w:tcMar>
+              <w:top w:type="dxa" w:w="80"/>
+              <w:left w:type="dxa" w:w="110"/>
+              <w:bottom w:type="dxa" w:w="80"/>
+              <w:right w:type="dxa" w:w="110"/>
+            </w:tcMar>
+          </w:tcPr>
+          <w:p>
+            <w:pPr>
+              <w:spacing w:after="50"/>
+            </w:pPr>
+            <w:r>
+              <w:rPr>
+                <w:b/>
+                <w:bCs/>
+                <w:sz w:val="17"/>
+                <w:szCs w:val="17"/>
+              </w:rPr>
+              <w:t xml:space="preserve">Vue par programme : le hors-programme est porté, le rapprochement est indépendant, et un écart se voit</w:t>
+            </w:r>
+          </w:p>
+          <w:p>
+            <w:pPr>
+              <w:spacing w:after="0"/>
+            </w:pPr>
+            <w:r>
+              <w:rPr>
+                <w:color w:val="475569"/>
+                <w:sz w:val="15"/>
+                <w:szCs w:val="15"/>
+              </w:rPr>
+              <w:t xml:space="preserve">Vérifier qu'un contenu rattaché à aucun programme apparaît sur une ligne à lui au lieu de disparaître, que chaque indicateur retombe sur un total demandé séparément à la base, que la règle « exigence couverte » exprimée en requête dit la même chose que celle appliquée aux objets chargés, qu'un document dont le programme contredit celui de son activité est nommé, et — en rendant le composant — qu'un rapprochement en défaut s'affiche alors qu'un rapprochement juste n'affiche rien.</w:t>
+            </w:r>
+          </w:p>
+        </w:tc>
+        <w:tc>
+          <w:tcPr>
+            <w:tcW w:type="pct" w:w="45%"/>
+            <w:tcMar>
+              <w:top w:type="dxa" w:w="80"/>
+              <w:left w:type="dxa" w:w="110"/>
+              <w:bottom w:type="dxa" w:w="80"/>
+              <w:right w:type="dxa" w:w="110"/>
+            </w:tcMar>
+          </w:tcPr>
+          <w:p>
+            <w:pPr>
+              <w:spacing w:after="0"/>
+            </w:pPr>
+            <w:r>
+              <w:rPr>
+                <w:sz w:val="17"/>
+                <w:szCs w:val="17"/>
+              </w:rPr>
+              <w:t xml:space="preserve">4 programme(s) et une ligne « hors programme » non vide (16 document(s), 15 exigence(s)) ; les 8 indicateurs retombent sur des totaux demandés SÉPARÉMENT à la base ; une exigence sur deux non couverte donne 50 % et non 100 %, une mère couverte par sa fille est comptée couverte, un programme sans exigence ne dit rien ; les deux expressions de « couverte » s'accordent sur 2 exigence(s) ; le document rangé dans l'activité d'un programme sans porter ce programme est nommé (OQD-ORPHELIN → Programme A) ; au rendu, un rapprochement en défaut s'affiche avec ses nombres et un rapprochement juste n'affiche rien</w:t>
+            </w:r>
+          </w:p>
+        </w:tc>
+        <w:tc>
+          <w:tcPr>
+            <w:tcW w:type="pct" w:w="12%"/>
+            <w:tcMar>
+              <w:top w:type="dxa" w:w="80"/>
+              <w:left w:type="dxa" w:w="110"/>
+              <w:bottom w:type="dxa" w:w="80"/>
+              <w:right w:type="dxa" w:w="110"/>
+            </w:tcMar>
+          </w:tcPr>
+          <w:p>
+            <w:pPr>
+              <w:spacing w:after="40"/>
+            </w:pPr>
+            <w:r>
+              <w:rPr>
+                <w:b/>
+                <w:bCs/>
+                <w:color w:val="047857"/>
+                <w:sz w:val="17"/>
+                <w:szCs w:val="17"/>
+              </w:rPr>
+              <w:t xml:space="preserve">Conforme</w:t>
+            </w:r>
+          </w:p>
+          <w:p>
+            <w:pPr>
+              <w:spacing w:after="0"/>
+            </w:pPr>
+            <w:r>
+              <w:rPr>
+                <w:color w:val="475569"/>
+                <w:sz w:val="14"/>
+                <w:szCs w:val="14"/>
+              </w:rPr>
+              <w:t xml:space="preserve">93 ms</w:t>
+            </w:r>
+          </w:p>
+        </w:tc>
+      </w:tr>
+      <w:tr>
+        <w:tc>
+          <w:tcPr>
+            <w:tcW w:type="pct" w:w="13%"/>
+            <w:shd w:fill="F8FAFC"/>
+            <w:tcMar>
+              <w:top w:type="dxa" w:w="80"/>
+              <w:left w:type="dxa" w:w="110"/>
+              <w:bottom w:type="dxa" w:w="80"/>
+              <w:right w:type="dxa" w:w="110"/>
+            </w:tcMar>
+          </w:tcPr>
+          <w:p>
+            <w:pPr>
+              <w:spacing w:after="50"/>
+            </w:pPr>
+            <w:r>
+              <w:rPr>
+                <w:b/>
+                <w:bCs/>
+                <w:color w:val="4338CA"/>
+                <w:sz w:val="17"/>
+                <w:szCs w:val="17"/>
+              </w:rPr>
+              <w:t xml:space="preserve">OQ-40</w:t>
+            </w:r>
+          </w:p>
+          <w:p>
+            <w:pPr>
+              <w:spacing w:after="0"/>
+            </w:pPr>
+            <w:r>
+              <w:rPr>
+                <w:color w:val="475569"/>
+                <w:sz w:val="15"/>
+                <w:szCs w:val="15"/>
+              </w:rPr>
+              <w:t xml:space="preserve">URS-43</w:t>
+            </w:r>
+          </w:p>
+        </w:tc>
+        <w:tc>
+          <w:tcPr>
+            <w:tcW w:type="pct" w:w="30%"/>
+            <w:tcMar>
+              <w:top w:type="dxa" w:w="80"/>
+              <w:left w:type="dxa" w:w="110"/>
+              <w:bottom w:type="dxa" w:w="80"/>
+              <w:right w:type="dxa" w:w="110"/>
+            </w:tcMar>
+          </w:tcPr>
+          <w:p>
+            <w:pPr>
+              <w:spacing w:after="50"/>
+            </w:pPr>
+            <w:r>
+              <w:rPr>
+                <w:b/>
+                <w:bCs/>
+                <w:sz w:val="17"/>
+                <w:szCs w:val="17"/>
+              </w:rPr>
+              <w:t xml:space="preserve">Cellules fusionnées dépliées, colonnes non décalées, feuilles nommées quel que soit le producteur</w:t>
+            </w:r>
+          </w:p>
+          <w:p>
+            <w:pPr>
+              <w:spacing w:after="0"/>
+            </w:pPr>
+            <w:r>
+              <w:rPr>
+                <w:color w:val="475569"/>
+                <w:sz w:val="15"/>
+                <w:szCs w:val="15"/>
+              </w:rPr>
+              <w:t xml:space="preserve">Vérifier, sur des fichiers produits par deux bibliothèques TIERCES, qu'une fusion verticale voit sa valeur reprise sur toutes les lignes qu'elle couvre, qu'une fusion horizontale ne décale aucune colonne sans être recopiée dans les champs voisins, que les feuilles portent leur nom même quand le producteur écrit ses attributs dans un autre ordre qu'Excel, que les dates sont rendues lisibles, et qu'une formule sans valeur calculée est comptée et signalée.</w:t>
+            </w:r>
+          </w:p>
+        </w:tc>
+        <w:tc>
+          <w:tcPr>
+            <w:tcW w:type="pct" w:w="45%"/>
+            <w:tcMar>
+              <w:top w:type="dxa" w:w="80"/>
+              <w:left w:type="dxa" w:w="110"/>
+              <w:bottom w:type="dxa" w:w="80"/>
+              <w:right w:type="dxa" w:w="110"/>
+            </w:tcMar>
+          </w:tcPr>
+          <w:p>
+            <w:pPr>
+              <w:spacing w:after="0"/>
+            </w:pPr>
+            <w:r>
+              <w:rPr>
+                <w:sz w:val="17"/>
+                <w:szCs w:val="17"/>
+              </w:rPr>
+              <w:t xml:space="preserve">sur deux vecteurs produits par des bibliothèques TIERCES (openpyxl, docx) : feuilles nommées — le classeur d'openpyxl a révélé que les relations n'étaient lues que dans l'ordre d'attributs d'Excel, et que tout fichier venu d'un autre outil s'affichait « sheet1 » ; fusion verticale dépliée sur 3 lignes dans le classeur et 3 dans le document, chaque ligne gardant ses propres valeurs ; fusion horizontale non recopiée dans la colonne voisine et sans décalage de fin de ligne ; 5 dates rendues lisibles à la bonne origine de calendrier ; 2 formules sans valeur calculée comptées et signalées ; et aucune remarque sur un tableau qui n'a rien à signaler</w:t>
+            </w:r>
+          </w:p>
+        </w:tc>
+        <w:tc>
+          <w:tcPr>
+            <w:tcW w:type="pct" w:w="12%"/>
+            <w:tcMar>
+              <w:top w:type="dxa" w:w="80"/>
+              <w:left w:type="dxa" w:w="110"/>
+              <w:bottom w:type="dxa" w:w="80"/>
+              <w:right w:type="dxa" w:w="110"/>
+            </w:tcMar>
+          </w:tcPr>
+          <w:p>
+            <w:pPr>
+              <w:spacing w:after="40"/>
+            </w:pPr>
+            <w:r>
+              <w:rPr>
+                <w:b/>
+                <w:bCs/>
+                <w:color w:val="047857"/>
+                <w:sz w:val="17"/>
+                <w:szCs w:val="17"/>
+              </w:rPr>
+              <w:t xml:space="preserve">Conforme</w:t>
+            </w:r>
+          </w:p>
+          <w:p>
+            <w:pPr>
+              <w:spacing w:after="0"/>
+            </w:pPr>
+            <w:r>
+              <w:rPr>
+                <w:color w:val="475569"/>
+                <w:sz w:val="14"/>
+                <w:szCs w:val="14"/>
+              </w:rPr>
+              <w:t xml:space="preserve">8 ms</w:t>
+            </w:r>
+          </w:p>
+        </w:tc>
+      </w:tr>
+      <w:tr>
+        <w:tc>
+          <w:tcPr>
+            <w:tcW w:type="pct" w:w="13%"/>
+            <w:shd w:fill="F8FAFC"/>
+            <w:tcMar>
+              <w:top w:type="dxa" w:w="80"/>
+              <w:left w:type="dxa" w:w="110"/>
+              <w:bottom w:type="dxa" w:w="80"/>
+              <w:right w:type="dxa" w:w="110"/>
+            </w:tcMar>
+          </w:tcPr>
+          <w:p>
+            <w:pPr>
+              <w:spacing w:after="50"/>
+            </w:pPr>
+            <w:r>
+              <w:rPr>
+                <w:b/>
+                <w:bCs/>
+                <w:color w:val="4338CA"/>
+                <w:sz w:val="17"/>
+                <w:szCs w:val="17"/>
+              </w:rPr>
+              <w:t xml:space="preserve">OQ-41</w:t>
+            </w:r>
+          </w:p>
+          <w:p>
+            <w:pPr>
+              <w:spacing w:after="0"/>
+            </w:pPr>
+            <w:r>
+              <w:rPr>
+                <w:color w:val="475569"/>
+                <w:sz w:val="15"/>
+                <w:szCs w:val="15"/>
+              </w:rPr>
+              <w:t xml:space="preserve">URS-44</w:t>
+            </w:r>
+          </w:p>
+        </w:tc>
+        <w:tc>
+          <w:tcPr>
+            <w:tcW w:type="pct" w:w="30%"/>
+            <w:tcMar>
+              <w:top w:type="dxa" w:w="80"/>
+              <w:left w:type="dxa" w:w="110"/>
+              <w:bottom w:type="dxa" w:w="80"/>
+              <w:right w:type="dxa" w:w="110"/>
+            </w:tcMar>
+          </w:tcPr>
+          <w:p>
+            <w:pPr>
+              <w:spacing w:after="50"/>
+            </w:pPr>
+            <w:r>
+              <w:rPr>
+                <w:b/>
+                <w:bCs/>
+                <w:sz w:val="17"/>
+                <w:szCs w:val="17"/>
+              </w:rPr>
+              <w:t xml:space="preserve">Authentification déléguée : le jeton est vérifié, personne n'est créé, et la signature reste locale</w:t>
+            </w:r>
+          </w:p>
+          <w:p>
+            <w:pPr>
+              <w:spacing w:after="0"/>
+            </w:pPr>
+            <w:r>
+              <w:rPr>
+                <w:color w:val="475569"/>
+                <w:sz w:val="15"/>
+                <w:szCs w:val="15"/>
+              </w:rPr>
+              <w:t xml:space="preserve">Vérifier, sur des jetons FORGÉS pour l'occasion, qu'un jeton d'identité n'est accepté qu'après contrôle de sa signature RS256, de son émetteur, de son destinataire, de sa péremption et de son nonce ; que « alg: none » et la confusion d'algorithme sont refusées ; qu'une configuration incomplète ou en clair est traitée comme absente ; et — surtout — que le chemin de signature ne dépend d'aucun module d'authentification déléguée, de sorte que le second composant exigé par 21 CFR 11.200(a)(1) reste un secret local.</w:t>
+            </w:r>
+          </w:p>
+        </w:tc>
+        <w:tc>
+          <w:tcPr>
+            <w:tcW w:type="pct" w:w="45%"/>
+            <w:tcMar>
+              <w:top w:type="dxa" w:w="80"/>
+              <w:left w:type="dxa" w:w="110"/>
+              <w:bottom w:type="dxa" w:w="80"/>
+              <w:right w:type="dxa" w:w="110"/>
+            </w:tcMar>
+          </w:tcPr>
+          <w:p>
+            <w:pPr>
+              <w:spacing w:after="0"/>
+            </w:pPr>
+            <w:r>
+              <w:rPr>
+                <w:sz w:val="17"/>
+                <w:szCs w:val="17"/>
+              </w:rPr>
+              <w:t xml:space="preserve">jeton nominal accepté et adresse normalisée ; 15 jetons hostiles refusés, dont « alg: none », la confusion RS256/HS256, une signature d'une autre clé, une charge altérée après signature, un émetteur et un destinataire inattendus, des destinataires multiples sans partie autorisée, un jeton périmé, un nonce absent puis incorrect, et une adresse non vérifiée par l'annuaire ; configuration traitée comme absente si incomplète (4 variables éprouvées une à une) ou si l'émetteur n'est pas en HTTPS ; PKCE S256 dont le défi correspond à son vérifieur, state et nonce distincts et renouvelés à chaque demande ; 171 fichier(s) source relus, aucun module hors de la coque d'authentification ne dépend du SSO, la ré-authentification de signature vérifie toujours un secret LOCAL, et le retour d'annuaire ne crée aucune personne</w:t>
+            </w:r>
+          </w:p>
+        </w:tc>
+        <w:tc>
+          <w:tcPr>
+            <w:tcW w:type="pct" w:w="12%"/>
+            <w:tcMar>
+              <w:top w:type="dxa" w:w="80"/>
+              <w:left w:type="dxa" w:w="110"/>
+              <w:bottom w:type="dxa" w:w="80"/>
+              <w:right w:type="dxa" w:w="110"/>
+            </w:tcMar>
+          </w:tcPr>
+          <w:p>
+            <w:pPr>
+              <w:spacing w:after="40"/>
+            </w:pPr>
+            <w:r>
+              <w:rPr>
+                <w:b/>
+                <w:bCs/>
+                <w:color w:val="047857"/>
+                <w:sz w:val="17"/>
+                <w:szCs w:val="17"/>
+              </w:rPr>
+              <w:t xml:space="preserve">Conforme</w:t>
+            </w:r>
+          </w:p>
+          <w:p>
+            <w:pPr>
+              <w:spacing w:after="0"/>
+            </w:pPr>
+            <w:r>
+              <w:rPr>
+                <w:color w:val="475569"/>
+                <w:sz w:val="14"/>
+                <w:szCs w:val="14"/>
+              </w:rPr>
+              <w:t xml:space="preserve">112 ms</w:t>
+            </w:r>
+          </w:p>
+        </w:tc>
+      </w:tr>
+      <w:tr>
+        <w:tc>
+          <w:tcPr>
+            <w:tcW w:type="pct" w:w="13%"/>
+            <w:shd w:fill="F8FAFC"/>
+            <w:tcMar>
+              <w:top w:type="dxa" w:w="80"/>
+              <w:left w:type="dxa" w:w="110"/>
+              <w:bottom w:type="dxa" w:w="80"/>
+              <w:right w:type="dxa" w:w="110"/>
+            </w:tcMar>
+          </w:tcPr>
+          <w:p>
+            <w:pPr>
+              <w:spacing w:after="50"/>
+            </w:pPr>
+            <w:r>
+              <w:rPr>
+                <w:b/>
+                <w:bCs/>
+                <w:color w:val="4338CA"/>
+                <w:sz w:val="17"/>
+                <w:szCs w:val="17"/>
+              </w:rPr>
+              <w:t xml:space="preserve">OQ-42</w:t>
+            </w:r>
+          </w:p>
+          <w:p>
+            <w:pPr>
+              <w:spacing w:after="0"/>
+            </w:pPr>
+            <w:r>
+              <w:rPr>
+                <w:color w:val="475569"/>
+                <w:sz w:val="15"/>
+                <w:szCs w:val="15"/>
+              </w:rPr>
+              <w:t xml:space="preserve">URS-45</w:t>
+            </w:r>
+          </w:p>
+        </w:tc>
+        <w:tc>
+          <w:tcPr>
+            <w:tcW w:type="pct" w:w="30%"/>
+            <w:tcMar>
+              <w:top w:type="dxa" w:w="80"/>
+              <w:left w:type="dxa" w:w="110"/>
+              <w:bottom w:type="dxa" w:w="80"/>
+              <w:right w:type="dxa" w:w="110"/>
+            </w:tcMar>
+          </w:tcPr>
+          <w:p>
+            <w:pPr>
+              <w:spacing w:after="50"/>
+            </w:pPr>
+            <w:r>
+              <w:rPr>
+                <w:b/>
+                <w:bCs/>
+                <w:sz w:val="17"/>
+                <w:szCs w:val="17"/>
+              </w:rPr>
+              <w:t xml:space="preserve">Ce qui dépend du moteur de base est inventorié, et l'inventaire est relu sur la source</w:t>
+            </w:r>
+          </w:p>
+          <w:p>
+            <w:pPr>
+              <w:spacing w:after="0"/>
+            </w:pPr>
+            <w:r>
+              <w:rPr>
+                <w:color w:val="475569"/>
+                <w:sz w:val="15"/>
+                <w:szCs w:val="15"/>
+              </w:rPr>
+              <w:t xml:space="preserve">Vérifier qu'aucun point dépendant du moteur de base n'existe hors de l'inventaire déclaré, que le détecteur trouve réellement les points qu'il prétend surveiller — au premier rang desquels la lecture-puis-écriture de la tête de chaîne d'audit et son miroir de console —, et que la propriété du moteur sur laquelle repose la recherche est bien celle qui est documentée : constater l'insensibilité à la casse plutôt que la supposer.</w:t>
+            </w:r>
+          </w:p>
+        </w:tc>
+        <w:tc>
+          <w:tcPr>
+            <w:tcW w:type="pct" w:w="45%"/>
+            <w:tcMar>
+              <w:top w:type="dxa" w:w="80"/>
+              <w:left w:type="dxa" w:w="110"/>
+              <w:bottom w:type="dxa" w:w="80"/>
+              <w:right w:type="dxa" w:w="110"/>
+            </w:tcMar>
+          </w:tcPr>
+          <w:p>
+            <w:pPr>
+              <w:spacing w:after="0"/>
+            </w:pPr>
+            <w:r>
+              <w:rPr>
+                <w:sz w:val="17"/>
+                <w:szCs w:val="17"/>
+              </w:rPr>
+              <w:t xml:space="preserve">34 point(s) dépendant du moteur relevés sur la source et tous déclarés — 3 instruction(s) PRAGMA, 2 lecture(s)-puis-écriture de la tête de chaîne (le chaînage ET son miroir de console, ce second exemplaire ayant été trouvé par l'audit et non prévu), 27 recherche(s) par « contains », le fournisseur figé et la lignée de migrations ; l'insensibilité à la casse du moteur qualifié est CONSTATÉE et non supposée (1 = 1) ; le schéma annonce toujours « sqlite » et la note de portabilité dit que l'autre moteur n'est pas offert</w:t>
+            </w:r>
+          </w:p>
+        </w:tc>
+        <w:tc>
+          <w:tcPr>
+            <w:tcW w:type="pct" w:w="12%"/>
+            <w:tcMar>
+              <w:top w:type="dxa" w:w="80"/>
+              <w:left w:type="dxa" w:w="110"/>
+              <w:bottom w:type="dxa" w:w="80"/>
+              <w:right w:type="dxa" w:w="110"/>
+            </w:tcMar>
+          </w:tcPr>
+          <w:p>
+            <w:pPr>
+              <w:spacing w:after="40"/>
+            </w:pPr>
+            <w:r>
+              <w:rPr>
+                <w:b/>
+                <w:bCs/>
+                <w:color w:val="047857"/>
+                <w:sz w:val="17"/>
+                <w:szCs w:val="17"/>
+              </w:rPr>
+              <w:t xml:space="preserve">Conforme</w:t>
+            </w:r>
+          </w:p>
+          <w:p>
+            <w:pPr>
+              <w:spacing w:after="0"/>
+            </w:pPr>
+            <w:r>
+              <w:rPr>
+                <w:color w:val="475569"/>
+                <w:sz w:val="14"/>
+                <w:szCs w:val="14"/>
+              </w:rPr>
+              <w:t xml:space="preserve">58 ms</w:t>
+            </w:r>
+          </w:p>
+        </w:tc>
+      </w:tr>
+      <w:tr>
+        <w:tc>
+          <w:tcPr>
+            <w:tcW w:type="pct" w:w="13%"/>
+            <w:shd w:fill="F8FAFC"/>
+            <w:tcMar>
+              <w:top w:type="dxa" w:w="80"/>
+              <w:left w:type="dxa" w:w="110"/>
+              <w:bottom w:type="dxa" w:w="80"/>
+              <w:right w:type="dxa" w:w="110"/>
+            </w:tcMar>
+          </w:tcPr>
+          <w:p>
+            <w:pPr>
+              <w:spacing w:after="50"/>
+            </w:pPr>
+            <w:r>
+              <w:rPr>
+                <w:b/>
+                <w:bCs/>
+                <w:color w:val="4338CA"/>
+                <w:sz w:val="17"/>
+                <w:szCs w:val="17"/>
+              </w:rPr>
+              <w:t xml:space="preserve">OQ-43</w:t>
+            </w:r>
+          </w:p>
+          <w:p>
+            <w:pPr>
+              <w:spacing w:after="0"/>
+            </w:pPr>
+            <w:r>
+              <w:rPr>
+                <w:color w:val="475569"/>
+                <w:sz w:val="15"/>
+                <w:szCs w:val="15"/>
+              </w:rPr>
+              <w:t xml:space="preserve">URS-46</w:t>
+            </w:r>
+          </w:p>
+        </w:tc>
+        <w:tc>
+          <w:tcPr>
+            <w:tcW w:type="pct" w:w="30%"/>
+            <w:tcMar>
+              <w:top w:type="dxa" w:w="80"/>
+              <w:left w:type="dxa" w:w="110"/>
+              <w:bottom w:type="dxa" w:w="80"/>
+              <w:right w:type="dxa" w:w="110"/>
+            </w:tcMar>
+          </w:tcPr>
+          <w:p>
+            <w:pPr>
+              <w:spacing w:after="50"/>
+            </w:pPr>
+            <w:r>
+              <w:rPr>
+                <w:b/>
+                <w:bCs/>
+                <w:sz w:val="17"/>
+                <w:szCs w:val="17"/>
+              </w:rPr>
+              <w:t xml:space="preserve">API en lecture seule : aucune écriture dans le graphe, jeton conservé par son empreinte, réponse refaisable</w:t>
+            </w:r>
+          </w:p>
+          <w:p>
+            <w:pPr>
+              <w:spacing w:after="0"/>
+            </w:pPr>
+            <w:r>
+              <w:rPr>
+                <w:color w:val="475569"/>
+                <w:sz w:val="15"/>
+                <w:szCs w:val="15"/>
+              </w:rPr>
+              <w:t xml:space="preserve">Vérifier en relisant la source qu'aucune route de l'API n'écrit dans le graphe de conception et que toutes passent par la garde unique ; qu'un jeton est refusé absent, mal formé, inconnu puis révoqué, sans que la réponse distingue ces cas ; qu'il n'est conservé que par son empreinte ; et qu'une réponse permet à son destinataire de REFAIRE l'empreinte annoncée en appliquant à la lettre la règle écrite dans la réponse.</w:t>
+            </w:r>
+          </w:p>
+        </w:tc>
+        <w:tc>
+          <w:tcPr>
+            <w:tcW w:type="pct" w:w="45%"/>
+            <w:tcMar>
+              <w:top w:type="dxa" w:w="80"/>
+              <w:left w:type="dxa" w:w="110"/>
+              <w:bottom w:type="dxa" w:w="80"/>
+              <w:right w:type="dxa" w:w="110"/>
+            </w:tcMar>
+          </w:tcPr>
+          <w:p>
+            <w:pPr>
+              <w:spacing w:after="0"/>
+            </w:pPr>
+            <w:r>
+              <w:rPr>
+                <w:sz w:val="17"/>
+                <w:szCs w:val="17"/>
+              </w:rPr>
+              <w:t xml:space="preserve">4 route(s) d'API relues : aucune n'écrit en base et toutes passent par la garde unique ; le module de jetons n'écrit que sur les jetons eux-mêmes (émission et date de dernier usage) ; un jeton est refusé absent, vide, sans schéma Bearer, mal formé, sans préfixe, inconnu, puis révoqué — et le refus ne distingue aucun de ces cas ; le jeton n'est conservé que par son empreinte SHA-256, sa valeur en clair n'existe nulle part en base ; l'empreinte annoncée d'une réponse se REFAIT en appliquant à la lettre la règle écrite dans cette réponse, échappements compris ; et son ancrage désigne bien la tête de chaîne d'audit à l'instant de l'extraction (rang 85). 3 ressources publiées.</w:t>
+            </w:r>
+          </w:p>
+        </w:tc>
+        <w:tc>
+          <w:tcPr>
+            <w:tcW w:type="pct" w:w="12%"/>
+            <w:tcMar>
+              <w:top w:type="dxa" w:w="80"/>
+              <w:left w:type="dxa" w:w="110"/>
+              <w:bottom w:type="dxa" w:w="80"/>
+              <w:right w:type="dxa" w:w="110"/>
+            </w:tcMar>
+          </w:tcPr>
+          <w:p>
+            <w:pPr>
+              <w:spacing w:after="40"/>
+            </w:pPr>
+            <w:r>
+              <w:rPr>
+                <w:b/>
+                <w:bCs/>
+                <w:color w:val="047857"/>
+                <w:sz w:val="17"/>
+                <w:szCs w:val="17"/>
+              </w:rPr>
+              <w:t xml:space="preserve">Conforme</w:t>
+            </w:r>
+          </w:p>
+          <w:p>
+            <w:pPr>
+              <w:spacing w:after="0"/>
+            </w:pPr>
+            <w:r>
+              <w:rPr>
+                <w:color w:val="475569"/>
+                <w:sz w:val="14"/>
+                <w:szCs w:val="14"/>
+              </w:rPr>
+              <w:t xml:space="preserve">18 ms</w:t>
+            </w:r>
+          </w:p>
+        </w:tc>
+      </w:tr>
+      <w:tr>
+        <w:tc>
+          <w:tcPr>
+            <w:tcW w:type="pct" w:w="13%"/>
+            <w:shd w:fill="F8FAFC"/>
+            <w:tcMar>
+              <w:top w:type="dxa" w:w="80"/>
+              <w:left w:type="dxa" w:w="110"/>
+              <w:bottom w:type="dxa" w:w="80"/>
+              <w:right w:type="dxa" w:w="110"/>
+            </w:tcMar>
+          </w:tcPr>
+          <w:p>
+            <w:pPr>
+              <w:spacing w:after="50"/>
+            </w:pPr>
+            <w:r>
+              <w:rPr>
+                <w:b/>
+                <w:bCs/>
+                <w:color w:val="4338CA"/>
+                <w:sz w:val="17"/>
+                <w:szCs w:val="17"/>
+              </w:rPr>
+              <w:t xml:space="preserve">OQ-44</w:t>
+            </w:r>
+          </w:p>
+          <w:p>
+            <w:pPr>
+              <w:spacing w:after="0"/>
+            </w:pPr>
+            <w:r>
+              <w:rPr>
+                <w:color w:val="475569"/>
+                <w:sz w:val="15"/>
+                <w:szCs w:val="15"/>
+              </w:rPr>
+              <w:t xml:space="preserve">URS-47</w:t>
+            </w:r>
+          </w:p>
+        </w:tc>
+        <w:tc>
+          <w:tcPr>
+            <w:tcW w:type="pct" w:w="30%"/>
+            <w:tcMar>
+              <w:top w:type="dxa" w:w="80"/>
+              <w:left w:type="dxa" w:w="110"/>
+              <w:bottom w:type="dxa" w:w="80"/>
+              <w:right w:type="dxa" w:w="110"/>
+            </w:tcMar>
+          </w:tcPr>
+          <w:p>
+            <w:pPr>
+              <w:spacing w:after="50"/>
+            </w:pPr>
+            <w:r>
+              <w:rPr>
+                <w:b/>
+                <w:bCs/>
+                <w:sz w:val="17"/>
+                <w:szCs w:val="17"/>
+              </w:rPr>
+              <w:t xml:space="preserve">Conformité PDF/A prononcée par l'implémentation de référence, témoin à l'appui</w:t>
+            </w:r>
+          </w:p>
+          <w:p>
+            <w:pPr>
+              <w:spacing w:after="0"/>
+            </w:pPr>
+            <w:r>
+              <w:rPr>
+                <w:color w:val="475569"/>
+                <w:sz w:val="15"/>
+                <w:szCs w:val="15"/>
+              </w:rPr>
+              <w:t xml:space="preserve">Soumettre à veraPDF — l'implémentation de référence, extérieure à ce projet — un document bâti pour la mettre en défaut, et EXIGER d'abord qu'elle rejette un fichier délibérément non conforme. Un validateur qui ne sait plus dire « non » rendrait un vert permanent ; le témoin est donc contrôlé avant tout le reste, et son succès invaliderait l'exécution entière.</w:t>
+            </w:r>
+          </w:p>
+        </w:tc>
+        <w:tc>
+          <w:tcPr>
+            <w:tcW w:type="pct" w:w="45%"/>
+            <w:tcMar>
+              <w:top w:type="dxa" w:w="80"/>
+              <w:left w:type="dxa" w:w="110"/>
+              <w:bottom w:type="dxa" w:w="80"/>
+              <w:right w:type="dxa" w:w="110"/>
+            </w:tcMar>
+          </w:tcPr>
+          <w:p>
+            <w:pPr>
+              <w:spacing w:after="0"/>
+            </w:pPr>
+            <w:r>
+              <w:rPr>
+                <w:sz w:val="17"/>
+                <w:szCs w:val="17"/>
+              </w:rPr>
+              <w:t xml:space="preserve">veraPDF 1.30.2 a rendu deux verdicts sur des fichiers produits pendant ce cas. Le témoin — police non embarquée, sans intention de sortie ni métadonnées XMP, écrit octet par octet sans passer par les modules de Filum — est REJETÉ sur 5 règle(s) : la mesure discrimine. Le document de torture, qui rassemble 7 familles de caractères (chimie, grec, mathématiques, fractions, unités, idéogrammes, emoji, diacritiques) et a exercé 30 substitution(s) de glyphes absents, est déclaré CONFORME au profil PDF/A-2b. Le contrôle structurel interne rend le même verdict sur le même fichier, et confirme zéro renvoi au glyphe .notdef.</w:t>
+            </w:r>
+          </w:p>
+        </w:tc>
+        <w:tc>
+          <w:tcPr>
+            <w:tcW w:type="pct" w:w="12%"/>
+            <w:tcMar>
+              <w:top w:type="dxa" w:w="80"/>
+              <w:left w:type="dxa" w:w="110"/>
+              <w:bottom w:type="dxa" w:w="80"/>
+              <w:right w:type="dxa" w:w="110"/>
+            </w:tcMar>
+          </w:tcPr>
+          <w:p>
+            <w:pPr>
+              <w:spacing w:after="40"/>
+            </w:pPr>
+            <w:r>
+              <w:rPr>
+                <w:b/>
+                <w:bCs/>
+                <w:color w:val="047857"/>
+                <w:sz w:val="17"/>
+                <w:szCs w:val="17"/>
+              </w:rPr>
+              <w:t xml:space="preserve">Conforme</w:t>
+            </w:r>
+          </w:p>
+          <w:p>
+            <w:pPr>
+              <w:spacing w:after="0"/>
+            </w:pPr>
+            <w:r>
+              <w:rPr>
+                <w:color w:val="475569"/>
+                <w:sz w:val="14"/>
+                <w:szCs w:val="14"/>
+              </w:rPr>
+              <w:t xml:space="preserve">3546 ms</w:t>
             </w:r>
           </w:p>
         </w:tc>
@@ -14042,6 +15827,545 @@
           </w:p>
         </w:tc>
       </w:tr>
+      <w:tr>
+        <w:tc>
+          <w:tcPr>
+            <w:tcW w:type="pct" w:w="12%"/>
+            <w:tcMar>
+              <w:top w:type="dxa" w:w="80"/>
+              <w:left w:type="dxa" w:w="110"/>
+              <w:bottom w:type="dxa" w:w="80"/>
+              <w:right w:type="dxa" w:w="110"/>
+            </w:tcMar>
+          </w:tcPr>
+          <w:p>
+            <w:pPr>
+              <w:spacing w:after="0"/>
+            </w:pPr>
+            <w:r>
+              <w:rPr>
+                <w:b/>
+                <w:bCs/>
+                <w:color w:val="4338CA"/>
+                <w:sz w:val="17"/>
+                <w:szCs w:val="17"/>
+              </w:rPr>
+              <w:t xml:space="preserve">URS-41</w:t>
+            </w:r>
+          </w:p>
+        </w:tc>
+        <w:tc>
+          <w:tcPr>
+            <w:tcW w:type="pct" w:w="22%"/>
+            <w:tcMar>
+              <w:top w:type="dxa" w:w="80"/>
+              <w:left w:type="dxa" w:w="110"/>
+              <w:bottom w:type="dxa" w:w="80"/>
+              <w:right w:type="dxa" w:w="110"/>
+            </w:tcMar>
+          </w:tcPr>
+          <w:p>
+            <w:pPr>
+              <w:spacing w:after="0"/>
+            </w:pPr>
+            <w:r>
+              <w:rPr>
+                <w:b/>
+                <w:bCs/>
+                <w:color w:val="047857"/>
+                <w:sz w:val="17"/>
+                <w:szCs w:val="17"/>
+              </w:rPr>
+              <w:t xml:space="preserve">OQ-38</w:t>
+            </w:r>
+          </w:p>
+        </w:tc>
+        <w:tc>
+          <w:tcPr>
+            <w:tcW w:type="pct" w:w="66%"/>
+            <w:tcMar>
+              <w:top w:type="dxa" w:w="80"/>
+              <w:left w:type="dxa" w:w="110"/>
+              <w:bottom w:type="dxa" w:w="80"/>
+              <w:right w:type="dxa" w:w="110"/>
+            </w:tcMar>
+          </w:tcPr>
+          <w:p>
+            <w:pPr>
+              <w:spacing w:after="0"/>
+            </w:pPr>
+            <w:r>
+              <w:rPr>
+                <w:sz w:val="17"/>
+                <w:szCs w:val="17"/>
+              </w:rPr>
+              <w:t xml:space="preserve">Cas de test automatisé exécuté par l'éditeur à chaque version, résultat en section 5.1.</w:t>
+            </w:r>
+          </w:p>
+        </w:tc>
+      </w:tr>
+      <w:tr>
+        <w:tc>
+          <w:tcPr>
+            <w:tcW w:type="pct" w:w="12%"/>
+            <w:tcMar>
+              <w:top w:type="dxa" w:w="80"/>
+              <w:left w:type="dxa" w:w="110"/>
+              <w:bottom w:type="dxa" w:w="80"/>
+              <w:right w:type="dxa" w:w="110"/>
+            </w:tcMar>
+          </w:tcPr>
+          <w:p>
+            <w:pPr>
+              <w:spacing w:after="0"/>
+            </w:pPr>
+            <w:r>
+              <w:rPr>
+                <w:b/>
+                <w:bCs/>
+                <w:color w:val="4338CA"/>
+                <w:sz w:val="17"/>
+                <w:szCs w:val="17"/>
+              </w:rPr>
+              <w:t xml:space="preserve">URS-42</w:t>
+            </w:r>
+          </w:p>
+        </w:tc>
+        <w:tc>
+          <w:tcPr>
+            <w:tcW w:type="pct" w:w="22%"/>
+            <w:tcMar>
+              <w:top w:type="dxa" w:w="80"/>
+              <w:left w:type="dxa" w:w="110"/>
+              <w:bottom w:type="dxa" w:w="80"/>
+              <w:right w:type="dxa" w:w="110"/>
+            </w:tcMar>
+          </w:tcPr>
+          <w:p>
+            <w:pPr>
+              <w:spacing w:after="0"/>
+            </w:pPr>
+            <w:r>
+              <w:rPr>
+                <w:b/>
+                <w:bCs/>
+                <w:color w:val="047857"/>
+                <w:sz w:val="17"/>
+                <w:szCs w:val="17"/>
+              </w:rPr>
+              <w:t xml:space="preserve">OQ-39</w:t>
+            </w:r>
+          </w:p>
+        </w:tc>
+        <w:tc>
+          <w:tcPr>
+            <w:tcW w:type="pct" w:w="66%"/>
+            <w:tcMar>
+              <w:top w:type="dxa" w:w="80"/>
+              <w:left w:type="dxa" w:w="110"/>
+              <w:bottom w:type="dxa" w:w="80"/>
+              <w:right w:type="dxa" w:w="110"/>
+            </w:tcMar>
+          </w:tcPr>
+          <w:p>
+            <w:pPr>
+              <w:spacing w:after="0"/>
+            </w:pPr>
+            <w:r>
+              <w:rPr>
+                <w:sz w:val="17"/>
+                <w:szCs w:val="17"/>
+              </w:rPr>
+              <w:t xml:space="preserve">Cas de test automatisé exécuté par l'éditeur à chaque version, résultat en section 5.1.</w:t>
+            </w:r>
+          </w:p>
+        </w:tc>
+      </w:tr>
+      <w:tr>
+        <w:tc>
+          <w:tcPr>
+            <w:tcW w:type="pct" w:w="12%"/>
+            <w:tcMar>
+              <w:top w:type="dxa" w:w="80"/>
+              <w:left w:type="dxa" w:w="110"/>
+              <w:bottom w:type="dxa" w:w="80"/>
+              <w:right w:type="dxa" w:w="110"/>
+            </w:tcMar>
+          </w:tcPr>
+          <w:p>
+            <w:pPr>
+              <w:spacing w:after="0"/>
+            </w:pPr>
+            <w:r>
+              <w:rPr>
+                <w:b/>
+                <w:bCs/>
+                <w:color w:val="4338CA"/>
+                <w:sz w:val="17"/>
+                <w:szCs w:val="17"/>
+              </w:rPr>
+              <w:t xml:space="preserve">URS-43</w:t>
+            </w:r>
+          </w:p>
+        </w:tc>
+        <w:tc>
+          <w:tcPr>
+            <w:tcW w:type="pct" w:w="22%"/>
+            <w:tcMar>
+              <w:top w:type="dxa" w:w="80"/>
+              <w:left w:type="dxa" w:w="110"/>
+              <w:bottom w:type="dxa" w:w="80"/>
+              <w:right w:type="dxa" w:w="110"/>
+            </w:tcMar>
+          </w:tcPr>
+          <w:p>
+            <w:pPr>
+              <w:spacing w:after="0"/>
+            </w:pPr>
+            <w:r>
+              <w:rPr>
+                <w:b/>
+                <w:bCs/>
+                <w:color w:val="047857"/>
+                <w:sz w:val="17"/>
+                <w:szCs w:val="17"/>
+              </w:rPr>
+              <w:t xml:space="preserve">OQ-40</w:t>
+            </w:r>
+          </w:p>
+        </w:tc>
+        <w:tc>
+          <w:tcPr>
+            <w:tcW w:type="pct" w:w="66%"/>
+            <w:tcMar>
+              <w:top w:type="dxa" w:w="80"/>
+              <w:left w:type="dxa" w:w="110"/>
+              <w:bottom w:type="dxa" w:w="80"/>
+              <w:right w:type="dxa" w:w="110"/>
+            </w:tcMar>
+          </w:tcPr>
+          <w:p>
+            <w:pPr>
+              <w:spacing w:after="0"/>
+            </w:pPr>
+            <w:r>
+              <w:rPr>
+                <w:sz w:val="17"/>
+                <w:szCs w:val="17"/>
+              </w:rPr>
+              <w:t xml:space="preserve">Cas de test automatisé exécuté par l'éditeur à chaque version, résultat en section 5.1.</w:t>
+            </w:r>
+          </w:p>
+        </w:tc>
+      </w:tr>
+      <w:tr>
+        <w:tc>
+          <w:tcPr>
+            <w:tcW w:type="pct" w:w="12%"/>
+            <w:tcMar>
+              <w:top w:type="dxa" w:w="80"/>
+              <w:left w:type="dxa" w:w="110"/>
+              <w:bottom w:type="dxa" w:w="80"/>
+              <w:right w:type="dxa" w:w="110"/>
+            </w:tcMar>
+          </w:tcPr>
+          <w:p>
+            <w:pPr>
+              <w:spacing w:after="0"/>
+            </w:pPr>
+            <w:r>
+              <w:rPr>
+                <w:b/>
+                <w:bCs/>
+                <w:color w:val="4338CA"/>
+                <w:sz w:val="17"/>
+                <w:szCs w:val="17"/>
+              </w:rPr>
+              <w:t xml:space="preserve">URS-44</w:t>
+            </w:r>
+          </w:p>
+        </w:tc>
+        <w:tc>
+          <w:tcPr>
+            <w:tcW w:type="pct" w:w="22%"/>
+            <w:tcMar>
+              <w:top w:type="dxa" w:w="80"/>
+              <w:left w:type="dxa" w:w="110"/>
+              <w:bottom w:type="dxa" w:w="80"/>
+              <w:right w:type="dxa" w:w="110"/>
+            </w:tcMar>
+          </w:tcPr>
+          <w:p>
+            <w:pPr>
+              <w:spacing w:after="0"/>
+            </w:pPr>
+            <w:r>
+              <w:rPr>
+                <w:b/>
+                <w:bCs/>
+                <w:color w:val="047857"/>
+                <w:sz w:val="17"/>
+                <w:szCs w:val="17"/>
+              </w:rPr>
+              <w:t xml:space="preserve">OQ-41</w:t>
+            </w:r>
+          </w:p>
+        </w:tc>
+        <w:tc>
+          <w:tcPr>
+            <w:tcW w:type="pct" w:w="66%"/>
+            <w:tcMar>
+              <w:top w:type="dxa" w:w="80"/>
+              <w:left w:type="dxa" w:w="110"/>
+              <w:bottom w:type="dxa" w:w="80"/>
+              <w:right w:type="dxa" w:w="110"/>
+            </w:tcMar>
+          </w:tcPr>
+          <w:p>
+            <w:pPr>
+              <w:spacing w:after="0"/>
+            </w:pPr>
+            <w:r>
+              <w:rPr>
+                <w:sz w:val="17"/>
+                <w:szCs w:val="17"/>
+              </w:rPr>
+              <w:t xml:space="preserve">Cas de test automatisé exécuté par l'éditeur à chaque version, résultat en section 5.1.</w:t>
+            </w:r>
+          </w:p>
+        </w:tc>
+      </w:tr>
+      <w:tr>
+        <w:tc>
+          <w:tcPr>
+            <w:tcW w:type="pct" w:w="12%"/>
+            <w:tcMar>
+              <w:top w:type="dxa" w:w="80"/>
+              <w:left w:type="dxa" w:w="110"/>
+              <w:bottom w:type="dxa" w:w="80"/>
+              <w:right w:type="dxa" w:w="110"/>
+            </w:tcMar>
+          </w:tcPr>
+          <w:p>
+            <w:pPr>
+              <w:spacing w:after="0"/>
+            </w:pPr>
+            <w:r>
+              <w:rPr>
+                <w:b/>
+                <w:bCs/>
+                <w:color w:val="4338CA"/>
+                <w:sz w:val="17"/>
+                <w:szCs w:val="17"/>
+              </w:rPr>
+              <w:t xml:space="preserve">URS-45</w:t>
+            </w:r>
+          </w:p>
+        </w:tc>
+        <w:tc>
+          <w:tcPr>
+            <w:tcW w:type="pct" w:w="22%"/>
+            <w:tcMar>
+              <w:top w:type="dxa" w:w="80"/>
+              <w:left w:type="dxa" w:w="110"/>
+              <w:bottom w:type="dxa" w:w="80"/>
+              <w:right w:type="dxa" w:w="110"/>
+            </w:tcMar>
+          </w:tcPr>
+          <w:p>
+            <w:pPr>
+              <w:spacing w:after="0"/>
+            </w:pPr>
+            <w:r>
+              <w:rPr>
+                <w:b/>
+                <w:bCs/>
+                <w:color w:val="047857"/>
+                <w:sz w:val="17"/>
+                <w:szCs w:val="17"/>
+              </w:rPr>
+              <w:t xml:space="preserve">OQ-42</w:t>
+            </w:r>
+          </w:p>
+        </w:tc>
+        <w:tc>
+          <w:tcPr>
+            <w:tcW w:type="pct" w:w="66%"/>
+            <w:tcMar>
+              <w:top w:type="dxa" w:w="80"/>
+              <w:left w:type="dxa" w:w="110"/>
+              <w:bottom w:type="dxa" w:w="80"/>
+              <w:right w:type="dxa" w:w="110"/>
+            </w:tcMar>
+          </w:tcPr>
+          <w:p>
+            <w:pPr>
+              <w:spacing w:after="0"/>
+            </w:pPr>
+            <w:r>
+              <w:rPr>
+                <w:sz w:val="17"/>
+                <w:szCs w:val="17"/>
+              </w:rPr>
+              <w:t xml:space="preserve">Cas de test automatisé exécuté par l'éditeur à chaque version, résultat en section 5.1.</w:t>
+            </w:r>
+          </w:p>
+        </w:tc>
+      </w:tr>
+      <w:tr>
+        <w:tc>
+          <w:tcPr>
+            <w:tcW w:type="pct" w:w="12%"/>
+            <w:tcMar>
+              <w:top w:type="dxa" w:w="80"/>
+              <w:left w:type="dxa" w:w="110"/>
+              <w:bottom w:type="dxa" w:w="80"/>
+              <w:right w:type="dxa" w:w="110"/>
+            </w:tcMar>
+          </w:tcPr>
+          <w:p>
+            <w:pPr>
+              <w:spacing w:after="0"/>
+            </w:pPr>
+            <w:r>
+              <w:rPr>
+                <w:b/>
+                <w:bCs/>
+                <w:color w:val="4338CA"/>
+                <w:sz w:val="17"/>
+                <w:szCs w:val="17"/>
+              </w:rPr>
+              <w:t xml:space="preserve">URS-46</w:t>
+            </w:r>
+          </w:p>
+        </w:tc>
+        <w:tc>
+          <w:tcPr>
+            <w:tcW w:type="pct" w:w="22%"/>
+            <w:tcMar>
+              <w:top w:type="dxa" w:w="80"/>
+              <w:left w:type="dxa" w:w="110"/>
+              <w:bottom w:type="dxa" w:w="80"/>
+              <w:right w:type="dxa" w:w="110"/>
+            </w:tcMar>
+          </w:tcPr>
+          <w:p>
+            <w:pPr>
+              <w:spacing w:after="0"/>
+            </w:pPr>
+            <w:r>
+              <w:rPr>
+                <w:b/>
+                <w:bCs/>
+                <w:color w:val="047857"/>
+                <w:sz w:val="17"/>
+                <w:szCs w:val="17"/>
+              </w:rPr>
+              <w:t xml:space="preserve">OQ-43</w:t>
+            </w:r>
+          </w:p>
+        </w:tc>
+        <w:tc>
+          <w:tcPr>
+            <w:tcW w:type="pct" w:w="66%"/>
+            <w:tcMar>
+              <w:top w:type="dxa" w:w="80"/>
+              <w:left w:type="dxa" w:w="110"/>
+              <w:bottom w:type="dxa" w:w="80"/>
+              <w:right w:type="dxa" w:w="110"/>
+            </w:tcMar>
+          </w:tcPr>
+          <w:p>
+            <w:pPr>
+              <w:spacing w:after="0"/>
+            </w:pPr>
+            <w:r>
+              <w:rPr>
+                <w:sz w:val="17"/>
+                <w:szCs w:val="17"/>
+              </w:rPr>
+              <w:t xml:space="preserve">Cas de test automatisé exécuté par l'éditeur à chaque version, résultat en section 5.1.</w:t>
+            </w:r>
+          </w:p>
+        </w:tc>
+      </w:tr>
+      <w:tr>
+        <w:tc>
+          <w:tcPr>
+            <w:tcW w:type="pct" w:w="12%"/>
+            <w:tcMar>
+              <w:top w:type="dxa" w:w="80"/>
+              <w:left w:type="dxa" w:w="110"/>
+              <w:bottom w:type="dxa" w:w="80"/>
+              <w:right w:type="dxa" w:w="110"/>
+            </w:tcMar>
+          </w:tcPr>
+          <w:p>
+            <w:pPr>
+              <w:spacing w:after="0"/>
+            </w:pPr>
+            <w:r>
+              <w:rPr>
+                <w:b/>
+                <w:bCs/>
+                <w:color w:val="4338CA"/>
+                <w:sz w:val="17"/>
+                <w:szCs w:val="17"/>
+              </w:rPr>
+              <w:t xml:space="preserve">URS-47</w:t>
+            </w:r>
+          </w:p>
+        </w:tc>
+        <w:tc>
+          <w:tcPr>
+            <w:tcW w:type="pct" w:w="22%"/>
+            <w:tcMar>
+              <w:top w:type="dxa" w:w="80"/>
+              <w:left w:type="dxa" w:w="110"/>
+              <w:bottom w:type="dxa" w:w="80"/>
+              <w:right w:type="dxa" w:w="110"/>
+            </w:tcMar>
+          </w:tcPr>
+          <w:p>
+            <w:pPr>
+              <w:spacing w:after="0"/>
+            </w:pPr>
+            <w:r>
+              <w:rPr>
+                <w:b/>
+                <w:bCs/>
+                <w:color w:val="047857"/>
+                <w:sz w:val="17"/>
+                <w:szCs w:val="17"/>
+              </w:rPr>
+              <w:t xml:space="preserve">OQ-44</w:t>
+            </w:r>
+          </w:p>
+        </w:tc>
+        <w:tc>
+          <w:tcPr>
+            <w:tcW w:type="pct" w:w="66%"/>
+            <w:tcMar>
+              <w:top w:type="dxa" w:w="80"/>
+              <w:left w:type="dxa" w:w="110"/>
+              <w:bottom w:type="dxa" w:w="80"/>
+              <w:right w:type="dxa" w:w="110"/>
+            </w:tcMar>
+          </w:tcPr>
+          <w:p>
+            <w:pPr>
+              <w:spacing w:after="0"/>
+            </w:pPr>
+            <w:r>
+              <w:rPr>
+                <w:sz w:val="17"/>
+                <w:szCs w:val="17"/>
+              </w:rPr>
+              <w:t xml:space="preserve">Cas de test automatisé exécuté par l'éditeur à chaque version, résultat en section 5.1.</w:t>
+            </w:r>
+          </w:p>
+        </w:tc>
+      </w:tr>
     </w:tbl>
     <w:p>
       <w:pPr>
@@ -14061,7 +16385,7 @@
           <w:sz w:val="20"/>
           <w:szCs w:val="20"/>
         </w:rPr>
-        <w:t xml:space="preserve">Sur les 40 exigences, 36 sont vérifiées automatiquement par l'éditeur et 4 doivent l'être chez vous. Ce n'est pas un partage arbitraire : ces 4 exigences ne sont pas observables sans navigateur, sans requête HTTP ou sans votre infrastructure. Les compter comme couvertes serait une affirmation invérifiable.</w:t>
+        <w:t xml:space="preserve">Sur les 47 exigences, 43 sont vérifiées automatiquement par l'éditeur et 4 doivent l'être chez vous. Ce n'est pas un partage arbitraire : ces 4 exigences ne sont pas observables sans navigateur, sans requête HTTP ou sans votre infrastructure. Les compter comme couvertes serait une affirmation invérifiable.</w:t>
       </w:r>
     </w:p>
     <w:p>
@@ -14307,7 +16631,7 @@
           <w:sz w:val="20"/>
           <w:szCs w:val="20"/>
         </w:rPr>
-        <w:t xml:space="preserve">— Les copies d'archivage sont produites au format PDF/A-2b et contrôlées par nos propres vérifications structurelles, rejouées à chaque version : police et profil colorimétrique embarqués, métadonnées de conformité, table de références croisées exacte, texte retraduisible par la table du fichier. Aucun VALIDATEUR INDÉPENDANT — veraPDF, l'implémentation de référence — n'a été exécuté sur ces sorties. Le format est donc visé et contrôlé, pas certifié.</w:t>
+        <w:t xml:space="preserve">— Les copies d'archivage sont produites au format PDF/A-2b et validées par veraPDF 1.30.2, l'implémentation de référence, exécutée sur une archive complète et sur un document de torture bâti pour la faire échouer ; le harnais porte un témoin non conforme et refuse de conclure si le validateur le laisse passer. Ce contrôle a trouvé, à sa première exécution, deux non-conformités que nos propres vérifications ne voyaient pas. LE FORMAT EST VALIDÉ, PAS CERTIFIÉ : un validateur conforme n'est pas un organisme notifié, et l'affirmation porte sur cette version du validateur et sur ce corpus. LIMITE SUBSISTANTE : la police embarquée ne couvre pas l'alphabet grec ; les caractères qu'elle ne dessine pas sont remplacés, et chaque copie DÉCLARE lesquels dans une table dédiée.</w:t>
       </w:r>
     </w:p>
     <w:sectPr>
@@ -14413,7 +16737,7 @@
         <w:sz w:val="15"/>
         <w:szCs w:val="15"/>
       </w:rPr>
-      <w:t xml:space="preserve">   ·   Version 1.2.1 · rapport OQ exécuté le 7 août 2026 à 10:24 UTC</w:t>
+      <w:t xml:space="preserve">   ·   Version 1.2.1 · rapport OQ exécuté le 9 août 2026 à 11:08 UTC</w:t>
     </w:r>
   </w:p>
 </w:ftr>

</xml_diff>

<commit_message>
Site : le dossier de validation dit la nouvelle limite PDF/A
La police embarquée dans les copies d'archivage couvre désormais l'alphabet du
domaine — grec, opérateurs, exposants, fractions, flèches. Le paragraphe de limite
du dossier téléchargeable ne parle plus d'un grec absent mais de ce qui reste
réellement hors couverture : idéogrammes, cyrillique, emoji couleur, tous remplacés
et déclarés dans chaque copie.

Co-Authored-By: Claude Opus 5 <noreply@anthropic.com>
</commit_message>
<xml_diff>
--- a/docs/Dossier_de_validation_Filum.docx
+++ b/docs/Dossier_de_validation_Filum.docx
@@ -6038,7 +6038,7 @@
                 <w:sz w:val="17"/>
                 <w:szCs w:val="17"/>
               </w:rPr>
-              <w:t xml:space="preserve">9 août 2026 à 11:08</w:t>
+              <w:t xml:space="preserve">9 août 2026 à 11:54</w:t>
             </w:r>
           </w:p>
         </w:tc>
@@ -6620,7 +6620,7 @@
                 <w:sz w:val="17"/>
                 <w:szCs w:val="17"/>
               </w:rPr>
-              <w:t xml:space="preserve">empreintes distinctes pour un même mot de passe (fa821c43cdaa… ≠ a05851cac422…), vérification correcte, mot de passe faux et vide refusés</w:t>
+              <w:t xml:space="preserve">empreintes distinctes pour un même mot de passe (cca89a0dbae2… ≠ db67db189192…), vérification correcte, mot de passe faux et vide refusés</w:t>
             </w:r>
           </w:p>
         </w:tc>
@@ -6904,7 +6904,7 @@
                 <w:sz w:val="17"/>
                 <w:szCs w:val="17"/>
               </w:rPr>
-              <w:t xml:space="preserve">contenu gelé, empreinte 24604eb157d7fa54…, 10486 octets conservés, opération journalisée</w:t>
+              <w:t xml:space="preserve">contenu gelé, empreinte 24604eb157d7fa54…, 10485 octets conservés, opération journalisée</w:t>
             </w:r>
           </w:p>
         </w:tc>
@@ -6943,7 +6943,7 @@
                 <w:sz w:val="14"/>
                 <w:szCs w:val="14"/>
               </w:rPr>
-              <w:t xml:space="preserve">123 ms</w:t>
+              <w:t xml:space="preserve">121 ms</w:t>
             </w:r>
           </w:p>
         </w:tc>
@@ -7046,7 +7046,7 @@
                 <w:sz w:val="17"/>
                 <w:szCs w:val="17"/>
               </w:rPr>
-              <w:t xml:space="preserve">signature liée à l'instantané cmslp8xj…, empreinte attestée 3767 CD80 ACC9, manifestation « Testeur QA1 (QA1) · Approuvé · 09/08/2026 11:08:32 UTC · enregistrement 3767 CD80 ACC9 »</w:t>
+              <w:t xml:space="preserve">signature liée à l'instantané cmslqw5e…, empreinte attestée 3767 CD80 ACC9, manifestation « Testeur QA1 (QA1) · Approuvé · 09/08/2026 11:54:35 UTC · enregistrement 3767 CD80 ACC9 »</w:t>
             </w:r>
           </w:p>
         </w:tc>
@@ -7085,7 +7085,7 @@
                 <w:sz w:val="14"/>
                 <w:szCs w:val="14"/>
               </w:rPr>
-              <w:t xml:space="preserve">28 ms</w:t>
+              <w:t xml:space="preserve">27 ms</w:t>
             </w:r>
           </w:p>
         </w:tc>
@@ -7188,7 +7188,7 @@
                 <w:sz w:val="17"/>
                 <w:szCs w:val="17"/>
               </w:rPr>
-              <w:t xml:space="preserve">10486 octets relus à l'identique ; inversion d'un octet en position 5243 détectée</w:t>
+              <w:t xml:space="preserve">10483 octets relus à l'identique ; inversion d'un octet en position 5241 détectée</w:t>
             </w:r>
           </w:p>
         </w:tc>
@@ -7227,7 +7227,7 @@
                 <w:sz w:val="14"/>
                 <w:szCs w:val="14"/>
               </w:rPr>
-              <w:t xml:space="preserve">43 ms</w:t>
+              <w:t xml:space="preserve">44 ms</w:t>
             </w:r>
           </w:p>
         </w:tc>
@@ -7369,7 +7369,7 @@
                 <w:sz w:val="14"/>
                 <w:szCs w:val="14"/>
               </w:rPr>
-              <w:t xml:space="preserve">34 ms</w:t>
+              <w:t xml:space="preserve">35 ms</w:t>
             </w:r>
           </w:p>
         </w:tc>
@@ -7511,7 +7511,7 @@
                 <w:sz w:val="14"/>
                 <w:szCs w:val="14"/>
               </w:rPr>
-              <w:t xml:space="preserve">33 ms</w:t>
+              <w:t xml:space="preserve">30 ms</w:t>
             </w:r>
           </w:p>
         </w:tc>
@@ -7653,7 +7653,7 @@
                 <w:sz w:val="14"/>
                 <w:szCs w:val="14"/>
               </w:rPr>
-              <w:t xml:space="preserve">51 ms</w:t>
+              <w:t xml:space="preserve">48 ms</w:t>
             </w:r>
           </w:p>
         </w:tc>
@@ -7795,7 +7795,7 @@
                 <w:sz w:val="14"/>
                 <w:szCs w:val="14"/>
               </w:rPr>
-              <w:t xml:space="preserve">56 ms</w:t>
+              <w:t xml:space="preserve">58 ms</w:t>
             </w:r>
           </w:p>
         </w:tc>
@@ -7937,7 +7937,7 @@
                 <w:sz w:val="14"/>
                 <w:szCs w:val="14"/>
               </w:rPr>
-              <w:t xml:space="preserve">49 ms</w:t>
+              <w:t xml:space="preserve">46 ms</w:t>
             </w:r>
           </w:p>
         </w:tc>
@@ -8079,7 +8079,7 @@
                 <w:sz w:val="14"/>
                 <w:szCs w:val="14"/>
               </w:rPr>
-              <w:t xml:space="preserve">60 ms</w:t>
+              <w:t xml:space="preserve">57 ms</w:t>
             </w:r>
           </w:p>
         </w:tc>
@@ -8221,7 +8221,7 @@
                 <w:sz w:val="14"/>
                 <w:szCs w:val="14"/>
               </w:rPr>
-              <w:t xml:space="preserve">14 ms</w:t>
+              <w:t xml:space="preserve">16 ms</w:t>
             </w:r>
           </w:p>
         </w:tc>
@@ -8505,7 +8505,7 @@
                 <w:sz w:val="14"/>
                 <w:szCs w:val="14"/>
               </w:rPr>
-              <w:t xml:space="preserve">1 ms</w:t>
+              <w:t xml:space="preserve">0 ms</w:t>
             </w:r>
           </w:p>
         </w:tc>
@@ -8647,7 +8647,7 @@
                 <w:sz w:val="14"/>
                 <w:szCs w:val="14"/>
               </w:rPr>
-              <w:t xml:space="preserve">310 ms</w:t>
+              <w:t xml:space="preserve">324 ms</w:t>
             </w:r>
           </w:p>
         </w:tc>
@@ -8750,7 +8750,7 @@
                 <w:sz w:val="17"/>
                 <w:szCs w:val="17"/>
               </w:rPr>
-              <w:t xml:space="preserve">13 enregistrement(s) archivé(s), 43 fichier(s) couverts par empreintes.sha256, 0 écart ; ancre 9ff2befaf906e096… ; octets du gel restitués à l'identique ; altération d'un octet détectée et signalée ALTÉRÉ, fichier conservé dans l'archive</w:t>
+              <w:t xml:space="preserve">13 enregistrement(s) archivé(s), 43 fichier(s) couverts par empreintes.sha256, 0 écart ; ancre 2d6b823ad098cc17… ; octets du gel restitués à l'identique ; altération d'un octet détectée et signalée ALTÉRÉ, fichier conservé dans l'archive</w:t>
             </w:r>
           </w:p>
         </w:tc>
@@ -8789,7 +8789,7 @@
                 <w:sz w:val="14"/>
                 <w:szCs w:val="14"/>
               </w:rPr>
-              <w:t xml:space="preserve">376 ms</w:t>
+              <w:t xml:space="preserve">384 ms</w:t>
             </w:r>
           </w:p>
         </w:tc>
@@ -9073,7 +9073,7 @@
                 <w:sz w:val="14"/>
                 <w:szCs w:val="14"/>
               </w:rPr>
-              <w:t xml:space="preserve">300 ms</w:t>
+              <w:t xml:space="preserve">329 ms</w:t>
             </w:r>
           </w:p>
         </w:tc>
@@ -9215,7 +9215,7 @@
                 <w:sz w:val="14"/>
                 <w:szCs w:val="14"/>
               </w:rPr>
-              <w:t xml:space="preserve">238 ms</w:t>
+              <w:t xml:space="preserve">240 ms</w:t>
             </w:r>
           </w:p>
         </w:tc>
@@ -9318,7 +9318,7 @@
                 <w:sz w:val="17"/>
                 <w:szCs w:val="17"/>
               </w:rPr>
-              <w:t xml:space="preserve">requête DER de 90 octets portant l'empreinte demandée ; jeton de 2418 octets lu exactement (date 2026-08-03T08:55:03.000Z, série 02, politique 1.3.6.1.4.1.99999.1.1) ; quatre refus obtenus : autre empreinte, autre nonce, réponse de rejet de l'autorité, jeton tronqué</w:t>
+              <w:t xml:space="preserve">requête DER de 89 octets portant l'empreinte demandée ; jeton de 2418 octets lu exactement (date 2026-08-03T08:55:03.000Z, série 02, politique 1.3.6.1.4.1.99999.1.1) ; quatre refus obtenus : autre empreinte, autre nonce, réponse de rejet de l'autorité, jeton tronqué</w:t>
             </w:r>
           </w:p>
         </w:tc>
@@ -9641,7 +9641,7 @@
                 <w:sz w:val="14"/>
                 <w:szCs w:val="14"/>
               </w:rPr>
-              <w:t xml:space="preserve">14 ms</w:t>
+              <w:t xml:space="preserve">13 ms</w:t>
             </w:r>
           </w:p>
         </w:tc>
@@ -9744,7 +9744,7 @@
                 <w:sz w:val="17"/>
                 <w:szCs w:val="17"/>
               </w:rPr>
-              <w:t xml:space="preserve">235 fichier(s) source relus, aucune écriture dans la piste hors du module ; 9 empreintes comparées entre l'implémentation TypeScript et le miroir de la console serveur, toutes identiques</w:t>
+              <w:t xml:space="preserve">237 fichier(s) source relus, aucune écriture dans la piste hors du module ; 9 empreintes comparées entre l'implémentation TypeScript et le miroir de la console serveur, toutes identiques</w:t>
             </w:r>
           </w:p>
         </w:tc>
@@ -9925,7 +9925,7 @@
                 <w:sz w:val="14"/>
                 <w:szCs w:val="14"/>
               </w:rPr>
-              <w:t xml:space="preserve">1 ms</w:t>
+              <w:t xml:space="preserve">0 ms</w:t>
             </w:r>
           </w:p>
         </w:tc>
@@ -10209,7 +10209,7 @@
                 <w:sz w:val="14"/>
                 <w:szCs w:val="14"/>
               </w:rPr>
-              <w:t xml:space="preserve">193 ms</w:t>
+              <w:t xml:space="preserve">194 ms</w:t>
             </w:r>
           </w:p>
         </w:tc>
@@ -10312,7 +10312,7 @@
                 <w:sz w:val="17"/>
                 <w:szCs w:val="17"/>
               </w:rPr>
-              <w:t xml:space="preserve">235 fichier(s) source relus : aucune écriture de mot de passe hors des chemins autorisés ; une seule écriture dans les actions serveur, le changement personnel, qui exige l'ancien mot de passe ; l'outil d'urgence de la console émet un jeton et ne sait plus dériver de mot de passe ; aucun champ de mot de passe hors des 7 écrans où l'on saisit le sien</w:t>
+              <w:t xml:space="preserve">237 fichier(s) source relus : aucune écriture de mot de passe hors des chemins autorisés ; une seule écriture dans les actions serveur, le changement personnel, qui exige l'ancien mot de passe ; l'outil d'urgence de la console émet un jeton et ne sait plus dériver de mot de passe ; aucun champ de mot de passe hors des 7 écrans où l'on saisit le sien</w:t>
             </w:r>
           </w:p>
         </w:tc>
@@ -10351,7 +10351,7 @@
                 <w:sz w:val="14"/>
                 <w:szCs w:val="14"/>
               </w:rPr>
-              <w:t xml:space="preserve">83 ms</w:t>
+              <w:t xml:space="preserve">69 ms</w:t>
             </w:r>
           </w:p>
         </w:tc>
@@ -10493,7 +10493,7 @@
                 <w:sz w:val="14"/>
                 <w:szCs w:val="14"/>
               </w:rPr>
-              <w:t xml:space="preserve">8979 ms</w:t>
+              <w:t xml:space="preserve">9449 ms</w:t>
             </w:r>
           </w:p>
         </w:tc>
@@ -10635,7 +10635,7 @@
                 <w:sz w:val="14"/>
                 <w:szCs w:val="14"/>
               </w:rPr>
-              <w:t xml:space="preserve">22 ms</w:t>
+              <w:t xml:space="preserve">16 ms</w:t>
             </w:r>
           </w:p>
         </w:tc>
@@ -10738,7 +10738,7 @@
                 <w:sz w:val="17"/>
                 <w:szCs w:val="17"/>
               </w:rPr>
-              <w:t xml:space="preserve">copie d'archivage de OQ-012-revision rév. 001 produite (69084 octets, 1 page·s) ; 30 contrôles structurels PDF/A-2b passés — police embarquée, profil ICC « acsp » de 3024 octets, métadonnées pdfaid partie 2 niveau B, décalages exacts ; texte intégralement relu par la table du fichier, 44 caractère·s accentué·s ou typographiques restitués ; production déterministe (deux exécutions octet pour octet identiques)</w:t>
+              <w:t xml:space="preserve">copie d'archivage de OQ-012-revision rév. 001 produite (108365 octets, 1 page·s) ; 30 contrôles structurels PDF/A-2b passés — police embarquée, profil ICC « acsp » de 3024 octets, métadonnées pdfaid partie 2 niveau B, décalages exacts ; texte intégralement relu par la table du fichier, 44 caractère·s accentué·s ou typographiques restitués ; production déterministe (deux exécutions octet pour octet identiques)</w:t>
             </w:r>
           </w:p>
         </w:tc>
@@ -10919,7 +10919,7 @@
                 <w:sz w:val="14"/>
                 <w:szCs w:val="14"/>
               </w:rPr>
-              <w:t xml:space="preserve">83 ms</w:t>
+              <w:t xml:space="preserve">80 ms</w:t>
             </w:r>
           </w:p>
         </w:tc>
@@ -11022,7 +11022,7 @@
                 <w:sz w:val="17"/>
                 <w:szCs w:val="17"/>
               </w:rPr>
-              <w:t xml:space="preserve">clôture refusée trois fois avant d'être permise — conclusion vide, 1 entrée(s) non statuée(s), verdict affirmatif sans motif ; manifestation « Testeur QR2 (QR2) · Revu · 09/08/2026 11:08:43 UTC · enregistrement 507D 9BFA FBDF » portant le nom imprimé, la signification « Revu » et l'empreinte du contenu ; empreinte recalculée à l'identique hors du logiciel, et modifiée par le moindre changement de conclusion ou de verdict ; indépendance consignée sur le SIGNATAIRE (0 entrée·s écrite·s par lui, contre 5 par l'ouvreur) ; 10 règles de triage inscrites dans l'enregistrement ; re-clôture et re-statuage refusés ; aucune rupture ajoutée à la chaîne sur 82 entrées</w:t>
+              <w:t xml:space="preserve">clôture refusée trois fois avant d'être permise — conclusion vide, 1 entrée(s) non statuée(s), verdict affirmatif sans motif ; manifestation « Testeur QR2 (QR2) · Revu · 09/08/2026 11:54:46 UTC · enregistrement E88D D121 F5AC » portant le nom imprimé, la signification « Revu » et l'empreinte du contenu ; empreinte recalculée à l'identique hors du logiciel, et modifiée par le moindre changement de conclusion ou de verdict ; indépendance consignée sur le SIGNATAIRE (0 entrée·s écrite·s par lui, contre 5 par l'ouvreur) ; 10 règles de triage inscrites dans l'enregistrement ; re-clôture et re-statuage refusés ; aucune rupture ajoutée à la chaîne sur 82 entrées</w:t>
             </w:r>
           </w:p>
         </w:tc>
@@ -11061,7 +11061,7 @@
                 <w:sz w:val="14"/>
                 <w:szCs w:val="14"/>
               </w:rPr>
-              <w:t xml:space="preserve">88 ms</w:t>
+              <w:t xml:space="preserve">91 ms</w:t>
             </w:r>
           </w:p>
         </w:tc>
@@ -11345,7 +11345,7 @@
                 <w:sz w:val="14"/>
                 <w:szCs w:val="14"/>
               </w:rPr>
-              <w:t xml:space="preserve">15 ms</w:t>
+              <w:t xml:space="preserve">18 ms</w:t>
             </w:r>
           </w:p>
         </w:tc>
@@ -11487,7 +11487,7 @@
                 <w:sz w:val="14"/>
                 <w:szCs w:val="14"/>
               </w:rPr>
-              <w:t xml:space="preserve">44 ms</w:t>
+              <w:t xml:space="preserve">52 ms</w:t>
             </w:r>
           </w:p>
         </w:tc>
@@ -11629,7 +11629,7 @@
                 <w:sz w:val="14"/>
                 <w:szCs w:val="14"/>
               </w:rPr>
-              <w:t xml:space="preserve">167 ms</w:t>
+              <w:t xml:space="preserve">177 ms</w:t>
             </w:r>
           </w:p>
         </w:tc>
@@ -11771,7 +11771,7 @@
                 <w:sz w:val="14"/>
                 <w:szCs w:val="14"/>
               </w:rPr>
-              <w:t xml:space="preserve">130 ms</w:t>
+              <w:t xml:space="preserve">131 ms</w:t>
             </w:r>
           </w:p>
         </w:tc>
@@ -11913,7 +11913,7 @@
                 <w:sz w:val="14"/>
                 <w:szCs w:val="14"/>
               </w:rPr>
-              <w:t xml:space="preserve">93 ms</w:t>
+              <w:t xml:space="preserve">96 ms</w:t>
             </w:r>
           </w:p>
         </w:tc>
@@ -12197,7 +12197,7 @@
                 <w:sz w:val="14"/>
                 <w:szCs w:val="14"/>
               </w:rPr>
-              <w:t xml:space="preserve">112 ms</w:t>
+              <w:t xml:space="preserve">93 ms</w:t>
             </w:r>
           </w:p>
         </w:tc>
@@ -12339,7 +12339,7 @@
                 <w:sz w:val="14"/>
                 <w:szCs w:val="14"/>
               </w:rPr>
-              <w:t xml:space="preserve">58 ms</w:t>
+              <w:t xml:space="preserve">60 ms</w:t>
             </w:r>
           </w:p>
         </w:tc>
@@ -12481,7 +12481,7 @@
                 <w:sz w:val="14"/>
                 <w:szCs w:val="14"/>
               </w:rPr>
-              <w:t xml:space="preserve">18 ms</w:t>
+              <w:t xml:space="preserve">17 ms</w:t>
             </w:r>
           </w:p>
         </w:tc>
@@ -12584,7 +12584,7 @@
                 <w:sz w:val="17"/>
                 <w:szCs w:val="17"/>
               </w:rPr>
-              <w:t xml:space="preserve">veraPDF 1.30.2 a rendu deux verdicts sur des fichiers produits pendant ce cas. Le témoin — police non embarquée, sans intention de sortie ni métadonnées XMP, écrit octet par octet sans passer par les modules de Filum — est REJETÉ sur 5 règle(s) : la mesure discrimine. Le document de torture, qui rassemble 7 familles de caractères (chimie, grec, mathématiques, fractions, unités, idéogrammes, emoji, diacritiques) et a exercé 30 substitution(s) de glyphes absents, est déclaré CONFORME au profil PDF/A-2b. Le contrôle structurel interne rend le même verdict sur le même fichier, et confirme zéro renvoi au glyphe .notdef.</w:t>
+              <w:t xml:space="preserve">veraPDF 1.30.2 a rendu deux verdicts sur des fichiers produits pendant ce cas. Le témoin — police non embarquée, sans intention de sortie ni métadonnées XMP, écrit octet par octet sans passer par les modules de Filum — est REJETÉ sur 5 règle(s) : la mesure discrimine. Le document de torture, qui rassemble 7 familles de caractères (chimie, grec, mathématiques, fractions, unités, idéogrammes, emoji, diacritiques) et a exercé 10 substitution(s) de glyphes absents, est déclaré CONFORME au profil PDF/A-2b. Le contrôle structurel interne rend le même verdict sur le même fichier, et confirme zéro renvoi au glyphe .notdef.</w:t>
             </w:r>
           </w:p>
         </w:tc>
@@ -12623,7 +12623,7 @@
                 <w:sz w:val="14"/>
                 <w:szCs w:val="14"/>
               </w:rPr>
-              <w:t xml:space="preserve">3546 ms</w:t>
+              <w:t xml:space="preserve">3624 ms</w:t>
             </w:r>
           </w:p>
         </w:tc>
@@ -16631,7 +16631,7 @@
           <w:sz w:val="20"/>
           <w:szCs w:val="20"/>
         </w:rPr>
-        <w:t xml:space="preserve">— Les copies d'archivage sont produites au format PDF/A-2b et validées par veraPDF 1.30.2, l'implémentation de référence, exécutée sur une archive complète et sur un document de torture bâti pour la faire échouer ; le harnais porte un témoin non conforme et refuse de conclure si le validateur le laisse passer. Ce contrôle a trouvé, à sa première exécution, deux non-conformités que nos propres vérifications ne voyaient pas. LE FORMAT EST VALIDÉ, PAS CERTIFIÉ : un validateur conforme n'est pas un organisme notifié, et l'affirmation porte sur cette version du validateur et sur ce corpus. LIMITE SUBSISTANTE : la police embarquée ne couvre pas l'alphabet grec ; les caractères qu'elle ne dessine pas sont remplacés, et chaque copie DÉCLARE lesquels dans une table dédiée.</w:t>
+        <w:t xml:space="preserve">— Les copies d'archivage sont produites au format PDF/A-2b et validées par veraPDF 1.30.2, l'implémentation de référence, exécutée sur une archive complète et sur un document de torture bâti pour la faire échouer ; le harnais porte un témoin non conforme et refuse de conclure si le validateur le laisse passer. Ce contrôle a trouvé, à sa première exécution, deux non-conformités que nos propres vérifications ne voyaient pas. LE FORMAT EST VALIDÉ, PAS CERTIFIÉ : un validateur conforme n'est pas un organisme notifié, et l'affirmation porte sur cette version du validateur et sur ce corpus. La police embarquée a été remplacée pour couvrir l'alphabet du domaine — grec, opérateurs mathématiques, exposants, fractions, flèches —, un cas de qualification relit cette couverture sur la police livrée, et la police n'annonce que ce qu'elle sait dessiner. LIMITE SUBSISTANTE : idéogrammes, cyrillique et emoji couleur ne sont pas dessinables ; ils sont remplacés, et chaque copie DÉCLARE lesquels dans une table dédiée.</w:t>
       </w:r>
     </w:p>
     <w:sectPr>
@@ -16737,7 +16737,7 @@
         <w:sz w:val="15"/>
         <w:szCs w:val="15"/>
       </w:rPr>
-      <w:t xml:space="preserve">   ·   Version 1.2.1 · rapport OQ exécuté le 9 août 2026 à 11:08 UTC</w:t>
+      <w:t xml:space="preserve">   ·   Version 1.2.1 · rapport OQ exécuté le 9 août 2026 à 11:54 UTC</w:t>
     </w:r>
   </w:p>
 </w:ftr>

</xml_diff>

<commit_message>
Site : le cyrillique n'est plus une limite du PDF/A
Le paragraphe de limite du dossier de validation téléchargeable ne cite plus le
cyrillique parmi ce que la police embarquée ne dessine pas : il y est. Restent les
idéogrammes et les emoji couleur, remplacés et déclarés dans chaque copie.

Co-Authored-By: Claude Opus 5 <noreply@anthropic.com>
</commit_message>
<xml_diff>
--- a/docs/Dossier_de_validation_Filum.docx
+++ b/docs/Dossier_de_validation_Filum.docx
@@ -6038,7 +6038,7 @@
                 <w:sz w:val="17"/>
                 <w:szCs w:val="17"/>
               </w:rPr>
-              <w:t xml:space="preserve">9 août 2026 à 11:54</w:t>
+              <w:t xml:space="preserve">9 août 2026 à 12:14</w:t>
             </w:r>
           </w:p>
         </w:tc>
@@ -6620,7 +6620,7 @@
                 <w:sz w:val="17"/>
                 <w:szCs w:val="17"/>
               </w:rPr>
-              <w:t xml:space="preserve">empreintes distinctes pour un même mot de passe (cca89a0dbae2… ≠ db67db189192…), vérification correcte, mot de passe faux et vide refusés</w:t>
+              <w:t xml:space="preserve">empreintes distinctes pour un même mot de passe (7bc39c75c407… ≠ 0a8e1c2ac6bd…), vérification correcte, mot de passe faux et vide refusés</w:t>
             </w:r>
           </w:p>
         </w:tc>
@@ -6659,7 +6659,7 @@
                 <w:sz w:val="14"/>
                 <w:szCs w:val="14"/>
               </w:rPr>
-              <w:t xml:space="preserve">136 ms</w:t>
+              <w:t xml:space="preserve">137 ms</w:t>
             </w:r>
           </w:p>
         </w:tc>
@@ -6904,7 +6904,7 @@
                 <w:sz w:val="17"/>
                 <w:szCs w:val="17"/>
               </w:rPr>
-              <w:t xml:space="preserve">contenu gelé, empreinte 24604eb157d7fa54…, 10485 octets conservés, opération journalisée</w:t>
+              <w:t xml:space="preserve">contenu gelé, empreinte 24604eb157d7fa54…, 10487 octets conservés, opération journalisée</w:t>
             </w:r>
           </w:p>
         </w:tc>
@@ -6943,7 +6943,7 @@
                 <w:sz w:val="14"/>
                 <w:szCs w:val="14"/>
               </w:rPr>
-              <w:t xml:space="preserve">121 ms</w:t>
+              <w:t xml:space="preserve">123 ms</w:t>
             </w:r>
           </w:p>
         </w:tc>
@@ -7046,7 +7046,7 @@
                 <w:sz w:val="17"/>
                 <w:szCs w:val="17"/>
               </w:rPr>
-              <w:t xml:space="preserve">signature liée à l'instantané cmslqw5e…, empreinte attestée 3767 CD80 ACC9, manifestation « Testeur QA1 (QA1) · Approuvé · 09/08/2026 11:54:35 UTC · enregistrement 3767 CD80 ACC9 »</w:t>
+              <w:t xml:space="preserve">signature liée à l'instantané cmslrl3q…, empreinte attestée 3767 CD80 ACC9, manifestation « Testeur QA1 (QA1) · Approuvé · 09/08/2026 12:13:59 UTC · enregistrement 3767 CD80 ACC9 »</w:t>
             </w:r>
           </w:p>
         </w:tc>
@@ -7188,7 +7188,7 @@
                 <w:sz w:val="17"/>
                 <w:szCs w:val="17"/>
               </w:rPr>
-              <w:t xml:space="preserve">10483 octets relus à l'identique ; inversion d'un octet en position 5241 détectée</w:t>
+              <w:t xml:space="preserve">10484 octets relus à l'identique ; inversion d'un octet en position 5242 détectée</w:t>
             </w:r>
           </w:p>
         </w:tc>
@@ -7227,7 +7227,7 @@
                 <w:sz w:val="14"/>
                 <w:szCs w:val="14"/>
               </w:rPr>
-              <w:t xml:space="preserve">44 ms</w:t>
+              <w:t xml:space="preserve">40 ms</w:t>
             </w:r>
           </w:p>
         </w:tc>
@@ -7653,7 +7653,7 @@
                 <w:sz w:val="14"/>
                 <w:szCs w:val="14"/>
               </w:rPr>
-              <w:t xml:space="preserve">48 ms</w:t>
+              <w:t xml:space="preserve">49 ms</w:t>
             </w:r>
           </w:p>
         </w:tc>
@@ -7756,7 +7756,7 @@
                 <w:sz w:val="17"/>
                 <w:szCs w:val="17"/>
               </w:rPr>
-              <w:t xml:space="preserve">2 instantanés conservés : le gel de revue reste lisible (10495 o, dépassé), l'enregistrement approuvé porte la même empreinte de contenu</w:t>
+              <w:t xml:space="preserve">2 instantanés conservés : le gel de revue reste lisible (10497 o, dépassé), l'enregistrement approuvé porte la même empreinte de contenu</w:t>
             </w:r>
           </w:p>
         </w:tc>
@@ -7795,7 +7795,7 @@
                 <w:sz w:val="14"/>
                 <w:szCs w:val="14"/>
               </w:rPr>
-              <w:t xml:space="preserve">58 ms</w:t>
+              <w:t xml:space="preserve">57 ms</w:t>
             </w:r>
           </w:p>
         </w:tc>
@@ -7937,7 +7937,7 @@
                 <w:sz w:val="14"/>
                 <w:szCs w:val="14"/>
               </w:rPr>
-              <w:t xml:space="preserve">46 ms</w:t>
+              <w:t xml:space="preserve">48 ms</w:t>
             </w:r>
           </w:p>
         </w:tc>
@@ -8079,7 +8079,7 @@
                 <w:sz w:val="14"/>
                 <w:szCs w:val="14"/>
               </w:rPr>
-              <w:t xml:space="preserve">57 ms</w:t>
+              <w:t xml:space="preserve">59 ms</w:t>
             </w:r>
           </w:p>
         </w:tc>
@@ -8505,7 +8505,7 @@
                 <w:sz w:val="14"/>
                 <w:szCs w:val="14"/>
               </w:rPr>
-              <w:t xml:space="preserve">0 ms</w:t>
+              <w:t xml:space="preserve">1 ms</w:t>
             </w:r>
           </w:p>
         </w:tc>
@@ -8647,7 +8647,7 @@
                 <w:sz w:val="14"/>
                 <w:szCs w:val="14"/>
               </w:rPr>
-              <w:t xml:space="preserve">324 ms</w:t>
+              <w:t xml:space="preserve">325 ms</w:t>
             </w:r>
           </w:p>
         </w:tc>
@@ -8750,7 +8750,7 @@
                 <w:sz w:val="17"/>
                 <w:szCs w:val="17"/>
               </w:rPr>
-              <w:t xml:space="preserve">13 enregistrement(s) archivé(s), 43 fichier(s) couverts par empreintes.sha256, 0 écart ; ancre 2d6b823ad098cc17… ; octets du gel restitués à l'identique ; altération d'un octet détectée et signalée ALTÉRÉ, fichier conservé dans l'archive</w:t>
+              <w:t xml:space="preserve">13 enregistrement(s) archivé(s), 43 fichier(s) couverts par empreintes.sha256, 0 écart ; ancre 30d4cff7faa1d4b3… ; octets du gel restitués à l'identique ; altération d'un octet détectée et signalée ALTÉRÉ, fichier conservé dans l'archive</w:t>
             </w:r>
           </w:p>
         </w:tc>
@@ -8789,7 +8789,7 @@
                 <w:sz w:val="14"/>
                 <w:szCs w:val="14"/>
               </w:rPr>
-              <w:t xml:space="preserve">384 ms</w:t>
+              <w:t xml:space="preserve">406 ms</w:t>
             </w:r>
           </w:p>
         </w:tc>
@@ -8931,7 +8931,7 @@
                 <w:sz w:val="14"/>
                 <w:szCs w:val="14"/>
               </w:rPr>
-              <w:t xml:space="preserve">7 ms</w:t>
+              <w:t xml:space="preserve">8 ms</w:t>
             </w:r>
           </w:p>
         </w:tc>
@@ -9073,7 +9073,7 @@
                 <w:sz w:val="14"/>
                 <w:szCs w:val="14"/>
               </w:rPr>
-              <w:t xml:space="preserve">329 ms</w:t>
+              <w:t xml:space="preserve">343 ms</w:t>
             </w:r>
           </w:p>
         </w:tc>
@@ -9215,7 +9215,7 @@
                 <w:sz w:val="14"/>
                 <w:szCs w:val="14"/>
               </w:rPr>
-              <w:t xml:space="preserve">240 ms</w:t>
+              <w:t xml:space="preserve">263 ms</w:t>
             </w:r>
           </w:p>
         </w:tc>
@@ -9641,7 +9641,7 @@
                 <w:sz w:val="14"/>
                 <w:szCs w:val="14"/>
               </w:rPr>
-              <w:t xml:space="preserve">13 ms</w:t>
+              <w:t xml:space="preserve">14 ms</w:t>
             </w:r>
           </w:p>
         </w:tc>
@@ -9744,7 +9744,7 @@
                 <w:sz w:val="17"/>
                 <w:szCs w:val="17"/>
               </w:rPr>
-              <w:t xml:space="preserve">237 fichier(s) source relus, aucune écriture dans la piste hors du module ; 9 empreintes comparées entre l'implémentation TypeScript et le miroir de la console serveur, toutes identiques</w:t>
+              <w:t xml:space="preserve">236 fichier(s) source relus, aucune écriture dans la piste hors du module ; 9 empreintes comparées entre l'implémentation TypeScript et le miroir de la console serveur, toutes identiques</w:t>
             </w:r>
           </w:p>
         </w:tc>
@@ -9783,7 +9783,7 @@
                 <w:sz w:val="14"/>
                 <w:szCs w:val="14"/>
               </w:rPr>
-              <w:t xml:space="preserve">54 ms</w:t>
+              <w:t xml:space="preserve">52 ms</w:t>
             </w:r>
           </w:p>
         </w:tc>
@@ -10067,7 +10067,7 @@
                 <w:sz w:val="14"/>
                 <w:szCs w:val="14"/>
               </w:rPr>
-              <w:t xml:space="preserve">18 ms</w:t>
+              <w:t xml:space="preserve">17 ms</w:t>
             </w:r>
           </w:p>
         </w:tc>
@@ -10209,7 +10209,7 @@
                 <w:sz w:val="14"/>
                 <w:szCs w:val="14"/>
               </w:rPr>
-              <w:t xml:space="preserve">194 ms</w:t>
+              <w:t xml:space="preserve">198 ms</w:t>
             </w:r>
           </w:p>
         </w:tc>
@@ -10312,7 +10312,7 @@
                 <w:sz w:val="17"/>
                 <w:szCs w:val="17"/>
               </w:rPr>
-              <w:t xml:space="preserve">237 fichier(s) source relus : aucune écriture de mot de passe hors des chemins autorisés ; une seule écriture dans les actions serveur, le changement personnel, qui exige l'ancien mot de passe ; l'outil d'urgence de la console émet un jeton et ne sait plus dériver de mot de passe ; aucun champ de mot de passe hors des 7 écrans où l'on saisit le sien</w:t>
+              <w:t xml:space="preserve">236 fichier(s) source relus : aucune écriture de mot de passe hors des chemins autorisés ; une seule écriture dans les actions serveur, le changement personnel, qui exige l'ancien mot de passe ; l'outil d'urgence de la console émet un jeton et ne sait plus dériver de mot de passe ; aucun champ de mot de passe hors des 7 écrans où l'on saisit le sien</w:t>
             </w:r>
           </w:p>
         </w:tc>
@@ -10493,7 +10493,7 @@
                 <w:sz w:val="14"/>
                 <w:szCs w:val="14"/>
               </w:rPr>
-              <w:t xml:space="preserve">9449 ms</w:t>
+              <w:t xml:space="preserve">9379 ms</w:t>
             </w:r>
           </w:p>
         </w:tc>
@@ -10635,7 +10635,7 @@
                 <w:sz w:val="14"/>
                 <w:szCs w:val="14"/>
               </w:rPr>
-              <w:t xml:space="preserve">16 ms</w:t>
+              <w:t xml:space="preserve">21 ms</w:t>
             </w:r>
           </w:p>
         </w:tc>
@@ -10738,7 +10738,7 @@
                 <w:sz w:val="17"/>
                 <w:szCs w:val="17"/>
               </w:rPr>
-              <w:t xml:space="preserve">copie d'archivage de OQ-012-revision rév. 001 produite (108365 octets, 1 page·s) ; 30 contrôles structurels PDF/A-2b passés — police embarquée, profil ICC « acsp » de 3024 octets, métadonnées pdfaid partie 2 niveau B, décalages exacts ; texte intégralement relu par la table du fichier, 44 caractère·s accentué·s ou typographiques restitués ; production déterministe (deux exécutions octet pour octet identiques)</w:t>
+              <w:t xml:space="preserve">copie d'archivage de OQ-012-revision rév. 001 produite (124026 octets, 1 page·s) ; 30 contrôles structurels PDF/A-2b passés — police embarquée, profil ICC « acsp » de 3024 octets, métadonnées pdfaid partie 2 niveau B, décalages exacts ; texte intégralement relu par la table du fichier, 44 caractère·s accentué·s ou typographiques restitués ; production déterministe (deux exécutions octet pour octet identiques)</w:t>
             </w:r>
           </w:p>
         </w:tc>
@@ -10777,7 +10777,7 @@
                 <w:sz w:val="14"/>
                 <w:szCs w:val="14"/>
               </w:rPr>
-              <w:t xml:space="preserve">16 ms</w:t>
+              <w:t xml:space="preserve">17 ms</w:t>
             </w:r>
           </w:p>
         </w:tc>
@@ -10919,7 +10919,7 @@
                 <w:sz w:val="14"/>
                 <w:szCs w:val="14"/>
               </w:rPr>
-              <w:t xml:space="preserve">80 ms</w:t>
+              <w:t xml:space="preserve">82 ms</w:t>
             </w:r>
           </w:p>
         </w:tc>
@@ -11022,7 +11022,7 @@
                 <w:sz w:val="17"/>
                 <w:szCs w:val="17"/>
               </w:rPr>
-              <w:t xml:space="preserve">clôture refusée trois fois avant d'être permise — conclusion vide, 1 entrée(s) non statuée(s), verdict affirmatif sans motif ; manifestation « Testeur QR2 (QR2) · Revu · 09/08/2026 11:54:46 UTC · enregistrement E88D D121 F5AC » portant le nom imprimé, la signification « Revu » et l'empreinte du contenu ; empreinte recalculée à l'identique hors du logiciel, et modifiée par le moindre changement de conclusion ou de verdict ; indépendance consignée sur le SIGNATAIRE (0 entrée·s écrite·s par lui, contre 5 par l'ouvreur) ; 10 règles de triage inscrites dans l'enregistrement ; re-clôture et re-statuage refusés ; aucune rupture ajoutée à la chaîne sur 82 entrées</w:t>
+              <w:t xml:space="preserve">clôture refusée trois fois avant d'être permise — conclusion vide, 1 entrée(s) non statuée(s), verdict affirmatif sans motif ; manifestation « Testeur QR2 (QR2) · Revu · 09/08/2026 12:14:11 UTC · enregistrement 1B28 9A3E F877 » portant le nom imprimé, la signification « Revu » et l'empreinte du contenu ; empreinte recalculée à l'identique hors du logiciel, et modifiée par le moindre changement de conclusion ou de verdict ; indépendance consignée sur le SIGNATAIRE (0 entrée·s écrite·s par lui, contre 5 par l'ouvreur) ; 10 règles de triage inscrites dans l'enregistrement ; re-clôture et re-statuage refusés ; aucune rupture ajoutée à la chaîne sur 82 entrées</w:t>
             </w:r>
           </w:p>
         </w:tc>
@@ -11061,7 +11061,7 @@
                 <w:sz w:val="14"/>
                 <w:szCs w:val="14"/>
               </w:rPr>
-              <w:t xml:space="preserve">91 ms</w:t>
+              <w:t xml:space="preserve">90 ms</w:t>
             </w:r>
           </w:p>
         </w:tc>
@@ -11203,7 +11203,7 @@
                 <w:sz w:val="14"/>
                 <w:szCs w:val="14"/>
               </w:rPr>
-              <w:t xml:space="preserve">8 ms</w:t>
+              <w:t xml:space="preserve">7 ms</w:t>
             </w:r>
           </w:p>
         </w:tc>
@@ -11345,7 +11345,7 @@
                 <w:sz w:val="14"/>
                 <w:szCs w:val="14"/>
               </w:rPr>
-              <w:t xml:space="preserve">18 ms</w:t>
+              <w:t xml:space="preserve">16 ms</w:t>
             </w:r>
           </w:p>
         </w:tc>
@@ -11487,7 +11487,7 @@
                 <w:sz w:val="14"/>
                 <w:szCs w:val="14"/>
               </w:rPr>
-              <w:t xml:space="preserve">52 ms</w:t>
+              <w:t xml:space="preserve">43 ms</w:t>
             </w:r>
           </w:p>
         </w:tc>
@@ -11629,7 +11629,7 @@
                 <w:sz w:val="14"/>
                 <w:szCs w:val="14"/>
               </w:rPr>
-              <w:t xml:space="preserve">177 ms</w:t>
+              <w:t xml:space="preserve">171 ms</w:t>
             </w:r>
           </w:p>
         </w:tc>
@@ -11771,7 +11771,7 @@
                 <w:sz w:val="14"/>
                 <w:szCs w:val="14"/>
               </w:rPr>
-              <w:t xml:space="preserve">131 ms</w:t>
+              <w:t xml:space="preserve">133 ms</w:t>
             </w:r>
           </w:p>
         </w:tc>
@@ -12055,7 +12055,7 @@
                 <w:sz w:val="14"/>
                 <w:szCs w:val="14"/>
               </w:rPr>
-              <w:t xml:space="preserve">8 ms</w:t>
+              <w:t xml:space="preserve">7 ms</w:t>
             </w:r>
           </w:p>
         </w:tc>
@@ -12197,7 +12197,7 @@
                 <w:sz w:val="14"/>
                 <w:szCs w:val="14"/>
               </w:rPr>
-              <w:t xml:space="preserve">93 ms</w:t>
+              <w:t xml:space="preserve">92 ms</w:t>
             </w:r>
           </w:p>
         </w:tc>
@@ -12623,7 +12623,7 @@
                 <w:sz w:val="14"/>
                 <w:szCs w:val="14"/>
               </w:rPr>
-              <w:t xml:space="preserve">3624 ms</w:t>
+              <w:t xml:space="preserve">3679 ms</w:t>
             </w:r>
           </w:p>
         </w:tc>
@@ -16631,7 +16631,7 @@
           <w:sz w:val="20"/>
           <w:szCs w:val="20"/>
         </w:rPr>
-        <w:t xml:space="preserve">— Les copies d'archivage sont produites au format PDF/A-2b et validées par veraPDF 1.30.2, l'implémentation de référence, exécutée sur une archive complète et sur un document de torture bâti pour la faire échouer ; le harnais porte un témoin non conforme et refuse de conclure si le validateur le laisse passer. Ce contrôle a trouvé, à sa première exécution, deux non-conformités que nos propres vérifications ne voyaient pas. LE FORMAT EST VALIDÉ, PAS CERTIFIÉ : un validateur conforme n'est pas un organisme notifié, et l'affirmation porte sur cette version du validateur et sur ce corpus. La police embarquée a été remplacée pour couvrir l'alphabet du domaine — grec, opérateurs mathématiques, exposants, fractions, flèches —, un cas de qualification relit cette couverture sur la police livrée, et la police n'annonce que ce qu'elle sait dessiner. LIMITE SUBSISTANTE : idéogrammes, cyrillique et emoji couleur ne sont pas dessinables ; ils sont remplacés, et chaque copie DÉCLARE lesquels dans une table dédiée.</w:t>
+        <w:t xml:space="preserve">— Les copies d'archivage sont produites au format PDF/A-2b et validées par veraPDF 1.30.2, l'implémentation de référence, exécutée sur une archive complète et sur un document de torture bâti pour la faire échouer ; le harnais porte un témoin non conforme et refuse de conclure si le validateur le laisse passer. Ce contrôle a trouvé, à sa première exécution, deux non-conformités que nos propres vérifications ne voyaient pas. LE FORMAT EST VALIDÉ, PAS CERTIFIÉ : un validateur conforme n'est pas un organisme notifié, et l'affirmation porte sur cette version du validateur et sur ce corpus. La police embarquée a été remplacée pour couvrir l'alphabet du domaine — grec, cyrillique, opérateurs mathématiques, exposants, fractions, flèches —, un cas de qualification relit cette couverture sur la police livrée, et la police n'annonce que ce qu'elle sait dessiner. LIMITE SUBSISTANTE : idéogrammes et emoji couleur ne sont pas dessinables ; ils sont remplacés, et chaque copie DÉCLARE lesquels dans une table dédiée.</w:t>
       </w:r>
     </w:p>
     <w:sectPr>
@@ -16737,7 +16737,7 @@
         <w:sz w:val="15"/>
         <w:szCs w:val="15"/>
       </w:rPr>
-      <w:t xml:space="preserve">   ·   Version 1.2.1 · rapport OQ exécuté le 9 août 2026 à 11:54 UTC</w:t>
+      <w:t xml:space="preserve">   ·   Version 1.2.1 · rapport OQ exécuté le 9 août 2026 à 12:14 UTC</w:t>
     </w:r>
   </w:p>
 </w:ftr>

</xml_diff>

<commit_message>
Site : les copies d'archivage portent aussi les idéogrammes
Le paragraphe de limite du dossier de validation téléchargeable dit désormais que
les kana et idéogrammes sont couverts, que la police qui les dessine n'est
embarquée que dans les documents qui en portent, et ce qui reste hors couverture :
hangûl, idéogrammes propres au chinois simplifié, emoji couleur.

Co-Authored-By: Claude Opus 5 <noreply@anthropic.com>
</commit_message>
<xml_diff>
--- a/docs/Dossier_de_validation_Filum.docx
+++ b/docs/Dossier_de_validation_Filum.docx
@@ -6038,7 +6038,7 @@
                 <w:sz w:val="17"/>
                 <w:szCs w:val="17"/>
               </w:rPr>
-              <w:t xml:space="preserve">9 août 2026 à 12:14</w:t>
+              <w:t xml:space="preserve">9 août 2026 à 12:37</w:t>
             </w:r>
           </w:p>
         </w:tc>
@@ -6620,7 +6620,7 @@
                 <w:sz w:val="17"/>
                 <w:szCs w:val="17"/>
               </w:rPr>
-              <w:t xml:space="preserve">empreintes distinctes pour un même mot de passe (7bc39c75c407… ≠ 0a8e1c2ac6bd…), vérification correcte, mot de passe faux et vide refusés</w:t>
+              <w:t xml:space="preserve">empreintes distinctes pour un même mot de passe (47b2ac18f25f… ≠ 29600d156a97…), vérification correcte, mot de passe faux et vide refusés</w:t>
             </w:r>
           </w:p>
         </w:tc>
@@ -6659,7 +6659,7 @@
                 <w:sz w:val="14"/>
                 <w:szCs w:val="14"/>
               </w:rPr>
-              <w:t xml:space="preserve">137 ms</w:t>
+              <w:t xml:space="preserve">138 ms</w:t>
             </w:r>
           </w:p>
         </w:tc>
@@ -6904,7 +6904,7 @@
                 <w:sz w:val="17"/>
                 <w:szCs w:val="17"/>
               </w:rPr>
-              <w:t xml:space="preserve">contenu gelé, empreinte 24604eb157d7fa54…, 10487 octets conservés, opération journalisée</w:t>
+              <w:t xml:space="preserve">contenu gelé, empreinte 24604eb157d7fa54…, 10488 octets conservés, opération journalisée</w:t>
             </w:r>
           </w:p>
         </w:tc>
@@ -6943,7 +6943,7 @@
                 <w:sz w:val="14"/>
                 <w:szCs w:val="14"/>
               </w:rPr>
-              <w:t xml:space="preserve">123 ms</w:t>
+              <w:t xml:space="preserve">126 ms</w:t>
             </w:r>
           </w:p>
         </w:tc>
@@ -7046,7 +7046,7 @@
                 <w:sz w:val="17"/>
                 <w:szCs w:val="17"/>
               </w:rPr>
-              <w:t xml:space="preserve">signature liée à l'instantané cmslrl3q…, empreinte attestée 3767 CD80 ACC9, manifestation « Testeur QA1 (QA1) · Approuvé · 09/08/2026 12:13:59 UTC · enregistrement 3767 CD80 ACC9 »</w:t>
+              <w:t xml:space="preserve">signature liée à l'instantané cmslsfmm…, empreinte attestée 3767 CD80 ACC9, manifestation « Testeur QA1 (QA1) · Approuvé · 09/08/2026 12:37:43 UTC · enregistrement 3767 CD80 ACC9 »</w:t>
             </w:r>
           </w:p>
         </w:tc>
@@ -7085,7 +7085,7 @@
                 <w:sz w:val="14"/>
                 <w:szCs w:val="14"/>
               </w:rPr>
-              <w:t xml:space="preserve">27 ms</w:t>
+              <w:t xml:space="preserve">29 ms</w:t>
             </w:r>
           </w:p>
         </w:tc>
@@ -7188,7 +7188,7 @@
                 <w:sz w:val="17"/>
                 <w:szCs w:val="17"/>
               </w:rPr>
-              <w:t xml:space="preserve">10484 octets relus à l'identique ; inversion d'un octet en position 5242 détectée</w:t>
+              <w:t xml:space="preserve">10489 octets relus à l'identique ; inversion d'un octet en position 5244 détectée</w:t>
             </w:r>
           </w:p>
         </w:tc>
@@ -7227,7 +7227,7 @@
                 <w:sz w:val="14"/>
                 <w:szCs w:val="14"/>
               </w:rPr>
-              <w:t xml:space="preserve">40 ms</w:t>
+              <w:t xml:space="preserve">44 ms</w:t>
             </w:r>
           </w:p>
         </w:tc>
@@ -7369,7 +7369,7 @@
                 <w:sz w:val="14"/>
                 <w:szCs w:val="14"/>
               </w:rPr>
-              <w:t xml:space="preserve">35 ms</w:t>
+              <w:t xml:space="preserve">37 ms</w:t>
             </w:r>
           </w:p>
         </w:tc>
@@ -7511,7 +7511,7 @@
                 <w:sz w:val="14"/>
                 <w:szCs w:val="14"/>
               </w:rPr>
-              <w:t xml:space="preserve">30 ms</w:t>
+              <w:t xml:space="preserve">33 ms</w:t>
             </w:r>
           </w:p>
         </w:tc>
@@ -7653,7 +7653,7 @@
                 <w:sz w:val="14"/>
                 <w:szCs w:val="14"/>
               </w:rPr>
-              <w:t xml:space="preserve">49 ms</w:t>
+              <w:t xml:space="preserve">55 ms</w:t>
             </w:r>
           </w:p>
         </w:tc>
@@ -7756,7 +7756,7 @@
                 <w:sz w:val="17"/>
                 <w:szCs w:val="17"/>
               </w:rPr>
-              <w:t xml:space="preserve">2 instantanés conservés : le gel de revue reste lisible (10497 o, dépassé), l'enregistrement approuvé porte la même empreinte de contenu</w:t>
+              <w:t xml:space="preserve">2 instantanés conservés : le gel de revue reste lisible (10495 o, dépassé), l'enregistrement approuvé porte la même empreinte de contenu</w:t>
             </w:r>
           </w:p>
         </w:tc>
@@ -7795,7 +7795,7 @@
                 <w:sz w:val="14"/>
                 <w:szCs w:val="14"/>
               </w:rPr>
-              <w:t xml:space="preserve">57 ms</w:t>
+              <w:t xml:space="preserve">59 ms</w:t>
             </w:r>
           </w:p>
         </w:tc>
@@ -7937,7 +7937,7 @@
                 <w:sz w:val="14"/>
                 <w:szCs w:val="14"/>
               </w:rPr>
-              <w:t xml:space="preserve">48 ms</w:t>
+              <w:t xml:space="preserve">50 ms</w:t>
             </w:r>
           </w:p>
         </w:tc>
@@ -8040,7 +8040,7 @@
                 <w:sz w:val="17"/>
                 <w:szCs w:val="17"/>
               </w:rPr>
-              <w:t xml:space="preserve">171 fichiers source inspectés : aucune modification ni suppression d'entrée ; 1 fichiers en écriture seule</w:t>
+              <w:t xml:space="preserve">172 fichiers source inspectés : aucune modification ni suppression d'entrée ; 1 fichiers en écriture seule</w:t>
             </w:r>
           </w:p>
         </w:tc>
@@ -8079,7 +8079,7 @@
                 <w:sz w:val="14"/>
                 <w:szCs w:val="14"/>
               </w:rPr>
-              <w:t xml:space="preserve">59 ms</w:t>
+              <w:t xml:space="preserve">60 ms</w:t>
             </w:r>
           </w:p>
         </w:tc>
@@ -8363,7 +8363,7 @@
                 <w:sz w:val="14"/>
                 <w:szCs w:val="14"/>
               </w:rPr>
-              <w:t xml:space="preserve">0 ms</w:t>
+              <w:t xml:space="preserve">1 ms</w:t>
             </w:r>
           </w:p>
         </w:tc>
@@ -8505,7 +8505,7 @@
                 <w:sz w:val="14"/>
                 <w:szCs w:val="14"/>
               </w:rPr>
-              <w:t xml:space="preserve">1 ms</w:t>
+              <w:t xml:space="preserve">0 ms</w:t>
             </w:r>
           </w:p>
         </w:tc>
@@ -8647,7 +8647,7 @@
                 <w:sz w:val="14"/>
                 <w:szCs w:val="14"/>
               </w:rPr>
-              <w:t xml:space="preserve">325 ms</w:t>
+              <w:t xml:space="preserve">319 ms</w:t>
             </w:r>
           </w:p>
         </w:tc>
@@ -8750,7 +8750,7 @@
                 <w:sz w:val="17"/>
                 <w:szCs w:val="17"/>
               </w:rPr>
-              <w:t xml:space="preserve">13 enregistrement(s) archivé(s), 43 fichier(s) couverts par empreintes.sha256, 0 écart ; ancre 30d4cff7faa1d4b3… ; octets du gel restitués à l'identique ; altération d'un octet détectée et signalée ALTÉRÉ, fichier conservé dans l'archive</w:t>
+              <w:t xml:space="preserve">13 enregistrement(s) archivé(s), 43 fichier(s) couverts par empreintes.sha256, 0 écart ; ancre ec36784a988a514e… ; octets du gel restitués à l'identique ; altération d'un octet détectée et signalée ALTÉRÉ, fichier conservé dans l'archive</w:t>
             </w:r>
           </w:p>
         </w:tc>
@@ -8789,7 +8789,7 @@
                 <w:sz w:val="14"/>
                 <w:szCs w:val="14"/>
               </w:rPr>
-              <w:t xml:space="preserve">406 ms</w:t>
+              <w:t xml:space="preserve">411 ms</w:t>
             </w:r>
           </w:p>
         </w:tc>
@@ -9073,7 +9073,7 @@
                 <w:sz w:val="14"/>
                 <w:szCs w:val="14"/>
               </w:rPr>
-              <w:t xml:space="preserve">343 ms</w:t>
+              <w:t xml:space="preserve">373 ms</w:t>
             </w:r>
           </w:p>
         </w:tc>
@@ -9215,7 +9215,7 @@
                 <w:sz w:val="14"/>
                 <w:szCs w:val="14"/>
               </w:rPr>
-              <w:t xml:space="preserve">263 ms</w:t>
+              <w:t xml:space="preserve">265 ms</w:t>
             </w:r>
           </w:p>
         </w:tc>
@@ -9318,7 +9318,7 @@
                 <w:sz w:val="17"/>
                 <w:szCs w:val="17"/>
               </w:rPr>
-              <w:t xml:space="preserve">requête DER de 89 octets portant l'empreinte demandée ; jeton de 2418 octets lu exactement (date 2026-08-03T08:55:03.000Z, série 02, politique 1.3.6.1.4.1.99999.1.1) ; quatre refus obtenus : autre empreinte, autre nonce, réponse de rejet de l'autorité, jeton tronqué</w:t>
+              <w:t xml:space="preserve">requête DER de 90 octets portant l'empreinte demandée ; jeton de 2418 octets lu exactement (date 2026-08-03T08:55:03.000Z, série 02, politique 1.3.6.1.4.1.99999.1.1) ; quatre refus obtenus : autre empreinte, autre nonce, réponse de rejet de l'autorité, jeton tronqué</w:t>
             </w:r>
           </w:p>
         </w:tc>
@@ -9641,7 +9641,7 @@
                 <w:sz w:val="14"/>
                 <w:szCs w:val="14"/>
               </w:rPr>
-              <w:t xml:space="preserve">14 ms</w:t>
+              <w:t xml:space="preserve">12 ms</w:t>
             </w:r>
           </w:p>
         </w:tc>
@@ -9744,7 +9744,7 @@
                 <w:sz w:val="17"/>
                 <w:szCs w:val="17"/>
               </w:rPr>
-              <w:t xml:space="preserve">236 fichier(s) source relus, aucune écriture dans la piste hors du module ; 9 empreintes comparées entre l'implémentation TypeScript et le miroir de la console serveur, toutes identiques</w:t>
+              <w:t xml:space="preserve">237 fichier(s) source relus, aucune écriture dans la piste hors du module ; 9 empreintes comparées entre l'implémentation TypeScript et le miroir de la console serveur, toutes identiques</w:t>
             </w:r>
           </w:p>
         </w:tc>
@@ -9783,7 +9783,7 @@
                 <w:sz w:val="14"/>
                 <w:szCs w:val="14"/>
               </w:rPr>
-              <w:t xml:space="preserve">52 ms</w:t>
+              <w:t xml:space="preserve">57 ms</w:t>
             </w:r>
           </w:p>
         </w:tc>
@@ -10067,7 +10067,7 @@
                 <w:sz w:val="14"/>
                 <w:szCs w:val="14"/>
               </w:rPr>
-              <w:t xml:space="preserve">17 ms</w:t>
+              <w:t xml:space="preserve">18 ms</w:t>
             </w:r>
           </w:p>
         </w:tc>
@@ -10209,7 +10209,7 @@
                 <w:sz w:val="14"/>
                 <w:szCs w:val="14"/>
               </w:rPr>
-              <w:t xml:space="preserve">198 ms</w:t>
+              <w:t xml:space="preserve">195 ms</w:t>
             </w:r>
           </w:p>
         </w:tc>
@@ -10312,7 +10312,7 @@
                 <w:sz w:val="17"/>
                 <w:szCs w:val="17"/>
               </w:rPr>
-              <w:t xml:space="preserve">236 fichier(s) source relus : aucune écriture de mot de passe hors des chemins autorisés ; une seule écriture dans les actions serveur, le changement personnel, qui exige l'ancien mot de passe ; l'outil d'urgence de la console émet un jeton et ne sait plus dériver de mot de passe ; aucun champ de mot de passe hors des 7 écrans où l'on saisit le sien</w:t>
+              <w:t xml:space="preserve">237 fichier(s) source relus : aucune écriture de mot de passe hors des chemins autorisés ; une seule écriture dans les actions serveur, le changement personnel, qui exige l'ancien mot de passe ; l'outil d'urgence de la console émet un jeton et ne sait plus dériver de mot de passe ; aucun champ de mot de passe hors des 7 écrans où l'on saisit le sien</w:t>
             </w:r>
           </w:p>
         </w:tc>
@@ -10351,7 +10351,7 @@
                 <w:sz w:val="14"/>
                 <w:szCs w:val="14"/>
               </w:rPr>
-              <w:t xml:space="preserve">69 ms</w:t>
+              <w:t xml:space="preserve">71 ms</w:t>
             </w:r>
           </w:p>
         </w:tc>
@@ -10493,7 +10493,7 @@
                 <w:sz w:val="14"/>
                 <w:szCs w:val="14"/>
               </w:rPr>
-              <w:t xml:space="preserve">9379 ms</w:t>
+              <w:t xml:space="preserve">9512 ms</w:t>
             </w:r>
           </w:p>
         </w:tc>
@@ -10635,7 +10635,7 @@
                 <w:sz w:val="14"/>
                 <w:szCs w:val="14"/>
               </w:rPr>
-              <w:t xml:space="preserve">21 ms</w:t>
+              <w:t xml:space="preserve">17 ms</w:t>
             </w:r>
           </w:p>
         </w:tc>
@@ -10738,7 +10738,7 @@
                 <w:sz w:val="17"/>
                 <w:szCs w:val="17"/>
               </w:rPr>
-              <w:t xml:space="preserve">copie d'archivage de OQ-012-revision rév. 001 produite (124026 octets, 1 page·s) ; 30 contrôles structurels PDF/A-2b passés — police embarquée, profil ICC « acsp » de 3024 octets, métadonnées pdfaid partie 2 niveau B, décalages exacts ; texte intégralement relu par la table du fichier, 44 caractère·s accentué·s ou typographiques restitués ; production déterministe (deux exécutions octet pour octet identiques)</w:t>
+              <w:t xml:space="preserve">copie d'archivage de OQ-012-revision rév. 001 produite (124032 octets, 1 page·s) ; 30 contrôles structurels PDF/A-2b passés — police embarquée, profil ICC « acsp » de 3024 octets, métadonnées pdfaid partie 2 niveau B, décalages exacts ; texte intégralement relu par la table du fichier, 44 caractère·s accentué·s ou typographiques restitués ; production déterministe (deux exécutions octet pour octet identiques)</w:t>
             </w:r>
           </w:p>
         </w:tc>
@@ -10777,7 +10777,7 @@
                 <w:sz w:val="14"/>
                 <w:szCs w:val="14"/>
               </w:rPr>
-              <w:t xml:space="preserve">17 ms</w:t>
+              <w:t xml:space="preserve">18 ms</w:t>
             </w:r>
           </w:p>
         </w:tc>
@@ -10919,7 +10919,7 @@
                 <w:sz w:val="14"/>
                 <w:szCs w:val="14"/>
               </w:rPr>
-              <w:t xml:space="preserve">82 ms</w:t>
+              <w:t xml:space="preserve">81 ms</w:t>
             </w:r>
           </w:p>
         </w:tc>
@@ -11022,7 +11022,7 @@
                 <w:sz w:val="17"/>
                 <w:szCs w:val="17"/>
               </w:rPr>
-              <w:t xml:space="preserve">clôture refusée trois fois avant d'être permise — conclusion vide, 1 entrée(s) non statuée(s), verdict affirmatif sans motif ; manifestation « Testeur QR2 (QR2) · Revu · 09/08/2026 12:14:11 UTC · enregistrement 1B28 9A3E F877 » portant le nom imprimé, la signification « Revu » et l'empreinte du contenu ; empreinte recalculée à l'identique hors du logiciel, et modifiée par le moindre changement de conclusion ou de verdict ; indépendance consignée sur le SIGNATAIRE (0 entrée·s écrite·s par lui, contre 5 par l'ouvreur) ; 10 règles de triage inscrites dans l'enregistrement ; re-clôture et re-statuage refusés ; aucune rupture ajoutée à la chaîne sur 82 entrées</w:t>
+              <w:t xml:space="preserve">clôture refusée trois fois avant d'être permise — conclusion vide, 1 entrée(s) non statuée(s), verdict affirmatif sans motif ; manifestation « Testeur QR2 (QR2) · Revu · 09/08/2026 12:37:55 UTC · enregistrement 4E11 C71E 8EC8 » portant le nom imprimé, la signification « Revu » et l'empreinte du contenu ; empreinte recalculée à l'identique hors du logiciel, et modifiée par le moindre changement de conclusion ou de verdict ; indépendance consignée sur le SIGNATAIRE (0 entrée·s écrite·s par lui, contre 5 par l'ouvreur) ; 10 règles de triage inscrites dans l'enregistrement ; re-clôture et re-statuage refusés ; aucune rupture ajoutée à la chaîne sur 82 entrées</w:t>
             </w:r>
           </w:p>
         </w:tc>
@@ -11061,7 +11061,7 @@
                 <w:sz w:val="14"/>
                 <w:szCs w:val="14"/>
               </w:rPr>
-              <w:t xml:space="preserve">90 ms</w:t>
+              <w:t xml:space="preserve">88 ms</w:t>
             </w:r>
           </w:p>
         </w:tc>
@@ -11203,7 +11203,7 @@
                 <w:sz w:val="14"/>
                 <w:szCs w:val="14"/>
               </w:rPr>
-              <w:t xml:space="preserve">7 ms</w:t>
+              <w:t xml:space="preserve">9 ms</w:t>
             </w:r>
           </w:p>
         </w:tc>
@@ -11345,7 +11345,7 @@
                 <w:sz w:val="14"/>
                 <w:szCs w:val="14"/>
               </w:rPr>
-              <w:t xml:space="preserve">16 ms</w:t>
+              <w:t xml:space="preserve">17 ms</w:t>
             </w:r>
           </w:p>
         </w:tc>
@@ -11487,7 +11487,7 @@
                 <w:sz w:val="14"/>
                 <w:szCs w:val="14"/>
               </w:rPr>
-              <w:t xml:space="preserve">43 ms</w:t>
+              <w:t xml:space="preserve">44 ms</w:t>
             </w:r>
           </w:p>
         </w:tc>
@@ -11590,7 +11590,7 @@
                 <w:sz w:val="17"/>
                 <w:szCs w:val="17"/>
               </w:rPr>
-              <w:t xml:space="preserve">base en journalisation WAL, passage idempotent ; 178 fichier(s) source relus, aucun chemin ne supprime ni n'écrase dans le volume des fichiers hors de la purge des imports — c'est cette propriété d'ajout seul qui rend sûre la règle « restaurer les fichiers à un instant égal ou postérieur à la base » ; sur 19 pièce(s) référencée(s), le retrait d'un enregistrement approuvé est signalé ABSENT et nommé (OQ-014-restauration), sa modification hors du logiciel est signalée ALTÉRÉE, les deux défauts ne sont jamais confondus, et le rapport redevient cohérent une fois la pièce remise en place</w:t>
+              <w:t xml:space="preserve">base en journalisation WAL, passage idempotent ; 179 fichier(s) source relus, aucun chemin ne supprime ni n'écrase dans le volume des fichiers hors de la purge des imports — c'est cette propriété d'ajout seul qui rend sûre la règle « restaurer les fichiers à un instant égal ou postérieur à la base » ; sur 19 pièce(s) référencée(s), le retrait d'un enregistrement approuvé est signalé ABSENT et nommé (OQ-014-restauration), sa modification hors du logiciel est signalée ALTÉRÉE, les deux défauts ne sont jamais confondus, et le rapport redevient cohérent une fois la pièce remise en place</w:t>
             </w:r>
           </w:p>
         </w:tc>
@@ -11629,7 +11629,7 @@
                 <w:sz w:val="14"/>
                 <w:szCs w:val="14"/>
               </w:rPr>
-              <w:t xml:space="preserve">171 ms</w:t>
+              <w:t xml:space="preserve">168 ms</w:t>
             </w:r>
           </w:p>
         </w:tc>
@@ -11732,7 +11732,7 @@
                 <w:sz w:val="17"/>
                 <w:szCs w:val="17"/>
               </w:rPr>
-              <w:t xml:space="preserve">mode éteint sans FILUM_DEMO et sur 10 valeurs voisines (« true », « oui », « 0 », « 1 » avec espace…), allumé sur « 1 » seul ; période annoncée bornée sur 12 valeurs, repli à 6 h pour une valeur absurde ou absente ; bandeau RENDU dans les deux langues portant les trois mentions dues — données fictives, effacement périodique, installation non qualifiée —, sans aucun bouton de fermeture et avec le rôle « alert » ; rendu AVANT la porte d'authentification, donc présent sur l'écran de connexion ; 176 fichier(s) source relus, aucun module hors de la coque ne dépend du mode</w:t>
+              <w:t xml:space="preserve">mode éteint sans FILUM_DEMO et sur 10 valeurs voisines (« true », « oui », « 0 », « 1 » avec espace…), allumé sur « 1 » seul ; période annoncée bornée sur 12 valeurs, repli à 6 h pour une valeur absurde ou absente ; bandeau RENDU dans les deux langues portant les trois mentions dues — données fictives, effacement périodique, installation non qualifiée —, sans aucun bouton de fermeture et avec le rôle « alert » ; rendu AVANT la porte d'authentification, donc présent sur l'écran de connexion ; 177 fichier(s) source relus, aucun module hors de la coque ne dépend du mode</w:t>
             </w:r>
           </w:p>
         </w:tc>
@@ -11771,7 +11771,7 @@
                 <w:sz w:val="14"/>
                 <w:szCs w:val="14"/>
               </w:rPr>
-              <w:t xml:space="preserve">133 ms</w:t>
+              <w:t xml:space="preserve">131 ms</w:t>
             </w:r>
           </w:p>
         </w:tc>
@@ -11913,7 +11913,7 @@
                 <w:sz w:val="14"/>
                 <w:szCs w:val="14"/>
               </w:rPr>
-              <w:t xml:space="preserve">96 ms</w:t>
+              <w:t xml:space="preserve">97 ms</w:t>
             </w:r>
           </w:p>
         </w:tc>
@@ -12055,7 +12055,7 @@
                 <w:sz w:val="14"/>
                 <w:szCs w:val="14"/>
               </w:rPr>
-              <w:t xml:space="preserve">7 ms</w:t>
+              <w:t xml:space="preserve">9 ms</w:t>
             </w:r>
           </w:p>
         </w:tc>
@@ -12158,7 +12158,7 @@
                 <w:sz w:val="17"/>
                 <w:szCs w:val="17"/>
               </w:rPr>
-              <w:t xml:space="preserve">jeton nominal accepté et adresse normalisée ; 15 jetons hostiles refusés, dont « alg: none », la confusion RS256/HS256, une signature d'une autre clé, une charge altérée après signature, un émetteur et un destinataire inattendus, des destinataires multiples sans partie autorisée, un jeton périmé, un nonce absent puis incorrect, et une adresse non vérifiée par l'annuaire ; configuration traitée comme absente si incomplète (4 variables éprouvées une à une) ou si l'émetteur n'est pas en HTTPS ; PKCE S256 dont le défi correspond à son vérifieur, state et nonce distincts et renouvelés à chaque demande ; 171 fichier(s) source relus, aucun module hors de la coque d'authentification ne dépend du SSO, la ré-authentification de signature vérifie toujours un secret LOCAL, et le retour d'annuaire ne crée aucune personne</w:t>
+              <w:t xml:space="preserve">jeton nominal accepté et adresse normalisée ; 15 jetons hostiles refusés, dont « alg: none », la confusion RS256/HS256, une signature d'une autre clé, une charge altérée après signature, un émetteur et un destinataire inattendus, des destinataires multiples sans partie autorisée, un jeton périmé, un nonce absent puis incorrect, et une adresse non vérifiée par l'annuaire ; configuration traitée comme absente si incomplète (4 variables éprouvées une à une) ou si l'émetteur n'est pas en HTTPS ; PKCE S256 dont le défi correspond à son vérifieur, state et nonce distincts et renouvelés à chaque demande ; 172 fichier(s) source relus, aucun module hors de la coque d'authentification ne dépend du SSO, la ré-authentification de signature vérifie toujours un secret LOCAL, et le retour d'annuaire ne crée aucune personne</w:t>
             </w:r>
           </w:p>
         </w:tc>
@@ -12197,7 +12197,7 @@
                 <w:sz w:val="14"/>
                 <w:szCs w:val="14"/>
               </w:rPr>
-              <w:t xml:space="preserve">92 ms</w:t>
+              <w:t xml:space="preserve">105 ms</w:t>
             </w:r>
           </w:p>
         </w:tc>
@@ -12339,7 +12339,7 @@
                 <w:sz w:val="14"/>
                 <w:szCs w:val="14"/>
               </w:rPr>
-              <w:t xml:space="preserve">60 ms</w:t>
+              <w:t xml:space="preserve">59 ms</w:t>
             </w:r>
           </w:p>
         </w:tc>
@@ -12481,7 +12481,7 @@
                 <w:sz w:val="14"/>
                 <w:szCs w:val="14"/>
               </w:rPr>
-              <w:t xml:space="preserve">17 ms</w:t>
+              <w:t xml:space="preserve">18 ms</w:t>
             </w:r>
           </w:p>
         </w:tc>
@@ -12584,7 +12584,7 @@
                 <w:sz w:val="17"/>
                 <w:szCs w:val="17"/>
               </w:rPr>
-              <w:t xml:space="preserve">veraPDF 1.30.2 a rendu deux verdicts sur des fichiers produits pendant ce cas. Le témoin — police non embarquée, sans intention de sortie ni métadonnées XMP, écrit octet par octet sans passer par les modules de Filum — est REJETÉ sur 5 règle(s) : la mesure discrimine. Le document de torture, qui rassemble 7 familles de caractères (chimie, grec, mathématiques, fractions, unités, idéogrammes, emoji, diacritiques) et a exercé 10 substitution(s) de glyphes absents, est déclaré CONFORME au profil PDF/A-2b. Le contrôle structurel interne rend le même verdict sur le même fichier, et confirme zéro renvoi au glyphe .notdef.</w:t>
+              <w:t xml:space="preserve">veraPDF 1.30.2 a rendu deux verdicts sur des fichiers produits pendant ce cas. Le témoin — police non embarquée, sans intention de sortie ni métadonnées XMP, écrit octet par octet sans passer par les modules de Filum — est REJETÉ sur 5 règle(s) : la mesure discrimine. Le document de torture, qui rassemble 7 familles de caractères (chimie, grec, mathématiques, fractions, unités, idéogrammes, emoji, diacritiques) et a exercé 2 substitution(s) de glyphes absents, est déclaré CONFORME au profil PDF/A-2b. Le contrôle structurel interne rend le même verdict sur le même fichier, et confirme zéro renvoi au glyphe .notdef.</w:t>
             </w:r>
           </w:p>
         </w:tc>
@@ -12623,7 +12623,7 @@
                 <w:sz w:val="14"/>
                 <w:szCs w:val="14"/>
               </w:rPr>
-              <w:t xml:space="preserve">3679 ms</w:t>
+              <w:t xml:space="preserve">3619 ms</w:t>
             </w:r>
           </w:p>
         </w:tc>
@@ -16631,7 +16631,7 @@
           <w:sz w:val="20"/>
           <w:szCs w:val="20"/>
         </w:rPr>
-        <w:t xml:space="preserve">— Les copies d'archivage sont produites au format PDF/A-2b et validées par veraPDF 1.30.2, l'implémentation de référence, exécutée sur une archive complète et sur un document de torture bâti pour la faire échouer ; le harnais porte un témoin non conforme et refuse de conclure si le validateur le laisse passer. Ce contrôle a trouvé, à sa première exécution, deux non-conformités que nos propres vérifications ne voyaient pas. LE FORMAT EST VALIDÉ, PAS CERTIFIÉ : un validateur conforme n'est pas un organisme notifié, et l'affirmation porte sur cette version du validateur et sur ce corpus. La police embarquée a été remplacée pour couvrir l'alphabet du domaine — grec, cyrillique, opérateurs mathématiques, exposants, fractions, flèches —, un cas de qualification relit cette couverture sur la police livrée, et la police n'annonce que ce qu'elle sait dessiner. LIMITE SUBSISTANTE : idéogrammes et emoji couleur ne sont pas dessinables ; ils sont remplacés, et chaque copie DÉCLARE lesquels dans une table dédiée.</w:t>
+        <w:t xml:space="preserve">— Les copies d'archivage sont produites au format PDF/A-2b et validées par veraPDF 1.30.2, l'implémentation de référence, exécutée sur une archive complète et sur un document de torture bâti pour la faire échouer ; le harnais porte un témoin non conforme et refuse de conclure si le validateur le laisse passer. Ce contrôle a trouvé, à sa première exécution, deux non-conformités que nos propres vérifications ne voyaient pas. LE FORMAT EST VALIDÉ, PAS CERTIFIÉ : un validateur conforme n'est pas un organisme notifié, et l'affirmation porte sur cette version du validateur et sur ce corpus. Les polices embarquées couvrent l'alphabet du domaine — grec, cyrillique, opérateurs mathématiques, exposants, fractions, flèches — ainsi que les kana et idéogrammes ; un cas de qualification relit cette couverture sur les polices livrées, et une police n'annonce que ce qu'elle sait dessiner. La police d'idéogrammes n'est embarquée que dans les documents qui en portent, et réduite à ce qu'ils emploient : un enregistrement sans idéogramme ne paie rien. LIMITE SUBSISTANTE : hangûl, idéogrammes propres au chinois simplifié et emoji couleur ne sont pas dessinables ; ils sont remplacés, et chaque copie DÉCLARE lesquels dans une table dédiée.</w:t>
       </w:r>
     </w:p>
     <w:sectPr>
@@ -16737,7 +16737,7 @@
         <w:sz w:val="15"/>
         <w:szCs w:val="15"/>
       </w:rPr>
-      <w:t xml:space="preserve">   ·   Version 1.2.1 · rapport OQ exécuté le 9 août 2026 à 12:14 UTC</w:t>
+      <w:t xml:space="preserve">   ·   Version 1.2.1 · rapport OQ exécuté le 9 août 2026 à 12:37 UTC</w:t>
     </w:r>
   </w:p>
 </w:ftr>

</xml_diff>

<commit_message>
Site : 45 cas, 48 exigences, et la revue périodique au périmètre
Le dossier de validation téléchargeable passe à 45 cas sur 48 exigences. Le
périmètre dit désormais qu'une procédure peut porter une date d'entrée en vigueur
distincte de son approbation et une revue périodique — et ce qui manque encore :
diffusion contrôlée et accusé de lecture.

Co-Authored-By: Claude Opus 5 <noreply@anthropic.com>
</commit_message>
<xml_diff>
--- a/docs/Dossier_de_validation_Filum.docx
+++ b/docs/Dossier_de_validation_Filum.docx
@@ -430,7 +430,7 @@
           <w:sz w:val="20"/>
           <w:szCs w:val="20"/>
         </w:rPr>
-        <w:t xml:space="preserve">Les 47 exigences ci-dessous énoncent ce que le logiciel doit faire. Le niveau de risque est celui de la DÉFAILLANCE de l'exigence, pas de son importance commerciale : il détermine la profondeur de vérification.</w:t>
+        <w:t xml:space="preserve">Les 48 exigences ci-dessous énoncent ce que le logiciel doit faire. Le niveau de risque est celui de la DÉFAILLANCE de l'exigence, pas de son importance commerciale : il détermine la profondeur de vérification.</w:t>
       </w:r>
     </w:p>
     <w:tbl>
@@ -5868,6 +5868,119 @@
           </w:p>
         </w:tc>
       </w:tr>
+      <w:tr>
+        <w:tc>
+          <w:tcPr>
+            <w:tcW w:type="pct" w:w="11%"/>
+            <w:shd w:fill="F8FAFC"/>
+            <w:tcMar>
+              <w:top w:type="dxa" w:w="80"/>
+              <w:left w:type="dxa" w:w="110"/>
+              <w:bottom w:type="dxa" w:w="80"/>
+              <w:right w:type="dxa" w:w="110"/>
+            </w:tcMar>
+          </w:tcPr>
+          <w:p>
+            <w:pPr>
+              <w:spacing w:after="60"/>
+            </w:pPr>
+            <w:r>
+              <w:rPr>
+                <w:b/>
+                <w:bCs/>
+                <w:color w:val="4338CA"/>
+                <w:sz w:val="17"/>
+                <w:szCs w:val="17"/>
+              </w:rPr>
+              <w:t xml:space="preserve">URS-48</w:t>
+            </w:r>
+          </w:p>
+          <w:p>
+            <w:pPr>
+              <w:spacing w:after="0"/>
+            </w:pPr>
+            <w:r>
+              <w:rPr>
+                <w:b/>
+                <w:bCs/>
+                <w:color w:val="B45309"/>
+                <w:sz w:val="15"/>
+                <w:szCs w:val="15"/>
+              </w:rPr>
+              <w:t xml:space="preserve">Moyen</w:t>
+            </w:r>
+          </w:p>
+        </w:tc>
+        <w:tc>
+          <w:tcPr>
+            <w:tcW w:type="pct" w:w="41%"/>
+            <w:tcMar>
+              <w:top w:type="dxa" w:w="80"/>
+              <w:left w:type="dxa" w:w="110"/>
+              <w:bottom w:type="dxa" w:w="80"/>
+              <w:right w:type="dxa" w:w="110"/>
+            </w:tcMar>
+          </w:tcPr>
+          <w:p>
+            <w:pPr>
+              <w:spacing w:after="0"/>
+            </w:pPr>
+            <w:r>
+              <w:rPr>
+                <w:sz w:val="17"/>
+                <w:szCs w:val="17"/>
+              </w:rPr>
+              <w:t xml:space="preserve">Un document peut declarer une DATE D ENTREE EN VIGUEUR distincte de son approbation et une PERIODICITE DE REVUE. A la publication, Filum pose l entree en vigueur et calcule l echeance de la prochaine revue. Une revue periodique se consigne avec sa CONCLUSION — reste applicable, ou doit etre revise — et repousse l echeance depuis la date de la revue. Le retard sur l echeance precedente est inscrit dans la piste d audit AVANT d etre remplace. Un document qui ne declare AUCUNE periodicite n acquiert jamais d echeance et n apparait dans aucun compteur.</w:t>
+            </w:r>
+          </w:p>
+        </w:tc>
+        <w:tc>
+          <w:tcPr>
+            <w:tcW w:type="pct" w:w="28%"/>
+            <w:tcMar>
+              <w:top w:type="dxa" w:w="80"/>
+              <w:left w:type="dxa" w:w="110"/>
+              <w:bottom w:type="dxa" w:w="80"/>
+              <w:right w:type="dxa" w:w="110"/>
+            </w:tcMar>
+          </w:tcPr>
+          <w:p>
+            <w:pPr>
+              <w:spacing w:after="0"/>
+            </w:pPr>
+            <w:r>
+              <w:rPr>
+                <w:sz w:val="17"/>
+                <w:szCs w:val="17"/>
+              </w:rPr>
+              <w:t xml:space="preserve">Sans revue periodique, une procedure approuvee reste indefiniment « a jour » : elle a l air parfaitement en regle, et c est precisement ce qui la rend invisible. C est un constat d audit classique sous ISO 13485 §4.2.4. La date d entree en vigueur repond au meme besoin par l autre bout : approuver et rendre applicable sont deux actes distincts — le temps de former les gens — et les confondre fait dire au dossier que la procedure s appliquait avant que quiconque en ait eu connaissance. Le risque symetrique est le bruit : faire apparaitre une echeance sur un rapport d essai fige remplirait de faux devoirs un ecran dont la valeur tient a ce qu il n en porte pas. D ou une periodicite FACULTATIVE, et un document sans periodicite qui reste totalement muet.</w:t>
+            </w:r>
+          </w:p>
+        </w:tc>
+        <w:tc>
+          <w:tcPr>
+            <w:tcW w:type="pct" w:w="20%"/>
+            <w:tcMar>
+              <w:top w:type="dxa" w:w="80"/>
+              <w:left w:type="dxa" w:w="110"/>
+              <w:bottom w:type="dxa" w:w="80"/>
+              <w:right w:type="dxa" w:w="110"/>
+            </w:tcMar>
+          </w:tcPr>
+          <w:p>
+            <w:pPr>
+              <w:spacing w:after="0"/>
+            </w:pPr>
+            <w:r>
+              <w:rPr>
+                <w:sz w:val="17"/>
+                <w:szCs w:val="17"/>
+              </w:rPr>
+              <w:t xml:space="preserve">ISO 13485 §4.2.4 · 21 CFR 11.10(a) · 21 CFR 11.10(e) · Annexe 11 §4</w:t>
+            </w:r>
+          </w:p>
+        </w:tc>
+      </w:tr>
     </w:tbl>
     <w:p>
       <w:pPr>
@@ -5887,7 +6000,7 @@
           <w:sz w:val="20"/>
           <w:szCs w:val="20"/>
         </w:rPr>
-        <w:t xml:space="preserve">Répartition : 29 exigences à risque haut, 16 à risque moyen, 2 à risque bas. Les exigences à risque haut touchent toutes à l'intégrité ou à l'attribution des enregistrements : leur défaillance ne dégrade pas le confort d'usage, elle rend un enregistrement indéfendable. Elles font l'objet de cas de test dédiés, exécutés à chaque version.</w:t>
+        <w:t xml:space="preserve">Répartition : 29 exigences à risque haut, 17 à risque moyen, 2 à risque bas. Les exigences à risque haut touchent toutes à l'intégrité ou à l'attribution des enregistrements : leur défaillance ne dégrade pas le confort d'usage, elle rend un enregistrement indéfendable. Elles font l'objet de cas de test dédiés, exécutés à chaque version.</w:t>
       </w:r>
     </w:p>
     <w:p>
@@ -6038,7 +6151,7 @@
                 <w:sz w:val="17"/>
                 <w:szCs w:val="17"/>
               </w:rPr>
-              <w:t xml:space="preserve">9 août 2026 à 12:37</w:t>
+              <w:t xml:space="preserve">23 août 2026 à 09:26</w:t>
             </w:r>
           </w:p>
         </w:tc>
@@ -6241,7 +6354,7 @@
                 <w:sz w:val="17"/>
                 <w:szCs w:val="17"/>
               </w:rPr>
-              <w:t xml:space="preserve">44 cas sur 44 conformes — aucun écart</w:t>
+              <w:t xml:space="preserve">45 cas sur 45 conformes — aucun écart</w:t>
             </w:r>
           </w:p>
         </w:tc>
@@ -6517,7 +6630,7 @@
                 <w:sz w:val="14"/>
                 <w:szCs w:val="14"/>
               </w:rPr>
-              <w:t xml:space="preserve">0 ms</w:t>
+              <w:t xml:space="preserve">1 ms</w:t>
             </w:r>
           </w:p>
         </w:tc>
@@ -6620,7 +6733,7 @@
                 <w:sz w:val="17"/>
                 <w:szCs w:val="17"/>
               </w:rPr>
-              <w:t xml:space="preserve">empreintes distinctes pour un même mot de passe (47b2ac18f25f… ≠ 29600d156a97…), vérification correcte, mot de passe faux et vide refusés</w:t>
+              <w:t xml:space="preserve">empreintes distinctes pour un même mot de passe (0f9e09e65062… ≠ cbdafa8d2330…), vérification correcte, mot de passe faux et vide refusés</w:t>
             </w:r>
           </w:p>
         </w:tc>
@@ -6659,7 +6772,7 @@
                 <w:sz w:val="14"/>
                 <w:szCs w:val="14"/>
               </w:rPr>
-              <w:t xml:space="preserve">138 ms</w:t>
+              <w:t xml:space="preserve">151 ms</w:t>
             </w:r>
           </w:p>
         </w:tc>
@@ -6904,7 +7017,7 @@
                 <w:sz w:val="17"/>
                 <w:szCs w:val="17"/>
               </w:rPr>
-              <w:t xml:space="preserve">contenu gelé, empreinte 24604eb157d7fa54…, 10488 octets conservés, opération journalisée</w:t>
+              <w:t xml:space="preserve">contenu gelé, empreinte 24604eb157d7fa54…, 10485 octets conservés, opération journalisée</w:t>
             </w:r>
           </w:p>
         </w:tc>
@@ -6943,7 +7056,7 @@
                 <w:sz w:val="14"/>
                 <w:szCs w:val="14"/>
               </w:rPr>
-              <w:t xml:space="preserve">126 ms</w:t>
+              <w:t xml:space="preserve">114 ms</w:t>
             </w:r>
           </w:p>
         </w:tc>
@@ -7046,7 +7159,7 @@
                 <w:sz w:val="17"/>
                 <w:szCs w:val="17"/>
               </w:rPr>
-              <w:t xml:space="preserve">signature liée à l'instantané cmslsfmm…, empreinte attestée 3767 CD80 ACC9, manifestation « Testeur QA1 (QA1) · Approuvé · 09/08/2026 12:37:43 UTC · enregistrement 3767 CD80 ACC9 »</w:t>
+              <w:t xml:space="preserve">signature liée à l'instantané cmt5lriy…, empreinte attestée 3767 CD80 ACC9, manifestation « Testeur QA1 (QA1) · Approuvé · 23/08/2026 09:26:24 UTC · enregistrement 3767 CD80 ACC9 »</w:t>
             </w:r>
           </w:p>
         </w:tc>
@@ -7085,7 +7198,7 @@
                 <w:sz w:val="14"/>
                 <w:szCs w:val="14"/>
               </w:rPr>
-              <w:t xml:space="preserve">29 ms</w:t>
+              <w:t xml:space="preserve">31 ms</w:t>
             </w:r>
           </w:p>
         </w:tc>
@@ -7188,7 +7301,7 @@
                 <w:sz w:val="17"/>
                 <w:szCs w:val="17"/>
               </w:rPr>
-              <w:t xml:space="preserve">10489 octets relus à l'identique ; inversion d'un octet en position 5244 détectée</w:t>
+              <w:t xml:space="preserve">10487 octets relus à l'identique ; inversion d'un octet en position 5243 détectée</w:t>
             </w:r>
           </w:p>
         </w:tc>
@@ -7227,7 +7340,7 @@
                 <w:sz w:val="14"/>
                 <w:szCs w:val="14"/>
               </w:rPr>
-              <w:t xml:space="preserve">44 ms</w:t>
+              <w:t xml:space="preserve">34 ms</w:t>
             </w:r>
           </w:p>
         </w:tc>
@@ -7369,7 +7482,7 @@
                 <w:sz w:val="14"/>
                 <w:szCs w:val="14"/>
               </w:rPr>
-              <w:t xml:space="preserve">37 ms</w:t>
+              <w:t xml:space="preserve">35 ms</w:t>
             </w:r>
           </w:p>
         </w:tc>
@@ -7511,7 +7624,7 @@
                 <w:sz w:val="14"/>
                 <w:szCs w:val="14"/>
               </w:rPr>
-              <w:t xml:space="preserve">33 ms</w:t>
+              <w:t xml:space="preserve">35 ms</w:t>
             </w:r>
           </w:p>
         </w:tc>
@@ -7653,7 +7766,7 @@
                 <w:sz w:val="14"/>
                 <w:szCs w:val="14"/>
               </w:rPr>
-              <w:t xml:space="preserve">55 ms</w:t>
+              <w:t xml:space="preserve">54 ms</w:t>
             </w:r>
           </w:p>
         </w:tc>
@@ -7756,7 +7869,7 @@
                 <w:sz w:val="17"/>
                 <w:szCs w:val="17"/>
               </w:rPr>
-              <w:t xml:space="preserve">2 instantanés conservés : le gel de revue reste lisible (10495 o, dépassé), l'enregistrement approuvé porte la même empreinte de contenu</w:t>
+              <w:t xml:space="preserve">2 instantanés conservés : le gel de revue reste lisible (10496 o, dépassé), l'enregistrement approuvé porte la même empreinte de contenu</w:t>
             </w:r>
           </w:p>
         </w:tc>
@@ -7795,7 +7908,7 @@
                 <w:sz w:val="14"/>
                 <w:szCs w:val="14"/>
               </w:rPr>
-              <w:t xml:space="preserve">59 ms</w:t>
+              <w:t xml:space="preserve">52 ms</w:t>
             </w:r>
           </w:p>
         </w:tc>
@@ -8040,7 +8153,7 @@
                 <w:sz w:val="17"/>
                 <w:szCs w:val="17"/>
               </w:rPr>
-              <w:t xml:space="preserve">172 fichiers source inspectés : aucune modification ni suppression d'entrée ; 1 fichiers en écriture seule</w:t>
+              <w:t xml:space="preserve">173 fichiers source inspectés : aucune modification ni suppression d'entrée ; 1 fichiers en écriture seule</w:t>
             </w:r>
           </w:p>
         </w:tc>
@@ -8079,7 +8192,7 @@
                 <w:sz w:val="14"/>
                 <w:szCs w:val="14"/>
               </w:rPr>
-              <w:t xml:space="preserve">60 ms</w:t>
+              <w:t xml:space="preserve">31 ms</w:t>
             </w:r>
           </w:p>
         </w:tc>
@@ -8221,7 +8334,7 @@
                 <w:sz w:val="14"/>
                 <w:szCs w:val="14"/>
               </w:rPr>
-              <w:t xml:space="preserve">16 ms</w:t>
+              <w:t xml:space="preserve">15 ms</w:t>
             </w:r>
           </w:p>
         </w:tc>
@@ -8363,7 +8476,7 @@
                 <w:sz w:val="14"/>
                 <w:szCs w:val="14"/>
               </w:rPr>
-              <w:t xml:space="preserve">1 ms</w:t>
+              <w:t xml:space="preserve">0 ms</w:t>
             </w:r>
           </w:p>
         </w:tc>
@@ -8505,7 +8618,7 @@
                 <w:sz w:val="14"/>
                 <w:szCs w:val="14"/>
               </w:rPr>
-              <w:t xml:space="preserve">0 ms</w:t>
+              <w:t xml:space="preserve">1 ms</w:t>
             </w:r>
           </w:p>
         </w:tc>
@@ -8647,7 +8760,7 @@
                 <w:sz w:val="14"/>
                 <w:szCs w:val="14"/>
               </w:rPr>
-              <w:t xml:space="preserve">319 ms</w:t>
+              <w:t xml:space="preserve">274 ms</w:t>
             </w:r>
           </w:p>
         </w:tc>
@@ -8750,7 +8863,7 @@
                 <w:sz w:val="17"/>
                 <w:szCs w:val="17"/>
               </w:rPr>
-              <w:t xml:space="preserve">13 enregistrement(s) archivé(s), 43 fichier(s) couverts par empreintes.sha256, 0 écart ; ancre ec36784a988a514e… ; octets du gel restitués à l'identique ; altération d'un octet détectée et signalée ALTÉRÉ, fichier conservé dans l'archive</w:t>
+              <w:t xml:space="preserve">13 enregistrement(s) archivé(s), 43 fichier(s) couverts par empreintes.sha256, 0 écart ; ancre cce526c5284e0805… ; octets du gel restitués à l'identique ; altération d'un octet détectée et signalée ALTÉRÉ, fichier conservé dans l'archive</w:t>
             </w:r>
           </w:p>
         </w:tc>
@@ -8789,7 +8902,7 @@
                 <w:sz w:val="14"/>
                 <w:szCs w:val="14"/>
               </w:rPr>
-              <w:t xml:space="preserve">411 ms</w:t>
+              <w:t xml:space="preserve">350 ms</w:t>
             </w:r>
           </w:p>
         </w:tc>
@@ -8931,7 +9044,7 @@
                 <w:sz w:val="14"/>
                 <w:szCs w:val="14"/>
               </w:rPr>
-              <w:t xml:space="preserve">8 ms</w:t>
+              <w:t xml:space="preserve">13 ms</w:t>
             </w:r>
           </w:p>
         </w:tc>
@@ -9034,7 +9147,7 @@
                 <w:sz w:val="17"/>
                 <w:szCs w:val="17"/>
               </w:rPr>
-              <w:t xml:space="preserve">durée non déclarée annoncée telle quelle ; quatre valeurs invalides refusées (0, -1, 101, 7.5) ; 10 ans déclarés → échéance 2036-08-09 portée par le manifeste, procédure QP-014 rév. B citée dans la lettre d'accompagnement</w:t>
+              <w:t xml:space="preserve">durée non déclarée annoncée telle quelle ; quatre valeurs invalides refusées (0, -1, 101, 7.5) ; 10 ans déclarés → échéance 2036-08-23 portée par le manifeste, procédure QP-014 rév. B citée dans la lettre d'accompagnement</w:t>
             </w:r>
           </w:p>
         </w:tc>
@@ -9215,7 +9328,7 @@
                 <w:sz w:val="14"/>
                 <w:szCs w:val="14"/>
               </w:rPr>
-              <w:t xml:space="preserve">265 ms</w:t>
+              <w:t xml:space="preserve">268 ms</w:t>
             </w:r>
           </w:p>
         </w:tc>
@@ -9318,7 +9431,7 @@
                 <w:sz w:val="17"/>
                 <w:szCs w:val="17"/>
               </w:rPr>
-              <w:t xml:space="preserve">requête DER de 90 octets portant l'empreinte demandée ; jeton de 2418 octets lu exactement (date 2026-08-03T08:55:03.000Z, série 02, politique 1.3.6.1.4.1.99999.1.1) ; quatre refus obtenus : autre empreinte, autre nonce, réponse de rejet de l'autorité, jeton tronqué</w:t>
+              <w:t xml:space="preserve">requête DER de 89 octets portant l'empreinte demandée ; jeton de 2418 octets lu exactement (date 2026-08-03T08:55:03.000Z, série 02, politique 1.3.6.1.4.1.99999.1.1) ; quatre refus obtenus : autre empreinte, autre nonce, réponse de rejet de l'autorité, jeton tronqué</w:t>
             </w:r>
           </w:p>
         </w:tc>
@@ -9641,7 +9754,7 @@
                 <w:sz w:val="14"/>
                 <w:szCs w:val="14"/>
               </w:rPr>
-              <w:t xml:space="preserve">12 ms</w:t>
+              <w:t xml:space="preserve">15 ms</w:t>
             </w:r>
           </w:p>
         </w:tc>
@@ -9744,7 +9857,7 @@
                 <w:sz w:val="17"/>
                 <w:szCs w:val="17"/>
               </w:rPr>
-              <w:t xml:space="preserve">237 fichier(s) source relus, aucune écriture dans la piste hors du module ; 9 empreintes comparées entre l'implémentation TypeScript et le miroir de la console serveur, toutes identiques</w:t>
+              <w:t xml:space="preserve">238 fichier(s) source relus, aucune écriture dans la piste hors du module ; 9 empreintes comparées entre l'implémentation TypeScript et le miroir de la console serveur, toutes identiques</w:t>
             </w:r>
           </w:p>
         </w:tc>
@@ -9783,7 +9896,7 @@
                 <w:sz w:val="14"/>
                 <w:szCs w:val="14"/>
               </w:rPr>
-              <w:t xml:space="preserve">57 ms</w:t>
+              <w:t xml:space="preserve">33 ms</w:t>
             </w:r>
           </w:p>
         </w:tc>
@@ -10067,7 +10180,7 @@
                 <w:sz w:val="14"/>
                 <w:szCs w:val="14"/>
               </w:rPr>
-              <w:t xml:space="preserve">18 ms</w:t>
+              <w:t xml:space="preserve">10 ms</w:t>
             </w:r>
           </w:p>
         </w:tc>
@@ -10209,7 +10322,7 @@
                 <w:sz w:val="14"/>
                 <w:szCs w:val="14"/>
               </w:rPr>
-              <w:t xml:space="preserve">195 ms</w:t>
+              <w:t xml:space="preserve">233 ms</w:t>
             </w:r>
           </w:p>
         </w:tc>
@@ -10312,7 +10425,7 @@
                 <w:sz w:val="17"/>
                 <w:szCs w:val="17"/>
               </w:rPr>
-              <w:t xml:space="preserve">237 fichier(s) source relus : aucune écriture de mot de passe hors des chemins autorisés ; une seule écriture dans les actions serveur, le changement personnel, qui exige l'ancien mot de passe ; l'outil d'urgence de la console émet un jeton et ne sait plus dériver de mot de passe ; aucun champ de mot de passe hors des 7 écrans où l'on saisit le sien</w:t>
+              <w:t xml:space="preserve">238 fichier(s) source relus : aucune écriture de mot de passe hors des chemins autorisés ; une seule écriture dans les actions serveur, le changement personnel, qui exige l'ancien mot de passe ; l'outil d'urgence de la console émet un jeton et ne sait plus dériver de mot de passe ; aucun champ de mot de passe hors des 7 écrans où l'on saisit le sien</w:t>
             </w:r>
           </w:p>
         </w:tc>
@@ -10351,7 +10464,7 @@
                 <w:sz w:val="14"/>
                 <w:szCs w:val="14"/>
               </w:rPr>
-              <w:t xml:space="preserve">71 ms</w:t>
+              <w:t xml:space="preserve">40 ms</w:t>
             </w:r>
           </w:p>
         </w:tc>
@@ -10493,7 +10606,7 @@
                 <w:sz w:val="14"/>
                 <w:szCs w:val="14"/>
               </w:rPr>
-              <w:t xml:space="preserve">9512 ms</w:t>
+              <w:t xml:space="preserve">10167 ms</w:t>
             </w:r>
           </w:p>
         </w:tc>
@@ -10596,7 +10709,7 @@
                 <w:sz w:val="17"/>
                 <w:szCs w:val="17"/>
               </w:rPr>
-              <w:t xml:space="preserve">193 messages du catalogue complets dans les deux langues et à variables identiques ; entrée écrite par le point de passage relue « SPEC-OQ30 : En attente → Justifié — justification : ess… » et « SPEC-OQ30: Pending → Justified — justification: essai d… » ; le statut suit la langue, le motif saisi est restitué à l'identique dans les deux ; réécriture des arguments et changement de clé détectés au rang 64, chaîne rétablie après remise en état ; une entrée sans message se sérialise sur 9 champs comme avant, 11 avec, miroir de console identique sur les deux formes</w:t>
+              <w:t xml:space="preserve">196 messages du catalogue complets dans les deux langues et à variables identiques ; entrée écrite par le point de passage relue « SPEC-OQ30 : En attente → Justifié — justification : ess… » et « SPEC-OQ30: Pending → Justified — justification: essai d… » ; le statut suit la langue, le motif saisi est restitué à l'identique dans les deux ; réécriture des arguments et changement de clé détectés au rang 64, chaîne rétablie après remise en état ; une entrée sans message se sérialise sur 9 champs comme avant, 11 avec, miroir de console identique sur les deux formes</w:t>
             </w:r>
           </w:p>
         </w:tc>
@@ -10738,7 +10851,7 @@
                 <w:sz w:val="17"/>
                 <w:szCs w:val="17"/>
               </w:rPr>
-              <w:t xml:space="preserve">copie d'archivage de OQ-012-revision rév. 001 produite (124032 octets, 1 page·s) ; 30 contrôles structurels PDF/A-2b passés — police embarquée, profil ICC « acsp » de 3024 octets, métadonnées pdfaid partie 2 niveau B, décalages exacts ; texte intégralement relu par la table du fichier, 44 caractère·s accentué·s ou typographiques restitués ; production déterministe (deux exécutions octet pour octet identiques)</w:t>
+              <w:t xml:space="preserve">copie d'archivage de OQ-012-revision rév. 001 produite (124016 octets, 1 page·s) ; 30 contrôles structurels PDF/A-2b passés — police embarquée, profil ICC « acsp » de 3024 octets, métadonnées pdfaid partie 2 niveau B, décalages exacts ; texte intégralement relu par la table du fichier, 44 caractère·s accentué·s ou typographiques restitués ; production déterministe (deux exécutions octet pour octet identiques)</w:t>
             </w:r>
           </w:p>
         </w:tc>
@@ -10777,7 +10890,7 @@
                 <w:sz w:val="14"/>
                 <w:szCs w:val="14"/>
               </w:rPr>
-              <w:t xml:space="preserve">18 ms</w:t>
+              <w:t xml:space="preserve">21 ms</w:t>
             </w:r>
           </w:p>
         </w:tc>
@@ -10919,7 +11032,7 @@
                 <w:sz w:val="14"/>
                 <w:szCs w:val="14"/>
               </w:rPr>
-              <w:t xml:space="preserve">81 ms</w:t>
+              <w:t xml:space="preserve">87 ms</w:t>
             </w:r>
           </w:p>
         </w:tc>
@@ -11022,7 +11135,7 @@
                 <w:sz w:val="17"/>
                 <w:szCs w:val="17"/>
               </w:rPr>
-              <w:t xml:space="preserve">clôture refusée trois fois avant d'être permise — conclusion vide, 1 entrée(s) non statuée(s), verdict affirmatif sans motif ; manifestation « Testeur QR2 (QR2) · Revu · 09/08/2026 12:37:55 UTC · enregistrement 4E11 C71E 8EC8 » portant le nom imprimé, la signification « Revu » et l'empreinte du contenu ; empreinte recalculée à l'identique hors du logiciel, et modifiée par le moindre changement de conclusion ou de verdict ; indépendance consignée sur le SIGNATAIRE (0 entrée·s écrite·s par lui, contre 5 par l'ouvreur) ; 10 règles de triage inscrites dans l'enregistrement ; re-clôture et re-statuage refusés ; aucune rupture ajoutée à la chaîne sur 82 entrées</w:t>
+              <w:t xml:space="preserve">clôture refusée trois fois avant d'être permise — conclusion vide, 1 entrée(s) non statuée(s), verdict affirmatif sans motif ; manifestation « Testeur QR2 (QR2) · Revu · 23/08/2026 09:26:37 UTC · enregistrement 090A 81AF EC55 » portant le nom imprimé, la signification « Revu » et l'empreinte du contenu ; empreinte recalculée à l'identique hors du logiciel, et modifiée par le moindre changement de conclusion ou de verdict ; indépendance consignée sur le SIGNATAIRE (0 entrée·s écrite·s par lui, contre 5 par l'ouvreur) ; 10 règles de triage inscrites dans l'enregistrement ; re-clôture et re-statuage refusés ; aucune rupture ajoutée à la chaîne sur 82 entrées</w:t>
             </w:r>
           </w:p>
         </w:tc>
@@ -11061,7 +11174,7 @@
                 <w:sz w:val="14"/>
                 <w:szCs w:val="14"/>
               </w:rPr>
-              <w:t xml:space="preserve">88 ms</w:t>
+              <w:t xml:space="preserve">98 ms</w:t>
             </w:r>
           </w:p>
         </w:tc>
@@ -11345,7 +11458,7 @@
                 <w:sz w:val="14"/>
                 <w:szCs w:val="14"/>
               </w:rPr>
-              <w:t xml:space="preserve">17 ms</w:t>
+              <w:t xml:space="preserve">18 ms</w:t>
             </w:r>
           </w:p>
         </w:tc>
@@ -11487,7 +11600,7 @@
                 <w:sz w:val="14"/>
                 <w:szCs w:val="14"/>
               </w:rPr>
-              <w:t xml:space="preserve">44 ms</w:t>
+              <w:t xml:space="preserve">48 ms</w:t>
             </w:r>
           </w:p>
         </w:tc>
@@ -11590,7 +11703,7 @@
                 <w:sz w:val="17"/>
                 <w:szCs w:val="17"/>
               </w:rPr>
-              <w:t xml:space="preserve">base en journalisation WAL, passage idempotent ; 179 fichier(s) source relus, aucun chemin ne supprime ni n'écrase dans le volume des fichiers hors de la purge des imports — c'est cette propriété d'ajout seul qui rend sûre la règle « restaurer les fichiers à un instant égal ou postérieur à la base » ; sur 19 pièce(s) référencée(s), le retrait d'un enregistrement approuvé est signalé ABSENT et nommé (OQ-014-restauration), sa modification hors du logiciel est signalée ALTÉRÉE, les deux défauts ne sont jamais confondus, et le rapport redevient cohérent une fois la pièce remise en place</w:t>
+              <w:t xml:space="preserve">base en journalisation WAL, passage idempotent ; 180 fichier(s) source relus, aucun chemin ne supprime ni n'écrase dans le volume des fichiers hors de la purge des imports — c'est cette propriété d'ajout seul qui rend sûre la règle « restaurer les fichiers à un instant égal ou postérieur à la base » ; sur 19 pièce(s) référencée(s), le retrait d'un enregistrement approuvé est signalé ABSENT et nommé (OQ-014-restauration), sa modification hors du logiciel est signalée ALTÉRÉE, les deux défauts ne sont jamais confondus, et le rapport redevient cohérent une fois la pièce remise en place</w:t>
             </w:r>
           </w:p>
         </w:tc>
@@ -11629,7 +11742,7 @@
                 <w:sz w:val="14"/>
                 <w:szCs w:val="14"/>
               </w:rPr>
-              <w:t xml:space="preserve">168 ms</w:t>
+              <w:t xml:space="preserve">160 ms</w:t>
             </w:r>
           </w:p>
         </w:tc>
@@ -11732,7 +11845,7 @@
                 <w:sz w:val="17"/>
                 <w:szCs w:val="17"/>
               </w:rPr>
-              <w:t xml:space="preserve">mode éteint sans FILUM_DEMO et sur 10 valeurs voisines (« true », « oui », « 0 », « 1 » avec espace…), allumé sur « 1 » seul ; période annoncée bornée sur 12 valeurs, repli à 6 h pour une valeur absurde ou absente ; bandeau RENDU dans les deux langues portant les trois mentions dues — données fictives, effacement périodique, installation non qualifiée —, sans aucun bouton de fermeture et avec le rôle « alert » ; rendu AVANT la porte d'authentification, donc présent sur l'écran de connexion ; 177 fichier(s) source relus, aucun module hors de la coque ne dépend du mode</w:t>
+              <w:t xml:space="preserve">mode éteint sans FILUM_DEMO et sur 10 valeurs voisines (« true », « oui », « 0 », « 1 » avec espace…), allumé sur « 1 » seul ; période annoncée bornée sur 12 valeurs, repli à 6 h pour une valeur absurde ou absente ; bandeau RENDU dans les deux langues portant les trois mentions dues — données fictives, effacement périodique, installation non qualifiée —, sans aucun bouton de fermeture et avec le rôle « alert » ; rendu AVANT la porte d'authentification, donc présent sur l'écran de connexion ; 178 fichier(s) source relus, aucun module hors de la coque ne dépend du mode</w:t>
             </w:r>
           </w:p>
         </w:tc>
@@ -11771,7 +11884,7 @@
                 <w:sz w:val="14"/>
                 <w:szCs w:val="14"/>
               </w:rPr>
-              <w:t xml:space="preserve">131 ms</w:t>
+              <w:t xml:space="preserve">125 ms</w:t>
             </w:r>
           </w:p>
         </w:tc>
@@ -11913,7 +12026,7 @@
                 <w:sz w:val="14"/>
                 <w:szCs w:val="14"/>
               </w:rPr>
-              <w:t xml:space="preserve">97 ms</w:t>
+              <w:t xml:space="preserve">82 ms</w:t>
             </w:r>
           </w:p>
         </w:tc>
@@ -12055,7 +12168,7 @@
                 <w:sz w:val="14"/>
                 <w:szCs w:val="14"/>
               </w:rPr>
-              <w:t xml:space="preserve">9 ms</w:t>
+              <w:t xml:space="preserve">8 ms</w:t>
             </w:r>
           </w:p>
         </w:tc>
@@ -12158,7 +12271,7 @@
                 <w:sz w:val="17"/>
                 <w:szCs w:val="17"/>
               </w:rPr>
-              <w:t xml:space="preserve">jeton nominal accepté et adresse normalisée ; 15 jetons hostiles refusés, dont « alg: none », la confusion RS256/HS256, une signature d'une autre clé, une charge altérée après signature, un émetteur et un destinataire inattendus, des destinataires multiples sans partie autorisée, un jeton périmé, un nonce absent puis incorrect, et une adresse non vérifiée par l'annuaire ; configuration traitée comme absente si incomplète (4 variables éprouvées une à une) ou si l'émetteur n'est pas en HTTPS ; PKCE S256 dont le défi correspond à son vérifieur, state et nonce distincts et renouvelés à chaque demande ; 172 fichier(s) source relus, aucun module hors de la coque d'authentification ne dépend du SSO, la ré-authentification de signature vérifie toujours un secret LOCAL, et le retour d'annuaire ne crée aucune personne</w:t>
+              <w:t xml:space="preserve">jeton nominal accepté et adresse normalisée ; 15 jetons hostiles refusés, dont « alg: none », la confusion RS256/HS256, une signature d'une autre clé, une charge altérée après signature, un émetteur et un destinataire inattendus, des destinataires multiples sans partie autorisée, un jeton périmé, un nonce absent puis incorrect, et une adresse non vérifiée par l'annuaire ; configuration traitée comme absente si incomplète (4 variables éprouvées une à une) ou si l'émetteur n'est pas en HTTPS ; PKCE S256 dont le défi correspond à son vérifieur, state et nonce distincts et renouvelés à chaque demande ; 173 fichier(s) source relus, aucun module hors de la coque d'authentification ne dépend du SSO, la ré-authentification de signature vérifie toujours un secret LOCAL, et le retour d'annuaire ne crée aucune personne</w:t>
             </w:r>
           </w:p>
         </w:tc>
@@ -12197,7 +12310,7 @@
                 <w:sz w:val="14"/>
                 <w:szCs w:val="14"/>
               </w:rPr>
-              <w:t xml:space="preserve">105 ms</w:t>
+              <w:t xml:space="preserve">81 ms</w:t>
             </w:r>
           </w:p>
         </w:tc>
@@ -12339,7 +12452,7 @@
                 <w:sz w:val="14"/>
                 <w:szCs w:val="14"/>
               </w:rPr>
-              <w:t xml:space="preserve">59 ms</w:t>
+              <w:t xml:space="preserve">44 ms</w:t>
             </w:r>
           </w:p>
         </w:tc>
@@ -12481,7 +12594,7 @@
                 <w:sz w:val="14"/>
                 <w:szCs w:val="14"/>
               </w:rPr>
-              <w:t xml:space="preserve">18 ms</w:t>
+              <w:t xml:space="preserve">20 ms</w:t>
             </w:r>
           </w:p>
         </w:tc>
@@ -12623,7 +12736,149 @@
                 <w:sz w:val="14"/>
                 <w:szCs w:val="14"/>
               </w:rPr>
-              <w:t xml:space="preserve">3619 ms</w:t>
+              <w:t xml:space="preserve">5214 ms</w:t>
+            </w:r>
+          </w:p>
+        </w:tc>
+      </w:tr>
+      <w:tr>
+        <w:tc>
+          <w:tcPr>
+            <w:tcW w:type="pct" w:w="13%"/>
+            <w:shd w:fill="F8FAFC"/>
+            <w:tcMar>
+              <w:top w:type="dxa" w:w="80"/>
+              <w:left w:type="dxa" w:w="110"/>
+              <w:bottom w:type="dxa" w:w="80"/>
+              <w:right w:type="dxa" w:w="110"/>
+            </w:tcMar>
+          </w:tcPr>
+          <w:p>
+            <w:pPr>
+              <w:spacing w:after="50"/>
+            </w:pPr>
+            <w:r>
+              <w:rPr>
+                <w:b/>
+                <w:bCs/>
+                <w:color w:val="4338CA"/>
+                <w:sz w:val="17"/>
+                <w:szCs w:val="17"/>
+              </w:rPr>
+              <w:t xml:space="preserve">OQ-45</w:t>
+            </w:r>
+          </w:p>
+          <w:p>
+            <w:pPr>
+              <w:spacing w:after="0"/>
+            </w:pPr>
+            <w:r>
+              <w:rPr>
+                <w:color w:val="475569"/>
+                <w:sz w:val="15"/>
+                <w:szCs w:val="15"/>
+              </w:rPr>
+              <w:t xml:space="preserve">URS-48</w:t>
+            </w:r>
+          </w:p>
+        </w:tc>
+        <w:tc>
+          <w:tcPr>
+            <w:tcW w:type="pct" w:w="30%"/>
+            <w:tcMar>
+              <w:top w:type="dxa" w:w="80"/>
+              <w:left w:type="dxa" w:w="110"/>
+              <w:bottom w:type="dxa" w:w="80"/>
+              <w:right w:type="dxa" w:w="110"/>
+            </w:tcMar>
+          </w:tcPr>
+          <w:p>
+            <w:pPr>
+              <w:spacing w:after="50"/>
+            </w:pPr>
+            <w:r>
+              <w:rPr>
+                <w:b/>
+                <w:bCs/>
+                <w:sz w:val="17"/>
+                <w:szCs w:val="17"/>
+              </w:rPr>
+              <w:t xml:space="preserve">Revue périodique : échéance calculée, conclusion consignée, retard inscrit avant d'être effacé</w:t>
+            </w:r>
+          </w:p>
+          <w:p>
+            <w:pPr>
+              <w:spacing w:after="0"/>
+            </w:pPr>
+            <w:r>
+              <w:rPr>
+                <w:color w:val="475569"/>
+                <w:sz w:val="15"/>
+                <w:szCs w:val="15"/>
+              </w:rPr>
+              <w:t xml:space="preserve">Éprouver le calcul d'échéance là où il se trompe le plus volontiers — les fins de mois —, vérifier qu'une revue consigne QUI a conclu QUOI, que le retard sur l'échéance précédente entre dans la piste AVANT d'être remplacé, et surtout qu'un document sans périodicité déclarée reste totalement muet.</w:t>
+            </w:r>
+          </w:p>
+        </w:tc>
+        <w:tc>
+          <w:tcPr>
+            <w:tcW w:type="pct" w:w="45%"/>
+            <w:tcMar>
+              <w:top w:type="dxa" w:w="80"/>
+              <w:left w:type="dxa" w:w="110"/>
+              <w:bottom w:type="dxa" w:w="80"/>
+              <w:right w:type="dxa" w:w="110"/>
+            </w:tcMar>
+          </w:tcPr>
+          <w:p>
+            <w:pPr>
+              <w:spacing w:after="0"/>
+            </w:pPr>
+            <w:r>
+              <w:rPr>
+                <w:sz w:val="17"/>
+                <w:szCs w:val="17"/>
+              </w:rPr>
+              <w:t xml:space="preserve">Le calcul d'échéance est éprouvé sur 6 cas dont quatre fins de mois : le 31 janvier + 1 mois rend le 28 février, et le 29 en année bissextile — un débordement de calendrier aurait glissé l'échéance de deux ou trois jours sans que rien ne le signale. Une procédure publiée reçoit son entrée en vigueur et son échéance ; un rapport d'essai publié dans les mêmes conditions n'en reçoit AUCUNE. Une revue tenue 92 jours après l'échéance consigne sa conclusion, son auteur, et inscrit LE RETARD dans la piste avant que l'échéance ne soit remplacée. L'échéance stockée de chaque document à périodicité est RECALCULÉE depuis sa source et confrontée. Sont refusées : la revue d'un brouillon, celle d'un document sans périodicité, et une conclusion hors des deux admises. Les bornes rejettent 0, 121 et une valeur non entière.</w:t>
+            </w:r>
+          </w:p>
+        </w:tc>
+        <w:tc>
+          <w:tcPr>
+            <w:tcW w:type="pct" w:w="12%"/>
+            <w:tcMar>
+              <w:top w:type="dxa" w:w="80"/>
+              <w:left w:type="dxa" w:w="110"/>
+              <w:bottom w:type="dxa" w:w="80"/>
+              <w:right w:type="dxa" w:w="110"/>
+            </w:tcMar>
+          </w:tcPr>
+          <w:p>
+            <w:pPr>
+              <w:spacing w:after="40"/>
+            </w:pPr>
+            <w:r>
+              <w:rPr>
+                <w:b/>
+                <w:bCs/>
+                <w:color w:val="047857"/>
+                <w:sz w:val="17"/>
+                <w:szCs w:val="17"/>
+              </w:rPr>
+              <w:t xml:space="preserve">Conforme</w:t>
+            </w:r>
+          </w:p>
+          <w:p>
+            <w:pPr>
+              <w:spacing w:after="0"/>
+            </w:pPr>
+            <w:r>
+              <w:rPr>
+                <w:color w:val="475569"/>
+                <w:sz w:val="14"/>
+                <w:szCs w:val="14"/>
+              </w:rPr>
+              <w:t xml:space="preserve">217 ms</w:t>
             </w:r>
           </w:p>
         </w:tc>
@@ -16366,6 +16621,83 @@
           </w:p>
         </w:tc>
       </w:tr>
+      <w:tr>
+        <w:tc>
+          <w:tcPr>
+            <w:tcW w:type="pct" w:w="12%"/>
+            <w:tcMar>
+              <w:top w:type="dxa" w:w="80"/>
+              <w:left w:type="dxa" w:w="110"/>
+              <w:bottom w:type="dxa" w:w="80"/>
+              <w:right w:type="dxa" w:w="110"/>
+            </w:tcMar>
+          </w:tcPr>
+          <w:p>
+            <w:pPr>
+              <w:spacing w:after="0"/>
+            </w:pPr>
+            <w:r>
+              <w:rPr>
+                <w:b/>
+                <w:bCs/>
+                <w:color w:val="4338CA"/>
+                <w:sz w:val="17"/>
+                <w:szCs w:val="17"/>
+              </w:rPr>
+              <w:t xml:space="preserve">URS-48</w:t>
+            </w:r>
+          </w:p>
+        </w:tc>
+        <w:tc>
+          <w:tcPr>
+            <w:tcW w:type="pct" w:w="22%"/>
+            <w:tcMar>
+              <w:top w:type="dxa" w:w="80"/>
+              <w:left w:type="dxa" w:w="110"/>
+              <w:bottom w:type="dxa" w:w="80"/>
+              <w:right w:type="dxa" w:w="110"/>
+            </w:tcMar>
+          </w:tcPr>
+          <w:p>
+            <w:pPr>
+              <w:spacing w:after="0"/>
+            </w:pPr>
+            <w:r>
+              <w:rPr>
+                <w:b/>
+                <w:bCs/>
+                <w:color w:val="047857"/>
+                <w:sz w:val="17"/>
+                <w:szCs w:val="17"/>
+              </w:rPr>
+              <w:t xml:space="preserve">OQ-45</w:t>
+            </w:r>
+          </w:p>
+        </w:tc>
+        <w:tc>
+          <w:tcPr>
+            <w:tcW w:type="pct" w:w="66%"/>
+            <w:tcMar>
+              <w:top w:type="dxa" w:w="80"/>
+              <w:left w:type="dxa" w:w="110"/>
+              <w:bottom w:type="dxa" w:w="80"/>
+              <w:right w:type="dxa" w:w="110"/>
+            </w:tcMar>
+          </w:tcPr>
+          <w:p>
+            <w:pPr>
+              <w:spacing w:after="0"/>
+            </w:pPr>
+            <w:r>
+              <w:rPr>
+                <w:sz w:val="17"/>
+                <w:szCs w:val="17"/>
+              </w:rPr>
+              <w:t xml:space="preserve">Cas de test automatisé exécuté par l'éditeur à chaque version, résultat en section 5.1.</w:t>
+            </w:r>
+          </w:p>
+        </w:tc>
+      </w:tr>
     </w:tbl>
     <w:p>
       <w:pPr>
@@ -16385,7 +16717,7 @@
           <w:sz w:val="20"/>
           <w:szCs w:val="20"/>
         </w:rPr>
-        <w:t xml:space="preserve">Sur les 47 exigences, 43 sont vérifiées automatiquement par l'éditeur et 4 doivent l'être chez vous. Ce n'est pas un partage arbitraire : ces 4 exigences ne sont pas observables sans navigateur, sans requête HTTP ou sans votre infrastructure. Les compter comme couvertes serait une affirmation invérifiable.</w:t>
+        <w:t xml:space="preserve">Sur les 48 exigences, 44 sont vérifiées automatiquement par l'éditeur et 4 doivent l'être chez vous. Ce n'est pas un partage arbitraire : ces 4 exigences ne sont pas observables sans navigateur, sans requête HTTP ou sans votre infrastructure. Les compter comme couvertes serait une affirmation invérifiable.</w:t>
       </w:r>
     </w:p>
     <w:p>
@@ -16737,7 +17069,7 @@
         <w:sz w:val="15"/>
         <w:szCs w:val="15"/>
       </w:rPr>
-      <w:t xml:space="preserve">   ·   Version 1.2.1 · rapport OQ exécuté le 9 août 2026 à 12:37 UTC</w:t>
+      <w:t xml:space="preserve">   ·   Version 1.2.1 · rapport OQ exécuté le 23 août 2026 à 09:26 UTC</w:t>
     </w:r>
   </w:p>
 </w:ftr>

</xml_diff>

<commit_message>
Site : 46 cas, 49 exigences, et la diffusion contrôlée au périmètre
Le document de périmètre affirmait que Filum ne savait faire ni la diffusion
contrôlée ni l'accusé de lecture. Les deux existent désormais : liste de
destinataires par révision, état de qui a lu et qui reste, accusé que chacun
pose pour lui-même et qui ne survit pas à la révision suivante.

La nuance qui remplace l'absence : un accusé de lecture N'EST PAS un
enregistrement de formation. Avoir lu une procédure n'établit pas qu'on sait
l'appliquer, et Filum ne tient ni plan de formation, ni matrice de compétences,
ni habilitation, ni évaluation d'efficacité — l'essentiel de l'ISO 13485 §6.2.
Le périmètre y perd une absence et y gagne une frontière plus honnête.

Chiffres relus sur les sources, jamais réécrits à la main : 46 cas de
qualification, 49 exigences utilisateur.
</commit_message>
<xml_diff>
--- a/docs/Dossier_de_validation_Filum.docx
+++ b/docs/Dossier_de_validation_Filum.docx
@@ -430,7 +430,7 @@
           <w:sz w:val="20"/>
           <w:szCs w:val="20"/>
         </w:rPr>
-        <w:t xml:space="preserve">Les 48 exigences ci-dessous énoncent ce que le logiciel doit faire. Le niveau de risque est celui de la DÉFAILLANCE de l'exigence, pas de son importance commerciale : il détermine la profondeur de vérification.</w:t>
+        <w:t xml:space="preserve">Les 49 exigences ci-dessous énoncent ce que le logiciel doit faire. Le niveau de risque est celui de la DÉFAILLANCE de l'exigence, pas de son importance commerciale : il détermine la profondeur de vérification.</w:t>
       </w:r>
     </w:p>
     <w:tbl>
@@ -5981,6 +5981,119 @@
           </w:p>
         </w:tc>
       </w:tr>
+      <w:tr>
+        <w:tc>
+          <w:tcPr>
+            <w:tcW w:type="pct" w:w="11%"/>
+            <w:shd w:fill="F8FAFC"/>
+            <w:tcMar>
+              <w:top w:type="dxa" w:w="80"/>
+              <w:left w:type="dxa" w:w="110"/>
+              <w:bottom w:type="dxa" w:w="80"/>
+              <w:right w:type="dxa" w:w="110"/>
+            </w:tcMar>
+          </w:tcPr>
+          <w:p>
+            <w:pPr>
+              <w:spacing w:after="60"/>
+            </w:pPr>
+            <w:r>
+              <w:rPr>
+                <w:b/>
+                <w:bCs/>
+                <w:color w:val="4338CA"/>
+                <w:sz w:val="17"/>
+                <w:szCs w:val="17"/>
+              </w:rPr>
+              <w:t xml:space="preserve">URS-49</w:t>
+            </w:r>
+          </w:p>
+          <w:p>
+            <w:pPr>
+              <w:spacing w:after="0"/>
+            </w:pPr>
+            <w:r>
+              <w:rPr>
+                <w:b/>
+                <w:bCs/>
+                <w:color w:val="B45309"/>
+                <w:sz w:val="15"/>
+                <w:szCs w:val="15"/>
+              </w:rPr>
+              <w:t xml:space="preserve">Moyen</w:t>
+            </w:r>
+          </w:p>
+        </w:tc>
+        <w:tc>
+          <w:tcPr>
+            <w:tcW w:type="pct" w:w="41%"/>
+            <w:tcMar>
+              <w:top w:type="dxa" w:w="80"/>
+              <w:left w:type="dxa" w:w="110"/>
+              <w:bottom w:type="dxa" w:w="80"/>
+              <w:right w:type="dxa" w:w="110"/>
+            </w:tcMar>
+          </w:tcPr>
+          <w:p>
+            <w:pPr>
+              <w:spacing w:after="0"/>
+            </w:pPr>
+            <w:r>
+              <w:rPr>
+                <w:sz w:val="17"/>
+                <w:szCs w:val="17"/>
+              </w:rPr>
+              <w:t xml:space="preserve">Un document peut porter une LISTE DE DIFFUSION nommant les personnes qui doivent l avoir lu. Chaque destinataire ACCUSE RECEPTION lui-meme, et pour lui seul : aucun chemin ne permet d accuser a la place d un autre. Un accuse vaut pour UNE REVISION — ouvrir une revision marque les lignes depassees, en cree de neuves pour les memes destinataires, et remet donc tout le monde en attente sans effacer ce qui avait ete lu de la revision precedente. L etat de diffusion compte a part les destinataires desactives : ni acquittes, ni exigibles. Filum n envoie rien.</w:t>
+            </w:r>
+          </w:p>
+        </w:tc>
+        <w:tc>
+          <w:tcPr>
+            <w:tcW w:type="pct" w:w="28%"/>
+            <w:tcMar>
+              <w:top w:type="dxa" w:w="80"/>
+              <w:left w:type="dxa" w:w="110"/>
+              <w:bottom w:type="dxa" w:w="80"/>
+              <w:right w:type="dxa" w:w="110"/>
+            </w:tcMar>
+          </w:tcPr>
+          <w:p>
+            <w:pPr>
+              <w:spacing w:after="0"/>
+            </w:pPr>
+            <w:r>
+              <w:rPr>
+                <w:sz w:val="17"/>
+                <w:szCs w:val="17"/>
+              </w:rPr>
+              <w:t xml:space="preserve">L ISO 13485 §4.2.4 exige que la version en vigueur soit disponible aux points d usage et que les versions perimees ne soient pas employees par inadvertance. Une procedure publiee dont personne ne sait si elle a atteint quiconque ne repond a aucune des deux exigences, et le defaut est invisible : le document a l air parfaitement en regle. Le risque symetrique est l accuse de complaisance — si un tiers peut accuser a la place d un operateur, l enregistrement porte un nom sans que l interesse ait rien lu, ce qui est pire qu une absence d accuse : il est trompeur. D ou la regle « on n accuse que pour soi », la meme qui gouverne la signature. Enfin, un accuse qui survivrait a une revision ferait passer pour lue une version que personne n a ouverte, ce qui retournerait la fonction contre son objet.</w:t>
+            </w:r>
+          </w:p>
+        </w:tc>
+        <w:tc>
+          <w:tcPr>
+            <w:tcW w:type="pct" w:w="20%"/>
+            <w:tcMar>
+              <w:top w:type="dxa" w:w="80"/>
+              <w:left w:type="dxa" w:w="110"/>
+              <w:bottom w:type="dxa" w:w="80"/>
+              <w:right w:type="dxa" w:w="110"/>
+            </w:tcMar>
+          </w:tcPr>
+          <w:p>
+            <w:pPr>
+              <w:spacing w:after="0"/>
+            </w:pPr>
+            <w:r>
+              <w:rPr>
+                <w:sz w:val="17"/>
+                <w:szCs w:val="17"/>
+              </w:rPr>
+              <w:t xml:space="preserve">ISO 13485 §4.2.4 · 21 CFR 11.10(d) · 21 CFR 11.200(a)(3) · ALCOA+ — attribuable</w:t>
+            </w:r>
+          </w:p>
+        </w:tc>
+      </w:tr>
     </w:tbl>
     <w:p>
       <w:pPr>
@@ -6000,7 +6113,7 @@
           <w:sz w:val="20"/>
           <w:szCs w:val="20"/>
         </w:rPr>
-        <w:t xml:space="preserve">Répartition : 29 exigences à risque haut, 17 à risque moyen, 2 à risque bas. Les exigences à risque haut touchent toutes à l'intégrité ou à l'attribution des enregistrements : leur défaillance ne dégrade pas le confort d'usage, elle rend un enregistrement indéfendable. Elles font l'objet de cas de test dédiés, exécutés à chaque version.</w:t>
+        <w:t xml:space="preserve">Répartition : 29 exigences à risque haut, 18 à risque moyen, 2 à risque bas. Les exigences à risque haut touchent toutes à l'intégrité ou à l'attribution des enregistrements : leur défaillance ne dégrade pas le confort d'usage, elle rend un enregistrement indéfendable. Elles font l'objet de cas de test dédiés, exécutés à chaque version.</w:t>
       </w:r>
     </w:p>
     <w:p>
@@ -6151,7 +6264,7 @@
                 <w:sz w:val="17"/>
                 <w:szCs w:val="17"/>
               </w:rPr>
-              <w:t xml:space="preserve">23 août 2026 à 09:26</w:t>
+              <w:t xml:space="preserve">23 août 2026 à 10:36</w:t>
             </w:r>
           </w:p>
         </w:tc>
@@ -6354,7 +6467,7 @@
                 <w:sz w:val="17"/>
                 <w:szCs w:val="17"/>
               </w:rPr>
-              <w:t xml:space="preserve">45 cas sur 45 conformes — aucun écart</w:t>
+              <w:t xml:space="preserve">46 cas sur 46 conformes — aucun écart</w:t>
             </w:r>
           </w:p>
         </w:tc>
@@ -6630,7 +6743,7 @@
                 <w:sz w:val="14"/>
                 <w:szCs w:val="14"/>
               </w:rPr>
-              <w:t xml:space="preserve">1 ms</w:t>
+              <w:t xml:space="preserve">0 ms</w:t>
             </w:r>
           </w:p>
         </w:tc>
@@ -6733,7 +6846,7 @@
                 <w:sz w:val="17"/>
                 <w:szCs w:val="17"/>
               </w:rPr>
-              <w:t xml:space="preserve">empreintes distinctes pour un même mot de passe (0f9e09e65062… ≠ cbdafa8d2330…), vérification correcte, mot de passe faux et vide refusés</w:t>
+              <w:t xml:space="preserve">empreintes distinctes pour un même mot de passe (173d0cd81e15… ≠ 0711dbc59e68…), vérification correcte, mot de passe faux et vide refusés</w:t>
             </w:r>
           </w:p>
         </w:tc>
@@ -6772,7 +6885,7 @@
                 <w:sz w:val="14"/>
                 <w:szCs w:val="14"/>
               </w:rPr>
-              <w:t xml:space="preserve">151 ms</w:t>
+              <w:t xml:space="preserve">140 ms</w:t>
             </w:r>
           </w:p>
         </w:tc>
@@ -7017,7 +7130,7 @@
                 <w:sz w:val="17"/>
                 <w:szCs w:val="17"/>
               </w:rPr>
-              <w:t xml:space="preserve">contenu gelé, empreinte 24604eb157d7fa54…, 10485 octets conservés, opération journalisée</w:t>
+              <w:t xml:space="preserve">contenu gelé, empreinte 24604eb157d7fa54…, 10484 octets conservés, opération journalisée</w:t>
             </w:r>
           </w:p>
         </w:tc>
@@ -7056,7 +7169,7 @@
                 <w:sz w:val="14"/>
                 <w:szCs w:val="14"/>
               </w:rPr>
-              <w:t xml:space="preserve">114 ms</w:t>
+              <w:t xml:space="preserve">111 ms</w:t>
             </w:r>
           </w:p>
         </w:tc>
@@ -7159,7 +7272,7 @@
                 <w:sz w:val="17"/>
                 <w:szCs w:val="17"/>
               </w:rPr>
-              <w:t xml:space="preserve">signature liée à l'instantané cmt5lriy…, empreinte attestée 3767 CD80 ACC9, manifestation « Testeur QA1 (QA1) · Approuvé · 23/08/2026 09:26:24 UTC · enregistrement 3767 CD80 ACC9 »</w:t>
+              <w:t xml:space="preserve">signature liée à l'instantané cmt5o8pn…, empreinte attestée 3767 CD80 ACC9, manifestation « Testeur QA1 (QA1) · Approuvé · 23/08/2026 10:35:46 UTC · enregistrement 3767 CD80 ACC9 »</w:t>
             </w:r>
           </w:p>
         </w:tc>
@@ -7198,7 +7311,7 @@
                 <w:sz w:val="14"/>
                 <w:szCs w:val="14"/>
               </w:rPr>
-              <w:t xml:space="preserve">31 ms</w:t>
+              <w:t xml:space="preserve">29 ms</w:t>
             </w:r>
           </w:p>
         </w:tc>
@@ -7340,7 +7453,7 @@
                 <w:sz w:val="14"/>
                 <w:szCs w:val="14"/>
               </w:rPr>
-              <w:t xml:space="preserve">34 ms</w:t>
+              <w:t xml:space="preserve">29 ms</w:t>
             </w:r>
           </w:p>
         </w:tc>
@@ -7482,7 +7595,7 @@
                 <w:sz w:val="14"/>
                 <w:szCs w:val="14"/>
               </w:rPr>
-              <w:t xml:space="preserve">35 ms</w:t>
+              <w:t xml:space="preserve">33 ms</w:t>
             </w:r>
           </w:p>
         </w:tc>
@@ -7624,7 +7737,7 @@
                 <w:sz w:val="14"/>
                 <w:szCs w:val="14"/>
               </w:rPr>
-              <w:t xml:space="preserve">35 ms</w:t>
+              <w:t xml:space="preserve">33 ms</w:t>
             </w:r>
           </w:p>
         </w:tc>
@@ -7766,7 +7879,7 @@
                 <w:sz w:val="14"/>
                 <w:szCs w:val="14"/>
               </w:rPr>
-              <w:t xml:space="preserve">54 ms</w:t>
+              <w:t xml:space="preserve">51 ms</w:t>
             </w:r>
           </w:p>
         </w:tc>
@@ -7908,7 +8021,7 @@
                 <w:sz w:val="14"/>
                 <w:szCs w:val="14"/>
               </w:rPr>
-              <w:t xml:space="preserve">52 ms</w:t>
+              <w:t xml:space="preserve">47 ms</w:t>
             </w:r>
           </w:p>
         </w:tc>
@@ -8050,7 +8163,7 @@
                 <w:sz w:val="14"/>
                 <w:szCs w:val="14"/>
               </w:rPr>
-              <w:t xml:space="preserve">50 ms</w:t>
+              <w:t xml:space="preserve">51 ms</w:t>
             </w:r>
           </w:p>
         </w:tc>
@@ -8153,7 +8266,7 @@
                 <w:sz w:val="17"/>
                 <w:szCs w:val="17"/>
               </w:rPr>
-              <w:t xml:space="preserve">173 fichiers source inspectés : aucune modification ni suppression d'entrée ; 1 fichiers en écriture seule</w:t>
+              <w:t xml:space="preserve">174 fichiers source inspectés : aucune modification ni suppression d'entrée ; 1 fichiers en écriture seule</w:t>
             </w:r>
           </w:p>
         </w:tc>
@@ -8192,7 +8305,7 @@
                 <w:sz w:val="14"/>
                 <w:szCs w:val="14"/>
               </w:rPr>
-              <w:t xml:space="preserve">31 ms</w:t>
+              <w:t xml:space="preserve">32 ms</w:t>
             </w:r>
           </w:p>
         </w:tc>
@@ -8334,7 +8447,7 @@
                 <w:sz w:val="14"/>
                 <w:szCs w:val="14"/>
               </w:rPr>
-              <w:t xml:space="preserve">15 ms</w:t>
+              <w:t xml:space="preserve">16 ms</w:t>
             </w:r>
           </w:p>
         </w:tc>
@@ -8760,7 +8873,7 @@
                 <w:sz w:val="14"/>
                 <w:szCs w:val="14"/>
               </w:rPr>
-              <w:t xml:space="preserve">274 ms</w:t>
+              <w:t xml:space="preserve">308 ms</w:t>
             </w:r>
           </w:p>
         </w:tc>
@@ -8863,7 +8976,7 @@
                 <w:sz w:val="17"/>
                 <w:szCs w:val="17"/>
               </w:rPr>
-              <w:t xml:space="preserve">13 enregistrement(s) archivé(s), 43 fichier(s) couverts par empreintes.sha256, 0 écart ; ancre cce526c5284e0805… ; octets du gel restitués à l'identique ; altération d'un octet détectée et signalée ALTÉRÉ, fichier conservé dans l'archive</w:t>
+              <w:t xml:space="preserve">13 enregistrement(s) archivé(s), 43 fichier(s) couverts par empreintes.sha256, 0 écart ; ancre 1af08e160b956b88… ; octets du gel restitués à l'identique ; altération d'un octet détectée et signalée ALTÉRÉ, fichier conservé dans l'archive</w:t>
             </w:r>
           </w:p>
         </w:tc>
@@ -8902,7 +9015,7 @@
                 <w:sz w:val="14"/>
                 <w:szCs w:val="14"/>
               </w:rPr>
-              <w:t xml:space="preserve">350 ms</w:t>
+              <w:t xml:space="preserve">386 ms</w:t>
             </w:r>
           </w:p>
         </w:tc>
@@ -9044,7 +9157,7 @@
                 <w:sz w:val="14"/>
                 <w:szCs w:val="14"/>
               </w:rPr>
-              <w:t xml:space="preserve">13 ms</w:t>
+              <w:t xml:space="preserve">9 ms</w:t>
             </w:r>
           </w:p>
         </w:tc>
@@ -9186,7 +9299,7 @@
                 <w:sz w:val="14"/>
                 <w:szCs w:val="14"/>
               </w:rPr>
-              <w:t xml:space="preserve">373 ms</w:t>
+              <w:t xml:space="preserve">408 ms</w:t>
             </w:r>
           </w:p>
         </w:tc>
@@ -9328,7 +9441,7 @@
                 <w:sz w:val="14"/>
                 <w:szCs w:val="14"/>
               </w:rPr>
-              <w:t xml:space="preserve">268 ms</w:t>
+              <w:t xml:space="preserve">294 ms</w:t>
             </w:r>
           </w:p>
         </w:tc>
@@ -9470,7 +9583,7 @@
                 <w:sz w:val="14"/>
                 <w:szCs w:val="14"/>
               </w:rPr>
-              <w:t xml:space="preserve">2 ms</w:t>
+              <w:t xml:space="preserve">3 ms</w:t>
             </w:r>
           </w:p>
         </w:tc>
@@ -9573,7 +9686,7 @@
                 <w:sz w:val="17"/>
                 <w:szCs w:val="17"/>
               </w:rPr>
-              <w:t xml:space="preserve">35 modèles déclarés, tous purgés ou détachés par prisma/seed.ts</w:t>
+              <w:t xml:space="preserve">36 modèles déclarés, tous purgés ou détachés par prisma/seed.ts</w:t>
             </w:r>
           </w:p>
         </w:tc>
@@ -9754,7 +9867,7 @@
                 <w:sz w:val="14"/>
                 <w:szCs w:val="14"/>
               </w:rPr>
-              <w:t xml:space="preserve">15 ms</w:t>
+              <w:t xml:space="preserve">14 ms</w:t>
             </w:r>
           </w:p>
         </w:tc>
@@ -9857,7 +9970,7 @@
                 <w:sz w:val="17"/>
                 <w:szCs w:val="17"/>
               </w:rPr>
-              <w:t xml:space="preserve">238 fichier(s) source relus, aucune écriture dans la piste hors du module ; 9 empreintes comparées entre l'implémentation TypeScript et le miroir de la console serveur, toutes identiques</w:t>
+              <w:t xml:space="preserve">240 fichier(s) source relus, aucune écriture dans la piste hors du module ; 9 empreintes comparées entre l'implémentation TypeScript et le miroir de la console serveur, toutes identiques</w:t>
             </w:r>
           </w:p>
         </w:tc>
@@ -9896,7 +10009,7 @@
                 <w:sz w:val="14"/>
                 <w:szCs w:val="14"/>
               </w:rPr>
-              <w:t xml:space="preserve">33 ms</w:t>
+              <w:t xml:space="preserve">34 ms</w:t>
             </w:r>
           </w:p>
         </w:tc>
@@ -10180,7 +10293,7 @@
                 <w:sz w:val="14"/>
                 <w:szCs w:val="14"/>
               </w:rPr>
-              <w:t xml:space="preserve">10 ms</w:t>
+              <w:t xml:space="preserve">9 ms</w:t>
             </w:r>
           </w:p>
         </w:tc>
@@ -10322,7 +10435,7 @@
                 <w:sz w:val="14"/>
                 <w:szCs w:val="14"/>
               </w:rPr>
-              <w:t xml:space="preserve">233 ms</w:t>
+              <w:t xml:space="preserve">228 ms</w:t>
             </w:r>
           </w:p>
         </w:tc>
@@ -10425,7 +10538,7 @@
                 <w:sz w:val="17"/>
                 <w:szCs w:val="17"/>
               </w:rPr>
-              <w:t xml:space="preserve">238 fichier(s) source relus : aucune écriture de mot de passe hors des chemins autorisés ; une seule écriture dans les actions serveur, le changement personnel, qui exige l'ancien mot de passe ; l'outil d'urgence de la console émet un jeton et ne sait plus dériver de mot de passe ; aucun champ de mot de passe hors des 7 écrans où l'on saisit le sien</w:t>
+              <w:t xml:space="preserve">240 fichier(s) source relus : aucune écriture de mot de passe hors des chemins autorisés ; une seule écriture dans les actions serveur, le changement personnel, qui exige l'ancien mot de passe ; l'outil d'urgence de la console émet un jeton et ne sait plus dériver de mot de passe ; aucun champ de mot de passe hors des 7 écrans où l'on saisit le sien</w:t>
             </w:r>
           </w:p>
         </w:tc>
@@ -10464,7 +10577,7 @@
                 <w:sz w:val="14"/>
                 <w:szCs w:val="14"/>
               </w:rPr>
-              <w:t xml:space="preserve">40 ms</w:t>
+              <w:t xml:space="preserve">41 ms</w:t>
             </w:r>
           </w:p>
         </w:tc>
@@ -10606,7 +10719,7 @@
                 <w:sz w:val="14"/>
                 <w:szCs w:val="14"/>
               </w:rPr>
-              <w:t xml:space="preserve">10167 ms</w:t>
+              <w:t xml:space="preserve">9704 ms</w:t>
             </w:r>
           </w:p>
         </w:tc>
@@ -10709,7 +10822,7 @@
                 <w:sz w:val="17"/>
                 <w:szCs w:val="17"/>
               </w:rPr>
-              <w:t xml:space="preserve">196 messages du catalogue complets dans les deux langues et à variables identiques ; entrée écrite par le point de passage relue « SPEC-OQ30 : En attente → Justifié — justification : ess… » et « SPEC-OQ30: Pending → Justified — justification: essai d… » ; le statut suit la langue, le motif saisi est restitué à l'identique dans les deux ; réécriture des arguments et changement de clé détectés au rang 64, chaîne rétablie après remise en état ; une entrée sans message se sérialise sur 9 champs comme avant, 11 avec, miroir de console identique sur les deux formes</w:t>
+              <w:t xml:space="preserve">199 messages du catalogue complets dans les deux langues et à variables identiques ; entrée écrite par le point de passage relue « SPEC-OQ30 : En attente → Justifié — justification : ess… » et « SPEC-OQ30: Pending → Justified — justification: essai d… » ; le statut suit la langue, le motif saisi est restitué à l'identique dans les deux ; réécriture des arguments et changement de clé détectés au rang 64, chaîne rétablie après remise en état ; une entrée sans message se sérialise sur 9 champs comme avant, 11 avec, miroir de console identique sur les deux formes</w:t>
             </w:r>
           </w:p>
         </w:tc>
@@ -10748,7 +10861,7 @@
                 <w:sz w:val="14"/>
                 <w:szCs w:val="14"/>
               </w:rPr>
-              <w:t xml:space="preserve">17 ms</w:t>
+              <w:t xml:space="preserve">14 ms</w:t>
             </w:r>
           </w:p>
         </w:tc>
@@ -10851,7 +10964,7 @@
                 <w:sz w:val="17"/>
                 <w:szCs w:val="17"/>
               </w:rPr>
-              <w:t xml:space="preserve">copie d'archivage de OQ-012-revision rév. 001 produite (124016 octets, 1 page·s) ; 30 contrôles structurels PDF/A-2b passés — police embarquée, profil ICC « acsp » de 3024 octets, métadonnées pdfaid partie 2 niveau B, décalages exacts ; texte intégralement relu par la table du fichier, 44 caractère·s accentué·s ou typographiques restitués ; production déterministe (deux exécutions octet pour octet identiques)</w:t>
+              <w:t xml:space="preserve">copie d'archivage de OQ-012-revision rév. 001 produite (124025 octets, 1 page·s) ; 30 contrôles structurels PDF/A-2b passés — police embarquée, profil ICC « acsp » de 3024 octets, métadonnées pdfaid partie 2 niveau B, décalages exacts ; texte intégralement relu par la table du fichier, 44 caractère·s accentué·s ou typographiques restitués ; production déterministe (deux exécutions octet pour octet identiques)</w:t>
             </w:r>
           </w:p>
         </w:tc>
@@ -10890,7 +11003,7 @@
                 <w:sz w:val="14"/>
                 <w:szCs w:val="14"/>
               </w:rPr>
-              <w:t xml:space="preserve">21 ms</w:t>
+              <w:t xml:space="preserve">19 ms</w:t>
             </w:r>
           </w:p>
         </w:tc>
@@ -11032,7 +11145,7 @@
                 <w:sz w:val="14"/>
                 <w:szCs w:val="14"/>
               </w:rPr>
-              <w:t xml:space="preserve">87 ms</w:t>
+              <w:t xml:space="preserve">82 ms</w:t>
             </w:r>
           </w:p>
         </w:tc>
@@ -11135,7 +11248,7 @@
                 <w:sz w:val="17"/>
                 <w:szCs w:val="17"/>
               </w:rPr>
-              <w:t xml:space="preserve">clôture refusée trois fois avant d'être permise — conclusion vide, 1 entrée(s) non statuée(s), verdict affirmatif sans motif ; manifestation « Testeur QR2 (QR2) · Revu · 23/08/2026 09:26:37 UTC · enregistrement 090A 81AF EC55 » portant le nom imprimé, la signification « Revu » et l'empreinte du contenu ; empreinte recalculée à l'identique hors du logiciel, et modifiée par le moindre changement de conclusion ou de verdict ; indépendance consignée sur le SIGNATAIRE (0 entrée·s écrite·s par lui, contre 5 par l'ouvreur) ; 10 règles de triage inscrites dans l'enregistrement ; re-clôture et re-statuage refusés ; aucune rupture ajoutée à la chaîne sur 82 entrées</w:t>
+              <w:t xml:space="preserve">clôture refusée trois fois avant d'être permise — conclusion vide, 1 entrée(s) non statuée(s), verdict affirmatif sans motif ; manifestation « Testeur QR2 (QR2) · Revu · 23/08/2026 10:35:57 UTC · enregistrement 678A DAA5 B36B » portant le nom imprimé, la signification « Revu » et l'empreinte du contenu ; empreinte recalculée à l'identique hors du logiciel, et modifiée par le moindre changement de conclusion ou de verdict ; indépendance consignée sur le SIGNATAIRE (0 entrée·s écrite·s par lui, contre 5 par l'ouvreur) ; 10 règles de triage inscrites dans l'enregistrement ; re-clôture et re-statuage refusés ; aucune rupture ajoutée à la chaîne sur 82 entrées</w:t>
             </w:r>
           </w:p>
         </w:tc>
@@ -11174,7 +11287,7 @@
                 <w:sz w:val="14"/>
                 <w:szCs w:val="14"/>
               </w:rPr>
-              <w:t xml:space="preserve">98 ms</w:t>
+              <w:t xml:space="preserve">87 ms</w:t>
             </w:r>
           </w:p>
         </w:tc>
@@ -11458,7 +11571,7 @@
                 <w:sz w:val="14"/>
                 <w:szCs w:val="14"/>
               </w:rPr>
-              <w:t xml:space="preserve">18 ms</w:t>
+              <w:t xml:space="preserve">16 ms</w:t>
             </w:r>
           </w:p>
         </w:tc>
@@ -11600,7 +11713,7 @@
                 <w:sz w:val="14"/>
                 <w:szCs w:val="14"/>
               </w:rPr>
-              <w:t xml:space="preserve">48 ms</w:t>
+              <w:t xml:space="preserve">45 ms</w:t>
             </w:r>
           </w:p>
         </w:tc>
@@ -11703,7 +11816,7 @@
                 <w:sz w:val="17"/>
                 <w:szCs w:val="17"/>
               </w:rPr>
-              <w:t xml:space="preserve">base en journalisation WAL, passage idempotent ; 180 fichier(s) source relus, aucun chemin ne supprime ni n'écrase dans le volume des fichiers hors de la purge des imports — c'est cette propriété d'ajout seul qui rend sûre la règle « restaurer les fichiers à un instant égal ou postérieur à la base » ; sur 19 pièce(s) référencée(s), le retrait d'un enregistrement approuvé est signalé ABSENT et nommé (OQ-014-restauration), sa modification hors du logiciel est signalée ALTÉRÉE, les deux défauts ne sont jamais confondus, et le rapport redevient cohérent une fois la pièce remise en place</w:t>
+              <w:t xml:space="preserve">base en journalisation WAL, passage idempotent ; 181 fichier(s) source relus, aucun chemin ne supprime ni n'écrase dans le volume des fichiers hors de la purge des imports — c'est cette propriété d'ajout seul qui rend sûre la règle « restaurer les fichiers à un instant égal ou postérieur à la base » ; sur 19 pièce(s) référencée(s), le retrait d'un enregistrement approuvé est signalé ABSENT et nommé (OQ-014-restauration), sa modification hors du logiciel est signalée ALTÉRÉE, les deux défauts ne sont jamais confondus, et le rapport redevient cohérent une fois la pièce remise en place</w:t>
             </w:r>
           </w:p>
         </w:tc>
@@ -11742,7 +11855,7 @@
                 <w:sz w:val="14"/>
                 <w:szCs w:val="14"/>
               </w:rPr>
-              <w:t xml:space="preserve">160 ms</w:t>
+              <w:t xml:space="preserve">146 ms</w:t>
             </w:r>
           </w:p>
         </w:tc>
@@ -11845,7 +11958,7 @@
                 <w:sz w:val="17"/>
                 <w:szCs w:val="17"/>
               </w:rPr>
-              <w:t xml:space="preserve">mode éteint sans FILUM_DEMO et sur 10 valeurs voisines (« true », « oui », « 0 », « 1 » avec espace…), allumé sur « 1 » seul ; période annoncée bornée sur 12 valeurs, repli à 6 h pour une valeur absurde ou absente ; bandeau RENDU dans les deux langues portant les trois mentions dues — données fictives, effacement périodique, installation non qualifiée —, sans aucun bouton de fermeture et avec le rôle « alert » ; rendu AVANT la porte d'authentification, donc présent sur l'écran de connexion ; 178 fichier(s) source relus, aucun module hors de la coque ne dépend du mode</w:t>
+              <w:t xml:space="preserve">mode éteint sans FILUM_DEMO et sur 10 valeurs voisines (« true », « oui », « 0 », « 1 » avec espace…), allumé sur « 1 » seul ; période annoncée bornée sur 12 valeurs, repli à 6 h pour une valeur absurde ou absente ; bandeau RENDU dans les deux langues portant les trois mentions dues — données fictives, effacement périodique, installation non qualifiée —, sans aucun bouton de fermeture et avec le rôle « alert » ; rendu AVANT la porte d'authentification, donc présent sur l'écran de connexion ; 179 fichier(s) source relus, aucun module hors de la coque ne dépend du mode</w:t>
             </w:r>
           </w:p>
         </w:tc>
@@ -11884,7 +11997,7 @@
                 <w:sz w:val="14"/>
                 <w:szCs w:val="14"/>
               </w:rPr>
-              <w:t xml:space="preserve">125 ms</w:t>
+              <w:t xml:space="preserve">119 ms</w:t>
             </w:r>
           </w:p>
         </w:tc>
@@ -12026,7 +12139,7 @@
                 <w:sz w:val="14"/>
                 <w:szCs w:val="14"/>
               </w:rPr>
-              <w:t xml:space="preserve">82 ms</w:t>
+              <w:t xml:space="preserve">76 ms</w:t>
             </w:r>
           </w:p>
         </w:tc>
@@ -12271,7 +12384,7 @@
                 <w:sz w:val="17"/>
                 <w:szCs w:val="17"/>
               </w:rPr>
-              <w:t xml:space="preserve">jeton nominal accepté et adresse normalisée ; 15 jetons hostiles refusés, dont « alg: none », la confusion RS256/HS256, une signature d'une autre clé, une charge altérée après signature, un émetteur et un destinataire inattendus, des destinataires multiples sans partie autorisée, un jeton périmé, un nonce absent puis incorrect, et une adresse non vérifiée par l'annuaire ; configuration traitée comme absente si incomplète (4 variables éprouvées une à une) ou si l'émetteur n'est pas en HTTPS ; PKCE S256 dont le défi correspond à son vérifieur, state et nonce distincts et renouvelés à chaque demande ; 173 fichier(s) source relus, aucun module hors de la coque d'authentification ne dépend du SSO, la ré-authentification de signature vérifie toujours un secret LOCAL, et le retour d'annuaire ne crée aucune personne</w:t>
+              <w:t xml:space="preserve">jeton nominal accepté et adresse normalisée ; 15 jetons hostiles refusés, dont « alg: none », la confusion RS256/HS256, une signature d'une autre clé, une charge altérée après signature, un émetteur et un destinataire inattendus, des destinataires multiples sans partie autorisée, un jeton périmé, un nonce absent puis incorrect, et une adresse non vérifiée par l'annuaire ; configuration traitée comme absente si incomplète (4 variables éprouvées une à une) ou si l'émetteur n'est pas en HTTPS ; PKCE S256 dont le défi correspond à son vérifieur, state et nonce distincts et renouvelés à chaque demande ; 174 fichier(s) source relus, aucun module hors de la coque d'authentification ne dépend du SSO, la ré-authentification de signature vérifie toujours un secret LOCAL, et le retour d'annuaire ne crée aucune personne</w:t>
             </w:r>
           </w:p>
         </w:tc>
@@ -12310,7 +12423,7 @@
                 <w:sz w:val="14"/>
                 <w:szCs w:val="14"/>
               </w:rPr>
-              <w:t xml:space="preserve">81 ms</w:t>
+              <w:t xml:space="preserve">127 ms</w:t>
             </w:r>
           </w:p>
         </w:tc>
@@ -12413,7 +12526,7 @@
                 <w:sz w:val="17"/>
                 <w:szCs w:val="17"/>
               </w:rPr>
-              <w:t xml:space="preserve">34 point(s) dépendant du moteur relevés sur la source et tous déclarés — 3 instruction(s) PRAGMA, 2 lecture(s)-puis-écriture de la tête de chaîne (le chaînage ET son miroir de console, ce second exemplaire ayant été trouvé par l'audit et non prévu), 27 recherche(s) par « contains », le fournisseur figé et la lignée de migrations ; l'insensibilité à la casse du moteur qualifié est CONSTATÉE et non supposée (1 = 1) ; le schéma annonce toujours « sqlite » et la note de portabilité dit que l'autre moteur n'est pas offert</w:t>
+              <w:t xml:space="preserve">35 point(s) dépendant du moteur relevés sur la source et tous déclarés — 4 instruction(s) PRAGMA, 2 lecture(s)-puis-écriture de la tête de chaîne (le chaînage ET son miroir de console, ce second exemplaire ayant été trouvé par l'audit et non prévu), 27 recherche(s) par « contains », le fournisseur figé et la lignée de migrations ; l'insensibilité à la casse du moteur qualifié est CONSTATÉE et non supposée (1 = 1) ; le schéma annonce toujours « sqlite » et la note de portabilité dit que l'autre moteur n'est pas offert</w:t>
             </w:r>
           </w:p>
         </w:tc>
@@ -12452,7 +12565,7 @@
                 <w:sz w:val="14"/>
                 <w:szCs w:val="14"/>
               </w:rPr>
-              <w:t xml:space="preserve">44 ms</w:t>
+              <w:t xml:space="preserve">42 ms</w:t>
             </w:r>
           </w:p>
         </w:tc>
@@ -12594,7 +12707,7 @@
                 <w:sz w:val="14"/>
                 <w:szCs w:val="14"/>
               </w:rPr>
-              <w:t xml:space="preserve">20 ms</w:t>
+              <w:t xml:space="preserve">19 ms</w:t>
             </w:r>
           </w:p>
         </w:tc>
@@ -12736,7 +12849,7 @@
                 <w:sz w:val="14"/>
                 <w:szCs w:val="14"/>
               </w:rPr>
-              <w:t xml:space="preserve">5214 ms</w:t>
+              <w:t xml:space="preserve">3859 ms</w:t>
             </w:r>
           </w:p>
         </w:tc>
@@ -12878,7 +12991,149 @@
                 <w:sz w:val="14"/>
                 <w:szCs w:val="14"/>
               </w:rPr>
-              <w:t xml:space="preserve">217 ms</w:t>
+              <w:t xml:space="preserve">193 ms</w:t>
+            </w:r>
+          </w:p>
+        </w:tc>
+      </w:tr>
+      <w:tr>
+        <w:tc>
+          <w:tcPr>
+            <w:tcW w:type="pct" w:w="13%"/>
+            <w:shd w:fill="F8FAFC"/>
+            <w:tcMar>
+              <w:top w:type="dxa" w:w="80"/>
+              <w:left w:type="dxa" w:w="110"/>
+              <w:bottom w:type="dxa" w:w="80"/>
+              <w:right w:type="dxa" w:w="110"/>
+            </w:tcMar>
+          </w:tcPr>
+          <w:p>
+            <w:pPr>
+              <w:spacing w:after="50"/>
+            </w:pPr>
+            <w:r>
+              <w:rPr>
+                <w:b/>
+                <w:bCs/>
+                <w:color w:val="4338CA"/>
+                <w:sz w:val="17"/>
+                <w:szCs w:val="17"/>
+              </w:rPr>
+              <w:t xml:space="preserve">OQ-46</w:t>
+            </w:r>
+          </w:p>
+          <w:p>
+            <w:pPr>
+              <w:spacing w:after="0"/>
+            </w:pPr>
+            <w:r>
+              <w:rPr>
+                <w:color w:val="475569"/>
+                <w:sz w:val="15"/>
+                <w:szCs w:val="15"/>
+              </w:rPr>
+              <w:t xml:space="preserve">URS-49</w:t>
+            </w:r>
+          </w:p>
+        </w:tc>
+        <w:tc>
+          <w:tcPr>
+            <w:tcW w:type="pct" w:w="30%"/>
+            <w:tcMar>
+              <w:top w:type="dxa" w:w="80"/>
+              <w:left w:type="dxa" w:w="110"/>
+              <w:bottom w:type="dxa" w:w="80"/>
+              <w:right w:type="dxa" w:w="110"/>
+            </w:tcMar>
+          </w:tcPr>
+          <w:p>
+            <w:pPr>
+              <w:spacing w:after="50"/>
+            </w:pPr>
+            <w:r>
+              <w:rPr>
+                <w:b/>
+                <w:bCs/>
+                <w:sz w:val="17"/>
+                <w:szCs w:val="17"/>
+              </w:rPr>
+              <w:t xml:space="preserve">Diffusion contrôlée : on n'accuse que pour soi, et une lecture ne survit pas à une révision</w:t>
+            </w:r>
+          </w:p>
+          <w:p>
+            <w:pPr>
+              <w:spacing w:after="0"/>
+            </w:pPr>
+            <w:r>
+              <w:rPr>
+                <w:color w:val="475569"/>
+                <w:sz w:val="15"/>
+                <w:szCs w:val="15"/>
+              </w:rPr>
+              <w:t xml:space="preserve">Éprouver les deux règles dont tout dépend — nul n'accuse à la place d'un autre, et publier une révision remet chacun en attente sans effacer ce qui avait été lu de la précédente — puis vérifier que l'état de diffusion ne se laisse pas bloquer par une personne désactivée.</w:t>
+            </w:r>
+          </w:p>
+        </w:tc>
+        <w:tc>
+          <w:tcPr>
+            <w:tcW w:type="pct" w:w="45%"/>
+            <w:tcMar>
+              <w:top w:type="dxa" w:w="80"/>
+              <w:left w:type="dxa" w:w="110"/>
+              <w:bottom w:type="dxa" w:w="80"/>
+              <w:right w:type="dxa" w:w="110"/>
+            </w:tcMar>
+          </w:tcPr>
+          <w:p>
+            <w:pPr>
+              <w:spacing w:after="0"/>
+            </w:pPr>
+            <w:r>
+              <w:rPr>
+                <w:sz w:val="17"/>
+                <w:szCs w:val="17"/>
+              </w:rPr>
+              <w:t xml:space="preserve">Trois destinataires posés sur une procédure. Un accusé de lecture est REFUSÉ sur un brouillon — attester d'un texte qui peut encore changer ne prouve rien sur ce qui sera appliqué. Après publication, la fonction n'accepte un accusé que pour la personne qu'on lui nomme, et la SOURCE de l'action serveur est relue pour établir qu'elle n'accepte aucun identifiant venu d'un formulaire : seule l'identité de la session agit. Un second accusé pour la même personne et la même révision est refusé. Un destinataire désactivé est compté à part — la révision peut être déclarée lue sans lui, sans qu'il soit pour autant réputé l'avoir lue. Enfin, ouvrir une révision dépasse les trois lignes en CONSERVANT leurs accusés, en crée trois neuves pour les mêmes destinataires, toutes en attente : une version que personne n'a ouverte ne peut pas passer pour lue. La piste nomme qui a lu quoi, dans les deux langues.</w:t>
+            </w:r>
+          </w:p>
+        </w:tc>
+        <w:tc>
+          <w:tcPr>
+            <w:tcW w:type="pct" w:w="12%"/>
+            <w:tcMar>
+              <w:top w:type="dxa" w:w="80"/>
+              <w:left w:type="dxa" w:w="110"/>
+              <w:bottom w:type="dxa" w:w="80"/>
+              <w:right w:type="dxa" w:w="110"/>
+            </w:tcMar>
+          </w:tcPr>
+          <w:p>
+            <w:pPr>
+              <w:spacing w:after="40"/>
+            </w:pPr>
+            <w:r>
+              <w:rPr>
+                <w:b/>
+                <w:bCs/>
+                <w:color w:val="047857"/>
+                <w:sz w:val="17"/>
+                <w:szCs w:val="17"/>
+              </w:rPr>
+              <w:t xml:space="preserve">Conforme</w:t>
+            </w:r>
+          </w:p>
+          <w:p>
+            <w:pPr>
+              <w:spacing w:after="0"/>
+            </w:pPr>
+            <w:r>
+              <w:rPr>
+                <w:color w:val="475569"/>
+                <w:sz w:val="14"/>
+                <w:szCs w:val="14"/>
+              </w:rPr>
+              <w:t xml:space="preserve">225 ms</w:t>
             </w:r>
           </w:p>
         </w:tc>
@@ -16698,6 +16953,83 @@
           </w:p>
         </w:tc>
       </w:tr>
+      <w:tr>
+        <w:tc>
+          <w:tcPr>
+            <w:tcW w:type="pct" w:w="12%"/>
+            <w:tcMar>
+              <w:top w:type="dxa" w:w="80"/>
+              <w:left w:type="dxa" w:w="110"/>
+              <w:bottom w:type="dxa" w:w="80"/>
+              <w:right w:type="dxa" w:w="110"/>
+            </w:tcMar>
+          </w:tcPr>
+          <w:p>
+            <w:pPr>
+              <w:spacing w:after="0"/>
+            </w:pPr>
+            <w:r>
+              <w:rPr>
+                <w:b/>
+                <w:bCs/>
+                <w:color w:val="4338CA"/>
+                <w:sz w:val="17"/>
+                <w:szCs w:val="17"/>
+              </w:rPr>
+              <w:t xml:space="preserve">URS-49</w:t>
+            </w:r>
+          </w:p>
+        </w:tc>
+        <w:tc>
+          <w:tcPr>
+            <w:tcW w:type="pct" w:w="22%"/>
+            <w:tcMar>
+              <w:top w:type="dxa" w:w="80"/>
+              <w:left w:type="dxa" w:w="110"/>
+              <w:bottom w:type="dxa" w:w="80"/>
+              <w:right w:type="dxa" w:w="110"/>
+            </w:tcMar>
+          </w:tcPr>
+          <w:p>
+            <w:pPr>
+              <w:spacing w:after="0"/>
+            </w:pPr>
+            <w:r>
+              <w:rPr>
+                <w:b/>
+                <w:bCs/>
+                <w:color w:val="047857"/>
+                <w:sz w:val="17"/>
+                <w:szCs w:val="17"/>
+              </w:rPr>
+              <w:t xml:space="preserve">OQ-46</w:t>
+            </w:r>
+          </w:p>
+        </w:tc>
+        <w:tc>
+          <w:tcPr>
+            <w:tcW w:type="pct" w:w="66%"/>
+            <w:tcMar>
+              <w:top w:type="dxa" w:w="80"/>
+              <w:left w:type="dxa" w:w="110"/>
+              <w:bottom w:type="dxa" w:w="80"/>
+              <w:right w:type="dxa" w:w="110"/>
+            </w:tcMar>
+          </w:tcPr>
+          <w:p>
+            <w:pPr>
+              <w:spacing w:after="0"/>
+            </w:pPr>
+            <w:r>
+              <w:rPr>
+                <w:sz w:val="17"/>
+                <w:szCs w:val="17"/>
+              </w:rPr>
+              <w:t xml:space="preserve">Cas de test automatisé exécuté par l'éditeur à chaque version, résultat en section 5.1.</w:t>
+            </w:r>
+          </w:p>
+        </w:tc>
+      </w:tr>
     </w:tbl>
     <w:p>
       <w:pPr>
@@ -16717,7 +17049,7 @@
           <w:sz w:val="20"/>
           <w:szCs w:val="20"/>
         </w:rPr>
-        <w:t xml:space="preserve">Sur les 48 exigences, 44 sont vérifiées automatiquement par l'éditeur et 4 doivent l'être chez vous. Ce n'est pas un partage arbitraire : ces 4 exigences ne sont pas observables sans navigateur, sans requête HTTP ou sans votre infrastructure. Les compter comme couvertes serait une affirmation invérifiable.</w:t>
+        <w:t xml:space="preserve">Sur les 49 exigences, 45 sont vérifiées automatiquement par l'éditeur et 4 doivent l'être chez vous. Ce n'est pas un partage arbitraire : ces 4 exigences ne sont pas observables sans navigateur, sans requête HTTP ou sans votre infrastructure. Les compter comme couvertes serait une affirmation invérifiable.</w:t>
       </w:r>
     </w:p>
     <w:p>
@@ -17069,7 +17401,7 @@
         <w:sz w:val="15"/>
         <w:szCs w:val="15"/>
       </w:rPr>
-      <w:t xml:space="preserve">   ·   Version 1.2.1 · rapport OQ exécuté le 23 août 2026 à 09:26 UTC</w:t>
+      <w:t xml:space="preserve">   ·   Version 1.2.1 · rapport OQ exécuté le 23 août 2026 à 10:36 UTC</w:t>
     </w:r>
   </w:p>
 </w:ftr>

</xml_diff>